<commit_message>
Deploying to gh-pages from @ Morrison-Lab/sds@f6471105a58480bfd6454f52dc2d6d77427a56dc 🚀
</commit_message>
<xml_diff>
--- a/exploratory-descriptive-handout.docx
+++ b/exploratory-descriptive-handout.docx
@@ -15,7 +15,7 @@
         <w:pStyle w:val="Date"/>
       </w:pPr>
       <w:r>
-        <w:t xml:space="preserve">Last modified: 2026-10-02 01:47:22 (PDT)</w:t>
+        <w:t xml:space="preserve">Last modified: 2026-10-02 10:09:58 (PDT)</w:t>
       </w:r>
     </w:p>
     <w:bookmarkStart w:id="15" w:name="introduction"/>
@@ -13970,7 +13970,7 @@
     <w:bookmarkEnd w:id="93"/>
     <w:bookmarkEnd w:id="94"/>
     <w:bookmarkEnd w:id="95"/>
-    <w:bookmarkStart w:id="105" w:name="data-transformations"/>
+    <w:bookmarkStart w:id="115" w:name="data-transformations"/>
     <w:p>
       <w:pPr>
         <w:pStyle w:val="Heading2"/>
@@ -15419,22 +15419,47 @@
         <w:t xml:space="preserve">the assumptions of that model and on the scientific question.</w:t>
       </w:r>
     </w:p>
-    <w:bookmarkEnd w:id="105"/>
-    <w:bookmarkStart w:id="107" w:name="an-exploratory-data-analysis-workflow"/>
+    <w:bookmarkStart w:id="114" w:name="sec-rescaling"/>
     <w:p>
       <w:pPr>
-        <w:pStyle w:val="Heading2"/>
+        <w:pStyle w:val="Heading3"/>
       </w:pPr>
       <w:r>
-        <w:t xml:space="preserve">6 An exploratory data analysis workflow</w:t>
+        <w:t xml:space="preserve">5.1 Rescaling a variable</w:t>
       </w:r>
     </w:p>
+    <w:bookmarkStart w:id="105" w:name="exr-standardize"/>
     <w:p>
       <w:pPr>
         <w:pStyle w:val="FirstParagraph"/>
       </w:pPr>
       <w:r>
-        <w:t xml:space="preserve">A typical exploratory data analysis proceeds as follows:</w:t>
+        <w:rPr>
+          <w:b/>
+          <w:bCs/>
+        </w:rPr>
+        <w:t xml:space="preserve">Exercise 2 (A standardized cholesterol value)</w:t>
+      </w:r>
+      <w:r>
+        <w:t xml:space="preserve"> </w:t>
+      </w:r>
+      <w:r>
+        <w:t xml:space="preserve">In the WCGS data,</w:t>
+      </w:r>
+      <w:r>
+        <w:t xml:space="preserve"> </w:t>
+      </w:r>
+      <w:r>
+        <w:t xml:space="preserve">cholesterol (</w:t>
+      </w:r>
+      <w:r>
+        <w:rPr>
+          <w:rStyle w:val="VerbatimChar"/>
+        </w:rPr>
+        <w:t xml:space="preserve">chol</w:t>
+      </w:r>
+      <w:r>
+        <w:t xml:space="preserve">) is measured in mg/dL.</w:t>
       </w:r>
     </w:p>
     <w:p>
@@ -15446,20 +15471,19 @@
         </w:numPr>
       </w:pPr>
       <w:r>
-        <w:rPr>
-          <w:b/>
-          <w:bCs/>
-        </w:rPr>
-        <w:t xml:space="preserve">Understand the dataset</w:t>
-      </w:r>
-      <w:r>
-        <w:t xml:space="preserve">:</w:t>
-      </w:r>
-      <w:r>
-        <w:t xml:space="preserve"> </w:t>
-      </w:r>
-      <w:r>
-        <w:t xml:space="preserve">the number of observations and variables, and each variable’s type.</w:t>
+        <w:t xml:space="preserve">Compute the sample mean and sample standard deviation of</w:t>
+      </w:r>
+      <w:r>
+        <w:t xml:space="preserve"> </w:t>
+      </w:r>
+      <w:r>
+        <w:rPr>
+          <w:rStyle w:val="VerbatimChar"/>
+        </w:rPr>
+        <w:t xml:space="preserve">chol</w:t>
+      </w:r>
+      <w:r>
+        <w:t xml:space="preserve">.</w:t>
       </w:r>
     </w:p>
     <w:p>
@@ -15471,50 +15495,34 @@
         </w:numPr>
       </w:pPr>
       <w:r>
-        <w:rPr>
-          <w:b/>
-          <w:bCs/>
-        </w:rPr>
-        <w:t xml:space="preserve">Examine each variable individually</w:t>
-      </w:r>
-      <w:r>
-        <w:t xml:space="preserve">:</w:t>
-      </w:r>
-    </w:p>
-    <w:p>
-      <w:pPr>
-        <w:pStyle w:val="Compact"/>
-        <w:numPr>
-          <w:ilvl w:val="1"/>
-          <w:numId w:val="1007"/>
-        </w:numPr>
-      </w:pPr>
-      <w:r>
-        <w:t xml:space="preserve">continuous: histogram, box plot, mean, SD, median, IQR;</w:t>
-      </w:r>
-    </w:p>
-    <w:p>
-      <w:pPr>
-        <w:pStyle w:val="Compact"/>
-        <w:numPr>
-          <w:ilvl w:val="1"/>
-          <w:numId w:val="1007"/>
-        </w:numPr>
-      </w:pPr>
-      <w:r>
-        <w:t xml:space="preserve">categorical: bar chart, frequency table;</w:t>
-      </w:r>
-    </w:p>
-    <w:p>
-      <w:pPr>
-        <w:pStyle w:val="Compact"/>
-        <w:numPr>
-          <w:ilvl w:val="1"/>
-          <w:numId w:val="1007"/>
-        </w:numPr>
-      </w:pPr>
-      <w:r>
-        <w:t xml:space="preserve">note missing values, unusual values, and outliers.</w:t>
+        <w:t xml:space="preserve">A man has</w:t>
+      </w:r>
+      <w:r>
+        <w:t xml:space="preserve"> </w:t>
+      </w:r>
+      <w:r>
+        <w:rPr>
+          <w:rStyle w:val="VerbatimChar"/>
+        </w:rPr>
+        <w:t xml:space="preserve">chol</w:t>
+      </w:r>
+      <w:r>
+        <w:t xml:space="preserve"> </w:t>
+      </w:r>
+      <w:r>
+        <w:t xml:space="preserve">equal to 250 mg/dL.</w:t>
+      </w:r>
+      <w:r>
+        <w:t xml:space="preserve"> </w:t>
+      </w:r>
+      <w:r>
+        <w:t xml:space="preserve">By how many standard deviations does his value differ from the sample mean,</w:t>
+      </w:r>
+      <w:r>
+        <w:t xml:space="preserve"> </w:t>
+      </w:r>
+      <w:r>
+        <w:t xml:space="preserve">and in which direction?</w:t>
       </w:r>
     </w:p>
     <w:p>
@@ -15526,11 +15534,2671 @@
         </w:numPr>
       </w:pPr>
       <w:r>
+        <w:t xml:space="preserve">What are the units of your answer to part 2?</w:t>
+      </w:r>
+    </w:p>
+    <w:bookmarkEnd w:id="105"/>
+    <w:bookmarkStart w:id="106" w:name="sol-standardize"/>
+    <w:p>
+      <w:pPr>
+        <w:pStyle w:val="FirstParagraph"/>
+      </w:pPr>
+      <w:r>
+        <w:rPr>
+          <w:i/>
+          <w:iCs/>
+        </w:rPr>
+        <w:t xml:space="preserve">Solution 2</w:t>
+      </w:r>
+      <w:r>
+        <w:t xml:space="preserve">. </w:t>
+      </w:r>
+    </w:p>
+    <w:p>
+      <w:pPr>
+        <w:pStyle w:val="SourceCode"/>
+      </w:pPr>
+      <w:r>
+        <w:rPr>
+          <w:rStyle w:val="NormalTok"/>
+        </w:rPr>
+        <w:t xml:space="preserve">chol_mean </w:t>
+      </w:r>
+      <w:r>
+        <w:rPr>
+          <w:rStyle w:val="OtherTok"/>
+        </w:rPr>
+        <w:t xml:space="preserve">&lt;-</w:t>
+      </w:r>
+      <w:r>
+        <w:rPr>
+          <w:rStyle w:val="NormalTok"/>
+        </w:rPr>
+        <w:t xml:space="preserve"> </w:t>
+      </w:r>
+      <w:r>
+        <w:rPr>
+          <w:rStyle w:val="FunctionTok"/>
+        </w:rPr>
+        <w:t xml:space="preserve">mean</w:t>
+      </w:r>
+      <w:r>
+        <w:rPr>
+          <w:rStyle w:val="NormalTok"/>
+        </w:rPr>
+        <w:t xml:space="preserve">(wcgs</w:t>
+      </w:r>
+      <w:r>
+        <w:rPr>
+          <w:rStyle w:val="SpecialCharTok"/>
+        </w:rPr>
+        <w:t xml:space="preserve">$</w:t>
+      </w:r>
+      <w:r>
+        <w:rPr>
+          <w:rStyle w:val="NormalTok"/>
+        </w:rPr>
+        <w:t xml:space="preserve">chol, </w:t>
+      </w:r>
+      <w:r>
+        <w:rPr>
+          <w:rStyle w:val="AttributeTok"/>
+        </w:rPr>
+        <w:t xml:space="preserve">na.rm =</w:t>
+      </w:r>
+      <w:r>
+        <w:rPr>
+          <w:rStyle w:val="NormalTok"/>
+        </w:rPr>
+        <w:t xml:space="preserve"> </w:t>
+      </w:r>
+      <w:r>
+        <w:rPr>
+          <w:rStyle w:val="ConstantTok"/>
+        </w:rPr>
+        <w:t xml:space="preserve">TRUE</w:t>
+      </w:r>
+      <w:r>
+        <w:rPr>
+          <w:rStyle w:val="NormalTok"/>
+        </w:rPr>
+        <w:t xml:space="preserve">)</w:t>
+      </w:r>
+      <w:r>
+        <w:br/>
+      </w:r>
+      <w:r>
+        <w:rPr>
+          <w:rStyle w:val="NormalTok"/>
+        </w:rPr>
+        <w:t xml:space="preserve">chol_sd </w:t>
+      </w:r>
+      <w:r>
+        <w:rPr>
+          <w:rStyle w:val="OtherTok"/>
+        </w:rPr>
+        <w:t xml:space="preserve">&lt;-</w:t>
+      </w:r>
+      <w:r>
+        <w:rPr>
+          <w:rStyle w:val="NormalTok"/>
+        </w:rPr>
+        <w:t xml:space="preserve"> </w:t>
+      </w:r>
+      <w:r>
+        <w:rPr>
+          <w:rStyle w:val="FunctionTok"/>
+        </w:rPr>
+        <w:t xml:space="preserve">sd</w:t>
+      </w:r>
+      <w:r>
+        <w:rPr>
+          <w:rStyle w:val="NormalTok"/>
+        </w:rPr>
+        <w:t xml:space="preserve">(wcgs</w:t>
+      </w:r>
+      <w:r>
+        <w:rPr>
+          <w:rStyle w:val="SpecialCharTok"/>
+        </w:rPr>
+        <w:t xml:space="preserve">$</w:t>
+      </w:r>
+      <w:r>
+        <w:rPr>
+          <w:rStyle w:val="NormalTok"/>
+        </w:rPr>
+        <w:t xml:space="preserve">chol, </w:t>
+      </w:r>
+      <w:r>
+        <w:rPr>
+          <w:rStyle w:val="AttributeTok"/>
+        </w:rPr>
+        <w:t xml:space="preserve">na.rm =</w:t>
+      </w:r>
+      <w:r>
+        <w:rPr>
+          <w:rStyle w:val="NormalTok"/>
+        </w:rPr>
+        <w:t xml:space="preserve"> </w:t>
+      </w:r>
+      <w:r>
+        <w:rPr>
+          <w:rStyle w:val="ConstantTok"/>
+        </w:rPr>
+        <w:t xml:space="preserve">TRUE</w:t>
+      </w:r>
+      <w:r>
+        <w:rPr>
+          <w:rStyle w:val="NormalTok"/>
+        </w:rPr>
+        <w:t xml:space="preserve">)</w:t>
+      </w:r>
+      <w:r>
+        <w:br/>
+      </w:r>
+      <w:r>
+        <w:rPr>
+          <w:rStyle w:val="NormalTok"/>
+        </w:rPr>
+        <w:t xml:space="preserve">chol_z </w:t>
+      </w:r>
+      <w:r>
+        <w:rPr>
+          <w:rStyle w:val="OtherTok"/>
+        </w:rPr>
+        <w:t xml:space="preserve">&lt;-</w:t>
+      </w:r>
+      <w:r>
+        <w:rPr>
+          <w:rStyle w:val="NormalTok"/>
+        </w:rPr>
+        <w:t xml:space="preserve"> (</w:t>
+      </w:r>
+      <w:r>
+        <w:rPr>
+          <w:rStyle w:val="DecValTok"/>
+        </w:rPr>
+        <w:t xml:space="preserve">250</w:t>
+      </w:r>
+      <w:r>
+        <w:rPr>
+          <w:rStyle w:val="NormalTok"/>
+        </w:rPr>
+        <w:t xml:space="preserve"> </w:t>
+      </w:r>
+      <w:r>
+        <w:rPr>
+          <w:rStyle w:val="SpecialCharTok"/>
+        </w:rPr>
+        <w:t xml:space="preserve">-</w:t>
+      </w:r>
+      <w:r>
+        <w:rPr>
+          <w:rStyle w:val="NormalTok"/>
+        </w:rPr>
+        <w:t xml:space="preserve"> chol_mean) </w:t>
+      </w:r>
+      <w:r>
+        <w:rPr>
+          <w:rStyle w:val="SpecialCharTok"/>
+        </w:rPr>
+        <w:t xml:space="preserve">/</w:t>
+      </w:r>
+      <w:r>
+        <w:rPr>
+          <w:rStyle w:val="NormalTok"/>
+        </w:rPr>
+        <w:t xml:space="preserve"> chol_sd</w:t>
+      </w:r>
+      <w:r>
+        <w:br/>
+      </w:r>
+      <w:r>
+        <w:rPr>
+          <w:rStyle w:val="FunctionTok"/>
+        </w:rPr>
+        <w:t xml:space="preserve">c</w:t>
+      </w:r>
+      <w:r>
+        <w:rPr>
+          <w:rStyle w:val="NormalTok"/>
+        </w:rPr>
+        <w:t xml:space="preserve">(</w:t>
+      </w:r>
+      <w:r>
+        <w:rPr>
+          <w:rStyle w:val="AttributeTok"/>
+        </w:rPr>
+        <w:t xml:space="preserve">mean =</w:t>
+      </w:r>
+      <w:r>
+        <w:rPr>
+          <w:rStyle w:val="NormalTok"/>
+        </w:rPr>
+        <w:t xml:space="preserve"> chol_mean, </w:t>
+      </w:r>
+      <w:r>
+        <w:rPr>
+          <w:rStyle w:val="AttributeTok"/>
+        </w:rPr>
+        <w:t xml:space="preserve">sd =</w:t>
+      </w:r>
+      <w:r>
+        <w:rPr>
+          <w:rStyle w:val="NormalTok"/>
+        </w:rPr>
+        <w:t xml:space="preserve"> chol_sd, </w:t>
+      </w:r>
+      <w:r>
+        <w:rPr>
+          <w:rStyle w:val="AttributeTok"/>
+        </w:rPr>
+        <w:t xml:space="preserve">z_250 =</w:t>
+      </w:r>
+      <w:r>
+        <w:rPr>
+          <w:rStyle w:val="NormalTok"/>
+        </w:rPr>
+        <w:t xml:space="preserve"> chol_z)</w:t>
+      </w:r>
+      <w:r>
+        <w:br/>
+      </w:r>
+      <w:r>
+        <w:rPr>
+          <w:rStyle w:val="CommentTok"/>
+        </w:rPr>
+        <w:t xml:space="preserve">#&gt;       mean         sd      z_250 </w:t>
+      </w:r>
+      <w:r>
+        <w:br/>
+      </w:r>
+      <w:r>
+        <w:rPr>
+          <w:rStyle w:val="CommentTok"/>
+        </w:rPr>
+        <w:t xml:space="preserve">#&gt; 226.372374  43.420426   0.544159</w:t>
+      </w:r>
+    </w:p>
+    <w:p>
+      <w:pPr>
+        <w:numPr>
+          <w:ilvl w:val="0"/>
+          <w:numId w:val="1007"/>
+        </w:numPr>
+      </w:pPr>
+      <w:r>
+        <w:t xml:space="preserve">The sample mean is 226.4 mg/dL</w:t>
+      </w:r>
+      <w:r>
+        <w:t xml:space="preserve"> </w:t>
+      </w:r>
+      <w:r>
+        <w:t xml:space="preserve">and the sample standard deviation is 43.4 mg/dL.</w:t>
+      </w:r>
+    </w:p>
+    <w:p>
+      <w:pPr>
+        <w:numPr>
+          <w:ilvl w:val="0"/>
+          <w:numId w:val="1007"/>
+        </w:numPr>
+      </w:pPr>
+      <m:oMath>
+        <m:r>
+          <m:rPr>
+            <m:sty m:val="p"/>
+          </m:rPr>
+          <m:t>(</m:t>
+        </m:r>
+        <m:r>
+          <m:t>250</m:t>
+        </m:r>
+        <m:r>
+          <m:rPr>
+            <m:sty m:val="p"/>
+          </m:rPr>
+          <m:t>−</m:t>
+        </m:r>
+        <m:acc>
+          <m:accPr>
+            <m:chr m:val="‾"/>
+          </m:accPr>
+          <m:e>
+            <m:r>
+              <m:t>x</m:t>
+            </m:r>
+          </m:e>
+        </m:acc>
+        <m:r>
+          <m:rPr>
+            <m:sty m:val="p"/>
+          </m:rPr>
+          <m:t>)</m:t>
+        </m:r>
+        <m:r>
+          <m:rPr>
+            <m:sty m:val="p"/>
+          </m:rPr>
+          <m:t>/</m:t>
+        </m:r>
+        <m:r>
+          <m:t>s</m:t>
+        </m:r>
+      </m:oMath>
+      <w:r>
+        <w:t xml:space="preserve"> </w:t>
+      </w:r>
+      <w:r>
+        <w:t xml:space="preserve">is 0.54:</w:t>
+      </w:r>
+      <w:r>
+        <w:t xml:space="preserve"> </w:t>
+      </w:r>
+      <w:r>
+        <w:t xml:space="preserve">his cholesterol is 0.54 standard deviations</w:t>
+      </w:r>
+      <w:r>
+        <w:t xml:space="preserve"> </w:t>
+      </w:r>
+      <w:r>
+        <w:t xml:space="preserve">above the sample mean.</w:t>
+      </w:r>
+    </w:p>
+    <w:p>
+      <w:pPr>
+        <w:numPr>
+          <w:ilvl w:val="0"/>
+          <w:numId w:val="1007"/>
+        </w:numPr>
+      </w:pPr>
+      <w:r>
+        <w:t xml:space="preserve">The numerator is in mg/dL and the denominator is in mg/dL,</w:t>
+      </w:r>
+      <w:r>
+        <w:t xml:space="preserve"> </w:t>
+      </w:r>
+      <w:r>
+        <w:t xml:space="preserve">so the answer has no units.</w:t>
+      </w:r>
+    </w:p>
+    <w:bookmarkEnd w:id="106"/>
+    <w:bookmarkStart w:id="107" w:name="def-standardization"/>
+    <w:p>
+      <w:pPr>
+        <w:pStyle w:val="FirstParagraph"/>
+      </w:pPr>
+      <w:r>
         <w:rPr>
           <w:b/>
           <w:bCs/>
         </w:rPr>
-        <w:t xml:space="preserve">Examine relationships between variables</w:t>
+        <w:t xml:space="preserve">Definition 16 (Standardization)</w:t>
+      </w:r>
+      <w:r>
+        <w:t xml:space="preserve"> </w:t>
+      </w:r>
+      <w:r>
+        <w:t xml:space="preserve">Let</w:t>
+      </w:r>
+      <w:r>
+        <w:t xml:space="preserve"> </w:t>
+      </w:r>
+      <m:oMath>
+        <m:sSub>
+          <m:e>
+            <m:r>
+              <m:t>x</m:t>
+            </m:r>
+          </m:e>
+          <m:sub>
+            <m:r>
+              <m:t>1</m:t>
+            </m:r>
+          </m:sub>
+        </m:sSub>
+        <m:r>
+          <m:rPr>
+            <m:sty m:val="p"/>
+          </m:rPr>
+          <m:t>,</m:t>
+        </m:r>
+        <m:r>
+          <m:rPr>
+            <m:sty m:val="p"/>
+          </m:rPr>
+          <m:t>…</m:t>
+        </m:r>
+        <m:r>
+          <m:rPr>
+            <m:sty m:val="p"/>
+          </m:rPr>
+          <m:t>,</m:t>
+        </m:r>
+        <m:sSub>
+          <m:e>
+            <m:r>
+              <m:t>x</m:t>
+            </m:r>
+          </m:e>
+          <m:sub>
+            <m:r>
+              <m:t>n</m:t>
+            </m:r>
+          </m:sub>
+        </m:sSub>
+      </m:oMath>
+      <w:r>
+        <w:t xml:space="preserve"> </w:t>
+      </w:r>
+      <w:r>
+        <w:t xml:space="preserve">be</w:t>
+      </w:r>
+      <w:r>
+        <w:t xml:space="preserve"> </w:t>
+      </w:r>
+      <m:oMath>
+        <m:r>
+          <m:t>n</m:t>
+        </m:r>
+        <m:r>
+          <m:rPr>
+            <m:sty m:val="p"/>
+          </m:rPr>
+          <m:t>≥</m:t>
+        </m:r>
+        <m:r>
+          <m:t>2</m:t>
+        </m:r>
+      </m:oMath>
+      <w:r>
+        <w:t xml:space="preserve"> </w:t>
+      </w:r>
+      <w:r>
+        <w:t xml:space="preserve">observations of a variable</w:t>
+      </w:r>
+      <w:r>
+        <w:t xml:space="preserve"> </w:t>
+      </w:r>
+      <w:r>
+        <w:t xml:space="preserve">with</w:t>
+      </w:r>
+      <w:r>
+        <w:t xml:space="preserve"> </w:t>
+      </w:r>
+      <w:hyperlink w:anchor="def-sample-mean">
+        <w:r>
+          <w:rPr>
+            <w:rStyle w:val="Hyperlink"/>
+          </w:rPr>
+          <w:t xml:space="preserve">sample mean</w:t>
+        </w:r>
+      </w:hyperlink>
+      <w:r>
+        <w:t xml:space="preserve"> </w:t>
+      </w:r>
+      <m:oMath>
+        <m:acc>
+          <m:accPr>
+            <m:chr m:val="‾"/>
+          </m:accPr>
+          <m:e>
+            <m:r>
+              <m:t>x</m:t>
+            </m:r>
+          </m:e>
+        </m:acc>
+      </m:oMath>
+      <w:r>
+        <w:t xml:space="preserve"> </w:t>
+      </w:r>
+      <w:r>
+        <w:t xml:space="preserve">and</w:t>
+      </w:r>
+      <w:r>
+        <w:t xml:space="preserve"> </w:t>
+      </w:r>
+      <w:hyperlink w:anchor="def-sample-sd">
+        <w:r>
+          <w:rPr>
+            <w:rStyle w:val="Hyperlink"/>
+          </w:rPr>
+          <w:t xml:space="preserve">sample standard deviation</w:t>
+        </w:r>
+      </w:hyperlink>
+      <w:r>
+        <w:t xml:space="preserve"> </w:t>
+      </w:r>
+      <m:oMath>
+        <m:r>
+          <m:t>s</m:t>
+        </m:r>
+        <m:r>
+          <m:rPr>
+            <m:sty m:val="p"/>
+          </m:rPr>
+          <m:t>&gt;</m:t>
+        </m:r>
+        <m:r>
+          <m:t>0</m:t>
+        </m:r>
+      </m:oMath>
+      <w:r>
+        <w:t xml:space="preserve">.</w:t>
+      </w:r>
+      <w:r>
+        <w:t xml:space="preserve"> </w:t>
+      </w:r>
+      <w:r>
+        <w:t xml:space="preserve">The</w:t>
+      </w:r>
+      <w:r>
+        <w:t xml:space="preserve"> </w:t>
+      </w:r>
+      <w:r>
+        <w:rPr>
+          <w:b/>
+          <w:bCs/>
+        </w:rPr>
+        <w:t xml:space="preserve">standardized value</w:t>
+      </w:r>
+      <w:r>
+        <w:t xml:space="preserve"> </w:t>
+      </w:r>
+      <w:r>
+        <w:t xml:space="preserve">of</w:t>
+      </w:r>
+      <w:r>
+        <w:t xml:space="preserve"> </w:t>
+      </w:r>
+      <m:oMath>
+        <m:sSub>
+          <m:e>
+            <m:r>
+              <m:t>x</m:t>
+            </m:r>
+          </m:e>
+          <m:sub>
+            <m:r>
+              <m:t>i</m:t>
+            </m:r>
+          </m:sub>
+        </m:sSub>
+      </m:oMath>
+      <w:r>
+        <w:t xml:space="preserve"> </w:t>
+      </w:r>
+      <w:r>
+        <w:t xml:space="preserve">is</w:t>
+      </w:r>
+    </w:p>
+    <w:p>
+      <w:pPr>
+        <w:pStyle w:val="BodyText"/>
+      </w:pPr>
+      <m:oMathPara>
+        <m:oMathParaPr>
+          <m:jc m:val="center"/>
+        </m:oMathParaPr>
+        <m:oMath>
+          <m:sSub>
+            <m:e>
+              <m:r>
+                <m:t>z</m:t>
+              </m:r>
+            </m:e>
+            <m:sub>
+              <m:r>
+                <m:t>i</m:t>
+              </m:r>
+            </m:sub>
+          </m:sSub>
+          <m:limUpp>
+            <m:e>
+              <m:r>
+                <m:rPr>
+                  <m:sty m:val="p"/>
+                </m:rPr>
+                <m:t>=</m:t>
+              </m:r>
+            </m:e>
+            <m:lim>
+              <m:r>
+                <m:rPr>
+                  <m:nor/>
+                  <m:sty m:val="p"/>
+                </m:rPr>
+                <m:t>def</m:t>
+              </m:r>
+            </m:lim>
+          </m:limUpp>
+          <m:f>
+            <m:fPr>
+              <m:type m:val="bar"/>
+            </m:fPr>
+            <m:num>
+              <m:sSub>
+                <m:e>
+                  <m:r>
+                    <m:t>x</m:t>
+                  </m:r>
+                </m:e>
+                <m:sub>
+                  <m:r>
+                    <m:t>i</m:t>
+                  </m:r>
+                </m:sub>
+              </m:sSub>
+              <m:r>
+                <m:rPr>
+                  <m:sty m:val="p"/>
+                </m:rPr>
+                <m:t>−</m:t>
+              </m:r>
+              <m:acc>
+                <m:accPr>
+                  <m:chr m:val="‾"/>
+                </m:accPr>
+                <m:e>
+                  <m:r>
+                    <m:t>x</m:t>
+                  </m:r>
+                </m:e>
+              </m:acc>
+            </m:num>
+            <m:den>
+              <m:r>
+                <m:t>s</m:t>
+              </m:r>
+            </m:den>
+          </m:f>
+        </m:oMath>
+      </m:oMathPara>
+    </w:p>
+    <w:bookmarkEnd w:id="107"/>
+    <w:bookmarkStart w:id="108" w:name="rem-standardization-units"/>
+    <w:p>
+      <w:pPr>
+        <w:pStyle w:val="FirstParagraph"/>
+      </w:pPr>
+      <w:r>
+        <w:rPr>
+          <w:i/>
+          <w:iCs/>
+        </w:rPr>
+        <w:t xml:space="preserve">Remark 1</w:t>
+      </w:r>
+      <w:r>
+        <w:t xml:space="preserve"> (Standardized values have no units). </w:t>
+      </w:r>
+      <w:r>
+        <w:t xml:space="preserve">In</w:t>
+      </w:r>
+      <w:r>
+        <w:t xml:space="preserve"> </w:t>
+      </w:r>
+      <w:hyperlink w:anchor="exr-standardize">
+        <w:r>
+          <w:rPr>
+            <w:rStyle w:val="Hyperlink"/>
+          </w:rPr>
+          <w:t xml:space="preserve">Exercise 2</w:t>
+        </w:r>
+      </w:hyperlink>
+      <w:r>
+        <w:t xml:space="preserve">,</w:t>
+      </w:r>
+      <w:r>
+        <w:t xml:space="preserve"> </w:t>
+      </w:r>
+      <w:r>
+        <w:t xml:space="preserve">the standardized value of a cholesterol of 250 mg/dL</w:t>
+      </w:r>
+      <w:r>
+        <w:t xml:space="preserve"> </w:t>
+      </w:r>
+      <w:r>
+        <w:t xml:space="preserve">is the number of sample standard deviations</w:t>
+      </w:r>
+      <w:r>
+        <w:t xml:space="preserve"> </w:t>
+      </w:r>
+      <w:r>
+        <w:t xml:space="preserve">between 250 and the sample mean.</w:t>
+      </w:r>
+      <w:r>
+        <w:t xml:space="preserve"> </w:t>
+      </w:r>
+      <w:r>
+        <w:t xml:space="preserve">Standardizing puts variables measured in different units</w:t>
+      </w:r>
+      <w:r>
+        <w:t xml:space="preserve"> </w:t>
+      </w:r>
+      <w:r>
+        <w:t xml:space="preserve">on a comparable scale.</w:t>
+      </w:r>
+      <w:r>
+        <w:t xml:space="preserve"> </w:t>
+      </w:r>
+      <w:r>
+        <w:t xml:space="preserve">For example, a salary in dollars and an age in years</w:t>
+      </w:r>
+      <w:r>
+        <w:t xml:space="preserve"> </w:t>
+      </w:r>
+      <w:r>
+        <w:t xml:space="preserve">both become unitless numbers of standard deviations.</w:t>
+      </w:r>
+    </w:p>
+    <w:bookmarkEnd w:id="108"/>
+    <w:bookmarkStart w:id="109" w:name="thm-standardized-mean-sd"/>
+    <w:p>
+      <w:pPr>
+        <w:pStyle w:val="BodyText"/>
+      </w:pPr>
+      <w:r>
+        <w:rPr>
+          <w:b/>
+          <w:bCs/>
+        </w:rPr>
+        <w:t xml:space="preserve">Theorem 2 (Standardized values have mean 0 and standard deviation 1)</w:t>
+      </w:r>
+      <w:r>
+        <w:t xml:space="preserve"> </w:t>
+      </w:r>
+      <w:r>
+        <w:t xml:space="preserve">For</w:t>
+      </w:r>
+      <w:r>
+        <w:t xml:space="preserve"> </w:t>
+      </w:r>
+      <m:oMath>
+        <m:r>
+          <m:t>n</m:t>
+        </m:r>
+        <m:r>
+          <m:rPr>
+            <m:sty m:val="p"/>
+          </m:rPr>
+          <m:t>≥</m:t>
+        </m:r>
+        <m:r>
+          <m:t>2</m:t>
+        </m:r>
+      </m:oMath>
+      <w:r>
+        <w:t xml:space="preserve"> </w:t>
+      </w:r>
+      <w:r>
+        <w:t xml:space="preserve">observations with</w:t>
+      </w:r>
+      <w:r>
+        <w:t xml:space="preserve"> </w:t>
+      </w:r>
+      <m:oMath>
+        <m:r>
+          <m:t>s</m:t>
+        </m:r>
+        <m:r>
+          <m:rPr>
+            <m:sty m:val="p"/>
+          </m:rPr>
+          <m:t>&gt;</m:t>
+        </m:r>
+        <m:r>
+          <m:t>0</m:t>
+        </m:r>
+      </m:oMath>
+      <w:r>
+        <w:t xml:space="preserve">,</w:t>
+      </w:r>
+      <w:r>
+        <w:t xml:space="preserve"> </w:t>
+      </w:r>
+      <w:r>
+        <w:t xml:space="preserve">the</w:t>
+      </w:r>
+      <w:r>
+        <w:t xml:space="preserve"> </w:t>
+      </w:r>
+      <w:hyperlink w:anchor="def-standardization">
+        <w:r>
+          <w:rPr>
+            <w:rStyle w:val="Hyperlink"/>
+          </w:rPr>
+          <w:t xml:space="preserve">standardized values</w:t>
+        </w:r>
+      </w:hyperlink>
+      <w:r>
+        <w:t xml:space="preserve"> </w:t>
+      </w:r>
+      <m:oMath>
+        <m:sSub>
+          <m:e>
+            <m:r>
+              <m:t>z</m:t>
+            </m:r>
+          </m:e>
+          <m:sub>
+            <m:r>
+              <m:t>1</m:t>
+            </m:r>
+          </m:sub>
+        </m:sSub>
+        <m:r>
+          <m:rPr>
+            <m:sty m:val="p"/>
+          </m:rPr>
+          <m:t>,</m:t>
+        </m:r>
+        <m:r>
+          <m:rPr>
+            <m:sty m:val="p"/>
+          </m:rPr>
+          <m:t>…</m:t>
+        </m:r>
+        <m:r>
+          <m:rPr>
+            <m:sty m:val="p"/>
+          </m:rPr>
+          <m:t>,</m:t>
+        </m:r>
+        <m:sSub>
+          <m:e>
+            <m:r>
+              <m:t>z</m:t>
+            </m:r>
+          </m:e>
+          <m:sub>
+            <m:r>
+              <m:t>n</m:t>
+            </m:r>
+          </m:sub>
+        </m:sSub>
+      </m:oMath>
+      <w:r>
+        <w:t xml:space="preserve"> </w:t>
+      </w:r>
+      <w:r>
+        <w:t xml:space="preserve">have sample mean</w:t>
+      </w:r>
+      <w:r>
+        <w:t xml:space="preserve"> </w:t>
+      </w:r>
+      <m:oMath>
+        <m:r>
+          <m:t>0</m:t>
+        </m:r>
+      </m:oMath>
+      <w:r>
+        <w:t xml:space="preserve"> </w:t>
+      </w:r>
+      <w:r>
+        <w:t xml:space="preserve">and sample standard deviation</w:t>
+      </w:r>
+      <w:r>
+        <w:t xml:space="preserve"> </w:t>
+      </w:r>
+      <m:oMath>
+        <m:r>
+          <m:t>1</m:t>
+        </m:r>
+      </m:oMath>
+      <w:r>
+        <w:t xml:space="preserve">.</w:t>
+      </w:r>
+    </w:p>
+    <w:bookmarkEnd w:id="109"/>
+    <w:p>
+      <w:pPr>
+        <w:pStyle w:val="BodyText"/>
+      </w:pPr>
+      <w:r>
+        <w:rPr>
+          <w:i/>
+          <w:iCs/>
+        </w:rPr>
+        <w:t xml:space="preserve">Proof</w:t>
+      </w:r>
+      <w:r>
+        <w:t xml:space="preserve">. </w:t>
+      </w:r>
+      <w:r>
+        <w:t xml:space="preserve">The sample mean of the</w:t>
+      </w:r>
+      <w:r>
+        <w:t xml:space="preserve"> </w:t>
+      </w:r>
+      <m:oMath>
+        <m:sSub>
+          <m:e>
+            <m:r>
+              <m:t>z</m:t>
+            </m:r>
+          </m:e>
+          <m:sub>
+            <m:r>
+              <m:t>i</m:t>
+            </m:r>
+          </m:sub>
+        </m:sSub>
+      </m:oMath>
+      <w:r>
+        <w:t xml:space="preserve"> </w:t>
+      </w:r>
+      <w:r>
+        <w:t xml:space="preserve">is</w:t>
+      </w:r>
+    </w:p>
+    <w:p>
+      <w:pPr>
+        <w:pStyle w:val="BodyText"/>
+      </w:pPr>
+      <m:oMathPara>
+        <m:oMathParaPr>
+          <m:jc m:val="center"/>
+        </m:oMathParaPr>
+        <m:oMath>
+          <m:f>
+            <m:fPr>
+              <m:type m:val="bar"/>
+            </m:fPr>
+            <m:num>
+              <m:r>
+                <m:t>1</m:t>
+              </m:r>
+            </m:num>
+            <m:den>
+              <m:r>
+                <m:t>n</m:t>
+              </m:r>
+            </m:den>
+          </m:f>
+          <m:nary>
+            <m:naryPr>
+              <m:chr m:val="∑"/>
+              <m:limLoc m:val="undOvr"/>
+              <m:subHide m:val="off"/>
+              <m:supHide m:val="off"/>
+            </m:naryPr>
+            <m:sub>
+              <m:r>
+                <m:t>i</m:t>
+              </m:r>
+              <m:r>
+                <m:rPr>
+                  <m:sty m:val="p"/>
+                </m:rPr>
+                <m:t>=</m:t>
+              </m:r>
+              <m:r>
+                <m:t>1</m:t>
+              </m:r>
+            </m:sub>
+            <m:sup>
+              <m:r>
+                <m:t>n</m:t>
+              </m:r>
+            </m:sup>
+            <m:e>
+              <m:f>
+                <m:fPr>
+                  <m:type m:val="bar"/>
+                </m:fPr>
+                <m:num>
+                  <m:sSub>
+                    <m:e>
+                      <m:r>
+                        <m:t>x</m:t>
+                      </m:r>
+                    </m:e>
+                    <m:sub>
+                      <m:r>
+                        <m:t>i</m:t>
+                      </m:r>
+                    </m:sub>
+                  </m:sSub>
+                  <m:r>
+                    <m:rPr>
+                      <m:sty m:val="p"/>
+                    </m:rPr>
+                    <m:t>−</m:t>
+                  </m:r>
+                  <m:acc>
+                    <m:accPr>
+                      <m:chr m:val="‾"/>
+                    </m:accPr>
+                    <m:e>
+                      <m:r>
+                        <m:t>x</m:t>
+                      </m:r>
+                    </m:e>
+                  </m:acc>
+                </m:num>
+                <m:den>
+                  <m:r>
+                    <m:t>s</m:t>
+                  </m:r>
+                </m:den>
+              </m:f>
+            </m:e>
+          </m:nary>
+          <m:r>
+            <m:rPr>
+              <m:sty m:val="p"/>
+            </m:rPr>
+            <m:t>=</m:t>
+          </m:r>
+          <m:f>
+            <m:fPr>
+              <m:type m:val="bar"/>
+            </m:fPr>
+            <m:num>
+              <m:r>
+                <m:t>1</m:t>
+              </m:r>
+            </m:num>
+            <m:den>
+              <m:r>
+                <m:t>s</m:t>
+              </m:r>
+            </m:den>
+          </m:f>
+          <m:r>
+            <m:t>​</m:t>
+          </m:r>
+          <m:d>
+            <m:dPr>
+              <m:begChr m:val="("/>
+              <m:sepChr m:val=""/>
+              <m:endChr m:val=")"/>
+              <m:grow/>
+            </m:dPr>
+            <m:e>
+              <m:f>
+                <m:fPr>
+                  <m:type m:val="bar"/>
+                </m:fPr>
+                <m:num>
+                  <m:r>
+                    <m:t>1</m:t>
+                  </m:r>
+                </m:num>
+                <m:den>
+                  <m:r>
+                    <m:t>n</m:t>
+                  </m:r>
+                </m:den>
+              </m:f>
+              <m:nary>
+                <m:naryPr>
+                  <m:chr m:val="∑"/>
+                  <m:limLoc m:val="undOvr"/>
+                  <m:subHide m:val="off"/>
+                  <m:supHide m:val="off"/>
+                </m:naryPr>
+                <m:sub>
+                  <m:r>
+                    <m:t>i</m:t>
+                  </m:r>
+                  <m:r>
+                    <m:rPr>
+                      <m:sty m:val="p"/>
+                    </m:rPr>
+                    <m:t>=</m:t>
+                  </m:r>
+                  <m:r>
+                    <m:t>1</m:t>
+                  </m:r>
+                </m:sub>
+                <m:sup>
+                  <m:r>
+                    <m:t>n</m:t>
+                  </m:r>
+                </m:sup>
+                <m:e>
+                  <m:sSub>
+                    <m:e>
+                      <m:r>
+                        <m:t>x</m:t>
+                      </m:r>
+                    </m:e>
+                    <m:sub>
+                      <m:r>
+                        <m:t>i</m:t>
+                      </m:r>
+                    </m:sub>
+                  </m:sSub>
+                </m:e>
+              </m:nary>
+              <m:r>
+                <m:rPr>
+                  <m:sty m:val="p"/>
+                </m:rPr>
+                <m:t>−</m:t>
+              </m:r>
+              <m:acc>
+                <m:accPr>
+                  <m:chr m:val="‾"/>
+                </m:accPr>
+                <m:e>
+                  <m:r>
+                    <m:t>x</m:t>
+                  </m:r>
+                </m:e>
+              </m:acc>
+            </m:e>
+          </m:d>
+          <m:r>
+            <m:t>​</m:t>
+          </m:r>
+          <m:r>
+            <m:rPr>
+              <m:sty m:val="p"/>
+            </m:rPr>
+            <m:t>=</m:t>
+          </m:r>
+          <m:f>
+            <m:fPr>
+              <m:type m:val="bar"/>
+            </m:fPr>
+            <m:num>
+              <m:r>
+                <m:t>1</m:t>
+              </m:r>
+            </m:num>
+            <m:den>
+              <m:r>
+                <m:t>s</m:t>
+              </m:r>
+            </m:den>
+          </m:f>
+          <m:r>
+            <m:rPr>
+              <m:sty m:val="p"/>
+            </m:rPr>
+            <m:t>(</m:t>
+          </m:r>
+          <m:acc>
+            <m:accPr>
+              <m:chr m:val="‾"/>
+            </m:accPr>
+            <m:e>
+              <m:r>
+                <m:t>x</m:t>
+              </m:r>
+            </m:e>
+          </m:acc>
+          <m:r>
+            <m:rPr>
+              <m:sty m:val="p"/>
+            </m:rPr>
+            <m:t>−</m:t>
+          </m:r>
+          <m:acc>
+            <m:accPr>
+              <m:chr m:val="‾"/>
+            </m:accPr>
+            <m:e>
+              <m:r>
+                <m:t>x</m:t>
+              </m:r>
+            </m:e>
+          </m:acc>
+          <m:r>
+            <m:rPr>
+              <m:sty m:val="p"/>
+            </m:rPr>
+            <m:t>)</m:t>
+          </m:r>
+          <m:r>
+            <m:rPr>
+              <m:sty m:val="p"/>
+            </m:rPr>
+            <m:t>=</m:t>
+          </m:r>
+          <m:r>
+            <m:t>0</m:t>
+          </m:r>
+          <m:r>
+            <m:rPr>
+              <m:sty m:val="p"/>
+            </m:rPr>
+            <m:t>.</m:t>
+          </m:r>
+        </m:oMath>
+      </m:oMathPara>
+    </w:p>
+    <w:p>
+      <w:pPr>
+        <w:pStyle w:val="FirstParagraph"/>
+      </w:pPr>
+      <w:r>
+        <w:t xml:space="preserve">Since the mean of the</w:t>
+      </w:r>
+      <w:r>
+        <w:t xml:space="preserve"> </w:t>
+      </w:r>
+      <m:oMath>
+        <m:sSub>
+          <m:e>
+            <m:r>
+              <m:t>z</m:t>
+            </m:r>
+          </m:e>
+          <m:sub>
+            <m:r>
+              <m:t>i</m:t>
+            </m:r>
+          </m:sub>
+        </m:sSub>
+      </m:oMath>
+      <w:r>
+        <w:t xml:space="preserve"> </w:t>
+      </w:r>
+      <w:r>
+        <w:t xml:space="preserve">is</w:t>
+      </w:r>
+      <w:r>
+        <w:t xml:space="preserve"> </w:t>
+      </w:r>
+      <m:oMath>
+        <m:r>
+          <m:t>0</m:t>
+        </m:r>
+      </m:oMath>
+      <w:r>
+        <w:t xml:space="preserve">,</w:t>
+      </w:r>
+      <w:r>
+        <w:t xml:space="preserve"> </w:t>
+      </w:r>
+      <w:r>
+        <w:t xml:space="preserve">their sample variance is</w:t>
+      </w:r>
+    </w:p>
+    <w:p>
+      <w:pPr>
+        <w:pStyle w:val="BodyText"/>
+      </w:pPr>
+      <m:oMathPara>
+        <m:oMathParaPr>
+          <m:jc m:val="center"/>
+        </m:oMathParaPr>
+        <m:oMath>
+          <m:f>
+            <m:fPr>
+              <m:type m:val="bar"/>
+            </m:fPr>
+            <m:num>
+              <m:r>
+                <m:t>1</m:t>
+              </m:r>
+            </m:num>
+            <m:den>
+              <m:r>
+                <m:t>n</m:t>
+              </m:r>
+              <m:r>
+                <m:rPr>
+                  <m:sty m:val="p"/>
+                </m:rPr>
+                <m:t>−</m:t>
+              </m:r>
+              <m:r>
+                <m:t>1</m:t>
+              </m:r>
+            </m:den>
+          </m:f>
+          <m:nary>
+            <m:naryPr>
+              <m:chr m:val="∑"/>
+              <m:limLoc m:val="undOvr"/>
+              <m:subHide m:val="off"/>
+              <m:supHide m:val="off"/>
+            </m:naryPr>
+            <m:sub>
+              <m:r>
+                <m:t>i</m:t>
+              </m:r>
+              <m:r>
+                <m:rPr>
+                  <m:sty m:val="p"/>
+                </m:rPr>
+                <m:t>=</m:t>
+              </m:r>
+              <m:r>
+                <m:t>1</m:t>
+              </m:r>
+            </m:sub>
+            <m:sup>
+              <m:r>
+                <m:t>n</m:t>
+              </m:r>
+            </m:sup>
+            <m:e>
+              <m:sSubSup>
+                <m:e>
+                  <m:r>
+                    <m:t>z</m:t>
+                  </m:r>
+                </m:e>
+                <m:sub>
+                  <m:r>
+                    <m:t>i</m:t>
+                  </m:r>
+                </m:sub>
+                <m:sup>
+                  <m:r>
+                    <m:t>2</m:t>
+                  </m:r>
+                </m:sup>
+              </m:sSubSup>
+            </m:e>
+          </m:nary>
+          <m:r>
+            <m:rPr>
+              <m:sty m:val="p"/>
+            </m:rPr>
+            <m:t>=</m:t>
+          </m:r>
+          <m:f>
+            <m:fPr>
+              <m:type m:val="bar"/>
+            </m:fPr>
+            <m:num>
+              <m:r>
+                <m:t>1</m:t>
+              </m:r>
+            </m:num>
+            <m:den>
+              <m:sSup>
+                <m:e>
+                  <m:r>
+                    <m:t>s</m:t>
+                  </m:r>
+                </m:e>
+                <m:sup>
+                  <m:r>
+                    <m:t>2</m:t>
+                  </m:r>
+                </m:sup>
+              </m:sSup>
+            </m:den>
+          </m:f>
+          <m:r>
+            <m:rPr>
+              <m:sty m:val="p"/>
+            </m:rPr>
+            <m:t>⋅</m:t>
+          </m:r>
+          <m:f>
+            <m:fPr>
+              <m:type m:val="bar"/>
+            </m:fPr>
+            <m:num>
+              <m:r>
+                <m:t>1</m:t>
+              </m:r>
+            </m:num>
+            <m:den>
+              <m:r>
+                <m:t>n</m:t>
+              </m:r>
+              <m:r>
+                <m:rPr>
+                  <m:sty m:val="p"/>
+                </m:rPr>
+                <m:t>−</m:t>
+              </m:r>
+              <m:r>
+                <m:t>1</m:t>
+              </m:r>
+            </m:den>
+          </m:f>
+          <m:nary>
+            <m:naryPr>
+              <m:chr m:val="∑"/>
+              <m:limLoc m:val="undOvr"/>
+              <m:subHide m:val="off"/>
+              <m:supHide m:val="off"/>
+            </m:naryPr>
+            <m:sub>
+              <m:r>
+                <m:t>i</m:t>
+              </m:r>
+              <m:r>
+                <m:rPr>
+                  <m:sty m:val="p"/>
+                </m:rPr>
+                <m:t>=</m:t>
+              </m:r>
+              <m:r>
+                <m:t>1</m:t>
+              </m:r>
+            </m:sub>
+            <m:sup>
+              <m:r>
+                <m:t>n</m:t>
+              </m:r>
+            </m:sup>
+            <m:e>
+              <m:r>
+                <m:rPr>
+                  <m:sty m:val="p"/>
+                </m:rPr>
+                <m:t>(</m:t>
+              </m:r>
+            </m:e>
+          </m:nary>
+          <m:sSub>
+            <m:e>
+              <m:r>
+                <m:t>x</m:t>
+              </m:r>
+            </m:e>
+            <m:sub>
+              <m:r>
+                <m:t>i</m:t>
+              </m:r>
+            </m:sub>
+          </m:sSub>
+          <m:r>
+            <m:rPr>
+              <m:sty m:val="p"/>
+            </m:rPr>
+            <m:t>−</m:t>
+          </m:r>
+          <m:acc>
+            <m:accPr>
+              <m:chr m:val="‾"/>
+            </m:accPr>
+            <m:e>
+              <m:r>
+                <m:t>x</m:t>
+              </m:r>
+            </m:e>
+          </m:acc>
+          <m:sSup>
+            <m:e>
+              <m:r>
+                <m:rPr>
+                  <m:sty m:val="p"/>
+                </m:rPr>
+                <m:t>)</m:t>
+              </m:r>
+            </m:e>
+            <m:sup>
+              <m:r>
+                <m:t>2</m:t>
+              </m:r>
+            </m:sup>
+          </m:sSup>
+          <m:r>
+            <m:rPr>
+              <m:sty m:val="p"/>
+            </m:rPr>
+            <m:t>=</m:t>
+          </m:r>
+          <m:f>
+            <m:fPr>
+              <m:type m:val="bar"/>
+            </m:fPr>
+            <m:num>
+              <m:sSup>
+                <m:e>
+                  <m:r>
+                    <m:t>s</m:t>
+                  </m:r>
+                </m:e>
+                <m:sup>
+                  <m:r>
+                    <m:t>2</m:t>
+                  </m:r>
+                </m:sup>
+              </m:sSup>
+            </m:num>
+            <m:den>
+              <m:sSup>
+                <m:e>
+                  <m:r>
+                    <m:t>s</m:t>
+                  </m:r>
+                </m:e>
+                <m:sup>
+                  <m:r>
+                    <m:t>2</m:t>
+                  </m:r>
+                </m:sup>
+              </m:sSup>
+            </m:den>
+          </m:f>
+          <m:r>
+            <m:rPr>
+              <m:sty m:val="p"/>
+            </m:rPr>
+            <m:t>=</m:t>
+          </m:r>
+          <m:r>
+            <m:t>1</m:t>
+          </m:r>
+          <m:r>
+            <m:rPr>
+              <m:sty m:val="p"/>
+            </m:rPr>
+            <m:t>,</m:t>
+          </m:r>
+        </m:oMath>
+      </m:oMathPara>
+    </w:p>
+    <w:p>
+      <w:pPr>
+        <w:pStyle w:val="FirstParagraph"/>
+      </w:pPr>
+      <w:r>
+        <w:t xml:space="preserve">so their sample standard deviation is</w:t>
+      </w:r>
+      <w:r>
+        <w:t xml:space="preserve"> </w:t>
+      </w:r>
+      <m:oMath>
+        <m:rad>
+          <m:radPr>
+            <m:degHide m:val="on"/>
+          </m:radPr>
+          <m:deg/>
+          <m:e>
+            <m:r>
+              <m:t>1</m:t>
+            </m:r>
+          </m:e>
+        </m:rad>
+        <m:r>
+          <m:rPr>
+            <m:sty m:val="p"/>
+          </m:rPr>
+          <m:t>=</m:t>
+        </m:r>
+        <m:r>
+          <m:t>1</m:t>
+        </m:r>
+      </m:oMath>
+      <w:r>
+        <w:t xml:space="preserve">.</w:t>
+      </w:r>
+    </w:p>
+    <w:bookmarkStart w:id="110" w:name="exm-scale-wcgs"/>
+    <w:p>
+      <w:pPr>
+        <w:pStyle w:val="BodyText"/>
+      </w:pPr>
+      <w:r>
+        <w:rPr>
+          <w:b/>
+          <w:bCs/>
+        </w:rPr>
+        <w:t xml:space="preserve">Example 8 (Standardizing cholesterol in R)</w:t>
+      </w:r>
+      <w:r>
+        <w:t xml:space="preserve"> </w:t>
+      </w:r>
+      <w:r>
+        <w:t xml:space="preserve">In R,</w:t>
+      </w:r>
+      <w:r>
+        <w:t xml:space="preserve"> </w:t>
+      </w:r>
+      <w:r>
+        <w:rPr>
+          <w:rStyle w:val="VerbatimChar"/>
+        </w:rPr>
+        <w:t xml:space="preserve">scale()</w:t>
+      </w:r>
+      <w:r>
+        <w:t xml:space="preserve"> </w:t>
+      </w:r>
+      <w:r>
+        <w:t xml:space="preserve">returns the standardized values of a column,</w:t>
+      </w:r>
+      <w:r>
+        <w:t xml:space="preserve"> </w:t>
+      </w:r>
+      <w:r>
+        <w:t xml:space="preserve">as a one-column matrix.</w:t>
+      </w:r>
+      <w:r>
+        <w:t xml:space="preserve"> </w:t>
+      </w:r>
+      <w:r>
+        <w:t xml:space="preserve">For the WCGS cholesterol values:</w:t>
+      </w:r>
+    </w:p>
+    <w:p>
+      <w:pPr>
+        <w:pStyle w:val="SourceCode"/>
+      </w:pPr>
+      <w:r>
+        <w:rPr>
+          <w:rStyle w:val="NormalTok"/>
+        </w:rPr>
+        <w:t xml:space="preserve">z </w:t>
+      </w:r>
+      <w:r>
+        <w:rPr>
+          <w:rStyle w:val="OtherTok"/>
+        </w:rPr>
+        <w:t xml:space="preserve">&lt;-</w:t>
+      </w:r>
+      <w:r>
+        <w:rPr>
+          <w:rStyle w:val="NormalTok"/>
+        </w:rPr>
+        <w:t xml:space="preserve"> </w:t>
+      </w:r>
+      <w:r>
+        <w:rPr>
+          <w:rStyle w:val="FunctionTok"/>
+        </w:rPr>
+        <w:t xml:space="preserve">scale</w:t>
+      </w:r>
+      <w:r>
+        <w:rPr>
+          <w:rStyle w:val="NormalTok"/>
+        </w:rPr>
+        <w:t xml:space="preserve">(wcgs</w:t>
+      </w:r>
+      <w:r>
+        <w:rPr>
+          <w:rStyle w:val="SpecialCharTok"/>
+        </w:rPr>
+        <w:t xml:space="preserve">$</w:t>
+      </w:r>
+      <w:r>
+        <w:rPr>
+          <w:rStyle w:val="NormalTok"/>
+        </w:rPr>
+        <w:t xml:space="preserve">chol)[, </w:t>
+      </w:r>
+      <w:r>
+        <w:rPr>
+          <w:rStyle w:val="DecValTok"/>
+        </w:rPr>
+        <w:t xml:space="preserve">1</w:t>
+      </w:r>
+      <w:r>
+        <w:rPr>
+          <w:rStyle w:val="NormalTok"/>
+        </w:rPr>
+        <w:t xml:space="preserve">]</w:t>
+      </w:r>
+      <w:r>
+        <w:br/>
+      </w:r>
+      <w:r>
+        <w:rPr>
+          <w:rStyle w:val="FunctionTok"/>
+        </w:rPr>
+        <w:t xml:space="preserve">mean</w:t>
+      </w:r>
+      <w:r>
+        <w:rPr>
+          <w:rStyle w:val="NormalTok"/>
+        </w:rPr>
+        <w:t xml:space="preserve">(z, </w:t>
+      </w:r>
+      <w:r>
+        <w:rPr>
+          <w:rStyle w:val="AttributeTok"/>
+        </w:rPr>
+        <w:t xml:space="preserve">na.rm =</w:t>
+      </w:r>
+      <w:r>
+        <w:rPr>
+          <w:rStyle w:val="NormalTok"/>
+        </w:rPr>
+        <w:t xml:space="preserve"> </w:t>
+      </w:r>
+      <w:r>
+        <w:rPr>
+          <w:rStyle w:val="ConstantTok"/>
+        </w:rPr>
+        <w:t xml:space="preserve">TRUE</w:t>
+      </w:r>
+      <w:r>
+        <w:rPr>
+          <w:rStyle w:val="NormalTok"/>
+        </w:rPr>
+        <w:t xml:space="preserve">)</w:t>
+      </w:r>
+      <w:r>
+        <w:br/>
+      </w:r>
+      <w:r>
+        <w:rPr>
+          <w:rStyle w:val="CommentTok"/>
+        </w:rPr>
+        <w:t xml:space="preserve">#&gt; [1] 2.79926e-16</w:t>
+      </w:r>
+      <w:r>
+        <w:br/>
+      </w:r>
+      <w:r>
+        <w:rPr>
+          <w:rStyle w:val="FunctionTok"/>
+        </w:rPr>
+        <w:t xml:space="preserve">sd</w:t>
+      </w:r>
+      <w:r>
+        <w:rPr>
+          <w:rStyle w:val="NormalTok"/>
+        </w:rPr>
+        <w:t xml:space="preserve">(z, </w:t>
+      </w:r>
+      <w:r>
+        <w:rPr>
+          <w:rStyle w:val="AttributeTok"/>
+        </w:rPr>
+        <w:t xml:space="preserve">na.rm =</w:t>
+      </w:r>
+      <w:r>
+        <w:rPr>
+          <w:rStyle w:val="NormalTok"/>
+        </w:rPr>
+        <w:t xml:space="preserve"> </w:t>
+      </w:r>
+      <w:r>
+        <w:rPr>
+          <w:rStyle w:val="ConstantTok"/>
+        </w:rPr>
+        <w:t xml:space="preserve">TRUE</w:t>
+      </w:r>
+      <w:r>
+        <w:rPr>
+          <w:rStyle w:val="NormalTok"/>
+        </w:rPr>
+        <w:t xml:space="preserve">)</w:t>
+      </w:r>
+      <w:r>
+        <w:br/>
+      </w:r>
+      <w:r>
+        <w:rPr>
+          <w:rStyle w:val="CommentTok"/>
+        </w:rPr>
+        <w:t xml:space="preserve">#&gt; [1] 1</w:t>
+      </w:r>
+    </w:p>
+    <w:p>
+      <w:pPr>
+        <w:pStyle w:val="FirstParagraph"/>
+      </w:pPr>
+      <w:r>
+        <w:t xml:space="preserve">The mean is</w:t>
+      </w:r>
+      <w:r>
+        <w:t xml:space="preserve"> </w:t>
+      </w:r>
+      <m:oMath>
+        <m:r>
+          <m:t>0</m:t>
+        </m:r>
+      </m:oMath>
+      <w:r>
+        <w:t xml:space="preserve"> </w:t>
+      </w:r>
+      <w:r>
+        <w:t xml:space="preserve">up to rounding error, and the standard deviation is</w:t>
+      </w:r>
+      <w:r>
+        <w:t xml:space="preserve"> </w:t>
+      </w:r>
+      <m:oMath>
+        <m:r>
+          <m:t>1</m:t>
+        </m:r>
+      </m:oMath>
+      <w:r>
+        <w:t xml:space="preserve">,</w:t>
+      </w:r>
+      <w:r>
+        <w:t xml:space="preserve"> </w:t>
+      </w:r>
+      <w:r>
+        <w:t xml:space="preserve">as</w:t>
+      </w:r>
+      <w:r>
+        <w:t xml:space="preserve"> </w:t>
+      </w:r>
+      <w:hyperlink w:anchor="thm-standardized-mean-sd">
+        <w:r>
+          <w:rPr>
+            <w:rStyle w:val="Hyperlink"/>
+          </w:rPr>
+          <w:t xml:space="preserve">Theorem 2</w:t>
+        </w:r>
+      </w:hyperlink>
+      <w:r>
+        <w:t xml:space="preserve"> </w:t>
+      </w:r>
+      <w:r>
+        <w:t xml:space="preserve">says.</w:t>
+      </w:r>
+      <w:r>
+        <w:t xml:space="preserve"> </w:t>
+      </w:r>
+      <w:r>
+        <w:t xml:space="preserve">The</w:t>
+      </w:r>
+      <w:r>
+        <w:t xml:space="preserve"> </w:t>
+      </w:r>
+      <w:r>
+        <w:rPr>
+          <w:rStyle w:val="VerbatimChar"/>
+        </w:rPr>
+        <w:t xml:space="preserve">na.rm = TRUE</w:t>
+      </w:r>
+      <w:r>
+        <w:t xml:space="preserve"> </w:t>
+      </w:r>
+      <w:r>
+        <w:t xml:space="preserve">is needed because 12 of the cholesterol values are missing.</w:t>
+      </w:r>
+    </w:p>
+    <w:bookmarkEnd w:id="110"/>
+    <w:bookmarkStart w:id="111" w:name="def-min-max-scaling"/>
+    <w:p>
+      <w:pPr>
+        <w:pStyle w:val="BodyText"/>
+      </w:pPr>
+      <w:r>
+        <w:rPr>
+          <w:b/>
+          <w:bCs/>
+        </w:rPr>
+        <w:t xml:space="preserve">Definition 17 (Min-max scaling)</w:t>
+      </w:r>
+      <w:r>
+        <w:t xml:space="preserve"> </w:t>
+      </w:r>
+      <w:r>
+        <w:t xml:space="preserve">Let</w:t>
+      </w:r>
+      <w:r>
+        <w:t xml:space="preserve"> </w:t>
+      </w:r>
+      <m:oMath>
+        <m:sSub>
+          <m:e>
+            <m:r>
+              <m:t>x</m:t>
+            </m:r>
+          </m:e>
+          <m:sub>
+            <m:r>
+              <m:t>1</m:t>
+            </m:r>
+          </m:sub>
+        </m:sSub>
+        <m:r>
+          <m:rPr>
+            <m:sty m:val="p"/>
+          </m:rPr>
+          <m:t>,</m:t>
+        </m:r>
+        <m:r>
+          <m:rPr>
+            <m:sty m:val="p"/>
+          </m:rPr>
+          <m:t>…</m:t>
+        </m:r>
+        <m:r>
+          <m:rPr>
+            <m:sty m:val="p"/>
+          </m:rPr>
+          <m:t>,</m:t>
+        </m:r>
+        <m:sSub>
+          <m:e>
+            <m:r>
+              <m:t>x</m:t>
+            </m:r>
+          </m:e>
+          <m:sub>
+            <m:r>
+              <m:t>n</m:t>
+            </m:r>
+          </m:sub>
+        </m:sSub>
+      </m:oMath>
+      <w:r>
+        <w:t xml:space="preserve"> </w:t>
+      </w:r>
+      <w:r>
+        <w:t xml:space="preserve">be observations of a variable</w:t>
+      </w:r>
+      <w:r>
+        <w:t xml:space="preserve"> </w:t>
+      </w:r>
+      <w:r>
+        <w:t xml:space="preserve">with minimum</w:t>
+      </w:r>
+      <w:r>
+        <w:t xml:space="preserve"> </w:t>
+      </w:r>
+      <m:oMath>
+        <m:sSub>
+          <m:e>
+            <m:r>
+              <m:t>x</m:t>
+            </m:r>
+          </m:e>
+          <m:sub>
+            <m:r>
+              <m:rPr>
+                <m:sty m:val="p"/>
+              </m:rPr>
+              <m:t>min</m:t>
+            </m:r>
+          </m:sub>
+        </m:sSub>
+      </m:oMath>
+      <w:r>
+        <w:t xml:space="preserve"> </w:t>
+      </w:r>
+      <w:r>
+        <w:t xml:space="preserve">and maximum</w:t>
+      </w:r>
+      <w:r>
+        <w:t xml:space="preserve"> </w:t>
+      </w:r>
+      <m:oMath>
+        <m:sSub>
+          <m:e>
+            <m:r>
+              <m:t>x</m:t>
+            </m:r>
+          </m:e>
+          <m:sub>
+            <m:r>
+              <m:rPr>
+                <m:sty m:val="p"/>
+              </m:rPr>
+              <m:t>max</m:t>
+            </m:r>
+          </m:sub>
+        </m:sSub>
+        <m:r>
+          <m:rPr>
+            <m:sty m:val="p"/>
+          </m:rPr>
+          <m:t>&gt;</m:t>
+        </m:r>
+        <m:sSub>
+          <m:e>
+            <m:r>
+              <m:t>x</m:t>
+            </m:r>
+          </m:e>
+          <m:sub>
+            <m:r>
+              <m:rPr>
+                <m:sty m:val="p"/>
+              </m:rPr>
+              <m:t>min</m:t>
+            </m:r>
+          </m:sub>
+        </m:sSub>
+      </m:oMath>
+      <w:r>
+        <w:t xml:space="preserve">.</w:t>
+      </w:r>
+      <w:r>
+        <w:t xml:space="preserve"> </w:t>
+      </w:r>
+      <w:r>
+        <w:t xml:space="preserve">The</w:t>
+      </w:r>
+      <w:r>
+        <w:t xml:space="preserve"> </w:t>
+      </w:r>
+      <w:r>
+        <w:rPr>
+          <w:b/>
+          <w:bCs/>
+        </w:rPr>
+        <w:t xml:space="preserve">min-max scaled value</w:t>
+      </w:r>
+      <w:r>
+        <w:t xml:space="preserve"> </w:t>
+      </w:r>
+      <w:r>
+        <w:t xml:space="preserve">of</w:t>
+      </w:r>
+      <w:r>
+        <w:t xml:space="preserve"> </w:t>
+      </w:r>
+      <m:oMath>
+        <m:sSub>
+          <m:e>
+            <m:r>
+              <m:t>x</m:t>
+            </m:r>
+          </m:e>
+          <m:sub>
+            <m:r>
+              <m:t>i</m:t>
+            </m:r>
+          </m:sub>
+        </m:sSub>
+      </m:oMath>
+      <w:r>
+        <w:t xml:space="preserve"> </w:t>
+      </w:r>
+      <w:r>
+        <w:t xml:space="preserve">is</w:t>
+      </w:r>
+    </w:p>
+    <w:p>
+      <w:pPr>
+        <w:pStyle w:val="BodyText"/>
+      </w:pPr>
+      <m:oMathPara>
+        <m:oMathParaPr>
+          <m:jc m:val="center"/>
+        </m:oMathParaPr>
+        <m:oMath>
+          <m:f>
+            <m:fPr>
+              <m:type m:val="bar"/>
+            </m:fPr>
+            <m:num>
+              <m:sSub>
+                <m:e>
+                  <m:r>
+                    <m:t>x</m:t>
+                  </m:r>
+                </m:e>
+                <m:sub>
+                  <m:r>
+                    <m:t>i</m:t>
+                  </m:r>
+                </m:sub>
+              </m:sSub>
+              <m:r>
+                <m:rPr>
+                  <m:sty m:val="p"/>
+                </m:rPr>
+                <m:t>−</m:t>
+              </m:r>
+              <m:sSub>
+                <m:e>
+                  <m:r>
+                    <m:t>x</m:t>
+                  </m:r>
+                </m:e>
+                <m:sub>
+                  <m:r>
+                    <m:rPr>
+                      <m:sty m:val="p"/>
+                    </m:rPr>
+                    <m:t>min</m:t>
+                  </m:r>
+                </m:sub>
+              </m:sSub>
+            </m:num>
+            <m:den>
+              <m:sSub>
+                <m:e>
+                  <m:r>
+                    <m:t>x</m:t>
+                  </m:r>
+                </m:e>
+                <m:sub>
+                  <m:r>
+                    <m:rPr>
+                      <m:sty m:val="p"/>
+                    </m:rPr>
+                    <m:t>max</m:t>
+                  </m:r>
+                </m:sub>
+              </m:sSub>
+              <m:r>
+                <m:rPr>
+                  <m:sty m:val="p"/>
+                </m:rPr>
+                <m:t>−</m:t>
+              </m:r>
+              <m:sSub>
+                <m:e>
+                  <m:r>
+                    <m:t>x</m:t>
+                  </m:r>
+                </m:e>
+                <m:sub>
+                  <m:r>
+                    <m:rPr>
+                      <m:sty m:val="p"/>
+                    </m:rPr>
+                    <m:t>min</m:t>
+                  </m:r>
+                </m:sub>
+              </m:sSub>
+            </m:den>
+          </m:f>
+        </m:oMath>
+      </m:oMathPara>
+    </w:p>
+    <w:bookmarkEnd w:id="111"/>
+    <w:bookmarkStart w:id="112" w:name="rem-min-max-outliers"/>
+    <w:p>
+      <w:pPr>
+        <w:pStyle w:val="FirstParagraph"/>
+      </w:pPr>
+      <w:r>
+        <w:rPr>
+          <w:i/>
+          <w:iCs/>
+        </w:rPr>
+        <w:t xml:space="preserve">Remark 2</w:t>
+      </w:r>
+      <w:r>
+        <w:t xml:space="preserve"> (Min-max scaling and outliers). </w:t>
+      </w:r>
+      <w:r>
+        <w:t xml:space="preserve">Every min-max scaled value lies in</w:t>
+      </w:r>
+      <w:r>
+        <w:t xml:space="preserve"> </w:t>
+      </w:r>
+      <m:oMath>
+        <m:r>
+          <m:rPr>
+            <m:sty m:val="p"/>
+          </m:rPr>
+          <m:t>[</m:t>
+        </m:r>
+        <m:r>
+          <m:t>0</m:t>
+        </m:r>
+        <m:r>
+          <m:rPr>
+            <m:sty m:val="p"/>
+          </m:rPr>
+          <m:t>,</m:t>
+        </m:r>
+        <m:r>
+          <m:t>1</m:t>
+        </m:r>
+        <m:r>
+          <m:rPr>
+            <m:sty m:val="p"/>
+          </m:rPr>
+          <m:t>]</m:t>
+        </m:r>
+      </m:oMath>
+      <w:r>
+        <w:t xml:space="preserve">:</w:t>
+      </w:r>
+      <w:r>
+        <w:t xml:space="preserve"> </w:t>
+      </w:r>
+      <w:r>
+        <w:t xml:space="preserve">the minimum maps to</w:t>
+      </w:r>
+      <w:r>
+        <w:t xml:space="preserve"> </w:t>
+      </w:r>
+      <m:oMath>
+        <m:r>
+          <m:t>0</m:t>
+        </m:r>
+      </m:oMath>
+      <w:r>
+        <w:t xml:space="preserve"> </w:t>
+      </w:r>
+      <w:r>
+        <w:t xml:space="preserve">and the maximum maps to</w:t>
+      </w:r>
+      <w:r>
+        <w:t xml:space="preserve"> </w:t>
+      </w:r>
+      <m:oMath>
+        <m:r>
+          <m:t>1</m:t>
+        </m:r>
+      </m:oMath>
+      <w:r>
+        <w:t xml:space="preserve">.</w:t>
+      </w:r>
+      <w:r>
+        <w:t xml:space="preserve"> </w:t>
+      </w:r>
+      <w:r>
+        <w:t xml:space="preserve">For example, if median incomes range from 0 to 15,</w:t>
+      </w:r>
+      <w:r>
+        <w:t xml:space="preserve"> </w:t>
+      </w:r>
+      <w:r>
+        <w:t xml:space="preserve">an income of 0 maps to</w:t>
+      </w:r>
+      <w:r>
+        <w:t xml:space="preserve"> </w:t>
+      </w:r>
+      <m:oMath>
+        <m:r>
+          <m:t>0</m:t>
+        </m:r>
+      </m:oMath>
+      <w:r>
+        <w:t xml:space="preserve">, and an income of 15 maps to</w:t>
+      </w:r>
+      <w:r>
+        <w:t xml:space="preserve"> </w:t>
+      </w:r>
+      <m:oMath>
+        <m:r>
+          <m:t>1</m:t>
+        </m:r>
+      </m:oMath>
+      <w:r>
+        <w:t xml:space="preserve">.</w:t>
+      </w:r>
+    </w:p>
+    <w:p>
+      <w:pPr>
+        <w:pStyle w:val="BodyText"/>
+      </w:pPr>
+      <w:r>
+        <w:t xml:space="preserve">Min-max scaling is sensitive to outliers.</w:t>
+      </w:r>
+      <w:r>
+        <w:t xml:space="preserve"> </w:t>
+      </w:r>
+      <w:r>
+        <w:t xml:space="preserve">For example, suppose one income of 100 is recorded by mistake.</w:t>
+      </w:r>
+      <w:r>
+        <w:t xml:space="preserve"> </w:t>
+      </w:r>
+      <w:r>
+        <w:t xml:space="preserve">The maximum is then 100,</w:t>
+      </w:r>
+      <w:r>
+        <w:t xml:space="preserve"> </w:t>
+      </w:r>
+      <w:r>
+        <w:t xml:space="preserve">so min-max scaling maps all the other incomes into</w:t>
+      </w:r>
+      <w:r>
+        <w:t xml:space="preserve"> </w:t>
+      </w:r>
+      <m:oMath>
+        <m:r>
+          <m:rPr>
+            <m:sty m:val="p"/>
+          </m:rPr>
+          <m:t>[</m:t>
+        </m:r>
+        <m:r>
+          <m:t>0</m:t>
+        </m:r>
+        <m:r>
+          <m:rPr>
+            <m:sty m:val="p"/>
+          </m:rPr>
+          <m:t>,</m:t>
+        </m:r>
+        <m:r>
+          <m:t>0.15</m:t>
+        </m:r>
+        <m:r>
+          <m:rPr>
+            <m:sty m:val="p"/>
+          </m:rPr>
+          <m:t>]</m:t>
+        </m:r>
+      </m:oMath>
+      <w:r>
+        <w:t xml:space="preserve">.</w:t>
+      </w:r>
+      <w:r>
+        <w:t xml:space="preserve"> </w:t>
+      </w:r>
+      <w:hyperlink w:anchor="def-standardization">
+        <w:r>
+          <w:rPr>
+            <w:rStyle w:val="Hyperlink"/>
+          </w:rPr>
+          <w:t xml:space="preserve">Standardization</w:t>
+        </w:r>
+      </w:hyperlink>
+      <w:r>
+        <w:t xml:space="preserve"> </w:t>
+      </w:r>
+      <w:r>
+        <w:t xml:space="preserve">changes them much less</w:t>
+      </w:r>
+      <w:r>
+        <w:t xml:space="preserve"> </w:t>
+      </w:r>
+      <w:r>
+        <w:t xml:space="preserve">(Géron 2017, chap. 2,</w:t>
+      </w:r>
+      <w:r>
+        <w:t xml:space="preserve"> </w:t>
+      </w:r>
+      <w:r>
+        <w:t xml:space="preserve">“Feature Scaling”</w:t>
+      </w:r>
+      <w:r>
+        <w:t xml:space="preserve">)</w:t>
+      </w:r>
+      <w:r>
+        <w:t xml:space="preserve">.</w:t>
+      </w:r>
+    </w:p>
+    <w:bookmarkEnd w:id="112"/>
+    <w:bookmarkStart w:id="113" w:name="exm-min-max-wcgs"/>
+    <w:p>
+      <w:pPr>
+        <w:pStyle w:val="BodyText"/>
+      </w:pPr>
+      <w:r>
+        <w:rPr>
+          <w:b/>
+          <w:bCs/>
+        </w:rPr>
+        <w:t xml:space="preserve">Example 9 (Min-max scaling of cholesterol in the WCGS)</w:t>
+      </w:r>
+      <w:r>
+        <w:t xml:space="preserve"> </w:t>
+      </w:r>
+      <w:r>
+        <w:t xml:space="preserve"> </w:t>
+      </w:r>
+    </w:p>
+    <w:p>
+      <w:pPr>
+        <w:pStyle w:val="SourceCode"/>
+      </w:pPr>
+      <w:r>
+        <w:rPr>
+          <w:rStyle w:val="NormalTok"/>
+        </w:rPr>
+        <w:t xml:space="preserve">chol_range </w:t>
+      </w:r>
+      <w:r>
+        <w:rPr>
+          <w:rStyle w:val="OtherTok"/>
+        </w:rPr>
+        <w:t xml:space="preserve">&lt;-</w:t>
+      </w:r>
+      <w:r>
+        <w:rPr>
+          <w:rStyle w:val="NormalTok"/>
+        </w:rPr>
+        <w:t xml:space="preserve"> </w:t>
+      </w:r>
+      <w:r>
+        <w:rPr>
+          <w:rStyle w:val="FunctionTok"/>
+        </w:rPr>
+        <w:t xml:space="preserve">range</w:t>
+      </w:r>
+      <w:r>
+        <w:rPr>
+          <w:rStyle w:val="NormalTok"/>
+        </w:rPr>
+        <w:t xml:space="preserve">(wcgs</w:t>
+      </w:r>
+      <w:r>
+        <w:rPr>
+          <w:rStyle w:val="SpecialCharTok"/>
+        </w:rPr>
+        <w:t xml:space="preserve">$</w:t>
+      </w:r>
+      <w:r>
+        <w:rPr>
+          <w:rStyle w:val="NormalTok"/>
+        </w:rPr>
+        <w:t xml:space="preserve">chol, </w:t>
+      </w:r>
+      <w:r>
+        <w:rPr>
+          <w:rStyle w:val="AttributeTok"/>
+        </w:rPr>
+        <w:t xml:space="preserve">na.rm =</w:t>
+      </w:r>
+      <w:r>
+        <w:rPr>
+          <w:rStyle w:val="NormalTok"/>
+        </w:rPr>
+        <w:t xml:space="preserve"> </w:t>
+      </w:r>
+      <w:r>
+        <w:rPr>
+          <w:rStyle w:val="ConstantTok"/>
+        </w:rPr>
+        <w:t xml:space="preserve">TRUE</w:t>
+      </w:r>
+      <w:r>
+        <w:rPr>
+          <w:rStyle w:val="NormalTok"/>
+        </w:rPr>
+        <w:t xml:space="preserve">)</w:t>
+      </w:r>
+      <w:r>
+        <w:br/>
+      </w:r>
+      <w:r>
+        <w:rPr>
+          <w:rStyle w:val="NormalTok"/>
+        </w:rPr>
+        <w:t xml:space="preserve">chol_minmax </w:t>
+      </w:r>
+      <w:r>
+        <w:rPr>
+          <w:rStyle w:val="OtherTok"/>
+        </w:rPr>
+        <w:t xml:space="preserve">&lt;-</w:t>
+      </w:r>
+      <w:r>
+        <w:rPr>
+          <w:rStyle w:val="NormalTok"/>
+        </w:rPr>
+        <w:t xml:space="preserve"> (wcgs</w:t>
+      </w:r>
+      <w:r>
+        <w:rPr>
+          <w:rStyle w:val="SpecialCharTok"/>
+        </w:rPr>
+        <w:t xml:space="preserve">$</w:t>
+      </w:r>
+      <w:r>
+        <w:rPr>
+          <w:rStyle w:val="NormalTok"/>
+        </w:rPr>
+        <w:t xml:space="preserve">chol </w:t>
+      </w:r>
+      <w:r>
+        <w:rPr>
+          <w:rStyle w:val="SpecialCharTok"/>
+        </w:rPr>
+        <w:t xml:space="preserve">-</w:t>
+      </w:r>
+      <w:r>
+        <w:rPr>
+          <w:rStyle w:val="NormalTok"/>
+        </w:rPr>
+        <w:t xml:space="preserve"> chol_range[</w:t>
+      </w:r>
+      <w:r>
+        <w:rPr>
+          <w:rStyle w:val="DecValTok"/>
+        </w:rPr>
+        <w:t xml:space="preserve">1</w:t>
+      </w:r>
+      <w:r>
+        <w:rPr>
+          <w:rStyle w:val="NormalTok"/>
+        </w:rPr>
+        <w:t xml:space="preserve">]) </w:t>
+      </w:r>
+      <w:r>
+        <w:rPr>
+          <w:rStyle w:val="SpecialCharTok"/>
+        </w:rPr>
+        <w:t xml:space="preserve">/</w:t>
+      </w:r>
+      <w:r>
+        <w:rPr>
+          <w:rStyle w:val="NormalTok"/>
+        </w:rPr>
+        <w:t xml:space="preserve"> </w:t>
+      </w:r>
+      <w:r>
+        <w:rPr>
+          <w:rStyle w:val="FunctionTok"/>
+        </w:rPr>
+        <w:t xml:space="preserve">diff</w:t>
+      </w:r>
+      <w:r>
+        <w:rPr>
+          <w:rStyle w:val="NormalTok"/>
+        </w:rPr>
+        <w:t xml:space="preserve">(chol_range)</w:t>
+      </w:r>
+      <w:r>
+        <w:br/>
+      </w:r>
+      <w:r>
+        <w:rPr>
+          <w:rStyle w:val="FunctionTok"/>
+        </w:rPr>
+        <w:t xml:space="preserve">range</w:t>
+      </w:r>
+      <w:r>
+        <w:rPr>
+          <w:rStyle w:val="NormalTok"/>
+        </w:rPr>
+        <w:t xml:space="preserve">(chol_minmax, </w:t>
+      </w:r>
+      <w:r>
+        <w:rPr>
+          <w:rStyle w:val="AttributeTok"/>
+        </w:rPr>
+        <w:t xml:space="preserve">na.rm =</w:t>
+      </w:r>
+      <w:r>
+        <w:rPr>
+          <w:rStyle w:val="NormalTok"/>
+        </w:rPr>
+        <w:t xml:space="preserve"> </w:t>
+      </w:r>
+      <w:r>
+        <w:rPr>
+          <w:rStyle w:val="ConstantTok"/>
+        </w:rPr>
+        <w:t xml:space="preserve">TRUE</w:t>
+      </w:r>
+      <w:r>
+        <w:rPr>
+          <w:rStyle w:val="NormalTok"/>
+        </w:rPr>
+        <w:t xml:space="preserve">)</w:t>
+      </w:r>
+      <w:r>
+        <w:br/>
+      </w:r>
+      <w:r>
+        <w:rPr>
+          <w:rStyle w:val="CommentTok"/>
+        </w:rPr>
+        <w:t xml:space="preserve">#&gt; [1] 0 1</w:t>
+      </w:r>
+    </w:p>
+    <w:p>
+      <w:pPr>
+        <w:pStyle w:val="FirstParagraph"/>
+      </w:pPr>
+      <w:r>
+        <w:t xml:space="preserve">The smallest cholesterol value maps to 0 and the largest maps to 1.</w:t>
+      </w:r>
+      <w:r>
+        <w:t xml:space="preserve"> </w:t>
+      </w:r>
+      <w:r>
+        <w:t xml:space="preserve">The scaled values keep the shape of the distribution</w:t>
+      </w:r>
+      <w:r>
+        <w:t xml:space="preserve"> </w:t>
+      </w:r>
+      <w:r>
+        <w:t xml:space="preserve">but have no units.</w:t>
+      </w:r>
+    </w:p>
+    <w:bookmarkEnd w:id="113"/>
+    <w:bookmarkEnd w:id="114"/>
+    <w:bookmarkEnd w:id="115"/>
+    <w:bookmarkStart w:id="117" w:name="an-exploratory-data-analysis-workflow"/>
+    <w:p>
+      <w:pPr>
+        <w:pStyle w:val="Heading2"/>
+      </w:pPr>
+      <w:r>
+        <w:t xml:space="preserve">6 An exploratory data analysis workflow</w:t>
+      </w:r>
+    </w:p>
+    <w:p>
+      <w:pPr>
+        <w:pStyle w:val="FirstParagraph"/>
+      </w:pPr>
+      <w:r>
+        <w:t xml:space="preserve">A typical exploratory data analysis proceeds as follows:</w:t>
+      </w:r>
+    </w:p>
+    <w:p>
+      <w:pPr>
+        <w:pStyle w:val="Compact"/>
+        <w:numPr>
+          <w:ilvl w:val="0"/>
+          <w:numId w:val="1008"/>
+        </w:numPr>
+      </w:pPr>
+      <w:r>
+        <w:rPr>
+          <w:b/>
+          <w:bCs/>
+        </w:rPr>
+        <w:t xml:space="preserve">Understand the dataset</w:t>
+      </w:r>
+      <w:r>
+        <w:t xml:space="preserve">:</w:t>
+      </w:r>
+      <w:r>
+        <w:t xml:space="preserve"> </w:t>
+      </w:r>
+      <w:r>
+        <w:t xml:space="preserve">the number of observations and variables, and each variable’s type.</w:t>
+      </w:r>
+    </w:p>
+    <w:p>
+      <w:pPr>
+        <w:pStyle w:val="Compact"/>
+        <w:numPr>
+          <w:ilvl w:val="0"/>
+          <w:numId w:val="1008"/>
+        </w:numPr>
+      </w:pPr>
+      <w:r>
+        <w:rPr>
+          <w:b/>
+          <w:bCs/>
+        </w:rPr>
+        <w:t xml:space="preserve">Examine each variable individually</w:t>
       </w:r>
       <w:r>
         <w:t xml:space="preserve">:</w:t>
@@ -15541,11 +18209,11 @@
         <w:pStyle w:val="Compact"/>
         <w:numPr>
           <w:ilvl w:val="1"/>
-          <w:numId w:val="1008"/>
+          <w:numId w:val="1009"/>
         </w:numPr>
       </w:pPr>
       <w:r>
-        <w:t xml:space="preserve">two continuous variables: scatter plot, correlation;</w:t>
+        <w:t xml:space="preserve">continuous: histogram, box plot, mean, SD, median, IQR;</w:t>
       </w:r>
     </w:p>
     <w:p>
@@ -15553,11 +18221,11 @@
         <w:pStyle w:val="Compact"/>
         <w:numPr>
           <w:ilvl w:val="1"/>
-          <w:numId w:val="1008"/>
+          <w:numId w:val="1009"/>
         </w:numPr>
       </w:pPr>
       <w:r>
-        <w:t xml:space="preserve">continuous by categorical: side-by-side box plots, group means;</w:t>
+        <w:t xml:space="preserve">categorical: bar chart, frequency table;</w:t>
       </w:r>
     </w:p>
     <w:p>
@@ -15565,11 +18233,11 @@
         <w:pStyle w:val="Compact"/>
         <w:numPr>
           <w:ilvl w:val="1"/>
-          <w:numId w:val="1008"/>
+          <w:numId w:val="1009"/>
         </w:numPr>
       </w:pPr>
       <w:r>
-        <w:t xml:space="preserve">two categorical variables: contingency table.</w:t>
+        <w:t xml:space="preserve">note missing values, unusual values, and outliers.</w:t>
       </w:r>
     </w:p>
     <w:p>
@@ -15577,7 +18245,7 @@
         <w:pStyle w:val="Compact"/>
         <w:numPr>
           <w:ilvl w:val="0"/>
-          <w:numId w:val="1006"/>
+          <w:numId w:val="1008"/>
         </w:numPr>
       </w:pPr>
       <w:r>
@@ -15585,13 +18253,46 @@
           <w:b/>
           <w:bCs/>
         </w:rPr>
-        <w:t xml:space="preserve">Consider transformations</w:t>
-      </w:r>
-      <w:r>
-        <w:t xml:space="preserve"> </w:t>
-      </w:r>
-      <w:r>
-        <w:t xml:space="preserve">for skewed continuous variables.</w:t>
+        <w:t xml:space="preserve">Examine relationships between variables</w:t>
+      </w:r>
+      <w:r>
+        <w:t xml:space="preserve">:</w:t>
+      </w:r>
+    </w:p>
+    <w:p>
+      <w:pPr>
+        <w:pStyle w:val="Compact"/>
+        <w:numPr>
+          <w:ilvl w:val="1"/>
+          <w:numId w:val="1010"/>
+        </w:numPr>
+      </w:pPr>
+      <w:r>
+        <w:t xml:space="preserve">two continuous variables: scatter plot, correlation;</w:t>
+      </w:r>
+    </w:p>
+    <w:p>
+      <w:pPr>
+        <w:pStyle w:val="Compact"/>
+        <w:numPr>
+          <w:ilvl w:val="1"/>
+          <w:numId w:val="1010"/>
+        </w:numPr>
+      </w:pPr>
+      <w:r>
+        <w:t xml:space="preserve">continuous by categorical: side-by-side box plots, group means;</w:t>
+      </w:r>
+    </w:p>
+    <w:p>
+      <w:pPr>
+        <w:pStyle w:val="Compact"/>
+        <w:numPr>
+          <w:ilvl w:val="1"/>
+          <w:numId w:val="1010"/>
+        </w:numPr>
+      </w:pPr>
+      <w:r>
+        <w:t xml:space="preserve">two categorical variables: contingency table.</w:t>
       </w:r>
     </w:p>
     <w:p>
@@ -15599,7 +18300,29 @@
         <w:pStyle w:val="Compact"/>
         <w:numPr>
           <w:ilvl w:val="0"/>
-          <w:numId w:val="1006"/>
+          <w:numId w:val="1008"/>
+        </w:numPr>
+      </w:pPr>
+      <w:r>
+        <w:rPr>
+          <w:b/>
+          <w:bCs/>
+        </w:rPr>
+        <w:t xml:space="preserve">Consider transformations</w:t>
+      </w:r>
+      <w:r>
+        <w:t xml:space="preserve"> </w:t>
+      </w:r>
+      <w:r>
+        <w:t xml:space="preserve">for skewed continuous variables.</w:t>
+      </w:r>
+    </w:p>
+    <w:p>
+      <w:pPr>
+        <w:pStyle w:val="Compact"/>
+        <w:numPr>
+          <w:ilvl w:val="0"/>
+          <w:numId w:val="1008"/>
         </w:numPr>
       </w:pPr>
       <w:r>
@@ -15648,7 +18371,7 @@
       <w:tr>
         <w:tc>
           <w:tcPr/>
-          <w:bookmarkStart w:id="106" w:name="tbl-wcgs-all-summary"/>
+          <w:bookmarkStart w:id="116" w:name="tbl-wcgs-all-summary"/>
           <w:p>
             <w:pPr>
               <w:jc w:val="center"/>
@@ -16829,12 +19552,12 @@
               </w:tc>
             </w:tr>
           </w:tbl>
-          <w:bookmarkEnd w:id="106"/>
+          <w:bookmarkEnd w:id="116"/>
         </w:tc>
       </w:tr>
     </w:tbl>
-    <w:bookmarkEnd w:id="107"/>
-    <w:bookmarkStart w:id="113" w:name="references"/>
+    <w:bookmarkEnd w:id="117"/>
+    <w:bookmarkStart w:id="124" w:name="references"/>
     <w:p>
       <w:pPr>
         <w:pStyle w:val="Heading2"/>
@@ -16843,29 +19566,14 @@
         <w:t xml:space="preserve">References</w:t>
       </w:r>
     </w:p>
-    <w:bookmarkStart w:id="112" w:name="refs"/>
-    <w:bookmarkStart w:id="109" w:name="ref-rosenman1975coronary"/>
+    <w:bookmarkStart w:id="123" w:name="refs"/>
+    <w:bookmarkStart w:id="118" w:name="ref-geron2017hands"/>
     <w:p>
       <w:pPr>
         <w:pStyle w:val="Bibliography"/>
       </w:pPr>
       <w:r>
-        <w:t xml:space="preserve">Rosenman, Ray H, Richard J Brand, C David Jenkins, Meyer Friedman, Reuben Straus, and Moses Wurm. 1975.</w:t>
-      </w:r>
-      <w:r>
-        <w:t xml:space="preserve"> </w:t>
-      </w:r>
-      <w:r>
-        <w:t xml:space="preserve">“Coronary Heart Disease in the</w:t>
-      </w:r>
-      <w:r>
-        <w:t xml:space="preserve"> </w:t>
-      </w:r>
-      <w:r>
-        <w:t xml:space="preserve">Western Collaborative Group Study</w:t>
-      </w:r>
-      <w:r>
-        <w:t xml:space="preserve">: Final Follow-up Experience of 8 1/2 Years.”</w:t>
+        <w:t xml:space="preserve">Géron, Aurélien. 2017.</w:t>
       </w:r>
       <w:r>
         <w:t xml:space="preserve"> </w:t>
@@ -16875,6 +19583,86 @@
           <w:i/>
           <w:iCs/>
         </w:rPr>
+        <w:t xml:space="preserve">Hands-on Machine Learning with</w:t>
+      </w:r>
+      <w:r>
+        <w:rPr>
+          <w:i/>
+          <w:iCs/>
+        </w:rPr>
+        <w:t xml:space="preserve"> </w:t>
+      </w:r>
+      <w:r>
+        <w:rPr>
+          <w:i/>
+          <w:iCs/>
+        </w:rPr>
+        <w:t xml:space="preserve">Scikit-Learn</w:t>
+      </w:r>
+      <w:r>
+        <w:rPr>
+          <w:i/>
+          <w:iCs/>
+        </w:rPr>
+        <w:t xml:space="preserve"> </w:t>
+      </w:r>
+      <w:r>
+        <w:rPr>
+          <w:i/>
+          <w:iCs/>
+        </w:rPr>
+        <w:t xml:space="preserve">and</w:t>
+      </w:r>
+      <w:r>
+        <w:rPr>
+          <w:i/>
+          <w:iCs/>
+        </w:rPr>
+        <w:t xml:space="preserve"> </w:t>
+      </w:r>
+      <w:r>
+        <w:rPr>
+          <w:i/>
+          <w:iCs/>
+        </w:rPr>
+        <w:t xml:space="preserve">TensorFlow</w:t>
+      </w:r>
+      <w:r>
+        <w:t xml:space="preserve">. 1st ed. O’Reilly Media.</w:t>
+      </w:r>
+    </w:p>
+    <w:bookmarkEnd w:id="118"/>
+    <w:bookmarkStart w:id="120" w:name="ref-rosenman1975coronary"/>
+    <w:p>
+      <w:pPr>
+        <w:pStyle w:val="Bibliography"/>
+      </w:pPr>
+      <w:r>
+        <w:t xml:space="preserve">Rosenman, Ray H, Richard J Brand, C David Jenkins, Meyer Friedman, Reuben Straus, and Moses Wurm. 1975.</w:t>
+      </w:r>
+      <w:r>
+        <w:t xml:space="preserve"> </w:t>
+      </w:r>
+      <w:r>
+        <w:t xml:space="preserve">“Coronary Heart Disease in the</w:t>
+      </w:r>
+      <w:r>
+        <w:t xml:space="preserve"> </w:t>
+      </w:r>
+      <w:r>
+        <w:t xml:space="preserve">Western Collaborative Group Study</w:t>
+      </w:r>
+      <w:r>
+        <w:t xml:space="preserve">: Final Follow-up Experience of 8 1/2 Years.”</w:t>
+      </w:r>
+      <w:r>
+        <w:t xml:space="preserve"> </w:t>
+      </w:r>
+      <w:r>
+        <w:rPr>
+          <w:i/>
+          <w:iCs/>
+        </w:rPr>
         <w:t xml:space="preserve">JAMA</w:t>
       </w:r>
       <w:r>
@@ -16886,7 +19674,7 @@
       <w:r>
         <w:t xml:space="preserve"> </w:t>
       </w:r>
-      <w:hyperlink r:id="rId108">
+      <w:hyperlink r:id="rId119">
         <w:r>
           <w:rPr>
             <w:rStyle w:val="Hyperlink"/>
@@ -16898,8 +19686,8 @@
         <w:t xml:space="preserve">.</w:t>
       </w:r>
     </w:p>
-    <w:bookmarkEnd w:id="109"/>
-    <w:bookmarkStart w:id="111" w:name="ref-vittinghoff2e"/>
+    <w:bookmarkEnd w:id="120"/>
+    <w:bookmarkStart w:id="122" w:name="ref-vittinghoff2e"/>
     <w:p>
       <w:pPr>
         <w:pStyle w:val="Bibliography"/>
@@ -16923,7 +19711,7 @@
       <w:r>
         <w:t xml:space="preserve"> </w:t>
       </w:r>
-      <w:hyperlink r:id="rId110">
+      <w:hyperlink r:id="rId121">
         <w:r>
           <w:rPr>
             <w:rStyle w:val="Hyperlink"/>
@@ -16935,9 +19723,9 @@
         <w:t xml:space="preserve">.</w:t>
       </w:r>
     </w:p>
-    <w:bookmarkEnd w:id="111"/>
-    <w:bookmarkEnd w:id="112"/>
-    <w:bookmarkEnd w:id="113"/>
+    <w:bookmarkEnd w:id="122"/>
+    <w:bookmarkEnd w:id="123"/>
+    <w:bookmarkEnd w:id="124"/>
     <w:sectPr>
       <w:footnotePr>
         <w:numRestart w:val="eachSect"/>
@@ -17285,9 +20073,69 @@
     </w:lvlOverride>
   </w:num>
   <w:num w:numId="1007">
+    <w:abstractNumId w:val="99411"/>
+    <w:lvlOverride w:ilvl="0">
+      <w:startOverride w:val="1"/>
+    </w:lvlOverride>
+    <w:lvlOverride w:ilvl="1">
+      <w:startOverride w:val="1"/>
+    </w:lvlOverride>
+    <w:lvlOverride w:ilvl="2">
+      <w:startOverride w:val="1"/>
+    </w:lvlOverride>
+    <w:lvlOverride w:ilvl="3">
+      <w:startOverride w:val="1"/>
+    </w:lvlOverride>
+    <w:lvlOverride w:ilvl="4">
+      <w:startOverride w:val="1"/>
+    </w:lvlOverride>
+    <w:lvlOverride w:ilvl="5">
+      <w:startOverride w:val="1"/>
+    </w:lvlOverride>
+    <w:lvlOverride w:ilvl="6">
+      <w:startOverride w:val="1"/>
+    </w:lvlOverride>
+    <w:lvlOverride w:ilvl="7">
+      <w:startOverride w:val="1"/>
+    </w:lvlOverride>
+    <w:lvlOverride w:ilvl="8">
+      <w:startOverride w:val="1"/>
+    </w:lvlOverride>
+  </w:num>
+  <w:num w:numId="1008">
+    <w:abstractNumId w:val="99411"/>
+    <w:lvlOverride w:ilvl="0">
+      <w:startOverride w:val="1"/>
+    </w:lvlOverride>
+    <w:lvlOverride w:ilvl="1">
+      <w:startOverride w:val="1"/>
+    </w:lvlOverride>
+    <w:lvlOverride w:ilvl="2">
+      <w:startOverride w:val="1"/>
+    </w:lvlOverride>
+    <w:lvlOverride w:ilvl="3">
+      <w:startOverride w:val="1"/>
+    </w:lvlOverride>
+    <w:lvlOverride w:ilvl="4">
+      <w:startOverride w:val="1"/>
+    </w:lvlOverride>
+    <w:lvlOverride w:ilvl="5">
+      <w:startOverride w:val="1"/>
+    </w:lvlOverride>
+    <w:lvlOverride w:ilvl="6">
+      <w:startOverride w:val="1"/>
+    </w:lvlOverride>
+    <w:lvlOverride w:ilvl="7">
+      <w:startOverride w:val="1"/>
+    </w:lvlOverride>
+    <w:lvlOverride w:ilvl="8">
+      <w:startOverride w:val="1"/>
+    </w:lvlOverride>
+  </w:num>
+  <w:num w:numId="1009">
     <w:abstractNumId w:val="991"/>
   </w:num>
-  <w:num w:numId="1008">
+  <w:num w:numId="1010">
     <w:abstractNumId w:val="991"/>
   </w:num>
 </w:numbering>

</xml_diff>

<commit_message>
Deploying to gh-pages from @ Morrison-Lab/sds@ae95e41df374329283cf3c3f001924abc6b3f40a 🚀
</commit_message>
<xml_diff>
--- a/exploratory-descriptive-handout.docx
+++ b/exploratory-descriptive-handout.docx
@@ -15,7 +15,7 @@
         <w:pStyle w:val="Date"/>
       </w:pPr>
       <w:r>
-        <w:t xml:space="preserve">Last modified: 2026-10-05 16:04:28 (PDT)</w:t>
+        <w:t xml:space="preserve">Last modified: 2026-10-05 21:00:14 (PDT)</w:t>
       </w:r>
     </w:p>
     <w:bookmarkStart w:id="15" w:name="introduction"/>
@@ -14249,7 +14249,7 @@
     <w:bookmarkEnd w:id="93"/>
     <w:bookmarkEnd w:id="94"/>
     <w:bookmarkEnd w:id="95"/>
-    <w:bookmarkStart w:id="115" w:name="data-transformations"/>
+    <w:bookmarkStart w:id="122" w:name="data-transformations"/>
     <w:p>
       <w:pPr>
         <w:pStyle w:val="Heading2"/>
@@ -15725,7 +15725,7 @@
         <w:t xml:space="preserve">the assumptions of that model and on the scientific question.</w:t>
       </w:r>
     </w:p>
-    <w:bookmarkStart w:id="114" w:name="sec-rescaling"/>
+    <w:bookmarkStart w:id="121" w:name="sec-rescaling"/>
     <w:p>
       <w:pPr>
         <w:pStyle w:val="Heading3"/>
@@ -16229,7 +16229,7 @@
       </w:r>
     </w:p>
     <w:bookmarkEnd w:id="106"/>
-    <w:bookmarkStart w:id="107" w:name="def-standardization"/>
+    <w:bookmarkStart w:id="110" w:name="def-standardization"/>
     <w:p>
       <w:pPr>
         <w:pStyle w:val="FirstParagraph"/>
@@ -16521,11 +16521,157 @@
         </m:oMath>
       </m:oMathPara>
     </w:p>
-    <w:bookmarkEnd w:id="107"/>
-    <w:bookmarkStart w:id="108" w:name="rem-standardization-units"/>
+    <w:tbl>
+      <w:tblPr>
+        <w:tblStyle w:val="Table"/>
+        <w:tblLook w:firstRow="0" w:lastRow="0" w:firstColumn="0" w:lastColumn="0" w:noHBand="0" w:noVBand="0" w:val="0000"/>
+        <w:tblBorders>
+          <w:top w:val="single" w:sz="4" w:space="0" w:color="0758E5"/>
+          <w:left w:val="single" w:sz="24" w:space="0" w:color="0758E5"/>
+          <w:bottom w:val="single" w:sz="4" w:space="0" w:color="0758E5"/>
+          <w:right w:val="single" w:sz="4" w:space="0" w:color="0758E5"/>
+        </w:tblBorders>
+        <w:tblCellMar>
+          <w:left w:w="144" w:type="dxa"/>
+          <w:right w:w="144" w:type="dxa"/>
+        </w:tblCellMar>
+        <w:tblLook w:firstRow="0" w:lastRow="0" w:firstColumn="0" w:lastColumn="0" w:noHBand="0" w:noVBand="0" w:val="0000"/>
+      </w:tblPr>
+      <w:tr>
+        <w:trPr>
+          <w:cantSplit/>
+        </w:trPr>
+        <w:tc>
+          <w:tcPr>
+            <w:shd w:color="auto" w:fill="dae6fb" w:val="clear"/>
+            <w:tcMar>
+              <w:top w:w="92" w:type="dxa"/>
+              <w:bottom w:w="92" w:type="dxa"/>
+            </w:tcMar>
+          </w:tcPr>
+          <w:p>
+            <w:pPr>
+              <w:pStyle w:val="FirstParagraph"/>
+            </w:pPr>
+            <w:pPr>
+              <w:spacing w:before="0" w:after="0"/>
+              <w:textAlignment w:val="center"/>
+            </w:pPr>
+            <w:r>
+              <w:drawing>
+                <wp:inline>
+                  <wp:extent cx="152400" cy="152400"/>
+                  <wp:effectExtent b="0" l="0" r="0" t="0"/>
+                  <wp:docPr descr="" title="" id="108" name="Picture"/>
+                  <a:graphic>
+                    <a:graphicData uri="http://schemas.openxmlformats.org/drawingml/2006/picture">
+                      <pic:pic>
+                        <pic:nvPicPr>
+                          <pic:cNvPr descr="/opt/quarto/share/formats/docx/note.png" id="109" name="Picture"/>
+                          <pic:cNvPicPr>
+                            <a:picLocks noChangeArrowheads="1" noChangeAspect="1"/>
+                          </pic:cNvPicPr>
+                        </pic:nvPicPr>
+                        <pic:blipFill>
+                          <a:blip r:embed="rId107"/>
+                          <a:stretch>
+                            <a:fillRect/>
+                          </a:stretch>
+                        </pic:blipFill>
+                        <pic:spPr bwMode="auto">
+                          <a:xfrm>
+                            <a:off x="0" y="0"/>
+                            <a:ext cx="152400" cy="152400"/>
+                          </a:xfrm>
+                          <a:prstGeom prst="rect">
+                            <a:avLst/>
+                          </a:prstGeom>
+                          <a:noFill/>
+                          <a:ln w="9525">
+                            <a:noFill/>
+                            <a:headEnd/>
+                            <a:tailEnd/>
+                          </a:ln>
+                        </pic:spPr>
+                      </pic:pic>
+                    </a:graphicData>
+                  </a:graphic>
+                </wp:inline>
+              </w:drawing>
+            </w:r>
+            <w:r>
+              <w:t xml:space="preserve"> </w:t>
+            </w:r>
+            <w:r>
+              <w:t xml:space="preserve"> </w:t>
+            </w:r>
+            <w:r>
+              <w:t xml:space="preserve">Source</w:t>
+            </w:r>
+          </w:p>
+        </w:tc>
+      </w:tr>
+      <w:tr>
+        <w:trPr>
+          <w:cantSplit/>
+        </w:trPr>
+        <w:tc>
+          <w:tcPr>
+            <w:tcMar>
+              <w:top w:w="108" w:type="dxa"/>
+              <w:bottom w:w="108" w:type="dxa"/>
+            </w:tcMar>
+          </w:tcPr>
+          <w:p>
+            <w:pPr>
+              <w:pStyle w:val="BodyText"/>
+            </w:pPr>
+            <w:pPr>
+              <w:spacing w:before="16" w:after="16"/>
+            </w:pPr>
+            <w:r>
+              <w:t xml:space="preserve">James et al. (2021, sec. 4.7.6, p. 183)</w:t>
+            </w:r>
+            <w:r>
+              <w:t xml:space="preserve">.</w:t>
+            </w:r>
+            <w:r>
+              <w:t xml:space="preserve"> </w:t>
+            </w:r>
+            <w:r>
+              <w:t xml:space="preserve">Géron (2017, ch. 2)</w:t>
+            </w:r>
+            <w:r>
+              <w:t xml:space="preserve"> </w:t>
+            </w:r>
+            <w:r>
+              <w:t xml:space="preserve">describes the same operation but says it divides by the variance;</w:t>
+            </w:r>
+            <w:r>
+              <w:t xml:space="preserve"> </w:t>
+            </w:r>
+            <w:r>
+              <w:t xml:space="preserve">the standard deviation is used here, as in</w:t>
+            </w:r>
+            <w:r>
+              <w:t xml:space="preserve"> </w:t>
+            </w:r>
+            <w:r>
+              <w:t xml:space="preserve">James et al. (2021)</w:t>
+            </w:r>
+            <w:r>
+              <w:t xml:space="preserve">.</w:t>
+            </w:r>
+          </w:p>
+          <w:p/>
+        </w:tc>
+      </w:tr>
+    </w:tbl>
+    <w:bookmarkEnd w:id="110"/>
+    <w:bookmarkStart w:id="111" w:name="rem-standardization-units"/>
     <w:p>
       <w:pPr>
-        <w:pStyle w:val="FirstParagraph"/>
+        <w:pStyle w:val="BodyText"/>
       </w:pPr>
       <w:r>
         <w:rPr>
@@ -16597,8 +16743,8 @@
         <w:t xml:space="preserve">both become unitless numbers of standard deviations.</w:t>
       </w:r>
     </w:p>
-    <w:bookmarkEnd w:id="108"/>
-    <w:bookmarkStart w:id="109" w:name="thm-standardized-mean-sd"/>
+    <w:bookmarkEnd w:id="111"/>
+    <w:bookmarkStart w:id="114" w:name="thm-standardized-mean-sd"/>
     <w:p>
       <w:pPr>
         <w:pStyle w:val="BodyText"/>
@@ -16755,7 +16901,138 @@
         <w:t xml:space="preserve">.</w:t>
       </w:r>
     </w:p>
-    <w:bookmarkEnd w:id="109"/>
+    <w:tbl>
+      <w:tblPr>
+        <w:tblStyle w:val="Table"/>
+        <w:tblLook w:firstRow="0" w:lastRow="0" w:firstColumn="0" w:lastColumn="0" w:noHBand="0" w:noVBand="0" w:val="0000"/>
+        <w:tblBorders>
+          <w:top w:val="single" w:sz="4" w:space="0" w:color="0758E5"/>
+          <w:left w:val="single" w:sz="24" w:space="0" w:color="0758E5"/>
+          <w:bottom w:val="single" w:sz="4" w:space="0" w:color="0758E5"/>
+          <w:right w:val="single" w:sz="4" w:space="0" w:color="0758E5"/>
+        </w:tblBorders>
+        <w:tblCellMar>
+          <w:left w:w="144" w:type="dxa"/>
+          <w:right w:w="144" w:type="dxa"/>
+        </w:tblCellMar>
+        <w:tblLook w:firstRow="0" w:lastRow="0" w:firstColumn="0" w:lastColumn="0" w:noHBand="0" w:noVBand="0" w:val="0000"/>
+      </w:tblPr>
+      <w:tr>
+        <w:trPr>
+          <w:cantSplit/>
+        </w:trPr>
+        <w:tc>
+          <w:tcPr>
+            <w:shd w:color="auto" w:fill="dae6fb" w:val="clear"/>
+            <w:tcMar>
+              <w:top w:w="92" w:type="dxa"/>
+              <w:bottom w:w="92" w:type="dxa"/>
+            </w:tcMar>
+          </w:tcPr>
+          <w:p>
+            <w:pPr>
+              <w:pStyle w:val="BodyText"/>
+            </w:pPr>
+            <w:pPr>
+              <w:spacing w:before="0" w:after="0"/>
+              <w:textAlignment w:val="center"/>
+            </w:pPr>
+            <w:r>
+              <w:drawing>
+                <wp:inline>
+                  <wp:extent cx="152400" cy="152400"/>
+                  <wp:effectExtent b="0" l="0" r="0" t="0"/>
+                  <wp:docPr descr="" title="" id="112" name="Picture"/>
+                  <a:graphic>
+                    <a:graphicData uri="http://schemas.openxmlformats.org/drawingml/2006/picture">
+                      <pic:pic>
+                        <pic:nvPicPr>
+                          <pic:cNvPr descr="/opt/quarto/share/formats/docx/note.png" id="113" name="Picture"/>
+                          <pic:cNvPicPr>
+                            <a:picLocks noChangeArrowheads="1" noChangeAspect="1"/>
+                          </pic:cNvPicPr>
+                        </pic:nvPicPr>
+                        <pic:blipFill>
+                          <a:blip r:embed="rId107"/>
+                          <a:stretch>
+                            <a:fillRect/>
+                          </a:stretch>
+                        </pic:blipFill>
+                        <pic:spPr bwMode="auto">
+                          <a:xfrm>
+                            <a:off x="0" y="0"/>
+                            <a:ext cx="152400" cy="152400"/>
+                          </a:xfrm>
+                          <a:prstGeom prst="rect">
+                            <a:avLst/>
+                          </a:prstGeom>
+                          <a:noFill/>
+                          <a:ln w="9525">
+                            <a:noFill/>
+                            <a:headEnd/>
+                            <a:tailEnd/>
+                          </a:ln>
+                        </pic:spPr>
+                      </pic:pic>
+                    </a:graphicData>
+                  </a:graphic>
+                </wp:inline>
+              </w:drawing>
+            </w:r>
+            <w:r>
+              <w:t xml:space="preserve"> </w:t>
+            </w:r>
+            <w:r>
+              <w:t xml:space="preserve"> </w:t>
+            </w:r>
+            <w:r>
+              <w:t xml:space="preserve">Source</w:t>
+            </w:r>
+          </w:p>
+        </w:tc>
+      </w:tr>
+      <w:tr>
+        <w:trPr>
+          <w:cantSplit/>
+        </w:trPr>
+        <w:tc>
+          <w:tcPr>
+            <w:tcMar>
+              <w:top w:w="108" w:type="dxa"/>
+              <w:bottom w:w="108" w:type="dxa"/>
+            </w:tcMar>
+          </w:tcPr>
+          <w:p>
+            <w:pPr>
+              <w:pStyle w:val="BodyText"/>
+            </w:pPr>
+            <w:pPr>
+              <w:spacing w:before="16" w:after="16"/>
+            </w:pPr>
+            <w:r>
+              <w:t xml:space="preserve">Stated for the standardized Caravan variables in</w:t>
+            </w:r>
+            <w:r>
+              <w:t xml:space="preserve"> </w:t>
+            </w:r>
+            <w:r>
+              <w:t xml:space="preserve">James et al. (2021, sec. 4.7.6, p. 183)</w:t>
+            </w:r>
+            <w:r>
+              <w:t xml:space="preserve">;</w:t>
+            </w:r>
+            <w:r>
+              <w:t xml:space="preserve"> </w:t>
+            </w:r>
+            <w:r>
+              <w:t xml:space="preserve">the proof is the elementary calculation.</w:t>
+            </w:r>
+          </w:p>
+          <w:p/>
+        </w:tc>
+      </w:tr>
+    </w:tbl>
+    <w:bookmarkEnd w:id="114"/>
     <w:p>
       <w:pPr>
         <w:pStyle w:val="BodyText"/>
@@ -17434,7 +17711,7 @@
         <w:t xml:space="preserve">.</w:t>
       </w:r>
     </w:p>
-    <w:bookmarkStart w:id="110" w:name="exm-scale-wcgs"/>
+    <w:bookmarkStart w:id="115" w:name="exm-scale-wcgs"/>
     <w:p>
       <w:pPr>
         <w:pStyle w:val="BodyText"/>
@@ -17712,8 +17989,8 @@
         <w:t xml:space="preserve">is needed because 12 of the cholesterol values are missing.</w:t>
       </w:r>
     </w:p>
-    <w:bookmarkEnd w:id="110"/>
-    <w:bookmarkStart w:id="111" w:name="def-min-max-scaling"/>
+    <w:bookmarkEnd w:id="115"/>
+    <w:bookmarkStart w:id="118" w:name="def-min-max-scaling"/>
     <w:p>
       <w:pPr>
         <w:pStyle w:val="BodyText"/>
@@ -17996,11 +18273,130 @@
         </m:oMath>
       </m:oMathPara>
     </w:p>
-    <w:bookmarkEnd w:id="111"/>
-    <w:bookmarkStart w:id="112" w:name="rem-min-max-outliers"/>
+    <w:tbl>
+      <w:tblPr>
+        <w:tblStyle w:val="Table"/>
+        <w:tblLook w:firstRow="0" w:lastRow="0" w:firstColumn="0" w:lastColumn="0" w:noHBand="0" w:noVBand="0" w:val="0000"/>
+        <w:tblBorders>
+          <w:top w:val="single" w:sz="4" w:space="0" w:color="0758E5"/>
+          <w:left w:val="single" w:sz="24" w:space="0" w:color="0758E5"/>
+          <w:bottom w:val="single" w:sz="4" w:space="0" w:color="0758E5"/>
+          <w:right w:val="single" w:sz="4" w:space="0" w:color="0758E5"/>
+        </w:tblBorders>
+        <w:tblCellMar>
+          <w:left w:w="144" w:type="dxa"/>
+          <w:right w:w="144" w:type="dxa"/>
+        </w:tblCellMar>
+        <w:tblLook w:firstRow="0" w:lastRow="0" w:firstColumn="0" w:lastColumn="0" w:noHBand="0" w:noVBand="0" w:val="0000"/>
+      </w:tblPr>
+      <w:tr>
+        <w:trPr>
+          <w:cantSplit/>
+        </w:trPr>
+        <w:tc>
+          <w:tcPr>
+            <w:shd w:color="auto" w:fill="dae6fb" w:val="clear"/>
+            <w:tcMar>
+              <w:top w:w="92" w:type="dxa"/>
+              <w:bottom w:w="92" w:type="dxa"/>
+            </w:tcMar>
+          </w:tcPr>
+          <w:p>
+            <w:pPr>
+              <w:pStyle w:val="FirstParagraph"/>
+            </w:pPr>
+            <w:pPr>
+              <w:spacing w:before="0" w:after="0"/>
+              <w:textAlignment w:val="center"/>
+            </w:pPr>
+            <w:r>
+              <w:drawing>
+                <wp:inline>
+                  <wp:extent cx="152400" cy="152400"/>
+                  <wp:effectExtent b="0" l="0" r="0" t="0"/>
+                  <wp:docPr descr="" title="" id="116" name="Picture"/>
+                  <a:graphic>
+                    <a:graphicData uri="http://schemas.openxmlformats.org/drawingml/2006/picture">
+                      <pic:pic>
+                        <pic:nvPicPr>
+                          <pic:cNvPr descr="/opt/quarto/share/formats/docx/note.png" id="117" name="Picture"/>
+                          <pic:cNvPicPr>
+                            <a:picLocks noChangeArrowheads="1" noChangeAspect="1"/>
+                          </pic:cNvPicPr>
+                        </pic:nvPicPr>
+                        <pic:blipFill>
+                          <a:blip r:embed="rId107"/>
+                          <a:stretch>
+                            <a:fillRect/>
+                          </a:stretch>
+                        </pic:blipFill>
+                        <pic:spPr bwMode="auto">
+                          <a:xfrm>
+                            <a:off x="0" y="0"/>
+                            <a:ext cx="152400" cy="152400"/>
+                          </a:xfrm>
+                          <a:prstGeom prst="rect">
+                            <a:avLst/>
+                          </a:prstGeom>
+                          <a:noFill/>
+                          <a:ln w="9525">
+                            <a:noFill/>
+                            <a:headEnd/>
+                            <a:tailEnd/>
+                          </a:ln>
+                        </pic:spPr>
+                      </pic:pic>
+                    </a:graphicData>
+                  </a:graphic>
+                </wp:inline>
+              </w:drawing>
+            </w:r>
+            <w:r>
+              <w:t xml:space="preserve"> </w:t>
+            </w:r>
+            <w:r>
+              <w:t xml:space="preserve"> </w:t>
+            </w:r>
+            <w:r>
+              <w:t xml:space="preserve">Source</w:t>
+            </w:r>
+          </w:p>
+        </w:tc>
+      </w:tr>
+      <w:tr>
+        <w:trPr>
+          <w:cantSplit/>
+        </w:trPr>
+        <w:tc>
+          <w:tcPr>
+            <w:tcMar>
+              <w:top w:w="108" w:type="dxa"/>
+              <w:bottom w:w="108" w:type="dxa"/>
+            </w:tcMar>
+          </w:tcPr>
+          <w:p>
+            <w:pPr>
+              <w:pStyle w:val="BodyText"/>
+            </w:pPr>
+            <w:pPr>
+              <w:spacing w:before="16" w:after="16"/>
+            </w:pPr>
+            <w:r>
+              <w:t xml:space="preserve">Géron (2017, ch. 2)</w:t>
+            </w:r>
+            <w:r>
+              <w:t xml:space="preserve">.</w:t>
+            </w:r>
+          </w:p>
+          <w:p/>
+        </w:tc>
+      </w:tr>
+    </w:tbl>
+    <w:bookmarkEnd w:id="118"/>
+    <w:bookmarkStart w:id="119" w:name="rem-min-max-outliers"/>
     <w:p>
       <w:pPr>
-        <w:pStyle w:val="FirstParagraph"/>
+        <w:pStyle w:val="BodyText"/>
       </w:pPr>
       <w:r>
         <w:rPr>
@@ -18206,8 +18602,8 @@
         <w:t xml:space="preserve">.</w:t>
       </w:r>
     </w:p>
-    <w:bookmarkEnd w:id="112"/>
-    <w:bookmarkStart w:id="113" w:name="exm-min-max-wcgs"/>
+    <w:bookmarkEnd w:id="119"/>
+    <w:bookmarkStart w:id="120" w:name="exm-min-max-wcgs"/>
     <w:p>
       <w:pPr>
         <w:pStyle w:val="BodyText"/>
@@ -18446,10 +18842,10 @@
         <w:t xml:space="preserve">but have no units.</w:t>
       </w:r>
     </w:p>
-    <w:bookmarkEnd w:id="113"/>
-    <w:bookmarkEnd w:id="114"/>
-    <w:bookmarkEnd w:id="115"/>
-    <w:bookmarkStart w:id="117" w:name="an-exploratory-data-analysis-workflow"/>
+    <w:bookmarkEnd w:id="120"/>
+    <w:bookmarkEnd w:id="121"/>
+    <w:bookmarkEnd w:id="122"/>
+    <w:bookmarkStart w:id="124" w:name="an-exploratory-data-analysis-workflow"/>
     <w:p>
       <w:pPr>
         <w:pStyle w:val="Heading2"/>
@@ -18677,7 +19073,7 @@
       <w:tr>
         <w:tc>
           <w:tcPr/>
-          <w:bookmarkStart w:id="116" w:name="tbl-wcgs-all-summary"/>
+          <w:bookmarkStart w:id="123" w:name="tbl-wcgs-all-summary"/>
           <w:p>
             <w:pPr>
               <w:jc w:val="center"/>
@@ -19858,12 +20254,12 @@
               </w:tc>
             </w:tr>
           </w:tbl>
-          <w:bookmarkEnd w:id="116"/>
+          <w:bookmarkEnd w:id="123"/>
         </w:tc>
       </w:tr>
     </w:tbl>
-    <w:bookmarkEnd w:id="117"/>
-    <w:bookmarkStart w:id="124" w:name="references"/>
+    <w:bookmarkEnd w:id="124"/>
+    <w:bookmarkStart w:id="133" w:name="references"/>
     <w:p>
       <w:pPr>
         <w:pStyle w:val="Heading2"/>
@@ -19872,8 +20268,8 @@
         <w:t xml:space="preserve">References</w:t>
       </w:r>
     </w:p>
-    <w:bookmarkStart w:id="123" w:name="refs"/>
-    <w:bookmarkStart w:id="118" w:name="ref-geron2017hands"/>
+    <w:bookmarkStart w:id="132" w:name="refs"/>
+    <w:bookmarkStart w:id="125" w:name="ref-geron2017hands"/>
     <w:p>
       <w:pPr>
         <w:pStyle w:val="Bibliography"/>
@@ -19937,29 +20333,14 @@
         <w:t xml:space="preserve">. 1st ed. O’Reilly Media.</w:t>
       </w:r>
     </w:p>
-    <w:bookmarkEnd w:id="118"/>
-    <w:bookmarkStart w:id="120" w:name="ref-rosenman1975coronary"/>
+    <w:bookmarkEnd w:id="125"/>
+    <w:bookmarkStart w:id="127" w:name="ref-james2021islr2e"/>
     <w:p>
       <w:pPr>
         <w:pStyle w:val="Bibliography"/>
       </w:pPr>
       <w:r>
-        <w:t xml:space="preserve">Rosenman, Ray H, Richard J Brand, C David Jenkins, Meyer Friedman, Reuben Straus, and Moses Wurm. 1975.</w:t>
-      </w:r>
-      <w:r>
-        <w:t xml:space="preserve"> </w:t>
-      </w:r>
-      <w:r>
-        <w:t xml:space="preserve">“Coronary Heart Disease in the</w:t>
-      </w:r>
-      <w:r>
-        <w:t xml:space="preserve"> </w:t>
-      </w:r>
-      <w:r>
-        <w:t xml:space="preserve">Western Collaborative Group Study</w:t>
-      </w:r>
-      <w:r>
-        <w:t xml:space="preserve">: Final Follow-up Experience of 8 1/2 Years.”</w:t>
+        <w:t xml:space="preserve">James, Gareth, Daniela Witten, Trevor Hastie, and Robert Tibshirani. 2021.</w:t>
       </w:r>
       <w:r>
         <w:t xml:space="preserve"> </w:t>
@@ -19969,6 +20350,72 @@
           <w:i/>
           <w:iCs/>
         </w:rPr>
+        <w:t xml:space="preserve">An Introduction to Statistical Learning: With Applications in</w:t>
+      </w:r>
+      <w:r>
+        <w:rPr>
+          <w:i/>
+          <w:iCs/>
+        </w:rPr>
+        <w:t xml:space="preserve"> </w:t>
+      </w:r>
+      <w:r>
+        <w:rPr>
+          <w:i/>
+          <w:iCs/>
+        </w:rPr>
+        <w:t xml:space="preserve">R</w:t>
+      </w:r>
+      <w:r>
+        <w:t xml:space="preserve">. 2nd ed. Springer.</w:t>
+      </w:r>
+      <w:r>
+        <w:t xml:space="preserve"> </w:t>
+      </w:r>
+      <w:hyperlink r:id="rId126">
+        <w:r>
+          <w:rPr>
+            <w:rStyle w:val="Hyperlink"/>
+          </w:rPr>
+          <w:t xml:space="preserve">https://doi.org/10.1007/978-1-0716-1418-1</w:t>
+        </w:r>
+      </w:hyperlink>
+      <w:r>
+        <w:t xml:space="preserve">.</w:t>
+      </w:r>
+    </w:p>
+    <w:bookmarkEnd w:id="127"/>
+    <w:bookmarkStart w:id="129" w:name="ref-rosenman1975coronary"/>
+    <w:p>
+      <w:pPr>
+        <w:pStyle w:val="Bibliography"/>
+      </w:pPr>
+      <w:r>
+        <w:t xml:space="preserve">Rosenman, Ray H, Richard J Brand, C David Jenkins, Meyer Friedman, Reuben Straus, and Moses Wurm. 1975.</w:t>
+      </w:r>
+      <w:r>
+        <w:t xml:space="preserve"> </w:t>
+      </w:r>
+      <w:r>
+        <w:t xml:space="preserve">“Coronary Heart Disease in the</w:t>
+      </w:r>
+      <w:r>
+        <w:t xml:space="preserve"> </w:t>
+      </w:r>
+      <w:r>
+        <w:t xml:space="preserve">Western Collaborative Group Study</w:t>
+      </w:r>
+      <w:r>
+        <w:t xml:space="preserve">: Final Follow-up Experience of 8 1/2 Years.”</w:t>
+      </w:r>
+      <w:r>
+        <w:t xml:space="preserve"> </w:t>
+      </w:r>
+      <w:r>
+        <w:rPr>
+          <w:i/>
+          <w:iCs/>
+        </w:rPr>
         <w:t xml:space="preserve">JAMA</w:t>
       </w:r>
       <w:r>
@@ -19980,7 +20427,7 @@
       <w:r>
         <w:t xml:space="preserve"> </w:t>
       </w:r>
-      <w:hyperlink r:id="rId119">
+      <w:hyperlink r:id="rId128">
         <w:r>
           <w:rPr>
             <w:rStyle w:val="Hyperlink"/>
@@ -19992,8 +20439,8 @@
         <w:t xml:space="preserve">.</w:t>
       </w:r>
     </w:p>
-    <w:bookmarkEnd w:id="120"/>
-    <w:bookmarkStart w:id="122" w:name="ref-vittinghoff2e"/>
+    <w:bookmarkEnd w:id="129"/>
+    <w:bookmarkStart w:id="131" w:name="ref-vittinghoff2e"/>
     <w:p>
       <w:pPr>
         <w:pStyle w:val="Bibliography"/>
@@ -20017,7 +20464,7 @@
       <w:r>
         <w:t xml:space="preserve"> </w:t>
       </w:r>
-      <w:hyperlink r:id="rId121">
+      <w:hyperlink r:id="rId130">
         <w:r>
           <w:rPr>
             <w:rStyle w:val="Hyperlink"/>
@@ -20029,9 +20476,9 @@
         <w:t xml:space="preserve">.</w:t>
       </w:r>
     </w:p>
-    <w:bookmarkEnd w:id="122"/>
-    <w:bookmarkEnd w:id="123"/>
-    <w:bookmarkEnd w:id="124"/>
+    <w:bookmarkEnd w:id="131"/>
+    <w:bookmarkEnd w:id="132"/>
+    <w:bookmarkEnd w:id="133"/>
     <w:sectPr>
       <w:footnotePr>
         <w:numRestart w:val="eachSect"/>

</xml_diff>

<commit_message>
Deploying to gh-pages from @ Morrison-Lab/sds@930b90c741a80b9699a7b41256c9f533b3bc7c05 🚀
</commit_message>
<xml_diff>
--- a/exploratory-descriptive-handout.docx
+++ b/exploratory-descriptive-handout.docx
@@ -15,10 +15,10 @@
         <w:pStyle w:val="Date"/>
       </w:pPr>
       <w:r>
-        <w:t xml:space="preserve">Last modified: 2026-10-12 20:15:07 (PDT)</w:t>
+        <w:t xml:space="preserve">Last modified: 2026-10-12 20:28:22 (PDT)</w:t>
       </w:r>
     </w:p>
-    <w:bookmarkStart w:id="15" w:name="introduction"/>
+    <w:bookmarkStart w:id="24" w:name="introduction"/>
     <w:p>
       <w:pPr>
         <w:pStyle w:val="Heading2"/>
@@ -1912,8 +1912,1186 @@
       </w:r>
     </w:p>
     <w:bookmarkEnd w:id="14"/>
+    <w:bookmarkStart w:id="23" w:name="sec-populations-samples"/>
+    <w:p>
+      <w:pPr>
+        <w:pStyle w:val="Heading3"/>
+      </w:pPr>
+      <w:r>
+        <w:t xml:space="preserve">1.4 Populations and samples</w:t>
+      </w:r>
+    </w:p>
+    <w:bookmarkStart w:id="15" w:name="def-population"/>
+    <w:p>
+      <w:pPr>
+        <w:pStyle w:val="FirstParagraph"/>
+      </w:pPr>
+      <w:r>
+        <w:rPr>
+          <w:b/>
+          <w:bCs/>
+        </w:rPr>
+        <w:t xml:space="preserve">Definition 1 (Population)</w:t>
+      </w:r>
+      <w:r>
+        <w:t xml:space="preserve"> </w:t>
+      </w:r>
+      <w:r>
+        <w:t xml:space="preserve">A</w:t>
+      </w:r>
+      <w:r>
+        <w:t xml:space="preserve"> </w:t>
+      </w:r>
+      <w:r>
+        <w:rPr>
+          <w:b/>
+          <w:bCs/>
+        </w:rPr>
+        <w:t xml:space="preserve">population</w:t>
+      </w:r>
+      <w:r>
+        <w:t xml:space="preserve"> </w:t>
+      </w:r>
+      <w:r>
+        <w:t xml:space="preserve">is the entire collection of units</w:t>
+      </w:r>
+      <w:r>
+        <w:t xml:space="preserve"> </w:t>
+      </w:r>
+      <w:r>
+        <w:t xml:space="preserve">(people, animals, objects, or events) that a study aims to learn about.</w:t>
+      </w:r>
+    </w:p>
     <w:bookmarkEnd w:id="15"/>
-    <w:bookmarkStart w:id="39" w:name="summarizing-a-single-variable"/>
+    <w:bookmarkStart w:id="18" w:name="def-population-distribution"/>
+    <w:p>
+      <w:pPr>
+        <w:pStyle w:val="BodyText"/>
+      </w:pPr>
+      <w:r>
+        <w:rPr>
+          <w:b/>
+          <w:bCs/>
+        </w:rPr>
+        <w:t xml:space="preserve">Definition 2 (Population distribution)</w:t>
+      </w:r>
+      <w:r>
+        <w:t xml:space="preserve"> </w:t>
+      </w:r>
+      <w:r>
+        <w:t xml:space="preserve">The</w:t>
+      </w:r>
+      <w:r>
+        <w:t xml:space="preserve"> </w:t>
+      </w:r>
+      <w:r>
+        <w:rPr>
+          <w:b/>
+          <w:bCs/>
+        </w:rPr>
+        <w:t xml:space="preserve">population distribution</w:t>
+      </w:r>
+      <w:r>
+        <w:t xml:space="preserve"> </w:t>
+      </w:r>
+      <w:r>
+        <w:t xml:space="preserve">of a variable</w:t>
+      </w:r>
+      <w:r>
+        <w:t xml:space="preserve"> </w:t>
+      </w:r>
+      <m:oMath>
+        <m:r>
+          <m:t>X</m:t>
+        </m:r>
+      </m:oMath>
+      <w:r>
+        <w:t xml:space="preserve"> </w:t>
+      </w:r>
+      <w:r>
+        <w:t xml:space="preserve">is the distribution of</w:t>
+      </w:r>
+      <w:r>
+        <w:t xml:space="preserve"> </w:t>
+      </w:r>
+      <m:oMath>
+        <m:r>
+          <m:t>X</m:t>
+        </m:r>
+      </m:oMath>
+      <w:r>
+        <w:t xml:space="preserve"> </w:t>
+      </w:r>
+      <w:r>
+        <w:t xml:space="preserve">for a unit</w:t>
+      </w:r>
+      <w:r>
+        <w:t xml:space="preserve"> </w:t>
+      </w:r>
+      <w:hyperlink r:id="rId16">
+        <w:r>
+          <w:rPr>
+            <w:rStyle w:val="Hyperlink"/>
+          </w:rPr>
+          <w:t xml:space="preserve">chosen at random</w:t>
+        </w:r>
+      </w:hyperlink>
+      <w:r>
+        <w:t xml:space="preserve"> </w:t>
+      </w:r>
+      <w:r>
+        <w:t xml:space="preserve">from a population (</w:t>
+      </w:r>
+      <w:hyperlink w:anchor="def-population">
+        <w:r>
+          <w:rPr>
+            <w:rStyle w:val="Hyperlink"/>
+          </w:rPr>
+          <w:t xml:space="preserve">Definition 1</w:t>
+        </w:r>
+      </w:hyperlink>
+      <w:r>
+        <w:t xml:space="preserve">):</w:t>
+      </w:r>
+      <w:r>
+        <w:t xml:space="preserve"> </w:t>
+      </w:r>
+      <w:r>
+        <w:t xml:space="preserve">the</w:t>
+      </w:r>
+      <w:r>
+        <w:t xml:space="preserve"> </w:t>
+      </w:r>
+      <w:hyperlink r:id="rId17">
+        <w:r>
+          <w:rPr>
+            <w:rStyle w:val="Hyperlink"/>
+          </w:rPr>
+          <w:t xml:space="preserve">probability</w:t>
+        </w:r>
+      </w:hyperlink>
+      <w:r>
+        <w:t xml:space="preserve"> </w:t>
+      </w:r>
+      <w:r>
+        <w:t xml:space="preserve">that</w:t>
+      </w:r>
+      <w:r>
+        <w:t xml:space="preserve"> </w:t>
+      </w:r>
+      <m:oMath>
+        <m:r>
+          <m:t>X</m:t>
+        </m:r>
+      </m:oMath>
+      <w:r>
+        <w:t xml:space="preserve"> </w:t>
+      </w:r>
+      <w:r>
+        <w:t xml:space="preserve">falls in a set</w:t>
+      </w:r>
+      <w:r>
+        <w:t xml:space="preserve"> </w:t>
+      </w:r>
+      <m:oMath>
+        <m:r>
+          <m:t>A</m:t>
+        </m:r>
+      </m:oMath>
+      <w:r>
+        <w:t xml:space="preserve"> </w:t>
+      </w:r>
+      <w:r>
+        <w:t xml:space="preserve">is</w:t>
+      </w:r>
+    </w:p>
+    <w:p>
+      <w:pPr>
+        <w:pStyle w:val="BodyText"/>
+      </w:pPr>
+      <m:oMathPara>
+        <m:oMathParaPr>
+          <m:jc m:val="center"/>
+        </m:oMathParaPr>
+        <m:oMath>
+          <m:r>
+            <m:rPr>
+              <m:sty m:val="p"/>
+            </m:rPr>
+            <m:t>P</m:t>
+          </m:r>
+          <m:r>
+            <m:t>​</m:t>
+          </m:r>
+          <m:d>
+            <m:dPr>
+              <m:begChr m:val="("/>
+              <m:sepChr m:val=""/>
+              <m:endChr m:val=")"/>
+              <m:grow/>
+            </m:dPr>
+            <m:e>
+              <m:r>
+                <m:t>A</m:t>
+              </m:r>
+            </m:e>
+          </m:d>
+          <m:r>
+            <m:t>​</m:t>
+          </m:r>
+          <m:limUpp>
+            <m:e>
+              <m:r>
+                <m:rPr>
+                  <m:sty m:val="p"/>
+                </m:rPr>
+                <m:t>=</m:t>
+              </m:r>
+            </m:e>
+            <m:lim>
+              <m:r>
+                <m:rPr>
+                  <m:nor/>
+                  <m:sty m:val="p"/>
+                </m:rPr>
+                <m:t>def</m:t>
+              </m:r>
+            </m:lim>
+          </m:limUpp>
+          <m:r>
+            <m:rPr>
+              <m:sty m:val="p"/>
+            </m:rPr>
+            <m:t>Pr</m:t>
+          </m:r>
+          <m:r>
+            <m:rPr>
+              <m:sty m:val="p"/>
+            </m:rPr>
+            <m:t>(</m:t>
+          </m:r>
+          <m:r>
+            <m:t>X</m:t>
+          </m:r>
+          <m:r>
+            <m:rPr>
+              <m:sty m:val="p"/>
+            </m:rPr>
+            <m:t>∈</m:t>
+          </m:r>
+          <m:r>
+            <m:t>A</m:t>
+          </m:r>
+          <m:r>
+            <m:rPr>
+              <m:sty m:val="p"/>
+            </m:rPr>
+            <m:t>)</m:t>
+          </m:r>
+          <m:r>
+            <m:rPr>
+              <m:sty m:val="p"/>
+            </m:rPr>
+            <m:t>,</m:t>
+          </m:r>
+        </m:oMath>
+      </m:oMathPara>
+    </w:p>
+    <w:p>
+      <w:pPr>
+        <w:pStyle w:val="FirstParagraph"/>
+      </w:pPr>
+      <w:r>
+        <w:t xml:space="preserve">where the probability refers to the random choice of the unit.</w:t>
+      </w:r>
+    </w:p>
+    <w:bookmarkEnd w:id="18"/>
+    <w:p>
+      <w:pPr>
+        <w:pStyle w:val="BodyText"/>
+      </w:pPr>
+      <w:r>
+        <w:rPr>
+          <w:i/>
+          <w:iCs/>
+        </w:rPr>
+        <w:t xml:space="preserve">Remark</w:t>
+      </w:r>
+      <w:r>
+        <w:t xml:space="preserve">. </w:t>
+      </w:r>
+      <w:r>
+        <w:t xml:space="preserve">A population may be finite or infinite.</w:t>
+      </w:r>
+      <w:r>
+        <w:t xml:space="preserve"> </w:t>
+      </w:r>
+      <w:r>
+        <w:t xml:space="preserve">For a finite population</w:t>
+      </w:r>
+      <w:r>
+        <w:t xml:space="preserve"> </w:t>
+      </w:r>
+      <m:oMath>
+        <m:r>
+          <m:t>U</m:t>
+        </m:r>
+      </m:oMath>
+      <w:r>
+        <w:t xml:space="preserve"> </w:t>
+      </w:r>
+      <w:r>
+        <w:t xml:space="preserve">of</w:t>
+      </w:r>
+      <w:r>
+        <w:t xml:space="preserve"> </w:t>
+      </w:r>
+      <m:oMath>
+        <m:r>
+          <m:t>N</m:t>
+        </m:r>
+      </m:oMath>
+      <w:r>
+        <w:t xml:space="preserve"> </w:t>
+      </w:r>
+      <w:r>
+        <w:t xml:space="preserve">units, with</w:t>
+      </w:r>
+      <w:r>
+        <w:t xml:space="preserve"> </w:t>
+      </w:r>
+      <m:oMath>
+        <m:r>
+          <m:t>X</m:t>
+        </m:r>
+        <m:r>
+          <m:rPr>
+            <m:sty m:val="p"/>
+          </m:rPr>
+          <m:t>(</m:t>
+        </m:r>
+        <m:r>
+          <m:t>u</m:t>
+        </m:r>
+        <m:r>
+          <m:rPr>
+            <m:sty m:val="p"/>
+          </m:rPr>
+          <m:t>)</m:t>
+        </m:r>
+      </m:oMath>
+      <w:r>
+        <w:t xml:space="preserve"> </w:t>
+      </w:r>
+      <w:r>
+        <w:t xml:space="preserve">the value of</w:t>
+      </w:r>
+      <w:r>
+        <w:t xml:space="preserve"> </w:t>
+      </w:r>
+      <m:oMath>
+        <m:r>
+          <m:t>X</m:t>
+        </m:r>
+      </m:oMath>
+      <w:r>
+        <w:t xml:space="preserve"> </w:t>
+      </w:r>
+      <w:r>
+        <w:t xml:space="preserve">for unit</w:t>
+      </w:r>
+      <w:r>
+        <w:t xml:space="preserve"> </w:t>
+      </w:r>
+      <m:oMath>
+        <m:r>
+          <m:t>u</m:t>
+        </m:r>
+      </m:oMath>
+      <w:r>
+        <w:t xml:space="preserve">,</w:t>
+      </w:r>
+      <w:r>
+        <w:t xml:space="preserve"> </w:t>
+      </w:r>
+      <w:r>
+        <w:t xml:space="preserve">the random choice gives each unit probability</w:t>
+      </w:r>
+      <w:r>
+        <w:t xml:space="preserve"> </w:t>
+      </w:r>
+      <m:oMath>
+        <m:r>
+          <m:t>1</m:t>
+        </m:r>
+        <m:r>
+          <m:rPr>
+            <m:sty m:val="p"/>
+          </m:rPr>
+          <m:t>/</m:t>
+        </m:r>
+        <m:r>
+          <m:t>N</m:t>
+        </m:r>
+      </m:oMath>
+      <w:r>
+        <w:t xml:space="preserve">, so</w:t>
+      </w:r>
+    </w:p>
+    <w:p>
+      <w:pPr>
+        <w:pStyle w:val="BodyText"/>
+      </w:pPr>
+      <m:oMathPara>
+        <m:oMathParaPr>
+          <m:jc m:val="center"/>
+        </m:oMathParaPr>
+        <m:oMath>
+          <m:r>
+            <m:rPr>
+              <m:sty m:val="p"/>
+            </m:rPr>
+            <m:t>P</m:t>
+          </m:r>
+          <m:r>
+            <m:t>​</m:t>
+          </m:r>
+          <m:d>
+            <m:dPr>
+              <m:begChr m:val="("/>
+              <m:sepChr m:val=""/>
+              <m:endChr m:val=")"/>
+              <m:grow/>
+            </m:dPr>
+            <m:e>
+              <m:r>
+                <m:t>A</m:t>
+              </m:r>
+            </m:e>
+          </m:d>
+          <m:r>
+            <m:t>​</m:t>
+          </m:r>
+          <m:r>
+            <m:rPr>
+              <m:sty m:val="p"/>
+            </m:rPr>
+            <m:t>=</m:t>
+          </m:r>
+          <m:f>
+            <m:fPr>
+              <m:type m:val="bar"/>
+            </m:fPr>
+            <m:num>
+              <m:r>
+                <m:t>​</m:t>
+              </m:r>
+              <m:d>
+                <m:dPr>
+                  <m:begChr m:val="|"/>
+                  <m:sepChr m:val=""/>
+                  <m:endChr m:val="|"/>
+                  <m:grow/>
+                </m:dPr>
+                <m:e>
+                  <m:r>
+                    <m:t>​</m:t>
+                  </m:r>
+                  <m:d>
+                    <m:dPr>
+                      <m:begChr m:val="{"/>
+                      <m:sepChr m:val=""/>
+                      <m:endChr m:val="}"/>
+                      <m:grow/>
+                    </m:dPr>
+                    <m:e>
+                      <m:r>
+                        <m:t>u</m:t>
+                      </m:r>
+                      <m:r>
+                        <m:rPr>
+                          <m:sty m:val="p"/>
+                        </m:rPr>
+                        <m:t>∈</m:t>
+                      </m:r>
+                      <m:r>
+                        <m:t>U</m:t>
+                      </m:r>
+                      <m:r>
+                        <m:rPr>
+                          <m:sty m:val="p"/>
+                        </m:rPr>
+                        <m:t>:</m:t>
+                      </m:r>
+                      <m:r>
+                        <m:t>X</m:t>
+                      </m:r>
+                      <m:r>
+                        <m:rPr>
+                          <m:sty m:val="p"/>
+                        </m:rPr>
+                        <m:t>(</m:t>
+                      </m:r>
+                      <m:r>
+                        <m:t>u</m:t>
+                      </m:r>
+                      <m:r>
+                        <m:rPr>
+                          <m:sty m:val="p"/>
+                        </m:rPr>
+                        <m:t>)</m:t>
+                      </m:r>
+                      <m:r>
+                        <m:rPr>
+                          <m:sty m:val="p"/>
+                        </m:rPr>
+                        <m:t>∈</m:t>
+                      </m:r>
+                      <m:r>
+                        <m:t>A</m:t>
+                      </m:r>
+                    </m:e>
+                  </m:d>
+                  <m:r>
+                    <m:t>​</m:t>
+                  </m:r>
+                </m:e>
+              </m:d>
+              <m:r>
+                <m:t>​</m:t>
+              </m:r>
+            </m:num>
+            <m:den>
+              <m:r>
+                <m:t>N</m:t>
+              </m:r>
+            </m:den>
+          </m:f>
+          <m:r>
+            <m:rPr>
+              <m:sty m:val="p"/>
+            </m:rPr>
+            <m:t>.</m:t>
+          </m:r>
+        </m:oMath>
+      </m:oMathPara>
+    </w:p>
+    <w:p>
+      <w:pPr>
+        <w:pStyle w:val="FirstParagraph"/>
+      </w:pPr>
+      <w:r>
+        <w:t xml:space="preserve">An infinite population, such as all the coin flips a coin could ever produce,</w:t>
+      </w:r>
+      <w:r>
+        <w:t xml:space="preserve"> </w:t>
+      </w:r>
+      <w:r>
+        <w:t xml:space="preserve">is described directly by a distribution.</w:t>
+      </w:r>
+      <w:r>
+        <w:t xml:space="preserve"> </w:t>
+      </w:r>
+      <w:r>
+        <w:t xml:space="preserve">The population distribution can equally be described by its</w:t>
+      </w:r>
+      <w:r>
+        <w:t xml:space="preserve"> </w:t>
+      </w:r>
+      <w:r>
+        <w:t xml:space="preserve">cumulative distribution function</w:t>
+      </w:r>
+      <w:r>
+        <w:t xml:space="preserve"> </w:t>
+      </w:r>
+      <m:oMath>
+        <m:r>
+          <m:rPr>
+            <m:sty m:val="p"/>
+          </m:rPr>
+          <m:t>F</m:t>
+        </m:r>
+        <m:r>
+          <m:t>​</m:t>
+        </m:r>
+        <m:d>
+          <m:dPr>
+            <m:begChr m:val="("/>
+            <m:sepChr m:val=""/>
+            <m:endChr m:val=")"/>
+            <m:grow/>
+          </m:dPr>
+          <m:e>
+            <m:r>
+              <m:t>t</m:t>
+            </m:r>
+          </m:e>
+        </m:d>
+        <m:r>
+          <m:t>​</m:t>
+        </m:r>
+        <m:r>
+          <m:rPr>
+            <m:sty m:val="p"/>
+          </m:rPr>
+          <m:t>=</m:t>
+        </m:r>
+        <m:r>
+          <m:rPr>
+            <m:sty m:val="p"/>
+          </m:rPr>
+          <m:t>P</m:t>
+        </m:r>
+        <m:r>
+          <m:t>​</m:t>
+        </m:r>
+        <m:d>
+          <m:dPr>
+            <m:begChr m:val="("/>
+            <m:sepChr m:val=""/>
+            <m:endChr m:val=")"/>
+            <m:grow/>
+          </m:dPr>
+          <m:e>
+            <m:r>
+              <m:rPr>
+                <m:sty m:val="p"/>
+              </m:rPr>
+              <m:t>(</m:t>
+            </m:r>
+            <m:r>
+              <m:rPr>
+                <m:sty m:val="p"/>
+              </m:rPr>
+              <m:t>−</m:t>
+            </m:r>
+            <m:r>
+              <m:rPr>
+                <m:sty m:val="p"/>
+              </m:rPr>
+              <m:t>∞</m:t>
+            </m:r>
+            <m:r>
+              <m:rPr>
+                <m:sty m:val="p"/>
+              </m:rPr>
+              <m:t>,</m:t>
+            </m:r>
+            <m:r>
+              <m:t>t</m:t>
+            </m:r>
+            <m:r>
+              <m:rPr>
+                <m:sty m:val="p"/>
+              </m:rPr>
+              <m:t>]</m:t>
+            </m:r>
+          </m:e>
+        </m:d>
+        <m:r>
+          <m:t>​</m:t>
+        </m:r>
+      </m:oMath>
+      <w:r>
+        <w:t xml:space="preserve"> </w:t>
+      </w:r>
+      <w:r>
+        <w:t xml:space="preserve">or, when it has one, by its probability mass or density function.</w:t>
+      </w:r>
+    </w:p>
+    <w:bookmarkStart w:id="19" w:name="def-sample"/>
+    <w:p>
+      <w:pPr>
+        <w:pStyle w:val="BodyText"/>
+      </w:pPr>
+      <w:r>
+        <w:rPr>
+          <w:b/>
+          <w:bCs/>
+        </w:rPr>
+        <w:t xml:space="preserve">Definition 3 (Sample)</w:t>
+      </w:r>
+      <w:r>
+        <w:t xml:space="preserve"> </w:t>
+      </w:r>
+      <w:r>
+        <w:t xml:space="preserve">A</w:t>
+      </w:r>
+      <w:r>
+        <w:t xml:space="preserve"> </w:t>
+      </w:r>
+      <w:r>
+        <w:rPr>
+          <w:b/>
+          <w:bCs/>
+        </w:rPr>
+        <w:t xml:space="preserve">sample</w:t>
+      </w:r>
+      <w:r>
+        <w:t xml:space="preserve"> </w:t>
+      </w:r>
+      <w:r>
+        <w:t xml:space="preserve">of size</w:t>
+      </w:r>
+      <w:r>
+        <w:t xml:space="preserve"> </w:t>
+      </w:r>
+      <m:oMath>
+        <m:r>
+          <m:t>n</m:t>
+        </m:r>
+      </m:oMath>
+      <w:r>
+        <w:t xml:space="preserve"> </w:t>
+      </w:r>
+      <w:r>
+        <w:t xml:space="preserve">is the data</w:t>
+      </w:r>
+      <w:r>
+        <w:t xml:space="preserve"> </w:t>
+      </w:r>
+      <m:oMath>
+        <m:sSub>
+          <m:e>
+            <m:r>
+              <m:t>x</m:t>
+            </m:r>
+          </m:e>
+          <m:sub>
+            <m:r>
+              <m:t>1</m:t>
+            </m:r>
+          </m:sub>
+        </m:sSub>
+        <m:r>
+          <m:rPr>
+            <m:sty m:val="p"/>
+          </m:rPr>
+          <m:t>,</m:t>
+        </m:r>
+        <m:r>
+          <m:rPr>
+            <m:sty m:val="p"/>
+          </m:rPr>
+          <m:t>…</m:t>
+        </m:r>
+        <m:r>
+          <m:rPr>
+            <m:sty m:val="p"/>
+          </m:rPr>
+          <m:t>,</m:t>
+        </m:r>
+        <m:sSub>
+          <m:e>
+            <m:r>
+              <m:t>x</m:t>
+            </m:r>
+          </m:e>
+          <m:sub>
+            <m:r>
+              <m:t>n</m:t>
+            </m:r>
+          </m:sub>
+        </m:sSub>
+      </m:oMath>
+      <w:r>
+        <w:t xml:space="preserve"> </w:t>
+      </w:r>
+      <w:r>
+        <w:t xml:space="preserve">observed on</w:t>
+      </w:r>
+      <w:r>
+        <w:t xml:space="preserve"> </w:t>
+      </w:r>
+      <m:oMath>
+        <m:r>
+          <m:t>n</m:t>
+        </m:r>
+      </m:oMath>
+      <w:r>
+        <w:t xml:space="preserve"> </w:t>
+      </w:r>
+      <w:r>
+        <w:t xml:space="preserve">units drawn from a population (</w:t>
+      </w:r>
+      <w:hyperlink w:anchor="def-population">
+        <w:r>
+          <w:rPr>
+            <w:rStyle w:val="Hyperlink"/>
+          </w:rPr>
+          <w:t xml:space="preserve">Definition 1</w:t>
+        </w:r>
+      </w:hyperlink>
+      <w:r>
+        <w:t xml:space="preserve">).</w:t>
+      </w:r>
+    </w:p>
+    <w:bookmarkEnd w:id="19"/>
+    <w:bookmarkStart w:id="21" w:name="def-random-sample"/>
+    <w:p>
+      <w:pPr>
+        <w:pStyle w:val="BodyText"/>
+      </w:pPr>
+      <w:r>
+        <w:rPr>
+          <w:b/>
+          <w:bCs/>
+        </w:rPr>
+        <w:t xml:space="preserve">Definition 4 (Random sample)</w:t>
+      </w:r>
+      <w:r>
+        <w:t xml:space="preserve"> </w:t>
+      </w:r>
+      <w:r>
+        <w:t xml:space="preserve">A sample (</w:t>
+      </w:r>
+      <w:hyperlink w:anchor="def-sample">
+        <w:r>
+          <w:rPr>
+            <w:rStyle w:val="Hyperlink"/>
+          </w:rPr>
+          <w:t xml:space="preserve">Definition 3</w:t>
+        </w:r>
+      </w:hyperlink>
+      <w:r>
+        <w:t xml:space="preserve">) is a</w:t>
+      </w:r>
+      <w:r>
+        <w:t xml:space="preserve"> </w:t>
+      </w:r>
+      <w:r>
+        <w:rPr>
+          <w:b/>
+          <w:bCs/>
+        </w:rPr>
+        <w:t xml:space="preserve">random sample</w:t>
+      </w:r>
+      <w:r>
+        <w:t xml:space="preserve"> </w:t>
+      </w:r>
+      <w:r>
+        <w:t xml:space="preserve">when the units are chosen by a chance mechanism</w:t>
+      </w:r>
+      <w:r>
+        <w:t xml:space="preserve"> </w:t>
+      </w:r>
+      <w:r>
+        <w:t xml:space="preserve">such that the observations are</w:t>
+      </w:r>
+      <w:r>
+        <w:t xml:space="preserve"> </w:t>
+      </w:r>
+      <w:hyperlink r:id="rId20">
+        <w:r>
+          <w:rPr>
+            <w:rStyle w:val="Hyperlink"/>
+          </w:rPr>
+          <w:t xml:space="preserve">independent and identically distributed</w:t>
+        </w:r>
+      </w:hyperlink>
+      <w:r>
+        <w:t xml:space="preserve"> </w:t>
+      </w:r>
+      <w:r>
+        <w:t xml:space="preserve">draws from the population distribution (</w:t>
+      </w:r>
+      <w:hyperlink w:anchor="def-population-distribution">
+        <w:r>
+          <w:rPr>
+            <w:rStyle w:val="Hyperlink"/>
+          </w:rPr>
+          <w:t xml:space="preserve">Definition 2</w:t>
+        </w:r>
+      </w:hyperlink>
+      <w:r>
+        <w:t xml:space="preserve">):</w:t>
+      </w:r>
+    </w:p>
+    <w:p>
+      <w:pPr>
+        <w:pStyle w:val="BodyText"/>
+      </w:pPr>
+      <m:oMathPara>
+        <m:oMathParaPr>
+          <m:jc m:val="center"/>
+        </m:oMathParaPr>
+        <m:oMath>
+          <m:sSub>
+            <m:e>
+              <m:r>
+                <m:t>X</m:t>
+              </m:r>
+            </m:e>
+            <m:sub>
+              <m:r>
+                <m:t>1</m:t>
+              </m:r>
+            </m:sub>
+          </m:sSub>
+          <m:r>
+            <m:rPr>
+              <m:sty m:val="p"/>
+            </m:rPr>
+            <m:t>,</m:t>
+          </m:r>
+          <m:r>
+            <m:rPr>
+              <m:sty m:val="p"/>
+            </m:rPr>
+            <m:t>…</m:t>
+          </m:r>
+          <m:r>
+            <m:rPr>
+              <m:sty m:val="p"/>
+            </m:rPr>
+            <m:t>,</m:t>
+          </m:r>
+          <m:sSub>
+            <m:e>
+              <m:r>
+                <m:t>X</m:t>
+              </m:r>
+            </m:e>
+            <m:sub>
+              <m:r>
+                <m:t>n</m:t>
+              </m:r>
+            </m:sub>
+          </m:sSub>
+          <m:r>
+            <m:rPr>
+              <m:sty m:val="p"/>
+            </m:rPr>
+            <m:t>iid</m:t>
+          </m:r>
+          <m:r>
+            <m:t> </m:t>
+          </m:r>
+          <m:r>
+            <m:rPr>
+              <m:sty m:val="p"/>
+            </m:rPr>
+            <m:t>P</m:t>
+          </m:r>
+          <m:r>
+            <m:rPr>
+              <m:sty m:val="p"/>
+            </m:rPr>
+            <m:t>,</m:t>
+          </m:r>
+        </m:oMath>
+      </m:oMathPara>
+    </w:p>
+    <w:p>
+      <w:pPr>
+        <w:pStyle w:val="FirstParagraph"/>
+      </w:pPr>
+      <w:r>
+        <w:t xml:space="preserve">where</w:t>
+      </w:r>
+      <w:r>
+        <w:t xml:space="preserve"> </w:t>
+      </w:r>
+      <m:oMath>
+        <m:r>
+          <m:rPr>
+            <m:sty m:val="p"/>
+          </m:rPr>
+          <m:t>P</m:t>
+        </m:r>
+      </m:oMath>
+      <w:r>
+        <w:t xml:space="preserve"> </w:t>
+      </w:r>
+      <w:r>
+        <w:t xml:space="preserve">is the population distribution.</w:t>
+      </w:r>
+    </w:p>
+    <w:bookmarkEnd w:id="21"/>
+    <w:p>
+      <w:pPr>
+        <w:pStyle w:val="BodyText"/>
+      </w:pPr>
+      <w:r>
+        <w:rPr>
+          <w:i/>
+          <w:iCs/>
+        </w:rPr>
+        <w:t xml:space="preserve">Remark</w:t>
+      </w:r>
+      <w:r>
+        <w:t xml:space="preserve">. </w:t>
+      </w:r>
+      <w:r>
+        <w:t xml:space="preserve">Drawing without replacement from a finite population gives observations that are only approximately independent,</w:t>
+      </w:r>
+      <w:r>
+        <w:t xml:space="preserve"> </w:t>
+      </w:r>
+      <w:r>
+        <w:t xml:space="preserve">and nearly so when the population is much larger than the sample.</w:t>
+      </w:r>
+      <w:r>
+        <w:t xml:space="preserve"> </w:t>
+      </w:r>
+      <w:r>
+        <w:t xml:space="preserve">Few real studies draw a perfectly random sample,</w:t>
+      </w:r>
+      <w:r>
+        <w:t xml:space="preserve"> </w:t>
+      </w:r>
+      <w:r>
+        <w:t xml:space="preserve">so conclusions about the population rest on how well the sampling mechanism</w:t>
+      </w:r>
+      <w:r>
+        <w:t xml:space="preserve"> </w:t>
+      </w:r>
+      <w:r>
+        <w:t xml:space="preserve">approximates one.</w:t>
+      </w:r>
+    </w:p>
+    <w:bookmarkStart w:id="22" w:name="exm-population-sample-wcgs"/>
+    <w:p>
+      <w:pPr>
+        <w:pStyle w:val="BodyText"/>
+      </w:pPr>
+      <w:r>
+        <w:rPr>
+          <w:b/>
+          <w:bCs/>
+        </w:rPr>
+        <w:t xml:space="preserve">Example 1 (Population and sample in the WCGS)</w:t>
+      </w:r>
+      <w:r>
+        <w:t xml:space="preserve"> </w:t>
+      </w:r>
+      <w:r>
+        <w:t xml:space="preserve">In 1960, the WCGS recruited employed men aged 39 to 59 years in California.</w:t>
+      </w:r>
+      <w:r>
+        <w:t xml:space="preserve"> </w:t>
+      </w:r>
+      <w:r>
+        <w:t xml:space="preserve">Take that group of men as the study’s population (</w:t>
+      </w:r>
+      <w:hyperlink w:anchor="def-population">
+        <w:r>
+          <w:rPr>
+            <w:rStyle w:val="Hyperlink"/>
+          </w:rPr>
+          <w:t xml:space="preserve">Definition 1</w:t>
+        </w:r>
+      </w:hyperlink>
+      <w:r>
+        <w:t xml:space="preserve">),</w:t>
+      </w:r>
+      <w:r>
+        <w:t xml:space="preserve"> </w:t>
+      </w:r>
+      <w:r>
+        <w:t xml:space="preserve">so the population distribution (</w:t>
+      </w:r>
+      <w:hyperlink w:anchor="def-population-distribution">
+        <w:r>
+          <w:rPr>
+            <w:rStyle w:val="Hyperlink"/>
+          </w:rPr>
+          <w:t xml:space="preserve">Definition 2</w:t>
+        </w:r>
+      </w:hyperlink>
+      <w:r>
+        <w:t xml:space="preserve">) of cholesterol is its distribution among those men.</w:t>
+      </w:r>
+      <w:r>
+        <w:t xml:space="preserve"> </w:t>
+      </w:r>
+      <w:r>
+        <w:t xml:space="preserve">The</w:t>
+      </w:r>
+      <w:r>
+        <w:t xml:space="preserve"> </w:t>
+      </w:r>
+      <w:r>
+        <w:rPr>
+          <w:rStyle w:val="VerbatimChar"/>
+        </w:rPr>
+        <w:t xml:space="preserve">wcgs</w:t>
+      </w:r>
+      <w:r>
+        <w:t xml:space="preserve"> </w:t>
+      </w:r>
+      <w:r>
+        <w:t xml:space="preserve">data frame is the sample (</w:t>
+      </w:r>
+      <w:hyperlink w:anchor="def-sample">
+        <w:r>
+          <w:rPr>
+            <w:rStyle w:val="Hyperlink"/>
+          </w:rPr>
+          <w:t xml:space="preserve">Definition 3</w:t>
+        </w:r>
+      </w:hyperlink>
+      <w:r>
+        <w:t xml:space="preserve">):</w:t>
+      </w:r>
+      <w:r>
+        <w:t xml:space="preserve"> </w:t>
+      </w:r>
+      <w:r>
+        <w:t xml:space="preserve">it holds 3154 of the men in that population.</w:t>
+      </w:r>
+      <w:r>
+        <w:t xml:space="preserve"> </w:t>
+      </w:r>
+      <w:r>
+        <w:t xml:space="preserve">The men volunteered, through 10 companies,</w:t>
+      </w:r>
+      <w:r>
+        <w:t xml:space="preserve"> </w:t>
+      </w:r>
+      <w:r>
+        <w:t xml:space="preserve">so the sample is not a random sample (</w:t>
+      </w:r>
+      <w:hyperlink w:anchor="def-random-sample">
+        <w:r>
+          <w:rPr>
+            <w:rStyle w:val="Hyperlink"/>
+          </w:rPr>
+          <w:t xml:space="preserve">Definition 4</w:t>
+        </w:r>
+      </w:hyperlink>
+      <w:r>
+        <w:t xml:space="preserve">) of the population.</w:t>
+      </w:r>
+      <w:r>
+        <w:t xml:space="preserve"> </w:t>
+      </w:r>
+      <w:r>
+        <w:t xml:space="preserve">Its mean cholesterol, 226.4 mg/dL,</w:t>
+      </w:r>
+      <w:r>
+        <w:t xml:space="preserve"> </w:t>
+      </w:r>
+      <w:r>
+        <w:t xml:space="preserve">describes these 3154 men exactly,</w:t>
+      </w:r>
+      <w:r>
+        <w:t xml:space="preserve"> </w:t>
+      </w:r>
+      <w:r>
+        <w:t xml:space="preserve">but it estimates the population mean well</w:t>
+      </w:r>
+      <w:r>
+        <w:t xml:space="preserve"> </w:t>
+      </w:r>
+      <w:r>
+        <w:t xml:space="preserve">only to the extent that the volunteers resemble the rest of the population.</w:t>
+      </w:r>
+    </w:p>
+    <w:bookmarkEnd w:id="22"/>
+    <w:bookmarkEnd w:id="23"/>
+    <w:bookmarkEnd w:id="24"/>
+    <w:bookmarkStart w:id="48" w:name="summarizing-a-single-variable"/>
     <w:p>
       <w:pPr>
         <w:pStyle w:val="Heading2"/>
@@ -1922,7 +3100,7 @@
         <w:t xml:space="preserve">2 Summarizing a single variable</w:t>
       </w:r>
     </w:p>
-    <w:bookmarkStart w:id="21" w:name="measures-of-center"/>
+    <w:bookmarkStart w:id="30" w:name="measures-of-center"/>
     <w:p>
       <w:pPr>
         <w:pStyle w:val="Heading3"/>
@@ -1931,7 +3109,7 @@
         <w:t xml:space="preserve">2.1 Measures of center</w:t>
       </w:r>
     </w:p>
-    <w:bookmarkStart w:id="16" w:name="def-sample-mean"/>
+    <w:bookmarkStart w:id="25" w:name="def-sample-mean"/>
     <w:p>
       <w:pPr>
         <w:pStyle w:val="FirstParagraph"/>
@@ -1941,7 +3119,7 @@
           <w:b/>
           <w:bCs/>
         </w:rPr>
-        <w:t xml:space="preserve">Definition 1 (Sample mean)</w:t>
+        <w:t xml:space="preserve">Definition 5 (Sample mean)</w:t>
       </w:r>
       <w:r>
         <w:t xml:space="preserve"> </w:t>
@@ -2130,8 +3308,8 @@
         </m:oMath>
       </m:oMathPara>
     </w:p>
-    <w:bookmarkEnd w:id="16"/>
-    <w:bookmarkStart w:id="17" w:name="exm-sample-mean"/>
+    <w:bookmarkEnd w:id="25"/>
+    <w:bookmarkStart w:id="26" w:name="exm-sample-mean"/>
     <w:p>
       <w:pPr>
         <w:pStyle w:val="FirstParagraph"/>
@@ -2141,7 +3319,7 @@
           <w:b/>
           <w:bCs/>
         </w:rPr>
-        <w:t xml:space="preserve">Example 1 (Mean cholesterol in the WCGS)</w:t>
+        <w:t xml:space="preserve">Example 2 (Mean cholesterol in the WCGS)</w:t>
       </w:r>
       <w:r>
         <w:t xml:space="preserve"> </w:t>
@@ -2239,8 +3417,8 @@
         <w:t xml:space="preserve">#&gt; [1] 226.372</w:t>
       </w:r>
     </w:p>
-    <w:bookmarkEnd w:id="17"/>
-    <w:bookmarkStart w:id="19" w:name="def-sample-median"/>
+    <w:bookmarkEnd w:id="26"/>
+    <w:bookmarkStart w:id="28" w:name="def-sample-median"/>
     <w:p>
       <w:pPr>
         <w:pStyle w:val="FirstParagraph"/>
@@ -2250,7 +3428,7 @@
           <w:b/>
           <w:bCs/>
         </w:rPr>
-        <w:t xml:space="preserve">Definition 2 (Sample median)</w:t>
+        <w:t xml:space="preserve">Definition 6 (Sample median)</w:t>
       </w:r>
       <w:r>
         <w:t xml:space="preserve"> </w:t>
@@ -2289,7 +3467,7 @@
       <w:r>
         <w:t xml:space="preserve"> </w:t>
       </w:r>
-      <w:hyperlink r:id="rId18">
+      <w:hyperlink r:id="rId27">
         <w:r>
           <w:rPr>
             <w:rStyle w:val="Hyperlink"/>
@@ -2606,8 +3784,8 @@
         <w:t xml:space="preserve">.</w:t>
       </w:r>
     </w:p>
-    <w:bookmarkEnd w:id="19"/>
-    <w:bookmarkStart w:id="20" w:name="exm-sample-median"/>
+    <w:bookmarkEnd w:id="28"/>
+    <w:bookmarkStart w:id="29" w:name="exm-sample-median"/>
     <w:p>
       <w:pPr>
         <w:pStyle w:val="FirstParagraph"/>
@@ -2617,7 +3795,7 @@
           <w:b/>
           <w:bCs/>
         </w:rPr>
-        <w:t xml:space="preserve">Example 2 (Median cholesterol in the WCGS)</w:t>
+        <w:t xml:space="preserve">Example 3 (Median cholesterol in the WCGS)</w:t>
       </w:r>
       <w:r>
         <w:t xml:space="preserve"> </w:t>
@@ -2706,7 +3884,7 @@
           <w:rPr>
             <w:rStyle w:val="Hyperlink"/>
           </w:rPr>
-          <w:t xml:space="preserve">Example 1</w:t>
+          <w:t xml:space="preserve">Example 2</w:t>
         </w:r>
       </w:hyperlink>
       <w:r>
@@ -2743,9 +3921,9 @@
         <w:t xml:space="preserve">A median is less sensitive to extreme values than a mean.</w:t>
       </w:r>
     </w:p>
-    <w:bookmarkEnd w:id="20"/>
-    <w:bookmarkEnd w:id="21"/>
-    <w:bookmarkStart w:id="32" w:name="measures-of-spread"/>
+    <w:bookmarkEnd w:id="29"/>
+    <w:bookmarkEnd w:id="30"/>
+    <w:bookmarkStart w:id="41" w:name="measures-of-spread"/>
     <w:p>
       <w:pPr>
         <w:pStyle w:val="Heading3"/>
@@ -2754,7 +3932,7 @@
         <w:t xml:space="preserve">2.2 Measures of spread</w:t>
       </w:r>
     </w:p>
-    <w:bookmarkStart w:id="22" w:name="def-sample-variance"/>
+    <w:bookmarkStart w:id="31" w:name="def-sample-variance"/>
     <w:p>
       <w:pPr>
         <w:pStyle w:val="FirstParagraph"/>
@@ -2764,7 +3942,7 @@
           <w:b/>
           <w:bCs/>
         </w:rPr>
-        <w:t xml:space="preserve">Definition 3 (Sample variance)</w:t>
+        <w:t xml:space="preserve">Definition 7 (Sample variance)</w:t>
       </w:r>
       <w:r>
         <w:t xml:space="preserve"> </w:t>
@@ -2957,8 +4135,8 @@
         </m:oMath>
       </m:oMathPara>
     </w:p>
-    <w:bookmarkEnd w:id="22"/>
-    <w:bookmarkStart w:id="23" w:name="def-sample-sd"/>
+    <w:bookmarkEnd w:id="31"/>
+    <w:bookmarkStart w:id="32" w:name="def-sample-sd"/>
     <w:p>
       <w:pPr>
         <w:pStyle w:val="FirstParagraph"/>
@@ -2968,7 +4146,7 @@
           <w:b/>
           <w:bCs/>
         </w:rPr>
-        <w:t xml:space="preserve">Definition 4 (Sample standard deviation)</w:t>
+        <w:t xml:space="preserve">Definition 8 (Sample standard deviation)</w:t>
       </w:r>
       <w:r>
         <w:t xml:space="preserve"> </w:t>
@@ -3061,8 +4239,8 @@
         </m:oMath>
       </m:oMathPara>
     </w:p>
-    <w:bookmarkEnd w:id="23"/>
-    <w:bookmarkStart w:id="24" w:name="rem-sd-units"/>
+    <w:bookmarkEnd w:id="32"/>
+    <w:bookmarkStart w:id="33" w:name="rem-sd-units"/>
     <w:p>
       <w:pPr>
         <w:pStyle w:val="FirstParagraph"/>
@@ -3093,8 +4271,8 @@
         <w:t xml:space="preserve">whose units are squared.</w:t>
       </w:r>
     </w:p>
-    <w:bookmarkEnd w:id="24"/>
-    <w:bookmarkStart w:id="25" w:name="exm-sample-sd"/>
+    <w:bookmarkEnd w:id="33"/>
+    <w:bookmarkStart w:id="34" w:name="exm-sample-sd"/>
     <w:p>
       <w:pPr>
         <w:pStyle w:val="BodyText"/>
@@ -3104,7 +4282,7 @@
           <w:b/>
           <w:bCs/>
         </w:rPr>
-        <w:t xml:space="preserve">Example 3 (Variance and standard deviation of cholesterol in the WCGS)</w:t>
+        <w:t xml:space="preserve">Example 4 (Variance and standard deviation of cholesterol in the WCGS)</w:t>
       </w:r>
       <w:r>
         <w:t xml:space="preserve"> </w:t>
@@ -3264,8 +4442,8 @@
         <w:t xml:space="preserve">like the cholesterol values themselves.</w:t>
       </w:r>
     </w:p>
-    <w:bookmarkEnd w:id="25"/>
-    <w:bookmarkStart w:id="27" w:name="def-quartiles"/>
+    <w:bookmarkEnd w:id="34"/>
+    <w:bookmarkStart w:id="36" w:name="def-quartiles"/>
     <w:p>
       <w:pPr>
         <w:pStyle w:val="BodyText"/>
@@ -3275,7 +4453,7 @@
           <w:b/>
           <w:bCs/>
         </w:rPr>
-        <w:t xml:space="preserve">Definition 5 (Quartiles)</w:t>
+        <w:t xml:space="preserve">Definition 9 (Quartiles)</w:t>
       </w:r>
       <w:r>
         <w:t xml:space="preserve"> </w:t>
@@ -3355,7 +4533,7 @@
       <w:r>
         <w:t xml:space="preserve">(</w:t>
       </w:r>
-      <w:hyperlink r:id="rId26">
+      <w:hyperlink r:id="rId35">
         <w:r>
           <w:rPr>
             <w:rStyle w:val="Hyperlink"/>
@@ -3373,8 +4551,8 @@
         <w:t xml:space="preserve">also called the 25th and 75th percentiles.</w:t>
       </w:r>
     </w:p>
-    <w:bookmarkEnd w:id="27"/>
-    <w:bookmarkStart w:id="29" w:name="rem-quartile-software"/>
+    <w:bookmarkEnd w:id="36"/>
+    <w:bookmarkStart w:id="38" w:name="rem-quartile-software"/>
     <w:p>
       <w:pPr>
         <w:pStyle w:val="BodyText"/>
@@ -3442,7 +4620,7 @@
       <w:r>
         <w:t xml:space="preserve">(</w:t>
       </w:r>
-      <w:hyperlink r:id="rId28">
+      <w:hyperlink r:id="rId37">
         <w:r>
           <w:rPr>
             <w:rStyle w:val="Hyperlink"/>
@@ -3493,8 +4671,8 @@
         <w:t xml:space="preserve">, interpolates.</w:t>
       </w:r>
     </w:p>
-    <w:bookmarkEnd w:id="29"/>
-    <w:bookmarkStart w:id="30" w:name="def-IQR"/>
+    <w:bookmarkEnd w:id="38"/>
+    <w:bookmarkStart w:id="39" w:name="def-IQR"/>
     <w:p>
       <w:pPr>
         <w:pStyle w:val="BodyText"/>
@@ -3504,7 +4682,7 @@
           <w:b/>
           <w:bCs/>
         </w:rPr>
-        <w:t xml:space="preserve">Definition 6 (Interquartile range)</w:t>
+        <w:t xml:space="preserve">Definition 10 (Interquartile range)</w:t>
       </w:r>
       <w:r>
         <w:t xml:space="preserve"> </w:t>
@@ -3617,8 +4795,8 @@
         </m:oMath>
       </m:oMathPara>
     </w:p>
-    <w:bookmarkEnd w:id="30"/>
-    <w:bookmarkStart w:id="31" w:name="exm-IQR"/>
+    <w:bookmarkEnd w:id="39"/>
+    <w:bookmarkStart w:id="40" w:name="exm-IQR"/>
     <w:p>
       <w:pPr>
         <w:pStyle w:val="FirstParagraph"/>
@@ -3628,7 +4806,7 @@
           <w:b/>
           <w:bCs/>
         </w:rPr>
-        <w:t xml:space="preserve">Example 4 (Quartiles and IQR of cholesterol in the WCGS)</w:t>
+        <w:t xml:space="preserve">Example 5 (Quartiles and IQR of cholesterol in the WCGS)</w:t>
       </w:r>
       <w:r>
         <w:t xml:space="preserve"> </w:t>
@@ -3890,9 +5068,9 @@
         <w:t xml:space="preserve">so it is less sensitive to outliers than the standard deviation.</w:t>
       </w:r>
     </w:p>
-    <w:bookmarkEnd w:id="31"/>
-    <w:bookmarkEnd w:id="32"/>
-    <w:bookmarkStart w:id="34" w:name="summary-statistics-in-r"/>
+    <w:bookmarkEnd w:id="40"/>
+    <w:bookmarkEnd w:id="41"/>
+    <w:bookmarkStart w:id="43" w:name="summary-statistics-in-r"/>
     <w:p>
       <w:pPr>
         <w:pStyle w:val="Heading3"/>
@@ -3958,7 +5136,7 @@
           <w:rPr>
             <w:rStyle w:val="Hyperlink"/>
           </w:rPr>
-          <w:t xml:space="preserve">Definition 5</w:t>
+          <w:t xml:space="preserve">Definition 9</w:t>
         </w:r>
       </w:hyperlink>
       <w:r>
@@ -4059,7 +5237,7 @@
       <w:tr>
         <w:tc>
           <w:tcPr/>
-          <w:bookmarkStart w:id="33" w:name="tbl-wcgs-summary-continuous"/>
+          <w:bookmarkStart w:id="42" w:name="tbl-wcgs-summary-continuous"/>
           <w:p>
             <w:pPr>
               <w:jc w:val="center"/>
@@ -4786,12 +5964,12 @@
               </w:tc>
             </w:tr>
           </w:tbl>
-          <w:bookmarkEnd w:id="33"/>
+          <w:bookmarkEnd w:id="42"/>
         </w:tc>
       </w:tr>
     </w:tbl>
-    <w:bookmarkEnd w:id="34"/>
-    <w:bookmarkStart w:id="38" w:name="binary-and-categorical-variables"/>
+    <w:bookmarkEnd w:id="43"/>
+    <w:bookmarkStart w:id="47" w:name="binary-and-categorical-variables"/>
     <w:p>
       <w:pPr>
         <w:pStyle w:val="Heading3"/>
@@ -4800,7 +5978,7 @@
         <w:t xml:space="preserve">2.4 Binary and categorical variables</w:t>
       </w:r>
     </w:p>
-    <w:bookmarkStart w:id="35" w:name="def-sample-proportion"/>
+    <w:bookmarkStart w:id="44" w:name="def-sample-proportion"/>
     <w:p>
       <w:pPr>
         <w:pStyle w:val="FirstParagraph"/>
@@ -4810,7 +5988,7 @@
           <w:b/>
           <w:bCs/>
         </w:rPr>
-        <w:t xml:space="preserve">Definition 7 (Sample proportion)</w:t>
+        <w:t xml:space="preserve">Definition 11 (Sample proportion)</w:t>
       </w:r>
       <w:r>
         <w:t xml:space="preserve"> </w:t>
@@ -4939,8 +6117,8 @@
         <w:t xml:space="preserve">is the number of observations.</w:t>
       </w:r>
     </w:p>
-    <w:bookmarkEnd w:id="35"/>
-    <w:bookmarkStart w:id="36" w:name="exm-sample-proportion"/>
+    <w:bookmarkEnd w:id="44"/>
+    <w:bookmarkStart w:id="45" w:name="exm-sample-proportion"/>
     <w:p>
       <w:pPr>
         <w:pStyle w:val="BodyText"/>
@@ -4950,7 +6128,7 @@
           <w:b/>
           <w:bCs/>
         </w:rPr>
-        <w:t xml:space="preserve">Example 5 (Proportion of WCGS participants with a CHD event)</w:t>
+        <w:t xml:space="preserve">Example 6 (Proportion of WCGS participants with a CHD event)</w:t>
       </w:r>
       <w:r>
         <w:t xml:space="preserve"> </w:t>
@@ -5101,7 +6279,7 @@
         <w:t xml:space="preserve">0.081.</w:t>
       </w:r>
     </w:p>
-    <w:bookmarkEnd w:id="36"/>
+    <w:bookmarkEnd w:id="45"/>
     <w:p>
       <w:pPr>
         <w:pStyle w:val="BodyText"/>
@@ -5152,7 +6330,7 @@
       <w:tr>
         <w:tc>
           <w:tcPr/>
-          <w:bookmarkStart w:id="37" w:name="tbl-wcgs-summary-cat"/>
+          <w:bookmarkStart w:id="46" w:name="tbl-wcgs-summary-cat"/>
           <w:p>
             <w:pPr>
               <w:jc w:val="center"/>
@@ -6147,13 +7325,13 @@
               </w:tc>
             </w:tr>
           </w:tbl>
-          <w:bookmarkEnd w:id="37"/>
+          <w:bookmarkEnd w:id="46"/>
         </w:tc>
       </w:tr>
     </w:tbl>
-    <w:bookmarkEnd w:id="38"/>
-    <w:bookmarkEnd w:id="39"/>
-    <w:bookmarkStart w:id="72" w:name="graphical-methods"/>
+    <w:bookmarkEnd w:id="47"/>
+    <w:bookmarkEnd w:id="48"/>
+    <w:bookmarkStart w:id="81" w:name="graphical-methods"/>
     <w:p>
       <w:pPr>
         <w:pStyle w:val="Heading2"/>
@@ -6188,7 +7366,7 @@
         <w:t xml:space="preserve">Different types of graph suit different types of variable.</w:t>
       </w:r>
     </w:p>
-    <w:bookmarkStart w:id="46" w:name="histograms"/>
+    <w:bookmarkStart w:id="55" w:name="histograms"/>
     <w:p>
       <w:pPr>
         <w:pStyle w:val="Heading3"/>
@@ -6197,7 +7375,7 @@
         <w:t xml:space="preserve">3.1 Histograms</w:t>
       </w:r>
     </w:p>
-    <w:bookmarkStart w:id="40" w:name="def-histogram"/>
+    <w:bookmarkStart w:id="49" w:name="def-histogram"/>
     <w:p>
       <w:pPr>
         <w:pStyle w:val="FirstParagraph"/>
@@ -6207,7 +7385,7 @@
           <w:b/>
           <w:bCs/>
         </w:rPr>
-        <w:t xml:space="preserve">Definition 8 (Histogram)</w:t>
+        <w:t xml:space="preserve">Definition 12 (Histogram)</w:t>
       </w:r>
       <w:r>
         <w:t xml:space="preserve"> </w:t>
@@ -6250,8 +7428,8 @@
         <w:t xml:space="preserve">whose height is the number (or proportion) of observations in that interval.</w:t>
       </w:r>
     </w:p>
-    <w:bookmarkEnd w:id="40"/>
-    <w:bookmarkStart w:id="41" w:name="def-bin"/>
+    <w:bookmarkEnd w:id="49"/>
+    <w:bookmarkStart w:id="50" w:name="def-bin"/>
     <w:p>
       <w:pPr>
         <w:pStyle w:val="BodyText"/>
@@ -6261,7 +7439,7 @@
           <w:b/>
           <w:bCs/>
         </w:rPr>
-        <w:t xml:space="preserve">Definition 9 (Bin)</w:t>
+        <w:t xml:space="preserve">Definition 13 (Bin)</w:t>
       </w:r>
       <w:r>
         <w:t xml:space="preserve"> </w:t>
@@ -6286,7 +7464,7 @@
         <w:t xml:space="preserve">of a histogram is one of its intervals.</w:t>
       </w:r>
     </w:p>
-    <w:bookmarkEnd w:id="41"/>
+    <w:bookmarkEnd w:id="50"/>
     <w:tbl>
       <w:tblPr>
         <w:tblStyle w:val="Table"/>
@@ -6300,7 +7478,7 @@
       <w:tr>
         <w:tc>
           <w:tcPr/>
-          <w:bookmarkStart w:id="45" w:name="fig-hist-chol"/>
+          <w:bookmarkStart w:id="54" w:name="fig-hist-chol"/>
           <w:p>
             <w:pPr>
               <w:pStyle w:val="SourceCode"/>
@@ -6586,18 +7764,18 @@
                 <wp:inline>
                   <wp:extent cx="4620126" cy="3696101"/>
                   <wp:effectExtent b="0" l="0" r="0" t="0"/>
-                  <wp:docPr descr="" title="" id="43" name="Picture"/>
+                  <wp:docPr descr="" title="" id="52" name="Picture"/>
                   <a:graphic>
                     <a:graphicData uri="http://schemas.openxmlformats.org/drawingml/2006/picture">
                       <pic:pic>
                         <pic:nvPicPr>
-                          <pic:cNvPr descr="exploratory-descriptive_files/figure-docx/unnamed-chunk-8-1.png" id="44" name="Picture"/>
+                          <pic:cNvPr descr="exploratory-descriptive_files/figure-docx/unnamed-chunk-8-1.png" id="53" name="Picture"/>
                           <pic:cNvPicPr>
                             <a:picLocks noChangeArrowheads="1" noChangeAspect="1"/>
                           </pic:cNvPicPr>
                         </pic:nvPicPr>
                         <pic:blipFill>
-                          <a:blip r:embed="rId42"/>
+                          <a:blip r:embed="rId51"/>
                           <a:stretch>
                             <a:fillRect/>
                           </a:stretch>
@@ -6637,7 +7815,7 @@
               <w:t xml:space="preserve">Figure 1: Histogram of total cholesterol in the WCGS dataset</w:t>
             </w:r>
           </w:p>
-          <w:bookmarkEnd w:id="45"/>
+          <w:bookmarkEnd w:id="54"/>
         </w:tc>
       </w:tr>
     </w:tbl>
@@ -6684,8 +7862,8 @@
         <w:t xml:space="preserve">but the largest value is 645 mg/dL.</w:t>
       </w:r>
     </w:p>
-    <w:bookmarkEnd w:id="46"/>
-    <w:bookmarkStart w:id="52" w:name="density-plots"/>
+    <w:bookmarkEnd w:id="55"/>
+    <w:bookmarkStart w:id="61" w:name="density-plots"/>
     <w:p>
       <w:pPr>
         <w:pStyle w:val="Heading3"/>
@@ -6694,7 +7872,7 @@
         <w:t xml:space="preserve">3.2 Density plots</w:t>
       </w:r>
     </w:p>
-    <w:bookmarkStart w:id="47" w:name="def-density-plot"/>
+    <w:bookmarkStart w:id="56" w:name="def-density-plot"/>
     <w:p>
       <w:pPr>
         <w:pStyle w:val="FirstParagraph"/>
@@ -6704,7 +7882,7 @@
           <w:b/>
           <w:bCs/>
         </w:rPr>
-        <w:t xml:space="preserve">Definition 10 (Density plot)</w:t>
+        <w:t xml:space="preserve">Definition 14 (Density plot)</w:t>
       </w:r>
       <w:r>
         <w:t xml:space="preserve"> </w:t>
@@ -6741,7 +7919,7 @@
         <w:t xml:space="preserve">scaled so that the area under the curve is 1.</w:t>
       </w:r>
     </w:p>
-    <w:bookmarkEnd w:id="47"/>
+    <w:bookmarkEnd w:id="56"/>
     <w:tbl>
       <w:tblPr>
         <w:tblStyle w:val="Table"/>
@@ -6755,7 +7933,7 @@
       <w:tr>
         <w:tc>
           <w:tcPr/>
-          <w:bookmarkStart w:id="51" w:name="fig-density-chol"/>
+          <w:bookmarkStart w:id="60" w:name="fig-density-chol"/>
           <w:p>
             <w:pPr>
               <w:pStyle w:val="SourceCode"/>
@@ -7017,18 +8195,18 @@
                 <wp:inline>
                   <wp:extent cx="4620126" cy="3696101"/>
                   <wp:effectExtent b="0" l="0" r="0" t="0"/>
-                  <wp:docPr descr="" title="" id="49" name="Picture"/>
+                  <wp:docPr descr="" title="" id="58" name="Picture"/>
                   <a:graphic>
                     <a:graphicData uri="http://schemas.openxmlformats.org/drawingml/2006/picture">
                       <pic:pic>
                         <pic:nvPicPr>
-                          <pic:cNvPr descr="exploratory-descriptive_files/figure-docx/unnamed-chunk-9-1.png" id="50" name="Picture"/>
+                          <pic:cNvPr descr="exploratory-descriptive_files/figure-docx/unnamed-chunk-9-1.png" id="59" name="Picture"/>
                           <pic:cNvPicPr>
                             <a:picLocks noChangeArrowheads="1" noChangeAspect="1"/>
                           </pic:cNvPicPr>
                         </pic:nvPicPr>
                         <pic:blipFill>
-                          <a:blip r:embed="rId48"/>
+                          <a:blip r:embed="rId57"/>
                           <a:stretch>
                             <a:fillRect/>
                           </a:stretch>
@@ -7068,12 +8246,12 @@
               <w:t xml:space="preserve">Figure 2: Density plot of total cholesterol in the WCGS dataset</w:t>
             </w:r>
           </w:p>
-          <w:bookmarkEnd w:id="51"/>
+          <w:bookmarkEnd w:id="60"/>
         </w:tc>
       </w:tr>
     </w:tbl>
-    <w:bookmarkEnd w:id="52"/>
-    <w:bookmarkStart w:id="59" w:name="box-plots"/>
+    <w:bookmarkEnd w:id="61"/>
+    <w:bookmarkStart w:id="68" w:name="box-plots"/>
     <w:p>
       <w:pPr>
         <w:pStyle w:val="Heading3"/>
@@ -7082,7 +8260,7 @@
         <w:t xml:space="preserve">3.3 Box plots</w:t>
       </w:r>
     </w:p>
-    <w:bookmarkStart w:id="53" w:name="def-boxplot"/>
+    <w:bookmarkStart w:id="62" w:name="def-boxplot"/>
     <w:p>
       <w:pPr>
         <w:pStyle w:val="FirstParagraph"/>
@@ -7092,7 +8270,7 @@
           <w:b/>
           <w:bCs/>
         </w:rPr>
-        <w:t xml:space="preserve">Definition 11 (Box plot)</w:t>
+        <w:t xml:space="preserve">Definition 15 (Box plot)</w:t>
       </w:r>
       <w:r>
         <w:t xml:space="preserve"> </w:t>
@@ -7258,8 +8436,8 @@
         <w:t xml:space="preserve">as potential outliers.</w:t>
       </w:r>
     </w:p>
-    <w:bookmarkEnd w:id="53"/>
-    <w:bookmarkStart w:id="54" w:name="rem-whisker-rule"/>
+    <w:bookmarkEnd w:id="62"/>
+    <w:bookmarkStart w:id="63" w:name="rem-whisker-rule"/>
     <w:p>
       <w:pPr>
         <w:pStyle w:val="FirstParagraph"/>
@@ -7344,7 +8522,7 @@
         <w:t xml:space="preserve">such as whiskers that run to the minimum and maximum.</w:t>
       </w:r>
     </w:p>
-    <w:bookmarkEnd w:id="54"/>
+    <w:bookmarkEnd w:id="63"/>
     <w:tbl>
       <w:tblPr>
         <w:tblStyle w:val="Table"/>
@@ -7358,7 +8536,7 @@
       <w:tr>
         <w:tc>
           <w:tcPr/>
-          <w:bookmarkStart w:id="58" w:name="fig-box-chol"/>
+          <w:bookmarkStart w:id="67" w:name="fig-box-chol"/>
           <w:p>
             <w:pPr>
               <w:pStyle w:val="SourceCode"/>
@@ -7635,18 +8813,18 @@
                 <wp:inline>
                   <wp:extent cx="4620126" cy="3696101"/>
                   <wp:effectExtent b="0" l="0" r="0" t="0"/>
-                  <wp:docPr descr="" title="" id="56" name="Picture"/>
+                  <wp:docPr descr="" title="" id="65" name="Picture"/>
                   <a:graphic>
                     <a:graphicData uri="http://schemas.openxmlformats.org/drawingml/2006/picture">
                       <pic:pic>
                         <pic:nvPicPr>
-                          <pic:cNvPr descr="exploratory-descriptive_files/figure-docx/unnamed-chunk-10-1.png" id="57" name="Picture"/>
+                          <pic:cNvPr descr="exploratory-descriptive_files/figure-docx/unnamed-chunk-10-1.png" id="66" name="Picture"/>
                           <pic:cNvPicPr>
                             <a:picLocks noChangeArrowheads="1" noChangeAspect="1"/>
                           </pic:cNvPicPr>
                         </pic:nvPicPr>
                         <pic:blipFill>
-                          <a:blip r:embed="rId55"/>
+                          <a:blip r:embed="rId64"/>
                           <a:stretch>
                             <a:fillRect/>
                           </a:stretch>
@@ -7686,12 +8864,12 @@
               <w:t xml:space="preserve">Figure 3: Box plot of total cholesterol in the WCGS dataset</w:t>
             </w:r>
           </w:p>
-          <w:bookmarkEnd w:id="58"/>
+          <w:bookmarkEnd w:id="67"/>
         </w:tc>
       </w:tr>
     </w:tbl>
-    <w:bookmarkEnd w:id="59"/>
-    <w:bookmarkStart w:id="65" w:name="bar-charts"/>
+    <w:bookmarkEnd w:id="68"/>
+    <w:bookmarkStart w:id="74" w:name="bar-charts"/>
     <w:p>
       <w:pPr>
         <w:pStyle w:val="Heading3"/>
@@ -7700,7 +8878,7 @@
         <w:t xml:space="preserve">3.4 Bar charts</w:t>
       </w:r>
     </w:p>
-    <w:bookmarkStart w:id="60" w:name="def-bar-chart"/>
+    <w:bookmarkStart w:id="69" w:name="def-bar-chart"/>
     <w:p>
       <w:pPr>
         <w:pStyle w:val="FirstParagraph"/>
@@ -7710,7 +8888,7 @@
           <w:b/>
           <w:bCs/>
         </w:rPr>
-        <w:t xml:space="preserve">Definition 12 (Bar chart)</w:t>
+        <w:t xml:space="preserve">Definition 16 (Bar chart)</w:t>
       </w:r>
       <w:r>
         <w:t xml:space="preserve"> </w:t>
@@ -7747,7 +8925,7 @@
         <w:t xml:space="preserve">as one bar per category.</w:t>
       </w:r>
     </w:p>
-    <w:bookmarkEnd w:id="60"/>
+    <w:bookmarkEnd w:id="69"/>
     <w:tbl>
       <w:tblPr>
         <w:tblStyle w:val="Table"/>
@@ -7761,7 +8939,7 @@
       <w:tr>
         <w:tc>
           <w:tcPr/>
-          <w:bookmarkStart w:id="64" w:name="fig-bar-behpat"/>
+          <w:bookmarkStart w:id="73" w:name="fig-bar-behpat"/>
           <w:p>
             <w:pPr>
               <w:pStyle w:val="SourceCode"/>
@@ -7999,18 +9177,18 @@
                 <wp:inline>
                   <wp:extent cx="4620126" cy="3696101"/>
                   <wp:effectExtent b="0" l="0" r="0" t="0"/>
-                  <wp:docPr descr="" title="" id="62" name="Picture"/>
+                  <wp:docPr descr="" title="" id="71" name="Picture"/>
                   <a:graphic>
                     <a:graphicData uri="http://schemas.openxmlformats.org/drawingml/2006/picture">
                       <pic:pic>
                         <pic:nvPicPr>
-                          <pic:cNvPr descr="exploratory-descriptive_files/figure-docx/unnamed-chunk-11-1.png" id="63" name="Picture"/>
+                          <pic:cNvPr descr="exploratory-descriptive_files/figure-docx/unnamed-chunk-11-1.png" id="72" name="Picture"/>
                           <pic:cNvPicPr>
                             <a:picLocks noChangeArrowheads="1" noChangeAspect="1"/>
                           </pic:cNvPicPr>
                         </pic:nvPicPr>
                         <pic:blipFill>
-                          <a:blip r:embed="rId61"/>
+                          <a:blip r:embed="rId70"/>
                           <a:stretch>
                             <a:fillRect/>
                           </a:stretch>
@@ -8050,12 +9228,12 @@
               <w:t xml:space="preserve">Figure 4: Bar chart of behavioral pattern in the WCGS dataset</w:t>
             </w:r>
           </w:p>
-          <w:bookmarkEnd w:id="64"/>
+          <w:bookmarkEnd w:id="73"/>
         </w:tc>
       </w:tr>
     </w:tbl>
-    <w:bookmarkEnd w:id="65"/>
-    <w:bookmarkStart w:id="71" w:name="normal-quantile-quantile-plots"/>
+    <w:bookmarkEnd w:id="74"/>
+    <w:bookmarkStart w:id="80" w:name="normal-quantile-quantile-plots"/>
     <w:p>
       <w:pPr>
         <w:pStyle w:val="Heading3"/>
@@ -8064,7 +9242,7 @@
         <w:t xml:space="preserve">3.5 Normal quantile-quantile plots</w:t>
       </w:r>
     </w:p>
-    <w:bookmarkStart w:id="66" w:name="def-qq-plot"/>
+    <w:bookmarkStart w:id="75" w:name="def-qq-plot"/>
     <w:p>
       <w:pPr>
         <w:pStyle w:val="FirstParagraph"/>
@@ -8074,7 +9252,7 @@
           <w:b/>
           <w:bCs/>
         </w:rPr>
-        <w:t xml:space="preserve">Definition 13 (Normal quantile-quantile plot)</w:t>
+        <w:t xml:space="preserve">Definition 17 (Normal quantile-quantile plot)</w:t>
       </w:r>
       <w:r>
         <w:t xml:space="preserve"> </w:t>
@@ -8104,7 +9282,7 @@
       <w:r>
         <w:t xml:space="preserve">(</w:t>
       </w:r>
-      <w:hyperlink r:id="rId18">
+      <w:hyperlink r:id="rId27">
         <w:r>
           <w:rPr>
             <w:rStyle w:val="Hyperlink"/>
@@ -8134,7 +9312,7 @@
         <w:t xml:space="preserve">the points fall close to a straight line.</w:t>
       </w:r>
     </w:p>
-    <w:bookmarkEnd w:id="66"/>
+    <w:bookmarkEnd w:id="75"/>
     <w:tbl>
       <w:tblPr>
         <w:tblStyle w:val="Table"/>
@@ -8148,7 +9326,7 @@
       <w:tr>
         <w:tc>
           <w:tcPr/>
-          <w:bookmarkStart w:id="70" w:name="fig-qq-chol"/>
+          <w:bookmarkStart w:id="79" w:name="fig-qq-chol"/>
           <w:p>
             <w:pPr>
               <w:pStyle w:val="SourceCode"/>
@@ -8419,18 +9597,18 @@
                 <wp:inline>
                   <wp:extent cx="4620126" cy="3696101"/>
                   <wp:effectExtent b="0" l="0" r="0" t="0"/>
-                  <wp:docPr descr="" title="" id="68" name="Picture"/>
+                  <wp:docPr descr="" title="" id="77" name="Picture"/>
                   <a:graphic>
                     <a:graphicData uri="http://schemas.openxmlformats.org/drawingml/2006/picture">
                       <pic:pic>
                         <pic:nvPicPr>
-                          <pic:cNvPr descr="exploratory-descriptive_files/figure-docx/unnamed-chunk-12-1.png" id="69" name="Picture"/>
+                          <pic:cNvPr descr="exploratory-descriptive_files/figure-docx/unnamed-chunk-12-1.png" id="78" name="Picture"/>
                           <pic:cNvPicPr>
                             <a:picLocks noChangeArrowheads="1" noChangeAspect="1"/>
                           </pic:cNvPicPr>
                         </pic:nvPicPr>
                         <pic:blipFill>
-                          <a:blip r:embed="rId67"/>
+                          <a:blip r:embed="rId76"/>
                           <a:stretch>
                             <a:fillRect/>
                           </a:stretch>
@@ -8470,7 +9648,7 @@
               <w:t xml:space="preserve">Figure 5: Normal Q-Q plot for total cholesterol in the WCGS dataset</w:t>
             </w:r>
           </w:p>
-          <w:bookmarkEnd w:id="70"/>
+          <w:bookmarkEnd w:id="79"/>
         </w:tc>
       </w:tr>
     </w:tbl>
@@ -8516,9 +9694,9 @@
         <w:t xml:space="preserve">.</w:t>
       </w:r>
     </w:p>
-    <w:bookmarkEnd w:id="71"/>
-    <w:bookmarkEnd w:id="72"/>
-    <w:bookmarkStart w:id="99" w:name="bivariate-relationships"/>
+    <w:bookmarkEnd w:id="80"/>
+    <w:bookmarkEnd w:id="81"/>
+    <w:bookmarkStart w:id="108" w:name="bivariate-relationships"/>
     <w:p>
       <w:pPr>
         <w:pStyle w:val="Heading2"/>
@@ -8527,7 +9705,7 @@
         <w:t xml:space="preserve">4 Bivariate relationships</w:t>
       </w:r>
     </w:p>
-    <w:bookmarkStart w:id="84" w:name="two-continuous-variables"/>
+    <w:bookmarkStart w:id="93" w:name="two-continuous-variables"/>
     <w:p>
       <w:pPr>
         <w:pStyle w:val="Heading3"/>
@@ -8536,7 +9714,7 @@
         <w:t xml:space="preserve">4.1 Two continuous variables</w:t>
       </w:r>
     </w:p>
-    <w:bookmarkStart w:id="73" w:name="def-scatterplot"/>
+    <w:bookmarkStart w:id="82" w:name="def-scatterplot"/>
     <w:p>
       <w:pPr>
         <w:pStyle w:val="FirstParagraph"/>
@@ -8546,7 +9724,7 @@
           <w:b/>
           <w:bCs/>
         </w:rPr>
-        <w:t xml:space="preserve">Definition 14 (Scatter plot)</w:t>
+        <w:t xml:space="preserve">Definition 18 (Scatter plot)</w:t>
       </w:r>
       <w:r>
         <w:t xml:space="preserve"> </w:t>
@@ -8583,7 +9761,7 @@
         <w:t xml:space="preserve">with one variable on each axis.</w:t>
       </w:r>
     </w:p>
-    <w:bookmarkEnd w:id="73"/>
+    <w:bookmarkEnd w:id="82"/>
     <w:tbl>
       <w:tblPr>
         <w:tblStyle w:val="Table"/>
@@ -8597,7 +9775,7 @@
       <w:tr>
         <w:tc>
           <w:tcPr/>
-          <w:bookmarkStart w:id="77" w:name="fig-scatter-chol-sbp"/>
+          <w:bookmarkStart w:id="86" w:name="fig-scatter-chol-sbp"/>
           <w:p>
             <w:pPr>
               <w:pStyle w:val="SourceCode"/>
@@ -8952,18 +10130,18 @@
                 <wp:inline>
                   <wp:extent cx="4620126" cy="3696101"/>
                   <wp:effectExtent b="0" l="0" r="0" t="0"/>
-                  <wp:docPr descr="" title="" id="75" name="Picture"/>
+                  <wp:docPr descr="" title="" id="84" name="Picture"/>
                   <a:graphic>
                     <a:graphicData uri="http://schemas.openxmlformats.org/drawingml/2006/picture">
                       <pic:pic>
                         <pic:nvPicPr>
-                          <pic:cNvPr descr="exploratory-descriptive_files/figure-docx/unnamed-chunk-13-1.png" id="76" name="Picture"/>
+                          <pic:cNvPr descr="exploratory-descriptive_files/figure-docx/unnamed-chunk-13-1.png" id="85" name="Picture"/>
                           <pic:cNvPicPr>
                             <a:picLocks noChangeArrowheads="1" noChangeAspect="1"/>
                           </pic:cNvPicPr>
                         </pic:nvPicPr>
                         <pic:blipFill>
-                          <a:blip r:embed="rId74"/>
+                          <a:blip r:embed="rId83"/>
                           <a:stretch>
                             <a:fillRect/>
                           </a:stretch>
@@ -9009,11 +10187,11 @@
               <w:t xml:space="preserve">with a least-squares line</w:t>
             </w:r>
           </w:p>
-          <w:bookmarkEnd w:id="77"/>
+          <w:bookmarkEnd w:id="86"/>
         </w:tc>
       </w:tr>
     </w:tbl>
-    <w:bookmarkStart w:id="78" w:name="def-pearson-r"/>
+    <w:bookmarkStart w:id="87" w:name="def-pearson-r"/>
     <w:p>
       <w:pPr>
         <w:pStyle w:val="BodyText"/>
@@ -9023,7 +10201,7 @@
           <w:b/>
           <w:bCs/>
         </w:rPr>
-        <w:t xml:space="preserve">Definition 15 (Pearson correlation coefficient)</w:t>
+        <w:t xml:space="preserve">Definition 19 (Pearson correlation coefficient)</w:t>
       </w:r>
       <w:r>
         <w:t xml:space="preserve"> </w:t>
@@ -9513,8 +10691,8 @@
         <w:t xml:space="preserve">so that both sums of squares are positive.</w:t>
       </w:r>
     </w:p>
-    <w:bookmarkEnd w:id="78"/>
-    <w:bookmarkStart w:id="79" w:name="thm-pearson-r-range"/>
+    <w:bookmarkEnd w:id="87"/>
+    <w:bookmarkStart w:id="88" w:name="thm-pearson-r-range"/>
     <w:p>
       <w:pPr>
         <w:pStyle w:val="BodyText"/>
@@ -9685,7 +10863,7 @@
         <w:t xml:space="preserve">if and only if they lie on a straight line with negative slope.</w:t>
       </w:r>
     </w:p>
-    <w:bookmarkEnd w:id="79"/>
+    <w:bookmarkEnd w:id="88"/>
     <w:p>
       <w:pPr>
         <w:pStyle w:val="BodyText"/>
@@ -10829,7 +12007,7 @@
         <w:t xml:space="preserve">.</w:t>
       </w:r>
     </w:p>
-    <w:bookmarkStart w:id="80" w:name="exm-pearson-r"/>
+    <w:bookmarkStart w:id="89" w:name="exm-pearson-r"/>
     <w:p>
       <w:pPr>
         <w:pStyle w:val="BodyText"/>
@@ -10839,7 +12017,7 @@
           <w:b/>
           <w:bCs/>
         </w:rPr>
-        <w:t xml:space="preserve">Example 6 (Correlation between cholesterol and blood pressure in the WCGS)</w:t>
+        <w:t xml:space="preserve">Example 7 (Correlation between cholesterol and blood pressure in the WCGS)</w:t>
       </w:r>
       <w:r>
         <w:t xml:space="preserve"> </w:t>
@@ -10968,7 +12146,7 @@
         <w:t xml:space="preserve">.</w:t>
       </w:r>
     </w:p>
-    <w:bookmarkEnd w:id="80"/>
+    <w:bookmarkEnd w:id="89"/>
     <w:tbl>
       <w:tblPr>
         <w:tblStyle w:val="Table"/>
@@ -11010,18 +12188,18 @@
                 <wp:inline>
                   <wp:extent cx="152400" cy="152400"/>
                   <wp:effectExtent b="0" l="0" r="0" t="0"/>
-                  <wp:docPr descr="" title="" id="82" name="Picture"/>
+                  <wp:docPr descr="" title="" id="91" name="Picture"/>
                   <a:graphic>
                     <a:graphicData uri="http://schemas.openxmlformats.org/drawingml/2006/picture">
                       <pic:pic>
                         <pic:nvPicPr>
-                          <pic:cNvPr descr="/opt/quarto/share/formats/docx/caution.png" id="83" name="Picture"/>
+                          <pic:cNvPr descr="/opt/quarto/share/formats/docx/caution.png" id="92" name="Picture"/>
                           <pic:cNvPicPr>
                             <a:picLocks noChangeArrowheads="1" noChangeAspect="1"/>
                           </pic:cNvPicPr>
                         </pic:nvPicPr>
                         <pic:blipFill>
-                          <a:blip r:embed="rId81"/>
+                          <a:blip r:embed="rId90"/>
                           <a:stretch>
                             <a:fillRect/>
                           </a:stretch>
@@ -11277,8 +12455,8 @@
         </w:tc>
       </w:tr>
     </w:tbl>
-    <w:bookmarkEnd w:id="84"/>
-    <w:bookmarkStart w:id="94" w:name="X276b94a7d03810956e9ce51874e5dad5aed6d75"/>
+    <w:bookmarkEnd w:id="93"/>
+    <w:bookmarkStart w:id="103" w:name="X276b94a7d03810956e9ce51874e5dad5aed6d75"/>
     <w:p>
       <w:pPr>
         <w:pStyle w:val="Heading3"/>
@@ -11365,7 +12543,7 @@
       <w:tr>
         <w:tc>
           <w:tcPr/>
-          <w:bookmarkStart w:id="88" w:name="fig-box-chol-by-smoke"/>
+          <w:bookmarkStart w:id="97" w:name="fig-box-chol-by-smoke"/>
           <w:p>
             <w:pPr>
               <w:pStyle w:val="SourceCode"/>
@@ -11660,18 +12838,18 @@
                 <wp:inline>
                   <wp:extent cx="4620126" cy="3696101"/>
                   <wp:effectExtent b="0" l="0" r="0" t="0"/>
-                  <wp:docPr descr="" title="" id="86" name="Picture"/>
+                  <wp:docPr descr="" title="" id="95" name="Picture"/>
                   <a:graphic>
                     <a:graphicData uri="http://schemas.openxmlformats.org/drawingml/2006/picture">
                       <pic:pic>
                         <pic:nvPicPr>
-                          <pic:cNvPr descr="exploratory-descriptive_files/figure-docx/unnamed-chunk-14-1.png" id="87" name="Picture"/>
+                          <pic:cNvPr descr="exploratory-descriptive_files/figure-docx/unnamed-chunk-14-1.png" id="96" name="Picture"/>
                           <pic:cNvPicPr>
                             <a:picLocks noChangeArrowheads="1" noChangeAspect="1"/>
                           </pic:cNvPicPr>
                         </pic:nvPicPr>
                         <pic:blipFill>
-                          <a:blip r:embed="rId85"/>
+                          <a:blip r:embed="rId94"/>
                           <a:stretch>
                             <a:fillRect/>
                           </a:stretch>
@@ -11711,7 +12889,7 @@
               <w:t xml:space="preserve">Figure 7: Box plots of cholesterol by smoking status in the WCGS dataset</w:t>
             </w:r>
           </w:p>
-          <w:bookmarkEnd w:id="88"/>
+          <w:bookmarkEnd w:id="97"/>
         </w:tc>
       </w:tr>
     </w:tbl>
@@ -11729,7 +12907,7 @@
       <w:tr>
         <w:tc>
           <w:tcPr/>
-          <w:bookmarkStart w:id="92" w:name="fig-box-chol-by-behpat"/>
+          <w:bookmarkStart w:id="101" w:name="fig-box-chol-by-behpat"/>
           <w:p>
             <w:pPr>
               <w:pStyle w:val="SourceCode"/>
@@ -12024,18 +13202,18 @@
                 <wp:inline>
                   <wp:extent cx="4620126" cy="3696101"/>
                   <wp:effectExtent b="0" l="0" r="0" t="0"/>
-                  <wp:docPr descr="" title="" id="90" name="Picture"/>
+                  <wp:docPr descr="" title="" id="99" name="Picture"/>
                   <a:graphic>
                     <a:graphicData uri="http://schemas.openxmlformats.org/drawingml/2006/picture">
                       <pic:pic>
                         <pic:nvPicPr>
-                          <pic:cNvPr descr="exploratory-descriptive_files/figure-docx/unnamed-chunk-15-1.png" id="91" name="Picture"/>
+                          <pic:cNvPr descr="exploratory-descriptive_files/figure-docx/unnamed-chunk-15-1.png" id="100" name="Picture"/>
                           <pic:cNvPicPr>
                             <a:picLocks noChangeArrowheads="1" noChangeAspect="1"/>
                           </pic:cNvPicPr>
                         </pic:nvPicPr>
                         <pic:blipFill>
-                          <a:blip r:embed="rId89"/>
+                          <a:blip r:embed="rId98"/>
                           <a:stretch>
                             <a:fillRect/>
                           </a:stretch>
@@ -12075,7 +13253,7 @@
               <w:t xml:space="preserve">Figure 8: Box plots of cholesterol by behavioral pattern in the WCGS dataset</w:t>
             </w:r>
           </w:p>
-          <w:bookmarkEnd w:id="92"/>
+          <w:bookmarkEnd w:id="101"/>
         </w:tc>
       </w:tr>
     </w:tbl>
@@ -12111,7 +13289,7 @@
       <w:tr>
         <w:tc>
           <w:tcPr/>
-          <w:bookmarkStart w:id="93" w:name="tbl-chol-by-chd"/>
+          <w:bookmarkStart w:id="102" w:name="tbl-chol-by-chd"/>
           <w:p>
             <w:pPr>
               <w:jc w:val="center"/>
@@ -13052,12 +14230,12 @@
               </w:tc>
             </w:tr>
           </w:tbl>
-          <w:bookmarkEnd w:id="93"/>
+          <w:bookmarkEnd w:id="102"/>
         </w:tc>
       </w:tr>
     </w:tbl>
-    <w:bookmarkEnd w:id="94"/>
-    <w:bookmarkStart w:id="98" w:name="two-categorical-variables"/>
+    <w:bookmarkEnd w:id="103"/>
+    <w:bookmarkStart w:id="107" w:name="two-categorical-variables"/>
     <w:p>
       <w:pPr>
         <w:pStyle w:val="Heading3"/>
@@ -13066,7 +14244,7 @@
         <w:t xml:space="preserve">4.3 Two categorical variables</w:t>
       </w:r>
     </w:p>
-    <w:bookmarkStart w:id="95" w:name="def-contingency-table"/>
+    <w:bookmarkStart w:id="104" w:name="def-contingency-table"/>
     <w:p>
       <w:pPr>
         <w:pStyle w:val="FirstParagraph"/>
@@ -13076,7 +14254,7 @@
           <w:b/>
           <w:bCs/>
         </w:rPr>
-        <w:t xml:space="preserve">Definition 16 (Contingency table)</w:t>
+        <w:t xml:space="preserve">Definition 20 (Contingency table)</w:t>
       </w:r>
       <w:r>
         <w:t xml:space="preserve"> </w:t>
@@ -13495,8 +14673,8 @@
         </w:tc>
       </w:tr>
     </w:tbl>
-    <w:bookmarkEnd w:id="95"/>
-    <w:bookmarkStart w:id="97" w:name="exm-contingency-table"/>
+    <w:bookmarkEnd w:id="104"/>
+    <w:bookmarkStart w:id="106" w:name="exm-contingency-table"/>
     <w:p>
       <w:pPr>
         <w:pStyle w:val="BodyText"/>
@@ -13506,7 +14684,7 @@
           <w:b/>
           <w:bCs/>
         </w:rPr>
-        <w:t xml:space="preserve">Example 7 (Smoking and CHD in the WCGS)</w:t>
+        <w:t xml:space="preserve">Example 8 (Smoking and CHD in the WCGS)</w:t>
       </w:r>
       <w:r>
         <w:t xml:space="preserve"> </w:t>
@@ -13820,7 +14998,7 @@
       <w:tr>
         <w:tc>
           <w:tcPr/>
-          <w:bookmarkStart w:id="96" w:name="tbl-gtsummary-smoke-chd"/>
+          <w:bookmarkStart w:id="105" w:name="tbl-gtsummary-smoke-chd"/>
           <w:p>
             <w:pPr>
               <w:jc w:val="center"/>
@@ -14293,14 +15471,14 @@
               </w:tc>
             </w:tr>
           </w:tbl>
-          <w:bookmarkEnd w:id="96"/>
+          <w:bookmarkEnd w:id="105"/>
         </w:tc>
       </w:tr>
     </w:tbl>
-    <w:bookmarkEnd w:id="97"/>
-    <w:bookmarkEnd w:id="98"/>
-    <w:bookmarkEnd w:id="99"/>
-    <w:bookmarkStart w:id="126" w:name="data-transformations"/>
+    <w:bookmarkEnd w:id="106"/>
+    <w:bookmarkEnd w:id="107"/>
+    <w:bookmarkEnd w:id="108"/>
+    <w:bookmarkStart w:id="135" w:name="data-transformations"/>
     <w:p>
       <w:pPr>
         <w:pStyle w:val="Heading2"/>
@@ -14609,7 +15787,7 @@
         <w:t xml:space="preserve">.</w:t>
       </w:r>
     </w:p>
-    <w:bookmarkStart w:id="108" w:name="fig-hist-sbp-log"/>
+    <w:bookmarkStart w:id="117" w:name="fig-hist-sbp-log"/>
     <w:tbl>
       <w:tblPr>
         <w:tblStyle w:val="Table"/>
@@ -14637,7 +15815,7 @@
             <w:tr>
               <w:tc>
                 <w:tcPr/>
-                <w:bookmarkStart w:id="103" w:name="fig-hist-sbp-raw"/>
+                <w:bookmarkStart w:id="112" w:name="fig-hist-sbp-raw"/>
                 <w:p>
                   <w:pPr>
                     <w:pStyle w:val="SourceCode"/>
@@ -14925,18 +16103,18 @@
                       <wp:inline>
                         <wp:extent cx="2971800" cy="2377440"/>
                         <wp:effectExtent b="0" l="0" r="0" t="0"/>
-                        <wp:docPr descr="" title="" id="101" name="Picture"/>
+                        <wp:docPr descr="" title="" id="110" name="Picture"/>
                         <a:graphic>
                           <a:graphicData uri="http://schemas.openxmlformats.org/drawingml/2006/picture">
                             <pic:pic>
                               <pic:nvPicPr>
-                                <pic:cNvPr descr="exploratory-descriptive_files/figure-docx/unnamed-chunk-18-1.png" id="102" name="Picture"/>
+                                <pic:cNvPr descr="exploratory-descriptive_files/figure-docx/unnamed-chunk-18-1.png" id="111" name="Picture"/>
                                 <pic:cNvPicPr>
                                   <a:picLocks noChangeArrowheads="1" noChangeAspect="1"/>
                                 </pic:cNvPicPr>
                               </pic:nvPicPr>
                               <pic:blipFill>
-                                <a:blip r:embed="rId100"/>
+                                <a:blip r:embed="rId109"/>
                                 <a:stretch>
                                   <a:fillRect/>
                                 </a:stretch>
@@ -14977,7 +16155,7 @@
                     <w:t xml:space="preserve">(a) Raw scale</w:t>
                   </w:r>
                 </w:p>
-                <w:bookmarkEnd w:id="103"/>
+                <w:bookmarkEnd w:id="112"/>
               </w:tc>
             </w:tr>
           </w:tbl>
@@ -15027,7 +16205,7 @@
             <w:tr>
               <w:tc>
                 <w:tcPr/>
-                <w:bookmarkStart w:id="107" w:name="fig-hist-sbp-logscale"/>
+                <w:bookmarkStart w:id="116" w:name="fig-hist-sbp-logscale"/>
                 <w:p>
                   <w:pPr>
                     <w:pStyle w:val="SourceCode"/>
@@ -15315,18 +16493,18 @@
                       <wp:inline>
                         <wp:extent cx="2971800" cy="2377440"/>
                         <wp:effectExtent b="0" l="0" r="0" t="0"/>
-                        <wp:docPr descr="" title="" id="105" name="Picture"/>
+                        <wp:docPr descr="" title="" id="114" name="Picture"/>
                         <a:graphic>
                           <a:graphicData uri="http://schemas.openxmlformats.org/drawingml/2006/picture">
                             <pic:pic>
                               <pic:nvPicPr>
-                                <pic:cNvPr descr="exploratory-descriptive_files/figure-docx/unnamed-chunk-19-1.png" id="106" name="Picture"/>
+                                <pic:cNvPr descr="exploratory-descriptive_files/figure-docx/unnamed-chunk-19-1.png" id="115" name="Picture"/>
                                 <pic:cNvPicPr>
                                   <a:picLocks noChangeArrowheads="1" noChangeAspect="1"/>
                                 </pic:cNvPicPr>
                               </pic:nvPicPr>
                               <pic:blipFill>
-                                <a:blip r:embed="rId104"/>
+                                <a:blip r:embed="rId113"/>
                                 <a:stretch>
                                   <a:fillRect/>
                                 </a:stretch>
@@ -15367,7 +16545,7 @@
                     <w:t xml:space="preserve">(b) Log scale</w:t>
                   </w:r>
                 </w:p>
-                <w:bookmarkEnd w:id="107"/>
+                <w:bookmarkEnd w:id="116"/>
               </w:tc>
             </w:tr>
           </w:tbl>
@@ -15387,7 +16565,7 @@
         <w:t xml:space="preserve">Figure 9: Distribution of systolic blood pressure in the WCGS, on two scales</w:t>
       </w:r>
     </w:p>
-    <w:bookmarkEnd w:id="108"/>
+    <w:bookmarkEnd w:id="117"/>
     <w:p>
       <w:pPr>
         <w:pStyle w:val="SourceCode"/>
@@ -15776,7 +16954,7 @@
         <w:t xml:space="preserve">the assumptions of that model and on the scientific question.</w:t>
       </w:r>
     </w:p>
-    <w:bookmarkStart w:id="125" w:name="sec-rescaling"/>
+    <w:bookmarkStart w:id="134" w:name="sec-rescaling"/>
     <w:p>
       <w:pPr>
         <w:pStyle w:val="Heading3"/>
@@ -15785,7 +16963,7 @@
         <w:t xml:space="preserve">5.1 Rescaling a variable</w:t>
       </w:r>
     </w:p>
-    <w:bookmarkStart w:id="109" w:name="exr-standardize"/>
+    <w:bookmarkStart w:id="118" w:name="exr-standardize"/>
     <w:p>
       <w:pPr>
         <w:pStyle w:val="FirstParagraph"/>
@@ -15894,8 +17072,8 @@
         <w:t xml:space="preserve">What are the units of your answer to part 2?</w:t>
       </w:r>
     </w:p>
-    <w:bookmarkEnd w:id="109"/>
-    <w:bookmarkStart w:id="110" w:name="sol-standardize"/>
+    <w:bookmarkEnd w:id="118"/>
+    <w:bookmarkStart w:id="119" w:name="sol-standardize"/>
     <w:p>
       <w:pPr>
         <w:pStyle w:val="FirstParagraph"/>
@@ -16279,8 +17457,8 @@
         <w:t xml:space="preserve">so the answer has no units.</w:t>
       </w:r>
     </w:p>
-    <w:bookmarkEnd w:id="110"/>
-    <w:bookmarkStart w:id="114" w:name="def-standardization"/>
+    <w:bookmarkEnd w:id="119"/>
+    <w:bookmarkStart w:id="123" w:name="def-standardization"/>
     <w:p>
       <w:pPr>
         <w:pStyle w:val="FirstParagraph"/>
@@ -16290,7 +17468,7 @@
           <w:b/>
           <w:bCs/>
         </w:rPr>
-        <w:t xml:space="preserve">Definition 17 (Standardization)</w:t>
+        <w:t xml:space="preserve">Definition 21 (Standardization)</w:t>
       </w:r>
       <w:r>
         <w:t xml:space="preserve"> </w:t>
@@ -16613,18 +17791,18 @@
                 <wp:inline>
                   <wp:extent cx="152400" cy="152400"/>
                   <wp:effectExtent b="0" l="0" r="0" t="0"/>
-                  <wp:docPr descr="" title="" id="112" name="Picture"/>
+                  <wp:docPr descr="" title="" id="121" name="Picture"/>
                   <a:graphic>
                     <a:graphicData uri="http://schemas.openxmlformats.org/drawingml/2006/picture">
                       <pic:pic>
                         <pic:nvPicPr>
-                          <pic:cNvPr descr="/opt/quarto/share/formats/docx/note.png" id="113" name="Picture"/>
+                          <pic:cNvPr descr="/opt/quarto/share/formats/docx/note.png" id="122" name="Picture"/>
                           <pic:cNvPicPr>
                             <a:picLocks noChangeArrowheads="1" noChangeAspect="1"/>
                           </pic:cNvPicPr>
                         </pic:nvPicPr>
                         <pic:blipFill>
-                          <a:blip r:embed="rId111"/>
+                          <a:blip r:embed="rId120"/>
                           <a:stretch>
                             <a:fillRect/>
                           </a:stretch>
@@ -16718,8 +17896,8 @@
         </w:tc>
       </w:tr>
     </w:tbl>
-    <w:bookmarkEnd w:id="114"/>
-    <w:bookmarkStart w:id="115" w:name="rem-standardization-units"/>
+    <w:bookmarkEnd w:id="123"/>
+    <w:bookmarkStart w:id="124" w:name="rem-standardization-units"/>
     <w:p>
       <w:pPr>
         <w:pStyle w:val="BodyText"/>
@@ -16794,8 +17972,8 @@
         <w:t xml:space="preserve">both become unitless numbers of standard deviations.</w:t>
       </w:r>
     </w:p>
-    <w:bookmarkEnd w:id="115"/>
-    <w:bookmarkStart w:id="118" w:name="thm-standardized-mean-sd"/>
+    <w:bookmarkEnd w:id="124"/>
+    <w:bookmarkStart w:id="127" w:name="thm-standardized-mean-sd"/>
     <w:p>
       <w:pPr>
         <w:pStyle w:val="BodyText"/>
@@ -16993,18 +18171,18 @@
                 <wp:inline>
                   <wp:extent cx="152400" cy="152400"/>
                   <wp:effectExtent b="0" l="0" r="0" t="0"/>
-                  <wp:docPr descr="" title="" id="116" name="Picture"/>
+                  <wp:docPr descr="" title="" id="125" name="Picture"/>
                   <a:graphic>
                     <a:graphicData uri="http://schemas.openxmlformats.org/drawingml/2006/picture">
                       <pic:pic>
                         <pic:nvPicPr>
-                          <pic:cNvPr descr="/opt/quarto/share/formats/docx/note.png" id="117" name="Picture"/>
+                          <pic:cNvPr descr="/opt/quarto/share/formats/docx/note.png" id="126" name="Picture"/>
                           <pic:cNvPicPr>
                             <a:picLocks noChangeArrowheads="1" noChangeAspect="1"/>
                           </pic:cNvPicPr>
                         </pic:nvPicPr>
                         <pic:blipFill>
-                          <a:blip r:embed="rId111"/>
+                          <a:blip r:embed="rId120"/>
                           <a:stretch>
                             <a:fillRect/>
                           </a:stretch>
@@ -17083,7 +18261,7 @@
         </w:tc>
       </w:tr>
     </w:tbl>
-    <w:bookmarkEnd w:id="118"/>
+    <w:bookmarkEnd w:id="127"/>
     <w:p>
       <w:pPr>
         <w:pStyle w:val="BodyText"/>
@@ -17796,7 +18974,7 @@
         <w:t xml:space="preserve">.</w:t>
       </w:r>
     </w:p>
-    <w:bookmarkStart w:id="119" w:name="exm-scale-wcgs"/>
+    <w:bookmarkStart w:id="128" w:name="exm-scale-wcgs"/>
     <w:p>
       <w:pPr>
         <w:pStyle w:val="BodyText"/>
@@ -17806,7 +18984,7 @@
           <w:b/>
           <w:bCs/>
         </w:rPr>
-        <w:t xml:space="preserve">Example 8 (Standardizing cholesterol in R)</w:t>
+        <w:t xml:space="preserve">Example 9 (Standardizing cholesterol in R)</w:t>
       </w:r>
       <w:r>
         <w:t xml:space="preserve"> </w:t>
@@ -18074,8 +19252,8 @@
         <w:t xml:space="preserve">is needed because 12 of the cholesterol values are missing.</w:t>
       </w:r>
     </w:p>
-    <w:bookmarkEnd w:id="119"/>
-    <w:bookmarkStart w:id="122" w:name="def-min-max-scaling"/>
+    <w:bookmarkEnd w:id="128"/>
+    <w:bookmarkStart w:id="131" w:name="def-min-max-scaling"/>
     <w:p>
       <w:pPr>
         <w:pStyle w:val="BodyText"/>
@@ -18085,7 +19263,7 @@
           <w:b/>
           <w:bCs/>
         </w:rPr>
-        <w:t xml:space="preserve">Definition 18 (Min-max scaling)</w:t>
+        <w:t xml:space="preserve">Definition 22 (Min-max scaling)</w:t>
       </w:r>
       <w:r>
         <w:t xml:space="preserve"> </w:t>
@@ -18399,18 +19577,18 @@
                 <wp:inline>
                   <wp:extent cx="152400" cy="152400"/>
                   <wp:effectExtent b="0" l="0" r="0" t="0"/>
-                  <wp:docPr descr="" title="" id="120" name="Picture"/>
+                  <wp:docPr descr="" title="" id="129" name="Picture"/>
                   <a:graphic>
                     <a:graphicData uri="http://schemas.openxmlformats.org/drawingml/2006/picture">
                       <pic:pic>
                         <pic:nvPicPr>
-                          <pic:cNvPr descr="/opt/quarto/share/formats/docx/note.png" id="121" name="Picture"/>
+                          <pic:cNvPr descr="/opt/quarto/share/formats/docx/note.png" id="130" name="Picture"/>
                           <pic:cNvPicPr>
                             <a:picLocks noChangeArrowheads="1" noChangeAspect="1"/>
                           </pic:cNvPicPr>
                         </pic:nvPicPr>
                         <pic:blipFill>
-                          <a:blip r:embed="rId111"/>
+                          <a:blip r:embed="rId120"/>
                           <a:stretch>
                             <a:fillRect/>
                           </a:stretch>
@@ -18477,8 +19655,8 @@
         </w:tc>
       </w:tr>
     </w:tbl>
-    <w:bookmarkEnd w:id="122"/>
-    <w:bookmarkStart w:id="123" w:name="rem-min-max-outliers"/>
+    <w:bookmarkEnd w:id="131"/>
+    <w:bookmarkStart w:id="132" w:name="rem-min-max-outliers"/>
     <w:p>
       <w:pPr>
         <w:pStyle w:val="BodyText"/>
@@ -18687,8 +19865,8 @@
         <w:t xml:space="preserve">.</w:t>
       </w:r>
     </w:p>
-    <w:bookmarkEnd w:id="123"/>
-    <w:bookmarkStart w:id="124" w:name="exm-min-max-wcgs"/>
+    <w:bookmarkEnd w:id="132"/>
+    <w:bookmarkStart w:id="133" w:name="exm-min-max-wcgs"/>
     <w:p>
       <w:pPr>
         <w:pStyle w:val="BodyText"/>
@@ -18698,7 +19876,7 @@
           <w:b/>
           <w:bCs/>
         </w:rPr>
-        <w:t xml:space="preserve">Example 9 (Min-max scaling of cholesterol in the WCGS)</w:t>
+        <w:t xml:space="preserve">Example 10 (Min-max scaling of cholesterol in the WCGS)</w:t>
       </w:r>
       <w:r>
         <w:t xml:space="preserve"> </w:t>
@@ -18927,10 +20105,10 @@
         <w:t xml:space="preserve">but have no units.</w:t>
       </w:r>
     </w:p>
-    <w:bookmarkEnd w:id="124"/>
-    <w:bookmarkEnd w:id="125"/>
-    <w:bookmarkEnd w:id="126"/>
-    <w:bookmarkStart w:id="128" w:name="an-exploratory-data-analysis-workflow"/>
+    <w:bookmarkEnd w:id="133"/>
+    <w:bookmarkEnd w:id="134"/>
+    <w:bookmarkEnd w:id="135"/>
+    <w:bookmarkStart w:id="137" w:name="an-exploratory-data-analysis-workflow"/>
     <w:p>
       <w:pPr>
         <w:pStyle w:val="Heading2"/>
@@ -19158,7 +20336,7 @@
       <w:tr>
         <w:tc>
           <w:tcPr/>
-          <w:bookmarkStart w:id="127" w:name="tbl-wcgs-all-summary"/>
+          <w:bookmarkStart w:id="136" w:name="tbl-wcgs-all-summary"/>
           <w:p>
             <w:pPr>
               <w:jc w:val="center"/>
@@ -20339,12 +21517,12 @@
               </w:tc>
             </w:tr>
           </w:tbl>
-          <w:bookmarkEnd w:id="127"/>
+          <w:bookmarkEnd w:id="136"/>
         </w:tc>
       </w:tr>
     </w:tbl>
-    <w:bookmarkEnd w:id="128"/>
-    <w:bookmarkStart w:id="137" w:name="references"/>
+    <w:bookmarkEnd w:id="137"/>
+    <w:bookmarkStart w:id="146" w:name="references"/>
     <w:p>
       <w:pPr>
         <w:pStyle w:val="Heading2"/>
@@ -20353,8 +21531,8 @@
         <w:t xml:space="preserve">References</w:t>
       </w:r>
     </w:p>
-    <w:bookmarkStart w:id="136" w:name="refs"/>
-    <w:bookmarkStart w:id="129" w:name="ref-geron2017hands"/>
+    <w:bookmarkStart w:id="145" w:name="refs"/>
+    <w:bookmarkStart w:id="138" w:name="ref-geron2017hands"/>
     <w:p>
       <w:pPr>
         <w:pStyle w:val="Bibliography"/>
@@ -20418,8 +21596,8 @@
         <w:t xml:space="preserve">. 1st ed. O’Reilly Media.</w:t>
       </w:r>
     </w:p>
-    <w:bookmarkEnd w:id="129"/>
-    <w:bookmarkStart w:id="131" w:name="ref-james2021islr2e"/>
+    <w:bookmarkEnd w:id="138"/>
+    <w:bookmarkStart w:id="140" w:name="ref-james2021islr2e"/>
     <w:p>
       <w:pPr>
         <w:pStyle w:val="Bibliography"/>
@@ -20457,7 +21635,7 @@
       <w:r>
         <w:t xml:space="preserve"> </w:t>
       </w:r>
-      <w:hyperlink r:id="rId130">
+      <w:hyperlink r:id="rId139">
         <w:r>
           <w:rPr>
             <w:rStyle w:val="Hyperlink"/>
@@ -20469,8 +21647,8 @@
         <w:t xml:space="preserve">.</w:t>
       </w:r>
     </w:p>
-    <w:bookmarkEnd w:id="131"/>
-    <w:bookmarkStart w:id="133" w:name="ref-rosenman1975coronary"/>
+    <w:bookmarkEnd w:id="140"/>
+    <w:bookmarkStart w:id="142" w:name="ref-rosenman1975coronary"/>
     <w:p>
       <w:pPr>
         <w:pStyle w:val="Bibliography"/>
@@ -20512,7 +21690,7 @@
       <w:r>
         <w:t xml:space="preserve"> </w:t>
       </w:r>
-      <w:hyperlink r:id="rId132">
+      <w:hyperlink r:id="rId141">
         <w:r>
           <w:rPr>
             <w:rStyle w:val="Hyperlink"/>
@@ -20524,8 +21702,8 @@
         <w:t xml:space="preserve">.</w:t>
       </w:r>
     </w:p>
-    <w:bookmarkEnd w:id="133"/>
-    <w:bookmarkStart w:id="135" w:name="ref-vittinghoff2e"/>
+    <w:bookmarkEnd w:id="142"/>
+    <w:bookmarkStart w:id="144" w:name="ref-vittinghoff2e"/>
     <w:p>
       <w:pPr>
         <w:pStyle w:val="Bibliography"/>
@@ -20549,7 +21727,7 @@
       <w:r>
         <w:t xml:space="preserve"> </w:t>
       </w:r>
-      <w:hyperlink r:id="rId134">
+      <w:hyperlink r:id="rId143">
         <w:r>
           <w:rPr>
             <w:rStyle w:val="Hyperlink"/>
@@ -20561,9 +21739,9 @@
         <w:t xml:space="preserve">.</w:t>
       </w:r>
     </w:p>
-    <w:bookmarkEnd w:id="135"/>
-    <w:bookmarkEnd w:id="136"/>
-    <w:bookmarkEnd w:id="137"/>
+    <w:bookmarkEnd w:id="144"/>
+    <w:bookmarkEnd w:id="145"/>
+    <w:bookmarkEnd w:id="146"/>
     <w:sectPr>
       <w:footnotePr>
         <w:numRestart w:val="eachSect"/>

</xml_diff>

<commit_message>
Deploying to gh-pages from @ Morrison-Lab/sds@17f68b026ec7f0f45e8525ebcecde79b199f4f28 🚀
</commit_message>
<xml_diff>
--- a/exploratory-descriptive-handout.docx
+++ b/exploratory-descriptive-handout.docx
@@ -15,7 +15,7 @@
         <w:pStyle w:val="Date"/>
       </w:pPr>
       <w:r>
-        <w:t xml:space="preserve">Last modified: 2026-10-15 12:42:47 (PDT)</w:t>
+        <w:t xml:space="preserve">Last modified: 2026-10-15 12:56:30 (PDT)</w:t>
       </w:r>
     </w:p>
     <w:bookmarkStart w:id="24" w:name="introduction"/>
@@ -15576,7 +15576,7 @@
     <w:bookmarkEnd w:id="108"/>
     <w:bookmarkEnd w:id="109"/>
     <w:bookmarkEnd w:id="110"/>
-    <w:bookmarkStart w:id="137" w:name="data-transformations"/>
+    <w:bookmarkStart w:id="133" w:name="data-transformations"/>
     <w:p>
       <w:pPr>
         <w:pStyle w:val="Heading2"/>
@@ -16392,7 +16392,7 @@
                     <w:rPr>
                       <w:rStyle w:val="NormalTok"/>
                     </w:rPr>
-                    <w:t xml:space="preserve"> lnsbp) </w:t>
+                    <w:t xml:space="preserve"> sbp) </w:t>
                   </w:r>
                   <w:r>
                     <w:rPr>
@@ -16524,6 +16524,111 @@
                     <w:rPr>
                       <w:rStyle w:val="FunctionTok"/>
                     </w:rPr>
+                    <w:t xml:space="preserve">scale_x_log10</w:t>
+                  </w:r>
+                  <w:r>
+                    <w:rPr>
+                      <w:rStyle w:val="NormalTok"/>
+                    </w:rPr>
+                    <w:t xml:space="preserve">(</w:t>
+                  </w:r>
+                  <w:r>
+                    <w:rPr>
+                      <w:rStyle w:val="AttributeTok"/>
+                    </w:rPr>
+                    <w:t xml:space="preserve">breaks =</w:t>
+                  </w:r>
+                  <w:r>
+                    <w:rPr>
+                      <w:rStyle w:val="NormalTok"/>
+                    </w:rPr>
+                    <w:t xml:space="preserve"> </w:t>
+                  </w:r>
+                  <w:r>
+                    <w:rPr>
+                      <w:rStyle w:val="FunctionTok"/>
+                    </w:rPr>
+                    <w:t xml:space="preserve">c</w:t>
+                  </w:r>
+                  <w:r>
+                    <w:rPr>
+                      <w:rStyle w:val="NormalTok"/>
+                    </w:rPr>
+                    <w:t xml:space="preserve">(</w:t>
+                  </w:r>
+                  <w:r>
+                    <w:rPr>
+                      <w:rStyle w:val="DecValTok"/>
+                    </w:rPr>
+                    <w:t xml:space="preserve">100</w:t>
+                  </w:r>
+                  <w:r>
+                    <w:rPr>
+                      <w:rStyle w:val="NormalTok"/>
+                    </w:rPr>
+                    <w:t xml:space="preserve">, </w:t>
+                  </w:r>
+                  <w:r>
+                    <w:rPr>
+                      <w:rStyle w:val="DecValTok"/>
+                    </w:rPr>
+                    <w:t xml:space="preserve">140</w:t>
+                  </w:r>
+                  <w:r>
+                    <w:rPr>
+                      <w:rStyle w:val="NormalTok"/>
+                    </w:rPr>
+                    <w:t xml:space="preserve">, </w:t>
+                  </w:r>
+                  <w:r>
+                    <w:rPr>
+                      <w:rStyle w:val="DecValTok"/>
+                    </w:rPr>
+                    <w:t xml:space="preserve">200</w:t>
+                  </w:r>
+                  <w:r>
+                    <w:rPr>
+                      <w:rStyle w:val="NormalTok"/>
+                    </w:rPr>
+                    <w:t xml:space="preserve">, </w:t>
+                  </w:r>
+                  <w:r>
+                    <w:rPr>
+                      <w:rStyle w:val="DecValTok"/>
+                    </w:rPr>
+                    <w:t xml:space="preserve">250</w:t>
+                  </w:r>
+                  <w:r>
+                    <w:rPr>
+                      <w:rStyle w:val="NormalTok"/>
+                    </w:rPr>
+                    <w:t xml:space="preserve">)) </w:t>
+                  </w:r>
+                  <w:r>
+                    <w:rPr>
+                      <w:rStyle w:val="SpecialCharTok"/>
+                    </w:rPr>
+                    <w:t xml:space="preserve">+</w:t>
+                  </w:r>
+                  <w:r>
+                    <w:br/>
+                  </w:r>
+                  <w:r>
+                    <w:rPr>
+                      <w:rStyle w:val="NormalTok"/>
+                    </w:rPr>
+                    <w:t xml:space="preserve">  ggplot2</w:t>
+                  </w:r>
+                  <w:r>
+                    <w:rPr>
+                      <w:rStyle w:val="SpecialCharTok"/>
+                    </w:rPr>
+                    <w:t xml:space="preserve">::</w:t>
+                  </w:r>
+                  <w:r>
+                    <w:rPr>
+                      <w:rStyle w:val="FunctionTok"/>
+                    </w:rPr>
                     <w:t xml:space="preserve">labs</w:t>
                   </w:r>
                   <w:r>
@@ -16548,7 +16653,7 @@
                     <w:rPr>
                       <w:rStyle w:val="StringTok"/>
                     </w:rPr>
-                    <w:t xml:space="preserve">"log(Systolic BP)"</w:t>
+                    <w:t xml:space="preserve">"Systolic BP (mmHg), log scale"</w:t>
                   </w:r>
                   <w:r>
                     <w:rPr>
@@ -16660,7 +16765,37 @@
         <w:pStyle w:val="ImageCaption"/>
       </w:pPr>
       <w:r>
-        <w:t xml:space="preserve">Figure 9: Distribution of systolic blood pressure in the WCGS, on two scales</w:t>
+        <w:t xml:space="preserve">Figure 9: Distribution of systolic blood pressure in the WCGS, on two scales.</w:t>
+      </w:r>
+      <w:r>
+        <w:t xml:space="preserve"> </w:t>
+      </w:r>
+      <w:r>
+        <w:t xml:space="preserve">Both panels label the axis in mmHg;</w:t>
+      </w:r>
+      <w:r>
+        <w:t xml:space="preserve"> </w:t>
+      </w:r>
+      <w:r>
+        <w:t xml:space="preserve">the right panel spaces the values logarithmically,</w:t>
+      </w:r>
+      <w:r>
+        <w:t xml:space="preserve"> </w:t>
+      </w:r>
+      <w:r>
+        <w:t xml:space="preserve">so its histogram is the histogram of</w:t>
+      </w:r>
+      <w:r>
+        <w:t xml:space="preserve"> </w:t>
+      </w:r>
+      <w:r>
+        <w:rPr>
+          <w:rStyle w:val="VerbatimChar"/>
+        </w:rPr>
+        <w:t xml:space="preserve">lnsbp</w:t>
+      </w:r>
+      <w:r>
+        <w:t xml:space="preserve">.</w:t>
       </w:r>
     </w:p>
     <w:bookmarkEnd w:id="119"/>
@@ -17052,7 +17187,7 @@
         <w:t xml:space="preserve">the assumptions of that model and on the scientific question.</w:t>
       </w:r>
     </w:p>
-    <w:bookmarkStart w:id="136" w:name="sec-rescaling"/>
+    <w:bookmarkStart w:id="132" w:name="sec-rescaling"/>
     <w:p>
       <w:pPr>
         <w:pStyle w:val="Heading3"/>
@@ -17556,7 +17691,7 @@
       </w:r>
     </w:p>
     <w:bookmarkEnd w:id="121"/>
-    <w:bookmarkStart w:id="125" w:name="def-standardization"/>
+    <w:bookmarkStart w:id="122" w:name="def-standardization"/>
     <w:p>
       <w:pPr>
         <w:pStyle w:val="FirstParagraph"/>
@@ -17848,154 +17983,58 @@
         </m:oMath>
       </m:oMathPara>
     </w:p>
-    <w:tbl>
-      <w:tblPr>
-        <w:tblStyle w:val="Table"/>
-        <w:tblLook w:firstRow="0" w:lastRow="0" w:firstColumn="0" w:lastColumn="0" w:noHBand="0" w:noVBand="0" w:val="0000"/>
-        <w:tblBorders>
-          <w:top w:val="single" w:sz="4" w:space="0" w:color="0758E5"/>
-          <w:left w:val="single" w:sz="24" w:space="0" w:color="0758E5"/>
-          <w:bottom w:val="single" w:sz="4" w:space="0" w:color="0758E5"/>
-          <w:right w:val="single" w:sz="4" w:space="0" w:color="0758E5"/>
-        </w:tblBorders>
-        <w:tblCellMar>
-          <w:left w:w="144" w:type="dxa"/>
-          <w:right w:w="144" w:type="dxa"/>
-        </w:tblCellMar>
-        <w:tblLook w:firstRow="0" w:lastRow="0" w:firstColumn="0" w:lastColumn="0" w:noHBand="0" w:noVBand="0" w:val="0000"/>
-      </w:tblPr>
-      <w:tr>
-        <w:trPr>
-          <w:cantSplit/>
-        </w:trPr>
-        <w:tc>
-          <w:tcPr>
-            <w:shd w:color="auto" w:fill="dae6fb" w:val="clear"/>
-            <w:tcMar>
-              <w:top w:w="92" w:type="dxa"/>
-              <w:bottom w:w="92" w:type="dxa"/>
-            </w:tcMar>
-          </w:tcPr>
-          <w:p>
-            <w:pPr>
-              <w:pStyle w:val="FirstParagraph"/>
-            </w:pPr>
-            <w:pPr>
-              <w:spacing w:before="0" w:after="0"/>
-              <w:textAlignment w:val="center"/>
-            </w:pPr>
-            <w:r>
-              <w:drawing>
-                <wp:inline>
-                  <wp:extent cx="152400" cy="152400"/>
-                  <wp:effectExtent b="0" l="0" r="0" t="0"/>
-                  <wp:docPr descr="" title="" id="123" name="Picture"/>
-                  <a:graphic>
-                    <a:graphicData uri="http://schemas.openxmlformats.org/drawingml/2006/picture">
-                      <pic:pic>
-                        <pic:nvPicPr>
-                          <pic:cNvPr descr="/opt/quarto/share/formats/docx/note.png" id="124" name="Picture"/>
-                          <pic:cNvPicPr>
-                            <a:picLocks noChangeArrowheads="1" noChangeAspect="1"/>
-                          </pic:cNvPicPr>
-                        </pic:nvPicPr>
-                        <pic:blipFill>
-                          <a:blip r:embed="rId122"/>
-                          <a:stretch>
-                            <a:fillRect/>
-                          </a:stretch>
-                        </pic:blipFill>
-                        <pic:spPr bwMode="auto">
-                          <a:xfrm>
-                            <a:off x="0" y="0"/>
-                            <a:ext cx="152400" cy="152400"/>
-                          </a:xfrm>
-                          <a:prstGeom prst="rect">
-                            <a:avLst/>
-                          </a:prstGeom>
-                          <a:noFill/>
-                          <a:ln w="9525">
-                            <a:noFill/>
-                            <a:headEnd/>
-                            <a:tailEnd/>
-                          </a:ln>
-                        </pic:spPr>
-                      </pic:pic>
-                    </a:graphicData>
-                  </a:graphic>
-                </wp:inline>
-              </w:drawing>
-            </w:r>
-            <w:r>
-              <w:t xml:space="preserve"> </w:t>
-            </w:r>
-            <w:r>
-              <w:t xml:space="preserve"> </w:t>
-            </w:r>
-            <w:r>
-              <w:t xml:space="preserve">Source</w:t>
-            </w:r>
-          </w:p>
-        </w:tc>
-      </w:tr>
-      <w:tr>
-        <w:trPr>
-          <w:cantSplit/>
-        </w:trPr>
-        <w:tc>
-          <w:tcPr>
-            <w:tcMar>
-              <w:top w:w="108" w:type="dxa"/>
-              <w:bottom w:w="108" w:type="dxa"/>
-            </w:tcMar>
-          </w:tcPr>
-          <w:p>
-            <w:pPr>
-              <w:pStyle w:val="BodyText"/>
-            </w:pPr>
-            <w:pPr>
-              <w:spacing w:before="16" w:after="16"/>
-            </w:pPr>
-            <w:r>
-              <w:t xml:space="preserve">James et al. (2021, sec. 4.7.6, p. 183)</w:t>
-            </w:r>
-            <w:r>
-              <w:t xml:space="preserve">.</w:t>
-            </w:r>
-            <w:r>
-              <w:t xml:space="preserve"> </w:t>
-            </w:r>
-            <w:r>
-              <w:t xml:space="preserve">Géron (2017, ch. 2)</w:t>
-            </w:r>
-            <w:r>
-              <w:t xml:space="preserve"> </w:t>
-            </w:r>
-            <w:r>
-              <w:t xml:space="preserve">describes the same operation but says it divides by the variance;</w:t>
-            </w:r>
-            <w:r>
-              <w:t xml:space="preserve"> </w:t>
-            </w:r>
-            <w:r>
-              <w:t xml:space="preserve">the standard deviation is used here, as in</w:t>
-            </w:r>
-            <w:r>
-              <w:t xml:space="preserve"> </w:t>
-            </w:r>
-            <w:r>
-              <w:t xml:space="preserve">James et al. (2021)</w:t>
-            </w:r>
-            <w:r>
-              <w:t xml:space="preserve">.</w:t>
-            </w:r>
-          </w:p>
-          <w:p/>
-        </w:tc>
-      </w:tr>
-    </w:tbl>
-    <w:bookmarkEnd w:id="125"/>
-    <w:bookmarkStart w:id="126" w:name="rem-standardization-units"/>
+    <w:bookmarkEnd w:id="122"/>
+    <w:bookmarkStart w:id="123" w:name="rem-source-standardization"/>
+    <w:p>
+      <w:pPr>
+        <w:pStyle w:val="FirstParagraph"/>
+      </w:pPr>
+      <w:r>
+        <w:rPr>
+          <w:i/>
+          <w:iCs/>
+        </w:rPr>
+        <w:t xml:space="preserve">Remark 5</w:t>
+      </w:r>
+      <w:r>
+        <w:t xml:space="preserve"> (Source: Standardization). </w:t>
+      </w:r>
+      <w:r>
+        <w:t xml:space="preserve">James et al. (2021, sec. 4.7.6, p. 183)</w:t>
+      </w:r>
+      <w:r>
+        <w:t xml:space="preserve">.</w:t>
+      </w:r>
+      <w:r>
+        <w:t xml:space="preserve"> </w:t>
+      </w:r>
+      <w:r>
+        <w:t xml:space="preserve">Géron (2017, ch. 2)</w:t>
+      </w:r>
+      <w:r>
+        <w:t xml:space="preserve"> </w:t>
+      </w:r>
+      <w:r>
+        <w:t xml:space="preserve">describes the same operation but says it divides by the variance;</w:t>
+      </w:r>
+      <w:r>
+        <w:t xml:space="preserve"> </w:t>
+      </w:r>
+      <w:r>
+        <w:t xml:space="preserve">the standard deviation is used here, as in</w:t>
+      </w:r>
+      <w:r>
+        <w:t xml:space="preserve"> </w:t>
+      </w:r>
+      <w:r>
+        <w:t xml:space="preserve">James et al. (2021)</w:t>
+      </w:r>
+      <w:r>
+        <w:t xml:space="preserve">.</w:t>
+      </w:r>
+    </w:p>
+    <w:bookmarkEnd w:id="123"/>
+    <w:bookmarkStart w:id="124" w:name="rem-standardization-units"/>
     <w:p>
       <w:pPr>
         <w:pStyle w:val="BodyText"/>
@@ -18005,7 +18044,7 @@
           <w:i/>
           <w:iCs/>
         </w:rPr>
-        <w:t xml:space="preserve">Remark 5</w:t>
+        <w:t xml:space="preserve">Remark 6</w:t>
       </w:r>
       <w:r>
         <w:t xml:space="preserve"> (Standardized values have no units). </w:t>
@@ -18070,8 +18109,8 @@
         <w:t xml:space="preserve">both become unitless numbers of standard deviations.</w:t>
       </w:r>
     </w:p>
-    <w:bookmarkEnd w:id="126"/>
-    <w:bookmarkStart w:id="129" w:name="thm-standardized-mean-sd"/>
+    <w:bookmarkEnd w:id="124"/>
+    <w:bookmarkStart w:id="125" w:name="thm-standardized-mean-sd"/>
     <w:p>
       <w:pPr>
         <w:pStyle w:val="BodyText"/>
@@ -18228,138 +18267,7 @@
         <w:t xml:space="preserve">.</w:t>
       </w:r>
     </w:p>
-    <w:tbl>
-      <w:tblPr>
-        <w:tblStyle w:val="Table"/>
-        <w:tblLook w:firstRow="0" w:lastRow="0" w:firstColumn="0" w:lastColumn="0" w:noHBand="0" w:noVBand="0" w:val="0000"/>
-        <w:tblBorders>
-          <w:top w:val="single" w:sz="4" w:space="0" w:color="0758E5"/>
-          <w:left w:val="single" w:sz="24" w:space="0" w:color="0758E5"/>
-          <w:bottom w:val="single" w:sz="4" w:space="0" w:color="0758E5"/>
-          <w:right w:val="single" w:sz="4" w:space="0" w:color="0758E5"/>
-        </w:tblBorders>
-        <w:tblCellMar>
-          <w:left w:w="144" w:type="dxa"/>
-          <w:right w:w="144" w:type="dxa"/>
-        </w:tblCellMar>
-        <w:tblLook w:firstRow="0" w:lastRow="0" w:firstColumn="0" w:lastColumn="0" w:noHBand="0" w:noVBand="0" w:val="0000"/>
-      </w:tblPr>
-      <w:tr>
-        <w:trPr>
-          <w:cantSplit/>
-        </w:trPr>
-        <w:tc>
-          <w:tcPr>
-            <w:shd w:color="auto" w:fill="dae6fb" w:val="clear"/>
-            <w:tcMar>
-              <w:top w:w="92" w:type="dxa"/>
-              <w:bottom w:w="92" w:type="dxa"/>
-            </w:tcMar>
-          </w:tcPr>
-          <w:p>
-            <w:pPr>
-              <w:pStyle w:val="BodyText"/>
-            </w:pPr>
-            <w:pPr>
-              <w:spacing w:before="0" w:after="0"/>
-              <w:textAlignment w:val="center"/>
-            </w:pPr>
-            <w:r>
-              <w:drawing>
-                <wp:inline>
-                  <wp:extent cx="152400" cy="152400"/>
-                  <wp:effectExtent b="0" l="0" r="0" t="0"/>
-                  <wp:docPr descr="" title="" id="127" name="Picture"/>
-                  <a:graphic>
-                    <a:graphicData uri="http://schemas.openxmlformats.org/drawingml/2006/picture">
-                      <pic:pic>
-                        <pic:nvPicPr>
-                          <pic:cNvPr descr="/opt/quarto/share/formats/docx/note.png" id="128" name="Picture"/>
-                          <pic:cNvPicPr>
-                            <a:picLocks noChangeArrowheads="1" noChangeAspect="1"/>
-                          </pic:cNvPicPr>
-                        </pic:nvPicPr>
-                        <pic:blipFill>
-                          <a:blip r:embed="rId122"/>
-                          <a:stretch>
-                            <a:fillRect/>
-                          </a:stretch>
-                        </pic:blipFill>
-                        <pic:spPr bwMode="auto">
-                          <a:xfrm>
-                            <a:off x="0" y="0"/>
-                            <a:ext cx="152400" cy="152400"/>
-                          </a:xfrm>
-                          <a:prstGeom prst="rect">
-                            <a:avLst/>
-                          </a:prstGeom>
-                          <a:noFill/>
-                          <a:ln w="9525">
-                            <a:noFill/>
-                            <a:headEnd/>
-                            <a:tailEnd/>
-                          </a:ln>
-                        </pic:spPr>
-                      </pic:pic>
-                    </a:graphicData>
-                  </a:graphic>
-                </wp:inline>
-              </w:drawing>
-            </w:r>
-            <w:r>
-              <w:t xml:space="preserve"> </w:t>
-            </w:r>
-            <w:r>
-              <w:t xml:space="preserve"> </w:t>
-            </w:r>
-            <w:r>
-              <w:t xml:space="preserve">Source</w:t>
-            </w:r>
-          </w:p>
-        </w:tc>
-      </w:tr>
-      <w:tr>
-        <w:trPr>
-          <w:cantSplit/>
-        </w:trPr>
-        <w:tc>
-          <w:tcPr>
-            <w:tcMar>
-              <w:top w:w="108" w:type="dxa"/>
-              <w:bottom w:w="108" w:type="dxa"/>
-            </w:tcMar>
-          </w:tcPr>
-          <w:p>
-            <w:pPr>
-              <w:pStyle w:val="BodyText"/>
-            </w:pPr>
-            <w:pPr>
-              <w:spacing w:before="16" w:after="16"/>
-            </w:pPr>
-            <w:r>
-              <w:t xml:space="preserve">Stated for the standardized Caravan variables in</w:t>
-            </w:r>
-            <w:r>
-              <w:t xml:space="preserve"> </w:t>
-            </w:r>
-            <w:r>
-              <w:t xml:space="preserve">James et al. (2021, sec. 4.7.6, p. 183)</w:t>
-            </w:r>
-            <w:r>
-              <w:t xml:space="preserve">;</w:t>
-            </w:r>
-            <w:r>
-              <w:t xml:space="preserve"> </w:t>
-            </w:r>
-            <w:r>
-              <w:t xml:space="preserve">the proof is the elementary calculation.</w:t>
-            </w:r>
-          </w:p>
-          <w:p/>
-        </w:tc>
-      </w:tr>
-    </w:tbl>
-    <w:bookmarkEnd w:id="129"/>
+    <w:bookmarkEnd w:id="125"/>
     <w:p>
       <w:pPr>
         <w:pStyle w:val="BodyText"/>
@@ -19072,7 +18980,42 @@
         <w:t xml:space="preserve">.</w:t>
       </w:r>
     </w:p>
-    <w:bookmarkStart w:id="130" w:name="exm-scale-wcgs"/>
+    <w:bookmarkStart w:id="126" w:name="rem-source-standardized-mean-sd"/>
+    <w:p>
+      <w:pPr>
+        <w:pStyle w:val="BodyText"/>
+      </w:pPr>
+      <w:r>
+        <w:rPr>
+          <w:i/>
+          <w:iCs/>
+        </w:rPr>
+        <w:t xml:space="preserve">Remark 7</w:t>
+      </w:r>
+      <w:r>
+        <w:t xml:space="preserve"> (Source: Standardized values have mean 0 and standard deviation 1). </w:t>
+      </w:r>
+      <w:r>
+        <w:t xml:space="preserve">Stated for the standardized Caravan variables in</w:t>
+      </w:r>
+      <w:r>
+        <w:t xml:space="preserve"> </w:t>
+      </w:r>
+      <w:r>
+        <w:t xml:space="preserve">James et al. (2021, sec. 4.7.6, p. 183)</w:t>
+      </w:r>
+      <w:r>
+        <w:t xml:space="preserve">;</w:t>
+      </w:r>
+      <w:r>
+        <w:t xml:space="preserve"> </w:t>
+      </w:r>
+      <w:r>
+        <w:t xml:space="preserve">the proof is the elementary calculation.</w:t>
+      </w:r>
+    </w:p>
+    <w:bookmarkEnd w:id="126"/>
+    <w:bookmarkStart w:id="127" w:name="exm-scale-wcgs"/>
     <w:p>
       <w:pPr>
         <w:pStyle w:val="BodyText"/>
@@ -19350,8 +19293,8 @@
         <w:t xml:space="preserve">is needed because 12 of the cholesterol values are missing.</w:t>
       </w:r>
     </w:p>
-    <w:bookmarkEnd w:id="130"/>
-    <w:bookmarkStart w:id="133" w:name="def-min-max-scaling"/>
+    <w:bookmarkEnd w:id="127"/>
+    <w:bookmarkStart w:id="128" w:name="def-min-max-scaling"/>
     <w:p>
       <w:pPr>
         <w:pStyle w:val="BodyText"/>
@@ -19634,127 +19577,31 @@
         </m:oMath>
       </m:oMathPara>
     </w:p>
-    <w:tbl>
-      <w:tblPr>
-        <w:tblStyle w:val="Table"/>
-        <w:tblLook w:firstRow="0" w:lastRow="0" w:firstColumn="0" w:lastColumn="0" w:noHBand="0" w:noVBand="0" w:val="0000"/>
-        <w:tblBorders>
-          <w:top w:val="single" w:sz="4" w:space="0" w:color="0758E5"/>
-          <w:left w:val="single" w:sz="24" w:space="0" w:color="0758E5"/>
-          <w:bottom w:val="single" w:sz="4" w:space="0" w:color="0758E5"/>
-          <w:right w:val="single" w:sz="4" w:space="0" w:color="0758E5"/>
-        </w:tblBorders>
-        <w:tblCellMar>
-          <w:left w:w="144" w:type="dxa"/>
-          <w:right w:w="144" w:type="dxa"/>
-        </w:tblCellMar>
-        <w:tblLook w:firstRow="0" w:lastRow="0" w:firstColumn="0" w:lastColumn="0" w:noHBand="0" w:noVBand="0" w:val="0000"/>
-      </w:tblPr>
-      <w:tr>
-        <w:trPr>
-          <w:cantSplit/>
-        </w:trPr>
-        <w:tc>
-          <w:tcPr>
-            <w:shd w:color="auto" w:fill="dae6fb" w:val="clear"/>
-            <w:tcMar>
-              <w:top w:w="92" w:type="dxa"/>
-              <w:bottom w:w="92" w:type="dxa"/>
-            </w:tcMar>
-          </w:tcPr>
-          <w:p>
-            <w:pPr>
-              <w:pStyle w:val="FirstParagraph"/>
-            </w:pPr>
-            <w:pPr>
-              <w:spacing w:before="0" w:after="0"/>
-              <w:textAlignment w:val="center"/>
-            </w:pPr>
-            <w:r>
-              <w:drawing>
-                <wp:inline>
-                  <wp:extent cx="152400" cy="152400"/>
-                  <wp:effectExtent b="0" l="0" r="0" t="0"/>
-                  <wp:docPr descr="" title="" id="131" name="Picture"/>
-                  <a:graphic>
-                    <a:graphicData uri="http://schemas.openxmlformats.org/drawingml/2006/picture">
-                      <pic:pic>
-                        <pic:nvPicPr>
-                          <pic:cNvPr descr="/opt/quarto/share/formats/docx/note.png" id="132" name="Picture"/>
-                          <pic:cNvPicPr>
-                            <a:picLocks noChangeArrowheads="1" noChangeAspect="1"/>
-                          </pic:cNvPicPr>
-                        </pic:nvPicPr>
-                        <pic:blipFill>
-                          <a:blip r:embed="rId122"/>
-                          <a:stretch>
-                            <a:fillRect/>
-                          </a:stretch>
-                        </pic:blipFill>
-                        <pic:spPr bwMode="auto">
-                          <a:xfrm>
-                            <a:off x="0" y="0"/>
-                            <a:ext cx="152400" cy="152400"/>
-                          </a:xfrm>
-                          <a:prstGeom prst="rect">
-                            <a:avLst/>
-                          </a:prstGeom>
-                          <a:noFill/>
-                          <a:ln w="9525">
-                            <a:noFill/>
-                            <a:headEnd/>
-                            <a:tailEnd/>
-                          </a:ln>
-                        </pic:spPr>
-                      </pic:pic>
-                    </a:graphicData>
-                  </a:graphic>
-                </wp:inline>
-              </w:drawing>
-            </w:r>
-            <w:r>
-              <w:t xml:space="preserve"> </w:t>
-            </w:r>
-            <w:r>
-              <w:t xml:space="preserve"> </w:t>
-            </w:r>
-            <w:r>
-              <w:t xml:space="preserve">Source</w:t>
-            </w:r>
-          </w:p>
-        </w:tc>
-      </w:tr>
-      <w:tr>
-        <w:trPr>
-          <w:cantSplit/>
-        </w:trPr>
-        <w:tc>
-          <w:tcPr>
-            <w:tcMar>
-              <w:top w:w="108" w:type="dxa"/>
-              <w:bottom w:w="108" w:type="dxa"/>
-            </w:tcMar>
-          </w:tcPr>
-          <w:p>
-            <w:pPr>
-              <w:pStyle w:val="BodyText"/>
-            </w:pPr>
-            <w:pPr>
-              <w:spacing w:before="16" w:after="16"/>
-            </w:pPr>
-            <w:r>
-              <w:t xml:space="preserve">Géron (2017, ch. 2)</w:t>
-            </w:r>
-            <w:r>
-              <w:t xml:space="preserve">.</w:t>
-            </w:r>
-          </w:p>
-          <w:p/>
-        </w:tc>
-      </w:tr>
-    </w:tbl>
-    <w:bookmarkEnd w:id="133"/>
-    <w:bookmarkStart w:id="134" w:name="rem-min-max-outliers"/>
+    <w:bookmarkEnd w:id="128"/>
+    <w:bookmarkStart w:id="129" w:name="rem-source-min-max-scaling"/>
+    <w:p>
+      <w:pPr>
+        <w:pStyle w:val="FirstParagraph"/>
+      </w:pPr>
+      <w:r>
+        <w:rPr>
+          <w:i/>
+          <w:iCs/>
+        </w:rPr>
+        <w:t xml:space="preserve">Remark 8</w:t>
+      </w:r>
+      <w:r>
+        <w:t xml:space="preserve"> (Source: Min-max scaling). </w:t>
+      </w:r>
+      <w:r>
+        <w:t xml:space="preserve">Géron (2017, ch. 2)</w:t>
+      </w:r>
+      <w:r>
+        <w:t xml:space="preserve">.</w:t>
+      </w:r>
+    </w:p>
+    <w:bookmarkEnd w:id="129"/>
+    <w:bookmarkStart w:id="130" w:name="rem-min-max-outliers"/>
     <w:p>
       <w:pPr>
         <w:pStyle w:val="BodyText"/>
@@ -19764,7 +19611,7 @@
           <w:i/>
           <w:iCs/>
         </w:rPr>
-        <w:t xml:space="preserve">Remark 6</w:t>
+        <w:t xml:space="preserve">Remark 9</w:t>
       </w:r>
       <w:r>
         <w:t xml:space="preserve"> (Min-max scaling and outliers). </w:t>
@@ -19963,8 +19810,8 @@
         <w:t xml:space="preserve">.</w:t>
       </w:r>
     </w:p>
-    <w:bookmarkEnd w:id="134"/>
-    <w:bookmarkStart w:id="135" w:name="exm-min-max-wcgs"/>
+    <w:bookmarkEnd w:id="130"/>
+    <w:bookmarkStart w:id="131" w:name="exm-min-max-wcgs"/>
     <w:p>
       <w:pPr>
         <w:pStyle w:val="BodyText"/>
@@ -20203,10 +20050,10 @@
         <w:t xml:space="preserve">but have no units.</w:t>
       </w:r>
     </w:p>
-    <w:bookmarkEnd w:id="135"/>
-    <w:bookmarkEnd w:id="136"/>
-    <w:bookmarkEnd w:id="137"/>
-    <w:bookmarkStart w:id="139" w:name="an-exploratory-data-analysis-workflow"/>
+    <w:bookmarkEnd w:id="131"/>
+    <w:bookmarkEnd w:id="132"/>
+    <w:bookmarkEnd w:id="133"/>
+    <w:bookmarkStart w:id="135" w:name="an-exploratory-data-analysis-workflow"/>
     <w:p>
       <w:pPr>
         <w:pStyle w:val="Heading2"/>
@@ -20434,7 +20281,7 @@
       <w:tr>
         <w:tc>
           <w:tcPr/>
-          <w:bookmarkStart w:id="138" w:name="tbl-wcgs-all-summary"/>
+          <w:bookmarkStart w:id="134" w:name="tbl-wcgs-all-summary"/>
           <w:p>
             <w:pPr>
               <w:jc w:val="center"/>
@@ -21615,12 +21462,12 @@
               </w:tc>
             </w:tr>
           </w:tbl>
-          <w:bookmarkEnd w:id="138"/>
+          <w:bookmarkEnd w:id="134"/>
         </w:tc>
       </w:tr>
     </w:tbl>
-    <w:bookmarkEnd w:id="139"/>
-    <w:bookmarkStart w:id="148" w:name="references"/>
+    <w:bookmarkEnd w:id="135"/>
+    <w:bookmarkStart w:id="144" w:name="references"/>
     <w:p>
       <w:pPr>
         <w:pStyle w:val="Heading2"/>
@@ -21629,8 +21476,8 @@
         <w:t xml:space="preserve">References</w:t>
       </w:r>
     </w:p>
-    <w:bookmarkStart w:id="147" w:name="refs"/>
-    <w:bookmarkStart w:id="140" w:name="ref-geron2017hands"/>
+    <w:bookmarkStart w:id="143" w:name="refs"/>
+    <w:bookmarkStart w:id="136" w:name="ref-geron2017hands"/>
     <w:p>
       <w:pPr>
         <w:pStyle w:val="Bibliography"/>
@@ -21694,8 +21541,8 @@
         <w:t xml:space="preserve">. 1st ed. O’Reilly Media.</w:t>
       </w:r>
     </w:p>
-    <w:bookmarkEnd w:id="140"/>
-    <w:bookmarkStart w:id="142" w:name="ref-james2021islr2e"/>
+    <w:bookmarkEnd w:id="136"/>
+    <w:bookmarkStart w:id="138" w:name="ref-james2021islr2e"/>
     <w:p>
       <w:pPr>
         <w:pStyle w:val="Bibliography"/>
@@ -21733,7 +21580,7 @@
       <w:r>
         <w:t xml:space="preserve"> </w:t>
       </w:r>
-      <w:hyperlink r:id="rId141">
+      <w:hyperlink r:id="rId137">
         <w:r>
           <w:rPr>
             <w:rStyle w:val="Hyperlink"/>
@@ -21745,8 +21592,8 @@
         <w:t xml:space="preserve">.</w:t>
       </w:r>
     </w:p>
-    <w:bookmarkEnd w:id="142"/>
-    <w:bookmarkStart w:id="144" w:name="ref-rosenman1975coronary"/>
+    <w:bookmarkEnd w:id="138"/>
+    <w:bookmarkStart w:id="140" w:name="ref-rosenman1975coronary"/>
     <w:p>
       <w:pPr>
         <w:pStyle w:val="Bibliography"/>
@@ -21788,7 +21635,7 @@
       <w:r>
         <w:t xml:space="preserve"> </w:t>
       </w:r>
-      <w:hyperlink r:id="rId143">
+      <w:hyperlink r:id="rId139">
         <w:r>
           <w:rPr>
             <w:rStyle w:val="Hyperlink"/>
@@ -21800,8 +21647,8 @@
         <w:t xml:space="preserve">.</w:t>
       </w:r>
     </w:p>
-    <w:bookmarkEnd w:id="144"/>
-    <w:bookmarkStart w:id="146" w:name="ref-vittinghoff2e"/>
+    <w:bookmarkEnd w:id="140"/>
+    <w:bookmarkStart w:id="142" w:name="ref-vittinghoff2e"/>
     <w:p>
       <w:pPr>
         <w:pStyle w:val="Bibliography"/>
@@ -21825,7 +21672,7 @@
       <w:r>
         <w:t xml:space="preserve"> </w:t>
       </w:r>
-      <w:hyperlink r:id="rId145">
+      <w:hyperlink r:id="rId141">
         <w:r>
           <w:rPr>
             <w:rStyle w:val="Hyperlink"/>
@@ -21837,9 +21684,9 @@
         <w:t xml:space="preserve">.</w:t>
       </w:r>
     </w:p>
-    <w:bookmarkEnd w:id="146"/>
-    <w:bookmarkEnd w:id="147"/>
-    <w:bookmarkEnd w:id="148"/>
+    <w:bookmarkEnd w:id="142"/>
+    <w:bookmarkEnd w:id="143"/>
+    <w:bookmarkEnd w:id="144"/>
     <w:sectPr>
       <w:footnotePr>
         <w:numRestart w:val="eachSect"/>

</xml_diff>

<commit_message>
Deploying to gh-pages from @ Morrison-Lab/sds@39b1d70aa77db529f4e1d497d315e9c8b4e9c3e5 🚀
</commit_message>
<xml_diff>
--- a/exploratory-descriptive-handout.docx
+++ b/exploratory-descriptive-handout.docx
@@ -15,7 +15,7 @@
         <w:pStyle w:val="Date"/>
       </w:pPr>
       <w:r>
-        <w:t xml:space="preserve">Last modified: 2026-10-15 14:34:20 (PDT)</w:t>
+        <w:t xml:space="preserve">Last modified: 2026-10-15 15:04:33 (PDT)</w:t>
       </w:r>
     </w:p>
     <w:bookmarkStart w:id="24" w:name="introduction"/>
@@ -16707,18 +16707,6 @@
                       <w:rStyle w:val="DecValTok"/>
                     </w:rPr>
                     <w:t xml:space="preserve">200</w:t>
-                  </w:r>
-                  <w:r>
-                    <w:rPr>
-                      <w:rStyle w:val="NormalTok"/>
-                    </w:rPr>
-                    <w:t xml:space="preserve">, </w:t>
-                  </w:r>
-                  <w:r>
-                    <w:rPr>
-                      <w:rStyle w:val="DecValTok"/>
-                    </w:rPr>
-                    <w:t xml:space="preserve">250</w:t>
                   </w:r>
                   <w:r>
                     <w:rPr>

</xml_diff>

<commit_message>
Deploying to gh-pages from @ Morrison-Lab/sds@5d158814e53a2198d1ccce50dcb456f388cb96a9 🚀
</commit_message>
<xml_diff>
--- a/exploratory-descriptive-handout.docx
+++ b/exploratory-descriptive-handout.docx
@@ -15,7 +15,7 @@
         <w:pStyle w:val="Date"/>
       </w:pPr>
       <w:r>
-        <w:t xml:space="preserve">Last modified: 2026-10-19 02:56:37 (PDT)</w:t>
+        <w:t xml:space="preserve">Last modified: 2026-10-19 03:13:51 (PDT)</w:t>
       </w:r>
     </w:p>
     <w:bookmarkStart w:id="24" w:name="introduction"/>
@@ -21880,17 +21880,109 @@
       </w:tr>
     </w:tbl>
     <w:bookmarkEnd w:id="136"/>
-    <w:bookmarkStart w:id="181" w:name="references"/>
+    <w:bookmarkStart w:id="140" w:name="further-reading"/>
     <w:p>
       <w:pPr>
         <w:pStyle w:val="Heading2"/>
       </w:pPr>
       <w:r>
+        <w:t xml:space="preserve">7 Further reading</w:t>
+      </w:r>
+    </w:p>
+    <w:p>
+      <w:pPr>
+        <w:pStyle w:val="FirstParagraph"/>
+      </w:pPr>
+      <w:hyperlink r:id="rId137">
+        <w:r>
+          <w:rPr>
+            <w:rStyle w:val="Hyperlink"/>
+          </w:rPr>
+          <w:t xml:space="preserve">Plotting a Binary Outcome</w:t>
+        </w:r>
+      </w:hyperlink>
+      <w:r>
+        <w:t xml:space="preserve"> </w:t>
+      </w:r>
+      <w:r>
+        <w:t xml:space="preserve">shows how to plot a 0/1 outcome against a</w:t>
+      </w:r>
+      <w:r>
+        <w:t xml:space="preserve"> </w:t>
+      </w:r>
+      <w:hyperlink r:id="rId62">
+        <w:r>
+          <w:rPr>
+            <w:rStyle w:val="Hyperlink"/>
+          </w:rPr>
+          <w:t xml:space="preserve">continuous</w:t>
+        </w:r>
+      </w:hyperlink>
+      <w:r>
+        <w:t xml:space="preserve"> </w:t>
+      </w:r>
+      <w:r>
+        <w:t xml:space="preserve">feature,</w:t>
+      </w:r>
+      <w:r>
+        <w:t xml:space="preserve"> </w:t>
+      </w:r>
+      <w:r>
+        <w:t xml:space="preserve">where</w:t>
+      </w:r>
+      <w:r>
+        <w:t xml:space="preserve"> </w:t>
+      </w:r>
+      <w:hyperlink r:id="rId138">
+        <w:r>
+          <w:rPr>
+            <w:rStyle w:val="Hyperlink"/>
+          </w:rPr>
+          <w:t xml:space="preserve">scatterplot</w:t>
+        </w:r>
+      </w:hyperlink>
+      <w:r>
+        <w:t xml:space="preserve"> </w:t>
+      </w:r>
+      <w:r>
+        <w:t xml:space="preserve">dots would pile into two stripes.</w:t>
+      </w:r>
+      <w:r>
+        <w:t xml:space="preserve"> </w:t>
+      </w:r>
+      <w:r>
+        <w:t xml:space="preserve">It draws a rug and two</w:t>
+      </w:r>
+      <w:r>
+        <w:t xml:space="preserve"> </w:t>
+      </w:r>
+      <w:hyperlink r:id="rId139">
+        <w:r>
+          <w:rPr>
+            <w:rStyle w:val="Hyperlink"/>
+          </w:rPr>
+          <w:t xml:space="preserve">histograms</w:t>
+        </w:r>
+      </w:hyperlink>
+      <w:r>
+        <w:t xml:space="preserve"> </w:t>
+      </w:r>
+      <w:r>
+        <w:t xml:space="preserve">of the WCGS data, in R and Python.</w:t>
+      </w:r>
+    </w:p>
+    <w:bookmarkEnd w:id="140"/>
+    <w:bookmarkStart w:id="185" w:name="references"/>
+    <w:p>
+      <w:pPr>
+        <w:pStyle w:val="Heading2"/>
+      </w:pPr>
+      <w:r>
         <w:t xml:space="preserve">References</w:t>
       </w:r>
     </w:p>
-    <w:bookmarkStart w:id="180" w:name="refs"/>
-    <w:bookmarkStart w:id="138" w:name="ref-vittinghoff2e"/>
+    <w:bookmarkStart w:id="184" w:name="refs"/>
+    <w:bookmarkStart w:id="142" w:name="ref-vittinghoff2e"/>
     <w:p>
       <w:pPr>
         <w:pStyle w:val="Bibliography"/>
@@ -21923,7 +22015,7 @@
       <w:r>
         <w:t xml:space="preserve"> </w:t>
       </w:r>
-      <w:hyperlink r:id="rId137">
+      <w:hyperlink r:id="rId141">
         <w:r>
           <w:rPr>
             <w:rStyle w:val="Hyperlink"/>
@@ -21935,8 +22027,8 @@
         <w:t xml:space="preserve">.</w:t>
       </w:r>
     </w:p>
-    <w:bookmarkEnd w:id="138"/>
-    <w:bookmarkStart w:id="140" w:name="ref-rosenman1975coronary"/>
+    <w:bookmarkEnd w:id="142"/>
+    <w:bookmarkStart w:id="144" w:name="ref-rosenman1975coronary"/>
     <w:p>
       <w:pPr>
         <w:pStyle w:val="Bibliography"/>
@@ -21984,7 +22076,7 @@
       <w:r>
         <w:t xml:space="preserve"> </w:t>
       </w:r>
-      <w:hyperlink r:id="rId139">
+      <w:hyperlink r:id="rId143">
         <w:r>
           <w:rPr>
             <w:rStyle w:val="Hyperlink"/>
@@ -21996,8 +22088,8 @@
         <w:t xml:space="preserve">.</w:t>
       </w:r>
     </w:p>
-    <w:bookmarkEnd w:id="140"/>
-    <w:bookmarkStart w:id="142" w:name="ref-wikipedia_statistical_population"/>
+    <w:bookmarkEnd w:id="144"/>
+    <w:bookmarkStart w:id="146" w:name="ref-wikipedia_statistical_population"/>
     <w:p>
       <w:pPr>
         <w:pStyle w:val="Bibliography"/>
@@ -22044,7 +22136,7 @@
       <w:r>
         <w:t xml:space="preserve"> </w:t>
       </w:r>
-      <w:hyperlink r:id="rId141">
+      <w:hyperlink r:id="rId145">
         <w:r>
           <w:rPr>
             <w:rStyle w:val="Hyperlink"/>
@@ -22053,8 +22145,8 @@
         </w:r>
       </w:hyperlink>
     </w:p>
-    <w:bookmarkEnd w:id="142"/>
-    <w:bookmarkStart w:id="144" w:name="ref-wikipedia_simple_random_sample"/>
+    <w:bookmarkEnd w:id="146"/>
+    <w:bookmarkStart w:id="148" w:name="ref-wikipedia_simple_random_sample"/>
     <w:p>
       <w:pPr>
         <w:pStyle w:val="Bibliography"/>
@@ -22101,7 +22193,7 @@
       <w:r>
         <w:t xml:space="preserve"> </w:t>
       </w:r>
-      <w:hyperlink r:id="rId143">
+      <w:hyperlink r:id="rId147">
         <w:r>
           <w:rPr>
             <w:rStyle w:val="Hyperlink"/>
@@ -22110,8 +22202,8 @@
         </w:r>
       </w:hyperlink>
     </w:p>
-    <w:bookmarkEnd w:id="144"/>
-    <w:bookmarkStart w:id="146" w:name="ref-wikipedia_median"/>
+    <w:bookmarkEnd w:id="148"/>
+    <w:bookmarkStart w:id="150" w:name="ref-wikipedia_median"/>
     <w:p>
       <w:pPr>
         <w:pStyle w:val="Bibliography"/>
@@ -22158,7 +22250,7 @@
       <w:r>
         <w:t xml:space="preserve"> </w:t>
       </w:r>
-      <w:hyperlink r:id="rId145">
+      <w:hyperlink r:id="rId149">
         <w:r>
           <w:rPr>
             <w:rStyle w:val="Hyperlink"/>
@@ -22167,8 +22259,8 @@
         </w:r>
       </w:hyperlink>
     </w:p>
-    <w:bookmarkEnd w:id="146"/>
-    <w:bookmarkStart w:id="148" w:name="ref-wikipedia_variance"/>
+    <w:bookmarkEnd w:id="150"/>
+    <w:bookmarkStart w:id="152" w:name="ref-wikipedia_variance"/>
     <w:p>
       <w:pPr>
         <w:pStyle w:val="Bibliography"/>
@@ -22215,7 +22307,7 @@
       <w:r>
         <w:t xml:space="preserve"> </w:t>
       </w:r>
-      <w:hyperlink r:id="rId147">
+      <w:hyperlink r:id="rId151">
         <w:r>
           <w:rPr>
             <w:rStyle w:val="Hyperlink"/>
@@ -22224,8 +22316,8 @@
         </w:r>
       </w:hyperlink>
     </w:p>
-    <w:bookmarkEnd w:id="148"/>
-    <w:bookmarkStart w:id="150" w:name="ref-wikipedia_standard_deviation"/>
+    <w:bookmarkEnd w:id="152"/>
+    <w:bookmarkStart w:id="154" w:name="ref-wikipedia_standard_deviation"/>
     <w:p>
       <w:pPr>
         <w:pStyle w:val="Bibliography"/>
@@ -22272,7 +22364,7 @@
       <w:r>
         <w:t xml:space="preserve"> </w:t>
       </w:r>
-      <w:hyperlink r:id="rId149">
+      <w:hyperlink r:id="rId153">
         <w:r>
           <w:rPr>
             <w:rStyle w:val="Hyperlink"/>
@@ -22281,8 +22373,8 @@
         </w:r>
       </w:hyperlink>
     </w:p>
-    <w:bookmarkEnd w:id="150"/>
-    <w:bookmarkStart w:id="152" w:name="ref-wikipedia_quartile"/>
+    <w:bookmarkEnd w:id="154"/>
+    <w:bookmarkStart w:id="156" w:name="ref-wikipedia_quartile"/>
     <w:p>
       <w:pPr>
         <w:pStyle w:val="Bibliography"/>
@@ -22329,7 +22421,7 @@
       <w:r>
         <w:t xml:space="preserve"> </w:t>
       </w:r>
-      <w:hyperlink r:id="rId151">
+      <w:hyperlink r:id="rId155">
         <w:r>
           <w:rPr>
             <w:rStyle w:val="Hyperlink"/>
@@ -22338,8 +22430,8 @@
         </w:r>
       </w:hyperlink>
     </w:p>
-    <w:bookmarkEnd w:id="152"/>
-    <w:bookmarkStart w:id="154" w:name="ref-wikipedia_interquartile_range"/>
+    <w:bookmarkEnd w:id="156"/>
+    <w:bookmarkStart w:id="158" w:name="ref-wikipedia_interquartile_range"/>
     <w:p>
       <w:pPr>
         <w:pStyle w:val="Bibliography"/>
@@ -22386,7 +22478,7 @@
       <w:r>
         <w:t xml:space="preserve"> </w:t>
       </w:r>
-      <w:hyperlink r:id="rId153">
+      <w:hyperlink r:id="rId157">
         <w:r>
           <w:rPr>
             <w:rStyle w:val="Hyperlink"/>
@@ -22395,8 +22487,8 @@
         </w:r>
       </w:hyperlink>
     </w:p>
-    <w:bookmarkEnd w:id="154"/>
-    <w:bookmarkStart w:id="155" w:name="ref-hoggtanis2015"/>
+    <w:bookmarkEnd w:id="158"/>
+    <w:bookmarkStart w:id="159" w:name="ref-hoggtanis2015"/>
     <w:p>
       <w:pPr>
         <w:pStyle w:val="Bibliography"/>
@@ -22427,8 +22519,8 @@
         <w:t xml:space="preserve">, Tenth edition. Boston: Pearson, 2019.</w:t>
       </w:r>
     </w:p>
-    <w:bookmarkEnd w:id="155"/>
-    <w:bookmarkStart w:id="156" w:name="ref-rice2007mathematical"/>
+    <w:bookmarkEnd w:id="159"/>
+    <w:bookmarkStart w:id="160" w:name="ref-rice2007mathematical"/>
     <w:p>
       <w:pPr>
         <w:pStyle w:val="Bibliography"/>
@@ -22459,8 +22551,8 @@
         <w:t xml:space="preserve">, 3rd ed. Belmont, CA: Cengage Learning, 2007.</w:t>
       </w:r>
     </w:p>
-    <w:bookmarkEnd w:id="156"/>
-    <w:bookmarkStart w:id="158" w:name="ref-wikipedia_histogram"/>
+    <w:bookmarkEnd w:id="160"/>
+    <w:bookmarkStart w:id="162" w:name="ref-wikipedia_histogram"/>
     <w:p>
       <w:pPr>
         <w:pStyle w:val="Bibliography"/>
@@ -22507,7 +22599,7 @@
       <w:r>
         <w:t xml:space="preserve"> </w:t>
       </w:r>
-      <w:hyperlink r:id="rId157">
+      <w:hyperlink r:id="rId161">
         <w:r>
           <w:rPr>
             <w:rStyle w:val="Hyperlink"/>
@@ -22516,8 +22608,8 @@
         </w:r>
       </w:hyperlink>
     </w:p>
-    <w:bookmarkEnd w:id="158"/>
-    <w:bookmarkStart w:id="160" w:name="ref-wikipedia_kernel_density_estimation"/>
+    <w:bookmarkEnd w:id="162"/>
+    <w:bookmarkStart w:id="164" w:name="ref-wikipedia_kernel_density_estimation"/>
     <w:p>
       <w:pPr>
         <w:pStyle w:val="Bibliography"/>
@@ -22564,7 +22656,7 @@
       <w:r>
         <w:t xml:space="preserve"> </w:t>
       </w:r>
-      <w:hyperlink r:id="rId159">
+      <w:hyperlink r:id="rId163">
         <w:r>
           <w:rPr>
             <w:rStyle w:val="Hyperlink"/>
@@ -22573,8 +22665,8 @@
         </w:r>
       </w:hyperlink>
     </w:p>
-    <w:bookmarkEnd w:id="160"/>
-    <w:bookmarkStart w:id="162" w:name="ref-wikipedia_box_plot"/>
+    <w:bookmarkEnd w:id="164"/>
+    <w:bookmarkStart w:id="166" w:name="ref-wikipedia_box_plot"/>
     <w:p>
       <w:pPr>
         <w:pStyle w:val="Bibliography"/>
@@ -22621,7 +22713,7 @@
       <w:r>
         <w:t xml:space="preserve"> </w:t>
       </w:r>
-      <w:hyperlink r:id="rId161">
+      <w:hyperlink r:id="rId165">
         <w:r>
           <w:rPr>
             <w:rStyle w:val="Hyperlink"/>
@@ -22630,8 +22722,8 @@
         </w:r>
       </w:hyperlink>
     </w:p>
-    <w:bookmarkEnd w:id="162"/>
-    <w:bookmarkStart w:id="164" w:name="ref-wikipedia_bar_chart"/>
+    <w:bookmarkEnd w:id="166"/>
+    <w:bookmarkStart w:id="168" w:name="ref-wikipedia_bar_chart"/>
     <w:p>
       <w:pPr>
         <w:pStyle w:val="Bibliography"/>
@@ -22678,7 +22770,7 @@
       <w:r>
         <w:t xml:space="preserve"> </w:t>
       </w:r>
-      <w:hyperlink r:id="rId163">
+      <w:hyperlink r:id="rId167">
         <w:r>
           <w:rPr>
             <w:rStyle w:val="Hyperlink"/>
@@ -22687,8 +22779,8 @@
         </w:r>
       </w:hyperlink>
     </w:p>
-    <w:bookmarkEnd w:id="164"/>
-    <w:bookmarkStart w:id="166" w:name="ref-wikipedia_q_q_plot"/>
+    <w:bookmarkEnd w:id="168"/>
+    <w:bookmarkStart w:id="170" w:name="ref-wikipedia_q_q_plot"/>
     <w:p>
       <w:pPr>
         <w:pStyle w:val="Bibliography"/>
@@ -22735,7 +22827,7 @@
       <w:r>
         <w:t xml:space="preserve"> </w:t>
       </w:r>
-      <w:hyperlink r:id="rId165">
+      <w:hyperlink r:id="rId169">
         <w:r>
           <w:rPr>
             <w:rStyle w:val="Hyperlink"/>
@@ -22744,8 +22836,8 @@
         </w:r>
       </w:hyperlink>
     </w:p>
-    <w:bookmarkEnd w:id="166"/>
-    <w:bookmarkStart w:id="168" w:name="ref-wikipedia_scatter_plot"/>
+    <w:bookmarkEnd w:id="170"/>
+    <w:bookmarkStart w:id="172" w:name="ref-wikipedia_scatter_plot"/>
     <w:p>
       <w:pPr>
         <w:pStyle w:val="Bibliography"/>
@@ -22792,7 +22884,7 @@
       <w:r>
         <w:t xml:space="preserve"> </w:t>
       </w:r>
-      <w:hyperlink r:id="rId167">
+      <w:hyperlink r:id="rId171">
         <w:r>
           <w:rPr>
             <w:rStyle w:val="Hyperlink"/>
@@ -22801,8 +22893,8 @@
         </w:r>
       </w:hyperlink>
     </w:p>
-    <w:bookmarkEnd w:id="168"/>
-    <w:bookmarkStart w:id="170" w:name="X9c68751dcff429bb8eebfb08e71b6f746222990"/>
+    <w:bookmarkEnd w:id="172"/>
+    <w:bookmarkStart w:id="174" w:name="X9c68751dcff429bb8eebfb08e71b6f746222990"/>
     <w:p>
       <w:pPr>
         <w:pStyle w:val="Bibliography"/>
@@ -22849,7 +22941,7 @@
       <w:r>
         <w:t xml:space="preserve"> </w:t>
       </w:r>
-      <w:hyperlink r:id="rId169">
+      <w:hyperlink r:id="rId173">
         <w:r>
           <w:rPr>
             <w:rStyle w:val="Hyperlink"/>
@@ -22858,8 +22950,8 @@
         </w:r>
       </w:hyperlink>
     </w:p>
-    <w:bookmarkEnd w:id="170"/>
-    <w:bookmarkStart w:id="172" w:name="ref-wikipedia_contingency_table"/>
+    <w:bookmarkEnd w:id="174"/>
+    <w:bookmarkStart w:id="176" w:name="ref-wikipedia_contingency_table"/>
     <w:p>
       <w:pPr>
         <w:pStyle w:val="Bibliography"/>
@@ -22906,7 +22998,7 @@
       <w:r>
         <w:t xml:space="preserve"> </w:t>
       </w:r>
-      <w:hyperlink r:id="rId171">
+      <w:hyperlink r:id="rId175">
         <w:r>
           <w:rPr>
             <w:rStyle w:val="Hyperlink"/>
@@ -22915,8 +23007,8 @@
         </w:r>
       </w:hyperlink>
     </w:p>
-    <w:bookmarkEnd w:id="172"/>
-    <w:bookmarkStart w:id="174" w:name="ref-wikipedia_standard_score"/>
+    <w:bookmarkEnd w:id="176"/>
+    <w:bookmarkStart w:id="178" w:name="ref-wikipedia_standard_score"/>
     <w:p>
       <w:pPr>
         <w:pStyle w:val="Bibliography"/>
@@ -22963,7 +23055,7 @@
       <w:r>
         <w:t xml:space="preserve"> </w:t>
       </w:r>
-      <w:hyperlink r:id="rId173">
+      <w:hyperlink r:id="rId177">
         <w:r>
           <w:rPr>
             <w:rStyle w:val="Hyperlink"/>
@@ -22972,8 +23064,8 @@
         </w:r>
       </w:hyperlink>
     </w:p>
-    <w:bookmarkEnd w:id="174"/>
-    <w:bookmarkStart w:id="176" w:name="ref-james2021islr2e"/>
+    <w:bookmarkEnd w:id="178"/>
+    <w:bookmarkStart w:id="180" w:name="ref-james2021islr2e"/>
     <w:p>
       <w:pPr>
         <w:pStyle w:val="Bibliography"/>
@@ -23020,7 +23112,7 @@
       <w:r>
         <w:t xml:space="preserve"> </w:t>
       </w:r>
-      <w:hyperlink r:id="rId175">
+      <w:hyperlink r:id="rId179">
         <w:r>
           <w:rPr>
             <w:rStyle w:val="Hyperlink"/>
@@ -23032,8 +23124,8 @@
         <w:t xml:space="preserve">.</w:t>
       </w:r>
     </w:p>
-    <w:bookmarkEnd w:id="176"/>
-    <w:bookmarkStart w:id="177" w:name="ref-geron2017hands"/>
+    <w:bookmarkEnd w:id="180"/>
+    <w:bookmarkStart w:id="181" w:name="ref-geron2017hands"/>
     <w:p>
       <w:pPr>
         <w:pStyle w:val="Bibliography"/>
@@ -23106,8 +23198,8 @@
         <w:t xml:space="preserve">, 1st ed. O’Reilly Media, 2017.</w:t>
       </w:r>
     </w:p>
-    <w:bookmarkEnd w:id="177"/>
-    <w:bookmarkStart w:id="179" w:name="ref-wikipedia_feature_scaling"/>
+    <w:bookmarkEnd w:id="181"/>
+    <w:bookmarkStart w:id="183" w:name="ref-wikipedia_feature_scaling"/>
     <w:p>
       <w:pPr>
         <w:pStyle w:val="Bibliography"/>
@@ -23154,7 +23246,7 @@
       <w:r>
         <w:t xml:space="preserve"> </w:t>
       </w:r>
-      <w:hyperlink r:id="rId178">
+      <w:hyperlink r:id="rId182">
         <w:r>
           <w:rPr>
             <w:rStyle w:val="Hyperlink"/>
@@ -23163,9 +23255,9 @@
         </w:r>
       </w:hyperlink>
     </w:p>
-    <w:bookmarkEnd w:id="179"/>
-    <w:bookmarkEnd w:id="180"/>
-    <w:bookmarkEnd w:id="181"/>
+    <w:bookmarkEnd w:id="183"/>
+    <w:bookmarkEnd w:id="184"/>
+    <w:bookmarkEnd w:id="185"/>
     <w:sectPr>
       <w:footnotePr>
         <w:numRestart w:val="eachSect"/>

</xml_diff>

<commit_message>
Deploying to gh-pages from @ Morrison-Lab/sds@0ac02da1fc7972057665ccc6014e4ca3dab5e488 🚀
</commit_message>
<xml_diff>
--- a/exploratory-descriptive-handout.docx
+++ b/exploratory-descriptive-handout.docx
@@ -15,10 +15,10 @@
         <w:pStyle w:val="Date"/>
       </w:pPr>
       <w:r>
-        <w:t xml:space="preserve">Last modified: 2026-10-23 11:56:24 (PDT)</w:t>
+        <w:t xml:space="preserve">Last modified: 2026-10-23 15:57:13 (PDT)</w:t>
       </w:r>
     </w:p>
-    <w:bookmarkStart w:id="24" w:name="introduction"/>
+    <w:bookmarkStart w:id="27" w:name="introduction"/>
     <w:p>
       <w:pPr>
         <w:pStyle w:val="Heading2"/>
@@ -1912,7 +1912,7 @@
       </w:r>
     </w:p>
     <w:bookmarkEnd w:id="14"/>
-    <w:bookmarkStart w:id="23" w:name="sec-populations-samples"/>
+    <w:bookmarkStart w:id="26" w:name="sec-populations-samples"/>
     <w:p>
       <w:pPr>
         <w:pStyle w:val="Heading3"/>
@@ -2622,7 +2622,7 @@
         <w:t xml:space="preserve">or, when it has one, by its probability mass or density function.</w:t>
       </w:r>
     </w:p>
-    <w:bookmarkStart w:id="19" w:name="def-sample"/>
+    <w:bookmarkStart w:id="20" w:name="def-observation"/>
     <w:p>
       <w:pPr>
         <w:pStyle w:val="BodyText"/>
@@ -2632,7 +2632,156 @@
           <w:b/>
           <w:bCs/>
         </w:rPr>
-        <w:t xml:space="preserve">Definition 3 (Sample)</w:t>
+        <w:t xml:space="preserve">Definition 3 (Observation)</w:t>
+      </w:r>
+      <w:r>
+        <w:t xml:space="preserve"> </w:t>
+      </w:r>
+      <w:r>
+        <w:t xml:space="preserve">An</w:t>
+      </w:r>
+      <w:r>
+        <w:t xml:space="preserve"> </w:t>
+      </w:r>
+      <w:r>
+        <w:rPr>
+          <w:b/>
+          <w:bCs/>
+        </w:rPr>
+        <w:t xml:space="preserve">observation</w:t>
+      </w:r>
+      <w:r>
+        <w:t xml:space="preserve"> </w:t>
+      </w:r>
+      <w:r>
+        <w:t xml:space="preserve">is the set of values recorded for the variables</w:t>
+      </w:r>
+      <w:r>
+        <w:t xml:space="preserve"> </w:t>
+      </w:r>
+      <w:r>
+        <w:t xml:space="preserve">on one unit of a population (</w:t>
+      </w:r>
+      <w:hyperlink w:anchor="def-population">
+        <w:r>
+          <w:rPr>
+            <w:rStyle w:val="Hyperlink"/>
+          </w:rPr>
+          <w:t xml:space="preserve">Definition 1</w:t>
+        </w:r>
+      </w:hyperlink>
+      <w:r>
+        <w:t xml:space="preserve">).</w:t>
+      </w:r>
+      <w:r>
+        <w:t xml:space="preserve"> </w:t>
+      </w:r>
+      <w:r>
+        <w:t xml:space="preserve">Each recorded value is a</w:t>
+      </w:r>
+      <w:r>
+        <w:t xml:space="preserve"> </w:t>
+      </w:r>
+      <w:hyperlink r:id="rId19">
+        <w:r>
+          <w:rPr>
+            <w:rStyle w:val="Hyperlink"/>
+          </w:rPr>
+          <w:t xml:space="preserve">realization</w:t>
+        </w:r>
+      </w:hyperlink>
+      <w:r>
+        <w:t xml:space="preserve"> </w:t>
+      </w:r>
+      <w:r>
+        <w:t xml:space="preserve">of the corresponding variable.</w:t>
+      </w:r>
+    </w:p>
+    <w:bookmarkEnd w:id="20"/>
+    <w:bookmarkStart w:id="21" w:name="exm-observation-wcgs"/>
+    <w:p>
+      <w:pPr>
+        <w:pStyle w:val="BodyText"/>
+      </w:pPr>
+      <w:r>
+        <w:rPr>
+          <w:b/>
+          <w:bCs/>
+        </w:rPr>
+        <w:t xml:space="preserve">Example 1 (One observation in the WCGS)</w:t>
+      </w:r>
+      <w:r>
+        <w:t xml:space="preserve"> </w:t>
+      </w:r>
+      <w:r>
+        <w:t xml:space="preserve">Each row of the</w:t>
+      </w:r>
+      <w:r>
+        <w:t xml:space="preserve"> </w:t>
+      </w:r>
+      <w:r>
+        <w:rPr>
+          <w:rStyle w:val="VerbatimChar"/>
+        </w:rPr>
+        <w:t xml:space="preserve">wcgs</w:t>
+      </w:r>
+      <w:r>
+        <w:t xml:space="preserve"> </w:t>
+      </w:r>
+      <w:r>
+        <w:t xml:space="preserve">data frame is one</w:t>
+      </w:r>
+      <w:r>
+        <w:t xml:space="preserve"> </w:t>
+      </w:r>
+      <w:hyperlink w:anchor="def-observation">
+        <w:r>
+          <w:rPr>
+            <w:rStyle w:val="Hyperlink"/>
+          </w:rPr>
+          <w:t xml:space="preserve">observation</w:t>
+        </w:r>
+      </w:hyperlink>
+      <w:r>
+        <w:t xml:space="preserve">:</w:t>
+      </w:r>
+      <w:r>
+        <w:t xml:space="preserve"> </w:t>
+      </w:r>
+      <w:r>
+        <w:t xml:space="preserve">the values recorded for one participant.</w:t>
+      </w:r>
+      <w:r>
+        <w:t xml:space="preserve"> </w:t>
+      </w:r>
+      <w:r>
+        <w:t xml:space="preserve">The first participant’s observation has</w:t>
+      </w:r>
+      <w:r>
+        <w:t xml:space="preserve"> </w:t>
+      </w:r>
+      <w:r>
+        <w:t xml:space="preserve">age 50 years and</w:t>
+      </w:r>
+      <w:r>
+        <w:t xml:space="preserve"> </w:t>
+      </w:r>
+      <w:r>
+        <w:t xml:space="preserve">cholesterol 249 mg/dL.</w:t>
+      </w:r>
+    </w:p>
+    <w:bookmarkEnd w:id="21"/>
+    <w:bookmarkStart w:id="22" w:name="def-sample"/>
+    <w:p>
+      <w:pPr>
+        <w:pStyle w:val="BodyText"/>
+      </w:pPr>
+      <w:r>
+        <w:rPr>
+          <w:b/>
+          <w:bCs/>
+        </w:rPr>
+        <w:t xml:space="preserve">Definition 4 (Sample)</w:t>
       </w:r>
       <w:r>
         <w:t xml:space="preserve"> </w:t>
@@ -2749,8 +2898,8 @@
         <w:t xml:space="preserve">).</w:t>
       </w:r>
     </w:p>
-    <w:bookmarkEnd w:id="19"/>
-    <w:bookmarkStart w:id="21" w:name="def-random-sample"/>
+    <w:bookmarkEnd w:id="22"/>
+    <w:bookmarkStart w:id="24" w:name="def-random-sample"/>
     <w:p>
       <w:pPr>
         <w:pStyle w:val="BodyText"/>
@@ -2760,7 +2909,7 @@
           <w:b/>
           <w:bCs/>
         </w:rPr>
-        <w:t xml:space="preserve">Definition 4 (Random sample)</w:t>
+        <w:t xml:space="preserve">Definition 5 (Random sample)</w:t>
       </w:r>
       <w:r>
         <w:t xml:space="preserve"> </w:t>
@@ -2773,7 +2922,7 @@
           <w:rPr>
             <w:rStyle w:val="Hyperlink"/>
           </w:rPr>
-          <w:t xml:space="preserve">Definition 3</w:t>
+          <w:t xml:space="preserve">Definition 4</w:t>
         </w:r>
       </w:hyperlink>
       <w:r>
@@ -2804,7 +2953,7 @@
       <w:r>
         <w:t xml:space="preserve"> </w:t>
       </w:r>
-      <w:hyperlink r:id="rId20">
+      <w:hyperlink r:id="rId23">
         <w:r>
           <w:rPr>
             <w:rStyle w:val="Hyperlink"/>
@@ -2949,7 +3098,7 @@
         <w:t xml:space="preserve">.</w:t>
       </w:r>
     </w:p>
-    <w:bookmarkEnd w:id="21"/>
+    <w:bookmarkEnd w:id="24"/>
     <w:p>
       <w:pPr>
         <w:pStyle w:val="BodyText"/>
@@ -2992,7 +3141,7 @@
         <w:t xml:space="preserve">approximates one.</w:t>
       </w:r>
     </w:p>
-    <w:bookmarkStart w:id="22" w:name="exm-population-sample-wcgs"/>
+    <w:bookmarkStart w:id="25" w:name="exm-population-sample-wcgs"/>
     <w:p>
       <w:pPr>
         <w:pStyle w:val="BodyText"/>
@@ -3002,7 +3151,7 @@
           <w:b/>
           <w:bCs/>
         </w:rPr>
-        <w:t xml:space="preserve">Example 1 (Population and sample in the WCGS)</w:t>
+        <w:t xml:space="preserve">Example 2 (Population and sample in the WCGS)</w:t>
       </w:r>
       <w:r>
         <w:t xml:space="preserve"> </w:t>
@@ -3070,7 +3219,7 @@
           <w:rPr>
             <w:rStyle w:val="Hyperlink"/>
           </w:rPr>
-          <w:t xml:space="preserve">Definition 3</w:t>
+          <w:t xml:space="preserve">Definition 4</w:t>
         </w:r>
       </w:hyperlink>
       <w:r>
@@ -3099,7 +3248,7 @@
           <w:rPr>
             <w:rStyle w:val="Hyperlink"/>
           </w:rPr>
-          <w:t xml:space="preserve">Definition 4</w:t>
+          <w:t xml:space="preserve">Definition 5</w:t>
         </w:r>
       </w:hyperlink>
       <w:r>
@@ -3130,10 +3279,10 @@
         <w:t xml:space="preserve">only to the extent that the volunteers resemble the rest of the population.</w:t>
       </w:r>
     </w:p>
-    <w:bookmarkEnd w:id="22"/>
-    <w:bookmarkEnd w:id="23"/>
-    <w:bookmarkEnd w:id="24"/>
-    <w:bookmarkStart w:id="48" w:name="summarizing-a-single-variable"/>
+    <w:bookmarkEnd w:id="25"/>
+    <w:bookmarkEnd w:id="26"/>
+    <w:bookmarkEnd w:id="27"/>
+    <w:bookmarkStart w:id="53" w:name="summarizing-a-single-variable"/>
     <w:p>
       <w:pPr>
         <w:pStyle w:val="Heading2"/>
@@ -3142,7 +3291,7 @@
         <w:t xml:space="preserve">2 Summarizing a single variable</w:t>
       </w:r>
     </w:p>
-    <w:bookmarkStart w:id="30" w:name="measures-of-center"/>
+    <w:bookmarkStart w:id="35" w:name="measures-of-center"/>
     <w:p>
       <w:pPr>
         <w:pStyle w:val="Heading3"/>
@@ -3151,7 +3300,7 @@
         <w:t xml:space="preserve">2.1 Measures of center</w:t>
       </w:r>
     </w:p>
-    <w:bookmarkStart w:id="25" w:name="def-sample-mean"/>
+    <w:bookmarkStart w:id="28" w:name="def-sample-mean"/>
     <w:p>
       <w:pPr>
         <w:pStyle w:val="FirstParagraph"/>
@@ -3161,7 +3310,7 @@
           <w:b/>
           <w:bCs/>
         </w:rPr>
-        <w:t xml:space="preserve">Definition 5 (Sample mean)</w:t>
+        <w:t xml:space="preserve">Definition 6 (Sample mean)</w:t>
       </w:r>
       <w:r>
         <w:t xml:space="preserve"> </w:t>
@@ -3350,8 +3499,8 @@
         </m:oMath>
       </m:oMathPara>
     </w:p>
-    <w:bookmarkEnd w:id="25"/>
-    <w:bookmarkStart w:id="26" w:name="exm-sample-mean"/>
+    <w:bookmarkEnd w:id="28"/>
+    <w:bookmarkStart w:id="29" w:name="exm-sample-mean"/>
     <w:p>
       <w:pPr>
         <w:pStyle w:val="FirstParagraph"/>
@@ -3361,7 +3510,7 @@
           <w:b/>
           <w:bCs/>
         </w:rPr>
-        <w:t xml:space="preserve">Example 2 (Sample mean cholesterol in the WCGS)</w:t>
+        <w:t xml:space="preserve">Example 3 (Sample mean cholesterol in the WCGS)</w:t>
       </w:r>
       <w:r>
         <w:t xml:space="preserve"> </w:t>
@@ -3459,8 +3608,8 @@
         <w:t xml:space="preserve">#&gt; [1] 226.372</w:t>
       </w:r>
     </w:p>
-    <w:bookmarkEnd w:id="26"/>
-    <w:bookmarkStart w:id="28" w:name="def-sample-median"/>
+    <w:bookmarkEnd w:id="29"/>
+    <w:bookmarkStart w:id="31" w:name="exm-sample-vs-population-mean"/>
     <w:p>
       <w:pPr>
         <w:pStyle w:val="FirstParagraph"/>
@@ -3470,7 +3619,7 @@
           <w:b/>
           <w:bCs/>
         </w:rPr>
-        <w:t xml:space="preserve">Definition 6 (Sample median)</w:t>
+        <w:t xml:space="preserve">Example 4 (Sample mean versus population mean of cholesterol)</w:t>
       </w:r>
       <w:r>
         <w:t xml:space="preserve"> </w:t>
@@ -3481,11 +3630,178 @@
       <w:r>
         <w:t xml:space="preserve"> </w:t>
       </w:r>
+      <w:hyperlink r:id="rId30">
+        <w:r>
+          <w:rPr>
+            <w:rStyle w:val="Hyperlink"/>
+          </w:rPr>
+          <w:t xml:space="preserve">population mean</w:t>
+        </w:r>
+      </w:hyperlink>
+      <w:r>
+        <w:t xml:space="preserve"> </w:t>
+      </w:r>
+      <w:r>
+        <w:t xml:space="preserve">of cholesterol</w:t>
+      </w:r>
+      <w:r>
+        <w:t xml:space="preserve"> </w:t>
+      </w:r>
+      <w:r>
+        <w:t xml:space="preserve">is the</w:t>
+      </w:r>
+      <w:r>
+        <w:t xml:space="preserve"> </w:t>
+      </w:r>
+      <w:hyperlink r:id="rId30">
+        <w:r>
+          <w:rPr>
+            <w:rStyle w:val="Hyperlink"/>
+          </w:rPr>
+          <w:t xml:space="preserve">expectation</w:t>
+        </w:r>
+      </w:hyperlink>
+      <w:r>
+        <w:t xml:space="preserve"> </w:t>
+      </w:r>
+      <w:r>
+        <w:t xml:space="preserve">of the population distribution (</w:t>
+      </w:r>
+      <w:hyperlink w:anchor="def-population-distribution">
+        <w:r>
+          <w:rPr>
+            <w:rStyle w:val="Hyperlink"/>
+          </w:rPr>
+          <w:t xml:space="preserve">Definition 2</w:t>
+        </w:r>
+      </w:hyperlink>
+      <w:r>
+        <w:t xml:space="preserve">).</w:t>
+      </w:r>
+      <w:r>
+        <w:t xml:space="preserve"> </w:t>
+      </w:r>
+      <w:r>
+        <w:t xml:space="preserve">It is a fixed number that we do not know.</w:t>
+      </w:r>
+      <w:r>
+        <w:t xml:space="preserve"> </w:t>
+      </w:r>
+      <w:r>
+        <w:t xml:space="preserve">The sample mean (</w:t>
+      </w:r>
+      <w:hyperlink w:anchor="def-sample-mean">
+        <w:r>
+          <w:rPr>
+            <w:rStyle w:val="Hyperlink"/>
+          </w:rPr>
+          <w:t xml:space="preserve">Definition 6</w:t>
+        </w:r>
+      </w:hyperlink>
+      <w:r>
+        <w:t xml:space="preserve">) of the</w:t>
+      </w:r>
+      <w:r>
+        <w:t xml:space="preserve"> </w:t>
+      </w:r>
+      <w:r>
+        <w:rPr>
+          <w:rStyle w:val="VerbatimChar"/>
+        </w:rPr>
+        <w:t xml:space="preserve">wcgs</w:t>
+      </w:r>
+      <w:r>
+        <w:t xml:space="preserve"> </w:t>
+      </w:r>
+      <w:r>
+        <w:t xml:space="preserve">data,</w:t>
+      </w:r>
+      <w:r>
+        <w:t xml:space="preserve"> </w:t>
+      </w:r>
+      <w:r>
+        <w:t xml:space="preserve">226.4 mg/dL,</w:t>
+      </w:r>
+      <w:r>
+        <w:t xml:space="preserve"> </w:t>
+      </w:r>
+      <w:r>
+        <w:t xml:space="preserve">is computed from the observed data.</w:t>
+      </w:r>
+      <w:r>
+        <w:t xml:space="preserve"> </w:t>
+      </w:r>
+      <w:r>
+        <w:t xml:space="preserve">A different</w:t>
+      </w:r>
+      <w:r>
+        <w:t xml:space="preserve"> </w:t>
+      </w:r>
+      <w:hyperlink w:anchor="def-sample">
+        <w:r>
+          <w:rPr>
+            <w:rStyle w:val="Hyperlink"/>
+          </w:rPr>
+          <w:t xml:space="preserve">sample</w:t>
+        </w:r>
+      </w:hyperlink>
+      <w:r>
+        <w:t xml:space="preserve"> </w:t>
+      </w:r>
+      <w:r>
+        <w:t xml:space="preserve">from the same</w:t>
+      </w:r>
+      <w:r>
+        <w:t xml:space="preserve"> </w:t>
+      </w:r>
+      <w:hyperlink w:anchor="def-population">
+        <w:r>
+          <w:rPr>
+            <w:rStyle w:val="Hyperlink"/>
+          </w:rPr>
+          <w:t xml:space="preserve">population</w:t>
+        </w:r>
+      </w:hyperlink>
+      <w:r>
+        <w:t xml:space="preserve"> </w:t>
+      </w:r>
+      <w:r>
+        <w:t xml:space="preserve">would give a different sample mean,</w:t>
+      </w:r>
+      <w:r>
+        <w:t xml:space="preserve"> </w:t>
+      </w:r>
+      <w:r>
+        <w:t xml:space="preserve">while the population mean would not change.</w:t>
+      </w:r>
+    </w:p>
+    <w:bookmarkEnd w:id="31"/>
+    <w:bookmarkStart w:id="33" w:name="def-sample-median"/>
+    <w:p>
+      <w:pPr>
+        <w:pStyle w:val="BodyText"/>
+      </w:pPr>
       <w:r>
         <w:rPr>
           <w:b/>
           <w:bCs/>
         </w:rPr>
+        <w:t xml:space="preserve">Definition 7 (Sample median)</w:t>
+      </w:r>
+      <w:r>
+        <w:t xml:space="preserve"> </w:t>
+      </w:r>
+      <w:r>
+        <w:t xml:space="preserve">The</w:t>
+      </w:r>
+      <w:r>
+        <w:t xml:space="preserve"> </w:t>
+      </w:r>
+      <w:r>
+        <w:rPr>
+          <w:b/>
+          <w:bCs/>
+        </w:rPr>
         <w:t xml:space="preserve">sample median</w:t>
       </w:r>
       <w:r>
@@ -3509,7 +3825,7 @@
       <w:r>
         <w:t xml:space="preserve"> </w:t>
       </w:r>
-      <w:hyperlink r:id="rId27">
+      <w:hyperlink r:id="rId32">
         <w:r>
           <w:rPr>
             <w:rStyle w:val="Hyperlink"/>
@@ -3843,8 +4159,8 @@
         <w:t xml:space="preserve">.</w:t>
       </w:r>
     </w:p>
-    <w:bookmarkEnd w:id="28"/>
-    <w:bookmarkStart w:id="29" w:name="exm-sample-median"/>
+    <w:bookmarkEnd w:id="33"/>
+    <w:bookmarkStart w:id="34" w:name="exm-sample-median"/>
     <w:p>
       <w:pPr>
         <w:pStyle w:val="BodyText"/>
@@ -3854,7 +4170,7 @@
           <w:b/>
           <w:bCs/>
         </w:rPr>
-        <w:t xml:space="preserve">Example 3 (Median cholesterol in the WCGS)</w:t>
+        <w:t xml:space="preserve">Example 5 (Median cholesterol in the WCGS)</w:t>
       </w:r>
       <w:r>
         <w:t xml:space="preserve"> </w:t>
@@ -3943,7 +4259,7 @@
           <w:rPr>
             <w:rStyle w:val="Hyperlink"/>
           </w:rPr>
-          <w:t xml:space="preserve">Example 2</w:t>
+          <w:t xml:space="preserve">Example 3</w:t>
         </w:r>
       </w:hyperlink>
       <w:r>
@@ -3980,9 +4296,9 @@
         <w:t xml:space="preserve">A median is less sensitive to extreme values than a sample mean.</w:t>
       </w:r>
     </w:p>
-    <w:bookmarkEnd w:id="29"/>
-    <w:bookmarkEnd w:id="30"/>
-    <w:bookmarkStart w:id="41" w:name="measures-of-spread"/>
+    <w:bookmarkEnd w:id="34"/>
+    <w:bookmarkEnd w:id="35"/>
+    <w:bookmarkStart w:id="46" w:name="measures-of-spread"/>
     <w:p>
       <w:pPr>
         <w:pStyle w:val="Heading3"/>
@@ -3991,7 +4307,7 @@
         <w:t xml:space="preserve">2.2 Measures of spread</w:t>
       </w:r>
     </w:p>
-    <w:bookmarkStart w:id="31" w:name="def-sample-variance"/>
+    <w:bookmarkStart w:id="36" w:name="def-sample-variance"/>
     <w:p>
       <w:pPr>
         <w:pStyle w:val="FirstParagraph"/>
@@ -4001,7 +4317,7 @@
           <w:b/>
           <w:bCs/>
         </w:rPr>
-        <w:t xml:space="preserve">Definition 7 (Sample variance)</w:t>
+        <w:t xml:space="preserve">Definition 8 (Sample variance)</w:t>
       </w:r>
       <w:r>
         <w:t xml:space="preserve"> </w:t>
@@ -4211,8 +4527,8 @@
         <w:t xml:space="preserve">.</w:t>
       </w:r>
     </w:p>
-    <w:bookmarkEnd w:id="31"/>
-    <w:bookmarkStart w:id="32" w:name="def-sample-sd"/>
+    <w:bookmarkEnd w:id="36"/>
+    <w:bookmarkStart w:id="37" w:name="def-sample-sd"/>
     <w:p>
       <w:pPr>
         <w:pStyle w:val="BodyText"/>
@@ -4222,7 +4538,7 @@
           <w:b/>
           <w:bCs/>
         </w:rPr>
-        <w:t xml:space="preserve">Definition 8 (Sample standard deviation)</w:t>
+        <w:t xml:space="preserve">Definition 9 (Sample standard deviation)</w:t>
       </w:r>
       <w:r>
         <w:t xml:space="preserve"> </w:t>
@@ -4332,8 +4648,8 @@
         <w:t xml:space="preserve">.</w:t>
       </w:r>
     </w:p>
-    <w:bookmarkEnd w:id="32"/>
-    <w:bookmarkStart w:id="33" w:name="rem-sd-units"/>
+    <w:bookmarkEnd w:id="37"/>
+    <w:bookmarkStart w:id="38" w:name="rem-sd-units"/>
     <w:p>
       <w:pPr>
         <w:pStyle w:val="BodyText"/>
@@ -4364,8 +4680,8 @@
         <w:t xml:space="preserve">whose units are squared.</w:t>
       </w:r>
     </w:p>
-    <w:bookmarkEnd w:id="33"/>
-    <w:bookmarkStart w:id="34" w:name="exm-sample-sd"/>
+    <w:bookmarkEnd w:id="38"/>
+    <w:bookmarkStart w:id="39" w:name="exm-sample-sd"/>
     <w:p>
       <w:pPr>
         <w:pStyle w:val="BodyText"/>
@@ -4375,7 +4691,7 @@
           <w:b/>
           <w:bCs/>
         </w:rPr>
-        <w:t xml:space="preserve">Example 4 (Variance and standard deviation of cholesterol in the WCGS)</w:t>
+        <w:t xml:space="preserve">Example 6 (Variance and standard deviation of cholesterol in the WCGS)</w:t>
       </w:r>
       <w:r>
         <w:t xml:space="preserve"> </w:t>
@@ -4535,8 +4851,8 @@
         <w:t xml:space="preserve">like the cholesterol values themselves.</w:t>
       </w:r>
     </w:p>
-    <w:bookmarkEnd w:id="34"/>
-    <w:bookmarkStart w:id="36" w:name="def-quartiles"/>
+    <w:bookmarkEnd w:id="39"/>
+    <w:bookmarkStart w:id="41" w:name="def-quartiles"/>
     <w:p>
       <w:pPr>
         <w:pStyle w:val="BodyText"/>
@@ -4546,7 +4862,7 @@
           <w:b/>
           <w:bCs/>
         </w:rPr>
-        <w:t xml:space="preserve">Definition 9 (Quartiles (first quartile, third quartile, 25th percentile, 75th percentile))</w:t>
+        <w:t xml:space="preserve">Definition 10 (Quartiles (first quartile, third quartile, 25th percentile, 75th percentile))</w:t>
       </w:r>
       <w:r>
         <w:t xml:space="preserve"> </w:t>
@@ -4645,7 +4961,7 @@
       <w:r>
         <w:t xml:space="preserve">(</w:t>
       </w:r>
-      <w:hyperlink r:id="rId35">
+      <w:hyperlink r:id="rId40">
         <w:r>
           <w:rPr>
             <w:rStyle w:val="Hyperlink"/>
@@ -4712,8 +5028,8 @@
         <w:t xml:space="preserve">.</w:t>
       </w:r>
     </w:p>
-    <w:bookmarkEnd w:id="36"/>
-    <w:bookmarkStart w:id="38" w:name="rem-quartile-software"/>
+    <w:bookmarkEnd w:id="41"/>
+    <w:bookmarkStart w:id="43" w:name="rem-quartile-software"/>
     <w:p>
       <w:pPr>
         <w:pStyle w:val="BodyText"/>
@@ -4781,7 +5097,7 @@
       <w:r>
         <w:t xml:space="preserve">(</w:t>
       </w:r>
-      <w:hyperlink r:id="rId37">
+      <w:hyperlink r:id="rId42">
         <w:r>
           <w:rPr>
             <w:rStyle w:val="Hyperlink"/>
@@ -4832,8 +5148,8 @@
         <w:t xml:space="preserve">, interpolates.</w:t>
       </w:r>
     </w:p>
-    <w:bookmarkEnd w:id="38"/>
-    <w:bookmarkStart w:id="39" w:name="def-IQR"/>
+    <w:bookmarkEnd w:id="43"/>
+    <w:bookmarkStart w:id="44" w:name="def-IQR"/>
     <w:p>
       <w:pPr>
         <w:pStyle w:val="BodyText"/>
@@ -4843,7 +5159,7 @@
           <w:b/>
           <w:bCs/>
         </w:rPr>
-        <w:t xml:space="preserve">Definition 10 (Interquartile range)</w:t>
+        <w:t xml:space="preserve">Definition 11 (Interquartile range)</w:t>
       </w:r>
       <w:r>
         <w:t xml:space="preserve"> </w:t>
@@ -4973,8 +5289,8 @@
         <w:t xml:space="preserve">.</w:t>
       </w:r>
     </w:p>
-    <w:bookmarkEnd w:id="39"/>
-    <w:bookmarkStart w:id="40" w:name="exm-IQR"/>
+    <w:bookmarkEnd w:id="44"/>
+    <w:bookmarkStart w:id="45" w:name="exm-IQR"/>
     <w:p>
       <w:pPr>
         <w:pStyle w:val="BodyText"/>
@@ -4984,7 +5300,7 @@
           <w:b/>
           <w:bCs/>
         </w:rPr>
-        <w:t xml:space="preserve">Example 5 (Quartiles and IQR of cholesterol in the WCGS)</w:t>
+        <w:t xml:space="preserve">Example 7 (Quartiles and IQR of cholesterol in the WCGS)</w:t>
       </w:r>
       <w:r>
         <w:t xml:space="preserve"> </w:t>
@@ -5246,9 +5562,9 @@
         <w:t xml:space="preserve">so it is less sensitive to outliers than the standard deviation.</w:t>
       </w:r>
     </w:p>
-    <w:bookmarkEnd w:id="40"/>
-    <w:bookmarkEnd w:id="41"/>
-    <w:bookmarkStart w:id="43" w:name="summary-statistics-in-r"/>
+    <w:bookmarkEnd w:id="45"/>
+    <w:bookmarkEnd w:id="46"/>
+    <w:bookmarkStart w:id="48" w:name="summary-statistics-in-r"/>
     <w:p>
       <w:pPr>
         <w:pStyle w:val="Heading3"/>
@@ -5314,7 +5630,7 @@
           <w:rPr>
             <w:rStyle w:val="Hyperlink"/>
           </w:rPr>
-          <w:t xml:space="preserve">Definition 9</w:t>
+          <w:t xml:space="preserve">Definition 10</w:t>
         </w:r>
       </w:hyperlink>
       <w:r>
@@ -5415,7 +5731,7 @@
       <w:tr>
         <w:tc>
           <w:tcPr/>
-          <w:bookmarkStart w:id="42" w:name="tbl-wcgs-summary-continuous"/>
+          <w:bookmarkStart w:id="47" w:name="tbl-wcgs-summary-continuous"/>
           <w:p>
             <w:pPr>
               <w:jc w:val="center"/>
@@ -6142,12 +6458,12 @@
               </w:tc>
             </w:tr>
           </w:tbl>
-          <w:bookmarkEnd w:id="42"/>
+          <w:bookmarkEnd w:id="47"/>
         </w:tc>
       </w:tr>
     </w:tbl>
-    <w:bookmarkEnd w:id="43"/>
-    <w:bookmarkStart w:id="47" w:name="binary-and-categorical-variables"/>
+    <w:bookmarkEnd w:id="48"/>
+    <w:bookmarkStart w:id="52" w:name="binary-and-categorical-variables"/>
     <w:p>
       <w:pPr>
         <w:pStyle w:val="Heading3"/>
@@ -6156,7 +6472,7 @@
         <w:t xml:space="preserve">2.4 Binary and categorical variables</w:t>
       </w:r>
     </w:p>
-    <w:bookmarkStart w:id="44" w:name="def-sample-proportion"/>
+    <w:bookmarkStart w:id="49" w:name="def-sample-proportion"/>
     <w:p>
       <w:pPr>
         <w:pStyle w:val="FirstParagraph"/>
@@ -6166,7 +6482,7 @@
           <w:b/>
           <w:bCs/>
         </w:rPr>
-        <w:t xml:space="preserve">Definition 11 (Sample proportion)</w:t>
+        <w:t xml:space="preserve">Definition 12 (Sample proportion)</w:t>
       </w:r>
       <w:r>
         <w:t xml:space="preserve"> </w:t>
@@ -6295,8 +6611,8 @@
         <w:t xml:space="preserve">is the number of observations.</w:t>
       </w:r>
     </w:p>
-    <w:bookmarkEnd w:id="44"/>
-    <w:bookmarkStart w:id="45" w:name="exm-sample-proportion"/>
+    <w:bookmarkEnd w:id="49"/>
+    <w:bookmarkStart w:id="50" w:name="exm-sample-proportion"/>
     <w:p>
       <w:pPr>
         <w:pStyle w:val="BodyText"/>
@@ -6306,7 +6622,7 @@
           <w:b/>
           <w:bCs/>
         </w:rPr>
-        <w:t xml:space="preserve">Example 6 (Proportion of WCGS participants with a CHD event)</w:t>
+        <w:t xml:space="preserve">Example 8 (Proportion of WCGS participants with a CHD event)</w:t>
       </w:r>
       <w:r>
         <w:t xml:space="preserve"> </w:t>
@@ -6457,7 +6773,7 @@
         <w:t xml:space="preserve">0.081.</w:t>
       </w:r>
     </w:p>
-    <w:bookmarkEnd w:id="45"/>
+    <w:bookmarkEnd w:id="50"/>
     <w:p>
       <w:pPr>
         <w:pStyle w:val="BodyText"/>
@@ -6508,7 +6824,7 @@
       <w:tr>
         <w:tc>
           <w:tcPr/>
-          <w:bookmarkStart w:id="46" w:name="tbl-wcgs-summary-cat"/>
+          <w:bookmarkStart w:id="51" w:name="tbl-wcgs-summary-cat"/>
           <w:p>
             <w:pPr>
               <w:jc w:val="center"/>
@@ -7503,7 +7819,7 @@
               </w:tc>
             </w:tr>
           </w:tbl>
-          <w:bookmarkEnd w:id="46"/>
+          <w:bookmarkEnd w:id="51"/>
         </w:tc>
       </w:tr>
     </w:tbl>
@@ -7543,9 +7859,9 @@
         <w:t xml:space="preserve">covers measures of location and dispersion.</w:t>
       </w:r>
     </w:p>
-    <w:bookmarkEnd w:id="47"/>
-    <w:bookmarkEnd w:id="48"/>
-    <w:bookmarkStart w:id="82" w:name="graphical-methods"/>
+    <w:bookmarkEnd w:id="52"/>
+    <w:bookmarkEnd w:id="53"/>
+    <w:bookmarkStart w:id="87" w:name="graphical-methods"/>
     <w:p>
       <w:pPr>
         <w:pStyle w:val="Heading2"/>
@@ -7580,7 +7896,7 @@
         <w:t xml:space="preserve">Different types of graph suit different types of variable.</w:t>
       </w:r>
     </w:p>
-    <w:bookmarkStart w:id="55" w:name="histograms"/>
+    <w:bookmarkStart w:id="60" w:name="histograms"/>
     <w:p>
       <w:pPr>
         <w:pStyle w:val="Heading3"/>
@@ -7589,7 +7905,7 @@
         <w:t xml:space="preserve">3.1 Histograms</w:t>
       </w:r>
     </w:p>
-    <w:bookmarkStart w:id="49" w:name="def-histogram"/>
+    <w:bookmarkStart w:id="54" w:name="def-histogram"/>
     <w:p>
       <w:pPr>
         <w:pStyle w:val="FirstParagraph"/>
@@ -7599,7 +7915,7 @@
           <w:b/>
           <w:bCs/>
         </w:rPr>
-        <w:t xml:space="preserve">Definition 12 (Histogram)</w:t>
+        <w:t xml:space="preserve">Definition 13 (Histogram)</w:t>
       </w:r>
       <w:r>
         <w:t xml:space="preserve"> </w:t>
@@ -7659,8 +7975,8 @@
         <w:t xml:space="preserve">.</w:t>
       </w:r>
     </w:p>
-    <w:bookmarkEnd w:id="49"/>
-    <w:bookmarkStart w:id="50" w:name="def-bin"/>
+    <w:bookmarkEnd w:id="54"/>
+    <w:bookmarkStart w:id="55" w:name="def-bin"/>
     <w:p>
       <w:pPr>
         <w:pStyle w:val="BodyText"/>
@@ -7670,7 +7986,7 @@
           <w:b/>
           <w:bCs/>
         </w:rPr>
-        <w:t xml:space="preserve">Definition 13 (Bin)</w:t>
+        <w:t xml:space="preserve">Definition 14 (Bin)</w:t>
       </w:r>
       <w:r>
         <w:t xml:space="preserve"> </w:t>
@@ -7695,7 +8011,7 @@
         <w:t xml:space="preserve">of a histogram is one of its intervals.</w:t>
       </w:r>
     </w:p>
-    <w:bookmarkEnd w:id="50"/>
+    <w:bookmarkEnd w:id="55"/>
     <w:tbl>
       <w:tblPr>
         <w:tblStyle w:val="Table"/>
@@ -7709,7 +8025,7 @@
       <w:tr>
         <w:tc>
           <w:tcPr/>
-          <w:bookmarkStart w:id="54" w:name="fig-hist-chol"/>
+          <w:bookmarkStart w:id="59" w:name="fig-hist-chol"/>
           <w:p>
             <w:pPr>
               <w:pStyle w:val="SourceCode"/>
@@ -7995,18 +8311,18 @@
                 <wp:inline>
                   <wp:extent cx="4620126" cy="3696101"/>
                   <wp:effectExtent b="0" l="0" r="0" t="0"/>
-                  <wp:docPr descr="" title="" id="52" name="Picture"/>
+                  <wp:docPr descr="" title="" id="57" name="Picture"/>
                   <a:graphic>
                     <a:graphicData uri="http://schemas.openxmlformats.org/drawingml/2006/picture">
                       <pic:pic>
                         <pic:nvPicPr>
-                          <pic:cNvPr descr="exploratory-descriptive_files/figure-docx/unnamed-chunk-8-1.png" id="53" name="Picture"/>
+                          <pic:cNvPr descr="exploratory-descriptive_files/figure-docx/unnamed-chunk-8-1.png" id="58" name="Picture"/>
                           <pic:cNvPicPr>
                             <a:picLocks noChangeArrowheads="1" noChangeAspect="1"/>
                           </pic:cNvPicPr>
                         </pic:nvPicPr>
                         <pic:blipFill>
-                          <a:blip r:embed="rId51"/>
+                          <a:blip r:embed="rId56"/>
                           <a:stretch>
                             <a:fillRect/>
                           </a:stretch>
@@ -8046,7 +8362,7 @@
               <w:t xml:space="preserve">Figure 1: Histogram of total cholesterol in the WCGS dataset</w:t>
             </w:r>
           </w:p>
-          <w:bookmarkEnd w:id="54"/>
+          <w:bookmarkEnd w:id="59"/>
         </w:tc>
       </w:tr>
     </w:tbl>
@@ -8093,8 +8409,8 @@
         <w:t xml:space="preserve">but the largest value is 645 mg/dL.</w:t>
       </w:r>
     </w:p>
-    <w:bookmarkEnd w:id="55"/>
-    <w:bookmarkStart w:id="61" w:name="density-plots"/>
+    <w:bookmarkEnd w:id="60"/>
+    <w:bookmarkStart w:id="66" w:name="density-plots"/>
     <w:p>
       <w:pPr>
         <w:pStyle w:val="Heading3"/>
@@ -8103,7 +8419,7 @@
         <w:t xml:space="preserve">3.2 Density plots</w:t>
       </w:r>
     </w:p>
-    <w:bookmarkStart w:id="56" w:name="def-density-plot"/>
+    <w:bookmarkStart w:id="61" w:name="def-density-plot"/>
     <w:p>
       <w:pPr>
         <w:pStyle w:val="FirstParagraph"/>
@@ -8113,7 +8429,7 @@
           <w:b/>
           <w:bCs/>
         </w:rPr>
-        <w:t xml:space="preserve">Definition 14 (Density plot)</w:t>
+        <w:t xml:space="preserve">Definition 15 (Density plot)</w:t>
       </w:r>
       <w:r>
         <w:t xml:space="preserve"> </w:t>
@@ -8167,7 +8483,7 @@
         <w:t xml:space="preserve">.</w:t>
       </w:r>
     </w:p>
-    <w:bookmarkEnd w:id="56"/>
+    <w:bookmarkEnd w:id="61"/>
     <w:tbl>
       <w:tblPr>
         <w:tblStyle w:val="Table"/>
@@ -8181,7 +8497,7 @@
       <w:tr>
         <w:tc>
           <w:tcPr/>
-          <w:bookmarkStart w:id="60" w:name="fig-density-chol"/>
+          <w:bookmarkStart w:id="65" w:name="fig-density-chol"/>
           <w:p>
             <w:pPr>
               <w:pStyle w:val="SourceCode"/>
@@ -8443,18 +8759,18 @@
                 <wp:inline>
                   <wp:extent cx="4620126" cy="3696101"/>
                   <wp:effectExtent b="0" l="0" r="0" t="0"/>
-                  <wp:docPr descr="" title="" id="58" name="Picture"/>
+                  <wp:docPr descr="" title="" id="63" name="Picture"/>
                   <a:graphic>
                     <a:graphicData uri="http://schemas.openxmlformats.org/drawingml/2006/picture">
                       <pic:pic>
                         <pic:nvPicPr>
-                          <pic:cNvPr descr="exploratory-descriptive_files/figure-docx/unnamed-chunk-9-1.png" id="59" name="Picture"/>
+                          <pic:cNvPr descr="exploratory-descriptive_files/figure-docx/unnamed-chunk-9-1.png" id="64" name="Picture"/>
                           <pic:cNvPicPr>
                             <a:picLocks noChangeArrowheads="1" noChangeAspect="1"/>
                           </pic:cNvPicPr>
                         </pic:nvPicPr>
                         <pic:blipFill>
-                          <a:blip r:embed="rId57"/>
+                          <a:blip r:embed="rId62"/>
                           <a:stretch>
                             <a:fillRect/>
                           </a:stretch>
@@ -8494,12 +8810,12 @@
               <w:t xml:space="preserve">Figure 2: Density plot of total cholesterol in the WCGS dataset</w:t>
             </w:r>
           </w:p>
-          <w:bookmarkEnd w:id="60"/>
+          <w:bookmarkEnd w:id="65"/>
         </w:tc>
       </w:tr>
     </w:tbl>
-    <w:bookmarkEnd w:id="61"/>
-    <w:bookmarkStart w:id="69" w:name="box-plots"/>
+    <w:bookmarkEnd w:id="66"/>
+    <w:bookmarkStart w:id="74" w:name="box-plots"/>
     <w:p>
       <w:pPr>
         <w:pStyle w:val="Heading3"/>
@@ -8508,7 +8824,7 @@
         <w:t xml:space="preserve">3.3 Box plots</w:t>
       </w:r>
     </w:p>
-    <w:bookmarkStart w:id="63" w:name="def-boxplot"/>
+    <w:bookmarkStart w:id="68" w:name="def-boxplot"/>
     <w:p>
       <w:pPr>
         <w:pStyle w:val="FirstParagraph"/>
@@ -8518,7 +8834,7 @@
           <w:b/>
           <w:bCs/>
         </w:rPr>
-        <w:t xml:space="preserve">Definition 15 (Box plot (box-and-whisker plot))</w:t>
+        <w:t xml:space="preserve">Definition 16 (Box plot (box-and-whisker plot))</w:t>
       </w:r>
       <w:r>
         <w:t xml:space="preserve"> </w:t>
@@ -8564,7 +8880,7 @@
       <w:r>
         <w:t xml:space="preserve"> </w:t>
       </w:r>
-      <w:hyperlink r:id="rId62">
+      <w:hyperlink r:id="rId67">
         <w:r>
           <w:rPr>
             <w:rStyle w:val="Hyperlink"/>
@@ -8728,8 +9044,8 @@
         <w:t xml:space="preserve">.</w:t>
       </w:r>
     </w:p>
-    <w:bookmarkEnd w:id="63"/>
-    <w:bookmarkStart w:id="64" w:name="rem-whisker-rule"/>
+    <w:bookmarkEnd w:id="68"/>
+    <w:bookmarkStart w:id="69" w:name="rem-whisker-rule"/>
     <w:p>
       <w:pPr>
         <w:pStyle w:val="BodyText"/>
@@ -8814,7 +9130,7 @@
         <w:t xml:space="preserve">such as whiskers that run to the minimum and maximum.</w:t>
       </w:r>
     </w:p>
-    <w:bookmarkEnd w:id="64"/>
+    <w:bookmarkEnd w:id="69"/>
     <w:tbl>
       <w:tblPr>
         <w:tblStyle w:val="Table"/>
@@ -8828,7 +9144,7 @@
       <w:tr>
         <w:tc>
           <w:tcPr/>
-          <w:bookmarkStart w:id="68" w:name="fig-box-chol"/>
+          <w:bookmarkStart w:id="73" w:name="fig-box-chol"/>
           <w:p>
             <w:pPr>
               <w:pStyle w:val="SourceCode"/>
@@ -9105,18 +9421,18 @@
                 <wp:inline>
                   <wp:extent cx="4620126" cy="3696101"/>
                   <wp:effectExtent b="0" l="0" r="0" t="0"/>
-                  <wp:docPr descr="" title="" id="66" name="Picture"/>
+                  <wp:docPr descr="" title="" id="71" name="Picture"/>
                   <a:graphic>
                     <a:graphicData uri="http://schemas.openxmlformats.org/drawingml/2006/picture">
                       <pic:pic>
                         <pic:nvPicPr>
-                          <pic:cNvPr descr="exploratory-descriptive_files/figure-docx/unnamed-chunk-10-1.png" id="67" name="Picture"/>
+                          <pic:cNvPr descr="exploratory-descriptive_files/figure-docx/unnamed-chunk-10-1.png" id="72" name="Picture"/>
                           <pic:cNvPicPr>
                             <a:picLocks noChangeArrowheads="1" noChangeAspect="1"/>
                           </pic:cNvPicPr>
                         </pic:nvPicPr>
                         <pic:blipFill>
-                          <a:blip r:embed="rId65"/>
+                          <a:blip r:embed="rId70"/>
                           <a:stretch>
                             <a:fillRect/>
                           </a:stretch>
@@ -9156,12 +9472,12 @@
               <w:t xml:space="preserve">Figure 3: Box plot of total cholesterol in the WCGS dataset</w:t>
             </w:r>
           </w:p>
-          <w:bookmarkEnd w:id="68"/>
+          <w:bookmarkEnd w:id="73"/>
         </w:tc>
       </w:tr>
     </w:tbl>
-    <w:bookmarkEnd w:id="69"/>
-    <w:bookmarkStart w:id="75" w:name="bar-charts"/>
+    <w:bookmarkEnd w:id="74"/>
+    <w:bookmarkStart w:id="80" w:name="bar-charts"/>
     <w:p>
       <w:pPr>
         <w:pStyle w:val="Heading3"/>
@@ -9170,7 +9486,7 @@
         <w:t xml:space="preserve">3.4 Bar charts</w:t>
       </w:r>
     </w:p>
-    <w:bookmarkStart w:id="70" w:name="def-bar-chart"/>
+    <w:bookmarkStart w:id="75" w:name="def-bar-chart"/>
     <w:p>
       <w:pPr>
         <w:pStyle w:val="FirstParagraph"/>
@@ -9180,7 +9496,7 @@
           <w:b/>
           <w:bCs/>
         </w:rPr>
-        <w:t xml:space="preserve">Definition 16 (Bar chart)</w:t>
+        <w:t xml:space="preserve">Definition 17 (Bar chart)</w:t>
       </w:r>
       <w:r>
         <w:t xml:space="preserve"> </w:t>
@@ -9234,7 +9550,7 @@
         <w:t xml:space="preserve">.</w:t>
       </w:r>
     </w:p>
-    <w:bookmarkEnd w:id="70"/>
+    <w:bookmarkEnd w:id="75"/>
     <w:tbl>
       <w:tblPr>
         <w:tblStyle w:val="Table"/>
@@ -9248,7 +9564,7 @@
       <w:tr>
         <w:tc>
           <w:tcPr/>
-          <w:bookmarkStart w:id="74" w:name="fig-bar-behpat"/>
+          <w:bookmarkStart w:id="79" w:name="fig-bar-behpat"/>
           <w:p>
             <w:pPr>
               <w:pStyle w:val="SourceCode"/>
@@ -9486,18 +9802,18 @@
                 <wp:inline>
                   <wp:extent cx="4620126" cy="3696101"/>
                   <wp:effectExtent b="0" l="0" r="0" t="0"/>
-                  <wp:docPr descr="" title="" id="72" name="Picture"/>
+                  <wp:docPr descr="" title="" id="77" name="Picture"/>
                   <a:graphic>
                     <a:graphicData uri="http://schemas.openxmlformats.org/drawingml/2006/picture">
                       <pic:pic>
                         <pic:nvPicPr>
-                          <pic:cNvPr descr="exploratory-descriptive_files/figure-docx/unnamed-chunk-11-1.png" id="73" name="Picture"/>
+                          <pic:cNvPr descr="exploratory-descriptive_files/figure-docx/unnamed-chunk-11-1.png" id="78" name="Picture"/>
                           <pic:cNvPicPr>
                             <a:picLocks noChangeArrowheads="1" noChangeAspect="1"/>
                           </pic:cNvPicPr>
                         </pic:nvPicPr>
                         <pic:blipFill>
-                          <a:blip r:embed="rId71"/>
+                          <a:blip r:embed="rId76"/>
                           <a:stretch>
                             <a:fillRect/>
                           </a:stretch>
@@ -9537,12 +9853,12 @@
               <w:t xml:space="preserve">Figure 4: Bar chart of behavioral pattern in the WCGS dataset</w:t>
             </w:r>
           </w:p>
-          <w:bookmarkEnd w:id="74"/>
+          <w:bookmarkEnd w:id="79"/>
         </w:tc>
       </w:tr>
     </w:tbl>
-    <w:bookmarkEnd w:id="75"/>
-    <w:bookmarkStart w:id="81" w:name="normal-quantile-quantile-plots"/>
+    <w:bookmarkEnd w:id="80"/>
+    <w:bookmarkStart w:id="86" w:name="normal-quantile-quantile-plots"/>
     <w:p>
       <w:pPr>
         <w:pStyle w:val="Heading3"/>
@@ -9551,7 +9867,7 @@
         <w:t xml:space="preserve">3.5 Normal quantile-quantile plots</w:t>
       </w:r>
     </w:p>
-    <w:bookmarkStart w:id="76" w:name="def-qq-plot"/>
+    <w:bookmarkStart w:id="81" w:name="def-qq-plot"/>
     <w:p>
       <w:pPr>
         <w:pStyle w:val="FirstParagraph"/>
@@ -9561,7 +9877,7 @@
           <w:b/>
           <w:bCs/>
         </w:rPr>
-        <w:t xml:space="preserve">Definition 17 (Normal quantile-quantile plot)</w:t>
+        <w:t xml:space="preserve">Definition 18 (Normal quantile-quantile plot)</w:t>
       </w:r>
       <w:r>
         <w:t xml:space="preserve"> </w:t>
@@ -9591,7 +9907,7 @@
       <w:r>
         <w:t xml:space="preserve">(</w:t>
       </w:r>
-      <w:hyperlink r:id="rId27">
+      <w:hyperlink r:id="rId32">
         <w:r>
           <w:rPr>
             <w:rStyle w:val="Hyperlink"/>
@@ -9638,7 +9954,7 @@
         <w:t xml:space="preserve">.</w:t>
       </w:r>
     </w:p>
-    <w:bookmarkEnd w:id="76"/>
+    <w:bookmarkEnd w:id="81"/>
     <w:tbl>
       <w:tblPr>
         <w:tblStyle w:val="Table"/>
@@ -9652,7 +9968,7 @@
       <w:tr>
         <w:tc>
           <w:tcPr/>
-          <w:bookmarkStart w:id="80" w:name="fig-qq-chol"/>
+          <w:bookmarkStart w:id="85" w:name="fig-qq-chol"/>
           <w:p>
             <w:pPr>
               <w:pStyle w:val="SourceCode"/>
@@ -9923,18 +10239,18 @@
                 <wp:inline>
                   <wp:extent cx="4620126" cy="3696101"/>
                   <wp:effectExtent b="0" l="0" r="0" t="0"/>
-                  <wp:docPr descr="" title="" id="78" name="Picture"/>
+                  <wp:docPr descr="" title="" id="83" name="Picture"/>
                   <a:graphic>
                     <a:graphicData uri="http://schemas.openxmlformats.org/drawingml/2006/picture">
                       <pic:pic>
                         <pic:nvPicPr>
-                          <pic:cNvPr descr="exploratory-descriptive_files/figure-docx/unnamed-chunk-12-1.png" id="79" name="Picture"/>
+                          <pic:cNvPr descr="exploratory-descriptive_files/figure-docx/unnamed-chunk-12-1.png" id="84" name="Picture"/>
                           <pic:cNvPicPr>
                             <a:picLocks noChangeArrowheads="1" noChangeAspect="1"/>
                           </pic:cNvPicPr>
                         </pic:nvPicPr>
                         <pic:blipFill>
-                          <a:blip r:embed="rId77"/>
+                          <a:blip r:embed="rId82"/>
                           <a:stretch>
                             <a:fillRect/>
                           </a:stretch>
@@ -9974,7 +10290,7 @@
               <w:t xml:space="preserve">Figure 5: Normal Q-Q plot for total cholesterol in the WCGS dataset</w:t>
             </w:r>
           </w:p>
-          <w:bookmarkEnd w:id="80"/>
+          <w:bookmarkEnd w:id="85"/>
         </w:tc>
       </w:tr>
     </w:tbl>
@@ -10092,9 +10408,9 @@
         <w:t xml:space="preserve">covers boxplots.</w:t>
       </w:r>
     </w:p>
-    <w:bookmarkEnd w:id="81"/>
-    <w:bookmarkEnd w:id="82"/>
-    <w:bookmarkStart w:id="112" w:name="bivariate-relationships"/>
+    <w:bookmarkEnd w:id="86"/>
+    <w:bookmarkEnd w:id="87"/>
+    <w:bookmarkStart w:id="117" w:name="bivariate-relationships"/>
     <w:p>
       <w:pPr>
         <w:pStyle w:val="Heading2"/>
@@ -10103,7 +10419,7 @@
         <w:t xml:space="preserve">4 Bivariate relationships</w:t>
       </w:r>
     </w:p>
-    <w:bookmarkStart w:id="96" w:name="two-continuous-variables"/>
+    <w:bookmarkStart w:id="101" w:name="two-continuous-variables"/>
     <w:p>
       <w:pPr>
         <w:pStyle w:val="Heading3"/>
@@ -10112,7 +10428,7 @@
         <w:t xml:space="preserve">4.1 Two continuous variables</w:t>
       </w:r>
     </w:p>
-    <w:bookmarkStart w:id="83" w:name="def-scatterplot"/>
+    <w:bookmarkStart w:id="88" w:name="def-scatterplot"/>
     <w:p>
       <w:pPr>
         <w:pStyle w:val="FirstParagraph"/>
@@ -10122,7 +10438,7 @@
           <w:b/>
           <w:bCs/>
         </w:rPr>
-        <w:t xml:space="preserve">Definition 18 (Scatter plot)</w:t>
+        <w:t xml:space="preserve">Definition 19 (Scatter plot)</w:t>
       </w:r>
       <w:r>
         <w:t xml:space="preserve"> </w:t>
@@ -10176,7 +10492,7 @@
         <w:t xml:space="preserve">.</w:t>
       </w:r>
     </w:p>
-    <w:bookmarkEnd w:id="83"/>
+    <w:bookmarkEnd w:id="88"/>
     <w:tbl>
       <w:tblPr>
         <w:tblStyle w:val="Table"/>
@@ -10190,7 +10506,7 @@
       <w:tr>
         <w:tc>
           <w:tcPr/>
-          <w:bookmarkStart w:id="87" w:name="fig-scatter-chol-sbp"/>
+          <w:bookmarkStart w:id="92" w:name="fig-scatter-chol-sbp"/>
           <w:p>
             <w:pPr>
               <w:pStyle w:val="SourceCode"/>
@@ -10545,18 +10861,18 @@
                 <wp:inline>
                   <wp:extent cx="4620126" cy="3696101"/>
                   <wp:effectExtent b="0" l="0" r="0" t="0"/>
-                  <wp:docPr descr="" title="" id="85" name="Picture"/>
+                  <wp:docPr descr="" title="" id="90" name="Picture"/>
                   <a:graphic>
                     <a:graphicData uri="http://schemas.openxmlformats.org/drawingml/2006/picture">
                       <pic:pic>
                         <pic:nvPicPr>
-                          <pic:cNvPr descr="exploratory-descriptive_files/figure-docx/unnamed-chunk-13-1.png" id="86" name="Picture"/>
+                          <pic:cNvPr descr="exploratory-descriptive_files/figure-docx/unnamed-chunk-13-1.png" id="91" name="Picture"/>
                           <pic:cNvPicPr>
                             <a:picLocks noChangeArrowheads="1" noChangeAspect="1"/>
                           </pic:cNvPicPr>
                         </pic:nvPicPr>
                         <pic:blipFill>
-                          <a:blip r:embed="rId84"/>
+                          <a:blip r:embed="rId89"/>
                           <a:stretch>
                             <a:fillRect/>
                           </a:stretch>
@@ -10602,11 +10918,11 @@
               <w:t xml:space="preserve">with a least-squares line</w:t>
             </w:r>
           </w:p>
-          <w:bookmarkEnd w:id="87"/>
+          <w:bookmarkEnd w:id="92"/>
         </w:tc>
       </w:tr>
     </w:tbl>
-    <w:bookmarkStart w:id="88" w:name="def-pearson-r"/>
+    <w:bookmarkStart w:id="93" w:name="def-pearson-r"/>
     <w:p>
       <w:pPr>
         <w:pStyle w:val="BodyText"/>
@@ -10616,7 +10932,7 @@
           <w:b/>
           <w:bCs/>
         </w:rPr>
-        <w:t xml:space="preserve">Definition 19 (Pearson correlation coefficient)</w:t>
+        <w:t xml:space="preserve">Definition 20 (Pearson correlation coefficient)</w:t>
       </w:r>
       <w:r>
         <w:t xml:space="preserve"> </w:t>
@@ -11123,8 +11439,8 @@
         <w:t xml:space="preserve">.</w:t>
       </w:r>
     </w:p>
-    <w:bookmarkEnd w:id="88"/>
-    <w:bookmarkStart w:id="90" w:name="rem-pearson-r-estimates-population"/>
+    <w:bookmarkEnd w:id="93"/>
+    <w:bookmarkStart w:id="95" w:name="rem-pearson-r-estimates-population"/>
     <w:p>
       <w:pPr>
         <w:pStyle w:val="BodyText"/>
@@ -11145,7 +11461,7 @@
       <w:r>
         <w:t xml:space="preserve"> </w:t>
       </w:r>
-      <w:hyperlink r:id="rId89">
+      <w:hyperlink r:id="rId94">
         <w:r>
           <w:rPr>
             <w:rStyle w:val="Hyperlink"/>
@@ -11157,8 +11473,8 @@
         <w:t xml:space="preserve">.</w:t>
       </w:r>
     </w:p>
-    <w:bookmarkEnd w:id="90"/>
-    <w:bookmarkStart w:id="91" w:name="thm-pearson-r-range"/>
+    <w:bookmarkEnd w:id="95"/>
+    <w:bookmarkStart w:id="96" w:name="thm-pearson-r-range"/>
     <w:p>
       <w:pPr>
         <w:pStyle w:val="BodyText"/>
@@ -11329,7 +11645,7 @@
         <w:t xml:space="preserve">if and only if they lie on a straight line with negative slope.</w:t>
       </w:r>
     </w:p>
-    <w:bookmarkEnd w:id="91"/>
+    <w:bookmarkEnd w:id="96"/>
     <w:p>
       <w:pPr>
         <w:pStyle w:val="BodyText"/>
@@ -12473,7 +12789,7 @@
         <w:t xml:space="preserve">.</w:t>
       </w:r>
     </w:p>
-    <w:bookmarkStart w:id="92" w:name="exm-pearson-r"/>
+    <w:bookmarkStart w:id="97" w:name="exm-pearson-r"/>
     <w:p>
       <w:pPr>
         <w:pStyle w:val="BodyText"/>
@@ -12483,7 +12799,7 @@
           <w:b/>
           <w:bCs/>
         </w:rPr>
-        <w:t xml:space="preserve">Example 7 (Correlation between cholesterol and blood pressure in the WCGS)</w:t>
+        <w:t xml:space="preserve">Example 9 (Correlation between cholesterol and blood pressure in the WCGS)</w:t>
       </w:r>
       <w:r>
         <w:t xml:space="preserve"> </w:t>
@@ -12612,7 +12928,7 @@
         <w:t xml:space="preserve">.</w:t>
       </w:r>
     </w:p>
-    <w:bookmarkEnd w:id="92"/>
+    <w:bookmarkEnd w:id="97"/>
     <w:tbl>
       <w:tblPr>
         <w:tblStyle w:val="Table"/>
@@ -12654,18 +12970,18 @@
                 <wp:inline>
                   <wp:extent cx="152400" cy="152400"/>
                   <wp:effectExtent b="0" l="0" r="0" t="0"/>
-                  <wp:docPr descr="" title="" id="94" name="Picture"/>
+                  <wp:docPr descr="" title="" id="99" name="Picture"/>
                   <a:graphic>
                     <a:graphicData uri="http://schemas.openxmlformats.org/drawingml/2006/picture">
                       <pic:pic>
                         <pic:nvPicPr>
-                          <pic:cNvPr descr="/opt/quarto/share/formats/docx/caution.png" id="95" name="Picture"/>
+                          <pic:cNvPr descr="/opt/quarto/share/formats/docx/caution.png" id="100" name="Picture"/>
                           <pic:cNvPicPr>
                             <a:picLocks noChangeArrowheads="1" noChangeAspect="1"/>
                           </pic:cNvPicPr>
                         </pic:nvPicPr>
                         <pic:blipFill>
-                          <a:blip r:embed="rId93"/>
+                          <a:blip r:embed="rId98"/>
                           <a:stretch>
                             <a:fillRect/>
                           </a:stretch>
@@ -12935,8 +13251,8 @@
         <w:t xml:space="preserve">covers scatterplots.</w:t>
       </w:r>
     </w:p>
-    <w:bookmarkEnd w:id="96"/>
-    <w:bookmarkStart w:id="106" w:name="X276b94a7d03810956e9ce51874e5dad5aed6d75"/>
+    <w:bookmarkEnd w:id="101"/>
+    <w:bookmarkStart w:id="111" w:name="X276b94a7d03810956e9ce51874e5dad5aed6d75"/>
     <w:p>
       <w:pPr>
         <w:pStyle w:val="Heading3"/>
@@ -13023,7 +13339,7 @@
       <w:tr>
         <w:tc>
           <w:tcPr/>
-          <w:bookmarkStart w:id="100" w:name="fig-box-chol-by-smoke"/>
+          <w:bookmarkStart w:id="105" w:name="fig-box-chol-by-smoke"/>
           <w:p>
             <w:pPr>
               <w:pStyle w:val="SourceCode"/>
@@ -13318,18 +13634,18 @@
                 <wp:inline>
                   <wp:extent cx="4620126" cy="3696101"/>
                   <wp:effectExtent b="0" l="0" r="0" t="0"/>
-                  <wp:docPr descr="" title="" id="98" name="Picture"/>
+                  <wp:docPr descr="" title="" id="103" name="Picture"/>
                   <a:graphic>
                     <a:graphicData uri="http://schemas.openxmlformats.org/drawingml/2006/picture">
                       <pic:pic>
                         <pic:nvPicPr>
-                          <pic:cNvPr descr="exploratory-descriptive_files/figure-docx/unnamed-chunk-14-1.png" id="99" name="Picture"/>
+                          <pic:cNvPr descr="exploratory-descriptive_files/figure-docx/unnamed-chunk-14-1.png" id="104" name="Picture"/>
                           <pic:cNvPicPr>
                             <a:picLocks noChangeArrowheads="1" noChangeAspect="1"/>
                           </pic:cNvPicPr>
                         </pic:nvPicPr>
                         <pic:blipFill>
-                          <a:blip r:embed="rId97"/>
+                          <a:blip r:embed="rId102"/>
                           <a:stretch>
                             <a:fillRect/>
                           </a:stretch>
@@ -13369,7 +13685,7 @@
               <w:t xml:space="preserve">Figure 7: Box plots of cholesterol by smoking status in the WCGS dataset</w:t>
             </w:r>
           </w:p>
-          <w:bookmarkEnd w:id="100"/>
+          <w:bookmarkEnd w:id="105"/>
         </w:tc>
       </w:tr>
     </w:tbl>
@@ -13387,7 +13703,7 @@
       <w:tr>
         <w:tc>
           <w:tcPr/>
-          <w:bookmarkStart w:id="104" w:name="fig-box-chol-by-behpat"/>
+          <w:bookmarkStart w:id="109" w:name="fig-box-chol-by-behpat"/>
           <w:p>
             <w:pPr>
               <w:pStyle w:val="SourceCode"/>
@@ -13682,18 +13998,18 @@
                 <wp:inline>
                   <wp:extent cx="4620126" cy="3696101"/>
                   <wp:effectExtent b="0" l="0" r="0" t="0"/>
-                  <wp:docPr descr="" title="" id="102" name="Picture"/>
+                  <wp:docPr descr="" title="" id="107" name="Picture"/>
                   <a:graphic>
                     <a:graphicData uri="http://schemas.openxmlformats.org/drawingml/2006/picture">
                       <pic:pic>
                         <pic:nvPicPr>
-                          <pic:cNvPr descr="exploratory-descriptive_files/figure-docx/unnamed-chunk-15-1.png" id="103" name="Picture"/>
+                          <pic:cNvPr descr="exploratory-descriptive_files/figure-docx/unnamed-chunk-15-1.png" id="108" name="Picture"/>
                           <pic:cNvPicPr>
                             <a:picLocks noChangeArrowheads="1" noChangeAspect="1"/>
                           </pic:cNvPicPr>
                         </pic:nvPicPr>
                         <pic:blipFill>
-                          <a:blip r:embed="rId101"/>
+                          <a:blip r:embed="rId106"/>
                           <a:stretch>
                             <a:fillRect/>
                           </a:stretch>
@@ -13733,7 +14049,7 @@
               <w:t xml:space="preserve">Figure 8: Box plots of cholesterol by behavioral pattern in the WCGS dataset</w:t>
             </w:r>
           </w:p>
-          <w:bookmarkEnd w:id="104"/>
+          <w:bookmarkEnd w:id="109"/>
         </w:tc>
       </w:tr>
     </w:tbl>
@@ -13769,7 +14085,7 @@
       <w:tr>
         <w:tc>
           <w:tcPr/>
-          <w:bookmarkStart w:id="105" w:name="tbl-chol-by-chd"/>
+          <w:bookmarkStart w:id="110" w:name="tbl-chol-by-chd"/>
           <w:p>
             <w:pPr>
               <w:jc w:val="center"/>
@@ -14710,12 +15026,12 @@
               </w:tc>
             </w:tr>
           </w:tbl>
-          <w:bookmarkEnd w:id="105"/>
+          <w:bookmarkEnd w:id="110"/>
         </w:tc>
       </w:tr>
     </w:tbl>
-    <w:bookmarkEnd w:id="106"/>
-    <w:bookmarkStart w:id="111" w:name="two-categorical-variables"/>
+    <w:bookmarkEnd w:id="111"/>
+    <w:bookmarkStart w:id="116" w:name="two-categorical-variables"/>
     <w:p>
       <w:pPr>
         <w:pStyle w:val="Heading3"/>
@@ -14724,7 +15040,7 @@
         <w:t xml:space="preserve">4.3 Two categorical variables</w:t>
       </w:r>
     </w:p>
-    <w:bookmarkStart w:id="108" w:name="def-contingency-table"/>
+    <w:bookmarkStart w:id="113" w:name="def-contingency-table"/>
     <w:p>
       <w:pPr>
         <w:pStyle w:val="FirstParagraph"/>
@@ -14734,7 +15050,7 @@
           <w:b/>
           <w:bCs/>
         </w:rPr>
-        <w:t xml:space="preserve">Definition 20 (Contingency table (cross-tabulation))</w:t>
+        <w:t xml:space="preserve">Definition 21 (Contingency table (cross-tabulation))</w:t>
       </w:r>
       <w:r>
         <w:t xml:space="preserve"> </w:t>
@@ -14780,7 +15096,7 @@
       <w:r>
         <w:t xml:space="preserve"> </w:t>
       </w:r>
-      <w:hyperlink r:id="rId107">
+      <w:hyperlink r:id="rId112">
         <w:r>
           <w:rPr>
             <w:rStyle w:val="Hyperlink"/>
@@ -15184,8 +15500,8 @@
         <w:t xml:space="preserve">.</w:t>
       </w:r>
     </w:p>
-    <w:bookmarkEnd w:id="108"/>
-    <w:bookmarkStart w:id="110" w:name="exm-contingency-table"/>
+    <w:bookmarkEnd w:id="113"/>
+    <w:bookmarkStart w:id="115" w:name="exm-contingency-table"/>
     <w:p>
       <w:pPr>
         <w:pStyle w:val="BodyText"/>
@@ -15195,7 +15511,7 @@
           <w:b/>
           <w:bCs/>
         </w:rPr>
-        <w:t xml:space="preserve">Example 8 (Smoking and CHD in the WCGS)</w:t>
+        <w:t xml:space="preserve">Example 10 (Smoking and CHD in the WCGS)</w:t>
       </w:r>
       <w:r>
         <w:t xml:space="preserve"> </w:t>
@@ -15509,7 +15825,7 @@
       <w:tr>
         <w:tc>
           <w:tcPr/>
-          <w:bookmarkStart w:id="109" w:name="tbl-gtsummary-smoke-chd"/>
+          <w:bookmarkStart w:id="114" w:name="tbl-gtsummary-smoke-chd"/>
           <w:p>
             <w:pPr>
               <w:jc w:val="center"/>
@@ -15982,14 +16298,14 @@
               </w:tc>
             </w:tr>
           </w:tbl>
-          <w:bookmarkEnd w:id="109"/>
+          <w:bookmarkEnd w:id="114"/>
         </w:tc>
       </w:tr>
     </w:tbl>
-    <w:bookmarkEnd w:id="110"/>
-    <w:bookmarkEnd w:id="111"/>
-    <w:bookmarkEnd w:id="112"/>
-    <w:bookmarkStart w:id="134" w:name="data-transformations"/>
+    <w:bookmarkEnd w:id="115"/>
+    <w:bookmarkEnd w:id="116"/>
+    <w:bookmarkEnd w:id="117"/>
+    <w:bookmarkStart w:id="139" w:name="data-transformations"/>
     <w:p>
       <w:pPr>
         <w:pStyle w:val="Heading2"/>
@@ -16298,7 +16614,7 @@
         <w:t xml:space="preserve">.</w:t>
       </w:r>
     </w:p>
-    <w:bookmarkStart w:id="121" w:name="fig-hist-sbp-log"/>
+    <w:bookmarkStart w:id="126" w:name="fig-hist-sbp-log"/>
     <w:tbl>
       <w:tblPr>
         <w:tblStyle w:val="Table"/>
@@ -16326,7 +16642,7 @@
             <w:tr>
               <w:tc>
                 <w:tcPr/>
-                <w:bookmarkStart w:id="116" w:name="fig-hist-sbp-raw"/>
+                <w:bookmarkStart w:id="121" w:name="fig-hist-sbp-raw"/>
                 <w:p>
                   <w:pPr>
                     <w:pStyle w:val="SourceCode"/>
@@ -16614,18 +16930,18 @@
                       <wp:inline>
                         <wp:extent cx="2971800" cy="2377440"/>
                         <wp:effectExtent b="0" l="0" r="0" t="0"/>
-                        <wp:docPr descr="" title="" id="114" name="Picture"/>
+                        <wp:docPr descr="" title="" id="119" name="Picture"/>
                         <a:graphic>
                           <a:graphicData uri="http://schemas.openxmlformats.org/drawingml/2006/picture">
                             <pic:pic>
                               <pic:nvPicPr>
-                                <pic:cNvPr descr="exploratory-descriptive_files/figure-docx/unnamed-chunk-18-1.png" id="115" name="Picture"/>
+                                <pic:cNvPr descr="exploratory-descriptive_files/figure-docx/unnamed-chunk-18-1.png" id="120" name="Picture"/>
                                 <pic:cNvPicPr>
                                   <a:picLocks noChangeArrowheads="1" noChangeAspect="1"/>
                                 </pic:cNvPicPr>
                               </pic:nvPicPr>
                               <pic:blipFill>
-                                <a:blip r:embed="rId113"/>
+                                <a:blip r:embed="rId118"/>
                                 <a:stretch>
                                   <a:fillRect/>
                                 </a:stretch>
@@ -16666,7 +16982,7 @@
                     <w:t xml:space="preserve">(a) Raw scale</w:t>
                   </w:r>
                 </w:p>
-                <w:bookmarkEnd w:id="116"/>
+                <w:bookmarkEnd w:id="121"/>
               </w:tc>
             </w:tr>
           </w:tbl>
@@ -16716,7 +17032,7 @@
             <w:tr>
               <w:tc>
                 <w:tcPr/>
-                <w:bookmarkStart w:id="120" w:name="fig-hist-sbp-logscale"/>
+                <w:bookmarkStart w:id="125" w:name="fig-hist-sbp-logscale"/>
                 <w:p>
                   <w:pPr>
                     <w:pStyle w:val="SourceCode"/>
@@ -17097,18 +17413,18 @@
                       <wp:inline>
                         <wp:extent cx="2971800" cy="2377440"/>
                         <wp:effectExtent b="0" l="0" r="0" t="0"/>
-                        <wp:docPr descr="" title="" id="118" name="Picture"/>
+                        <wp:docPr descr="" title="" id="123" name="Picture"/>
                         <a:graphic>
                           <a:graphicData uri="http://schemas.openxmlformats.org/drawingml/2006/picture">
                             <pic:pic>
                               <pic:nvPicPr>
-                                <pic:cNvPr descr="exploratory-descriptive_files/figure-docx/unnamed-chunk-19-1.png" id="119" name="Picture"/>
+                                <pic:cNvPr descr="exploratory-descriptive_files/figure-docx/unnamed-chunk-19-1.png" id="124" name="Picture"/>
                                 <pic:cNvPicPr>
                                   <a:picLocks noChangeArrowheads="1" noChangeAspect="1"/>
                                 </pic:cNvPicPr>
                               </pic:nvPicPr>
                               <pic:blipFill>
-                                <a:blip r:embed="rId117"/>
+                                <a:blip r:embed="rId122"/>
                                 <a:stretch>
                                   <a:fillRect/>
                                 </a:stretch>
@@ -17149,7 +17465,7 @@
                     <w:t xml:space="preserve">(b) Log scale</w:t>
                   </w:r>
                 </w:p>
-                <w:bookmarkEnd w:id="120"/>
+                <w:bookmarkEnd w:id="125"/>
               </w:tc>
             </w:tr>
           </w:tbl>
@@ -17199,7 +17515,7 @@
         <w:t xml:space="preserve">.</w:t>
       </w:r>
     </w:p>
-    <w:bookmarkEnd w:id="121"/>
+    <w:bookmarkEnd w:id="126"/>
     <w:p>
       <w:pPr>
         <w:pStyle w:val="SourceCode"/>
@@ -17588,7 +17904,7 @@
         <w:t xml:space="preserve">the assumptions of that model and on the scientific question.</w:t>
       </w:r>
     </w:p>
-    <w:bookmarkStart w:id="133" w:name="sec-rescaling"/>
+    <w:bookmarkStart w:id="138" w:name="sec-rescaling"/>
     <w:p>
       <w:pPr>
         <w:pStyle w:val="Heading3"/>
@@ -17597,7 +17913,7 @@
         <w:t xml:space="preserve">5.1 Rescaling a variable</w:t>
       </w:r>
     </w:p>
-    <w:bookmarkStart w:id="122" w:name="exr-standardize"/>
+    <w:bookmarkStart w:id="127" w:name="exr-standardize"/>
     <w:p>
       <w:pPr>
         <w:pStyle w:val="FirstParagraph"/>
@@ -17706,8 +18022,8 @@
         <w:t xml:space="preserve">What are the units of your answer to part 2?</w:t>
       </w:r>
     </w:p>
-    <w:bookmarkEnd w:id="122"/>
-    <w:bookmarkStart w:id="123" w:name="sol-standardize"/>
+    <w:bookmarkEnd w:id="127"/>
+    <w:bookmarkStart w:id="128" w:name="sol-standardize"/>
     <w:p>
       <w:pPr>
         <w:pStyle w:val="FirstParagraph"/>
@@ -18091,8 +18407,8 @@
         <w:t xml:space="preserve">so the answer has no units.</w:t>
       </w:r>
     </w:p>
-    <w:bookmarkEnd w:id="123"/>
-    <w:bookmarkStart w:id="124" w:name="def-standardization"/>
+    <w:bookmarkEnd w:id="128"/>
+    <w:bookmarkStart w:id="129" w:name="def-standardization"/>
     <w:p>
       <w:pPr>
         <w:pStyle w:val="FirstParagraph"/>
@@ -18102,7 +18418,7 @@
           <w:b/>
           <w:bCs/>
         </w:rPr>
-        <w:t xml:space="preserve">Definition 21 (Standardization (z-scoring, standard scaling))</w:t>
+        <w:t xml:space="preserve">Definition 22 (Standardization (z-scoring, standard scaling))</w:t>
       </w:r>
       <w:r>
         <w:t xml:space="preserve"> </w:t>
@@ -18438,8 +18754,8 @@
         <w:t xml:space="preserve">.</w:t>
       </w:r>
     </w:p>
-    <w:bookmarkEnd w:id="124"/>
-    <w:bookmarkStart w:id="125" w:name="rem-source-standardization"/>
+    <w:bookmarkEnd w:id="129"/>
+    <w:bookmarkStart w:id="130" w:name="rem-source-standardization"/>
     <w:p>
       <w:pPr>
         <w:pStyle w:val="BodyText"/>
@@ -18488,8 +18804,8 @@
         <w:t xml:space="preserve">.</w:t>
       </w:r>
     </w:p>
-    <w:bookmarkEnd w:id="125"/>
-    <w:bookmarkStart w:id="126" w:name="rem-standardization-units"/>
+    <w:bookmarkEnd w:id="130"/>
+    <w:bookmarkStart w:id="131" w:name="rem-standardization-units"/>
     <w:p>
       <w:pPr>
         <w:pStyle w:val="BodyText"/>
@@ -18564,8 +18880,8 @@
         <w:t xml:space="preserve">both become unitless numbers of standard deviations.</w:t>
       </w:r>
     </w:p>
-    <w:bookmarkEnd w:id="126"/>
-    <w:bookmarkStart w:id="127" w:name="thm-standardized-mean-sd"/>
+    <w:bookmarkEnd w:id="131"/>
+    <w:bookmarkStart w:id="132" w:name="thm-standardized-mean-sd"/>
     <w:p>
       <w:pPr>
         <w:pStyle w:val="BodyText"/>
@@ -18722,7 +19038,7 @@
         <w:t xml:space="preserve">.</w:t>
       </w:r>
     </w:p>
-    <w:bookmarkEnd w:id="127"/>
+    <w:bookmarkEnd w:id="132"/>
     <w:p>
       <w:pPr>
         <w:pStyle w:val="BodyText"/>
@@ -19435,7 +19751,7 @@
         <w:t xml:space="preserve">.</w:t>
       </w:r>
     </w:p>
-    <w:bookmarkStart w:id="128" w:name="rem-source-standardized-mean-sd"/>
+    <w:bookmarkStart w:id="133" w:name="rem-source-standardized-mean-sd"/>
     <w:p>
       <w:pPr>
         <w:pStyle w:val="BodyText"/>
@@ -19469,8 +19785,8 @@
         <w:t xml:space="preserve">the proof is the elementary calculation.</w:t>
       </w:r>
     </w:p>
-    <w:bookmarkEnd w:id="128"/>
-    <w:bookmarkStart w:id="129" w:name="exm-scale-wcgs"/>
+    <w:bookmarkEnd w:id="133"/>
+    <w:bookmarkStart w:id="134" w:name="exm-scale-wcgs"/>
     <w:p>
       <w:pPr>
         <w:pStyle w:val="BodyText"/>
@@ -19480,7 +19796,7 @@
           <w:b/>
           <w:bCs/>
         </w:rPr>
-        <w:t xml:space="preserve">Example 9 (Standardizing cholesterol in R)</w:t>
+        <w:t xml:space="preserve">Example 11 (Standardizing cholesterol in R)</w:t>
       </w:r>
       <w:r>
         <w:t xml:space="preserve"> </w:t>
@@ -19748,8 +20064,8 @@
         <w:t xml:space="preserve">is needed because 12 of the cholesterol values are missing.</w:t>
       </w:r>
     </w:p>
-    <w:bookmarkEnd w:id="129"/>
-    <w:bookmarkStart w:id="130" w:name="def-min-max-scaling"/>
+    <w:bookmarkEnd w:id="134"/>
+    <w:bookmarkStart w:id="135" w:name="def-min-max-scaling"/>
     <w:p>
       <w:pPr>
         <w:pStyle w:val="BodyText"/>
@@ -19759,7 +20075,7 @@
           <w:b/>
           <w:bCs/>
         </w:rPr>
-        <w:t xml:space="preserve">Definition 22 (Min-max scaling)</w:t>
+        <w:t xml:space="preserve">Definition 23 (Min-max scaling)</w:t>
       </w:r>
       <w:r>
         <w:t xml:space="preserve"> </w:t>
@@ -20058,8 +20374,8 @@
         <w:t xml:space="preserve">.</w:t>
       </w:r>
     </w:p>
-    <w:bookmarkEnd w:id="130"/>
-    <w:bookmarkStart w:id="131" w:name="rem-min-max-outliers"/>
+    <w:bookmarkEnd w:id="135"/>
+    <w:bookmarkStart w:id="136" w:name="rem-min-max-outliers"/>
     <w:p>
       <w:pPr>
         <w:pStyle w:val="BodyText"/>
@@ -20265,8 +20581,8 @@
         <w:t xml:space="preserve">.</w:t>
       </w:r>
     </w:p>
-    <w:bookmarkEnd w:id="131"/>
-    <w:bookmarkStart w:id="132" w:name="exm-min-max-wcgs"/>
+    <w:bookmarkEnd w:id="136"/>
+    <w:bookmarkStart w:id="137" w:name="exm-min-max-wcgs"/>
     <w:p>
       <w:pPr>
         <w:pStyle w:val="BodyText"/>
@@ -20276,7 +20592,7 @@
           <w:b/>
           <w:bCs/>
         </w:rPr>
-        <w:t xml:space="preserve">Example 10 (Min-max scaling of cholesterol in the WCGS)</w:t>
+        <w:t xml:space="preserve">Example 12 (Min-max scaling of cholesterol in the WCGS)</w:t>
       </w:r>
       <w:r>
         <w:t xml:space="preserve"> </w:t>
@@ -20505,10 +20821,10 @@
         <w:t xml:space="preserve">but have no units.</w:t>
       </w:r>
     </w:p>
-    <w:bookmarkEnd w:id="132"/>
-    <w:bookmarkEnd w:id="133"/>
-    <w:bookmarkEnd w:id="134"/>
-    <w:bookmarkStart w:id="136" w:name="an-exploratory-data-analysis-workflow"/>
+    <w:bookmarkEnd w:id="137"/>
+    <w:bookmarkEnd w:id="138"/>
+    <w:bookmarkEnd w:id="139"/>
+    <w:bookmarkStart w:id="141" w:name="an-exploratory-data-analysis-workflow"/>
     <w:p>
       <w:pPr>
         <w:pStyle w:val="Heading2"/>
@@ -20736,7 +21052,7 @@
       <w:tr>
         <w:tc>
           <w:tcPr/>
-          <w:bookmarkStart w:id="135" w:name="tbl-wcgs-all-summary"/>
+          <w:bookmarkStart w:id="140" w:name="tbl-wcgs-all-summary"/>
           <w:p>
             <w:pPr>
               <w:jc w:val="center"/>
@@ -21917,12 +22233,12 @@
               </w:tc>
             </w:tr>
           </w:tbl>
-          <w:bookmarkEnd w:id="135"/>
+          <w:bookmarkEnd w:id="140"/>
         </w:tc>
       </w:tr>
     </w:tbl>
-    <w:bookmarkEnd w:id="136"/>
-    <w:bookmarkStart w:id="140" w:name="further-reading"/>
+    <w:bookmarkEnd w:id="141"/>
+    <w:bookmarkStart w:id="145" w:name="further-reading"/>
     <w:p>
       <w:pPr>
         <w:pStyle w:val="Heading2"/>
@@ -21935,7 +22251,7 @@
       <w:pPr>
         <w:pStyle w:val="FirstParagraph"/>
       </w:pPr>
-      <w:hyperlink r:id="rId137">
+      <w:hyperlink r:id="rId142">
         <w:r>
           <w:rPr>
             <w:rStyle w:val="Hyperlink"/>
@@ -21952,7 +22268,7 @@
       <w:r>
         <w:t xml:space="preserve"> </w:t>
       </w:r>
-      <w:hyperlink r:id="rId62">
+      <w:hyperlink r:id="rId67">
         <w:r>
           <w:rPr>
             <w:rStyle w:val="Hyperlink"/>
@@ -21975,7 +22291,7 @@
       <w:r>
         <w:t xml:space="preserve"> </w:t>
       </w:r>
-      <w:hyperlink r:id="rId138">
+      <w:hyperlink r:id="rId143">
         <w:r>
           <w:rPr>
             <w:rStyle w:val="Hyperlink"/>
@@ -21998,7 +22314,7 @@
       <w:r>
         <w:t xml:space="preserve"> </w:t>
       </w:r>
-      <w:hyperlink r:id="rId139">
+      <w:hyperlink r:id="rId144">
         <w:r>
           <w:rPr>
             <w:rStyle w:val="Hyperlink"/>
@@ -22013,8 +22329,8 @@
         <w:t xml:space="preserve">of the WCGS data, in R and Python.</w:t>
       </w:r>
     </w:p>
-    <w:bookmarkEnd w:id="140"/>
-    <w:bookmarkStart w:id="185" w:name="references"/>
+    <w:bookmarkEnd w:id="145"/>
+    <w:bookmarkStart w:id="190" w:name="references"/>
     <w:p>
       <w:pPr>
         <w:pStyle w:val="Heading2"/>
@@ -22023,8 +22339,8 @@
         <w:t xml:space="preserve">References</w:t>
       </w:r>
     </w:p>
-    <w:bookmarkStart w:id="184" w:name="refs"/>
-    <w:bookmarkStart w:id="142" w:name="ref-vittinghoff2e"/>
+    <w:bookmarkStart w:id="189" w:name="refs"/>
+    <w:bookmarkStart w:id="147" w:name="ref-vittinghoff2e"/>
     <w:p>
       <w:pPr>
         <w:pStyle w:val="Bibliography"/>
@@ -22057,7 +22373,7 @@
       <w:r>
         <w:t xml:space="preserve"> </w:t>
       </w:r>
-      <w:hyperlink r:id="rId141">
+      <w:hyperlink r:id="rId146">
         <w:r>
           <w:rPr>
             <w:rStyle w:val="Hyperlink"/>
@@ -22069,8 +22385,8 @@
         <w:t xml:space="preserve">.</w:t>
       </w:r>
     </w:p>
-    <w:bookmarkEnd w:id="142"/>
-    <w:bookmarkStart w:id="144" w:name="ref-rosenman1975coronary"/>
+    <w:bookmarkEnd w:id="147"/>
+    <w:bookmarkStart w:id="149" w:name="ref-rosenman1975coronary"/>
     <w:p>
       <w:pPr>
         <w:pStyle w:val="Bibliography"/>
@@ -22118,7 +22434,7 @@
       <w:r>
         <w:t xml:space="preserve"> </w:t>
       </w:r>
-      <w:hyperlink r:id="rId143">
+      <w:hyperlink r:id="rId148">
         <w:r>
           <w:rPr>
             <w:rStyle w:val="Hyperlink"/>
@@ -22130,8 +22446,8 @@
         <w:t xml:space="preserve">.</w:t>
       </w:r>
     </w:p>
-    <w:bookmarkEnd w:id="144"/>
-    <w:bookmarkStart w:id="146" w:name="ref-wikipedia_statistical_population"/>
+    <w:bookmarkEnd w:id="149"/>
+    <w:bookmarkStart w:id="151" w:name="ref-wikipedia_statistical_population"/>
     <w:p>
       <w:pPr>
         <w:pStyle w:val="Bibliography"/>
@@ -22178,7 +22494,7 @@
       <w:r>
         <w:t xml:space="preserve"> </w:t>
       </w:r>
-      <w:hyperlink r:id="rId145">
+      <w:hyperlink r:id="rId150">
         <w:r>
           <w:rPr>
             <w:rStyle w:val="Hyperlink"/>
@@ -22187,8 +22503,8 @@
         </w:r>
       </w:hyperlink>
     </w:p>
-    <w:bookmarkEnd w:id="146"/>
-    <w:bookmarkStart w:id="148" w:name="ref-wikipedia_simple_random_sample"/>
+    <w:bookmarkEnd w:id="151"/>
+    <w:bookmarkStart w:id="153" w:name="ref-wikipedia_simple_random_sample"/>
     <w:p>
       <w:pPr>
         <w:pStyle w:val="Bibliography"/>
@@ -22235,7 +22551,7 @@
       <w:r>
         <w:t xml:space="preserve"> </w:t>
       </w:r>
-      <w:hyperlink r:id="rId147">
+      <w:hyperlink r:id="rId152">
         <w:r>
           <w:rPr>
             <w:rStyle w:val="Hyperlink"/>
@@ -22244,8 +22560,8 @@
         </w:r>
       </w:hyperlink>
     </w:p>
-    <w:bookmarkEnd w:id="148"/>
-    <w:bookmarkStart w:id="150" w:name="ref-wikipedia_median"/>
+    <w:bookmarkEnd w:id="153"/>
+    <w:bookmarkStart w:id="155" w:name="ref-wikipedia_median"/>
     <w:p>
       <w:pPr>
         <w:pStyle w:val="Bibliography"/>
@@ -22292,7 +22608,7 @@
       <w:r>
         <w:t xml:space="preserve"> </w:t>
       </w:r>
-      <w:hyperlink r:id="rId149">
+      <w:hyperlink r:id="rId154">
         <w:r>
           <w:rPr>
             <w:rStyle w:val="Hyperlink"/>
@@ -22301,8 +22617,8 @@
         </w:r>
       </w:hyperlink>
     </w:p>
-    <w:bookmarkEnd w:id="150"/>
-    <w:bookmarkStart w:id="152" w:name="ref-wikipedia_variance"/>
+    <w:bookmarkEnd w:id="155"/>
+    <w:bookmarkStart w:id="157" w:name="ref-wikipedia_variance"/>
     <w:p>
       <w:pPr>
         <w:pStyle w:val="Bibliography"/>
@@ -22349,7 +22665,7 @@
       <w:r>
         <w:t xml:space="preserve"> </w:t>
       </w:r>
-      <w:hyperlink r:id="rId151">
+      <w:hyperlink r:id="rId156">
         <w:r>
           <w:rPr>
             <w:rStyle w:val="Hyperlink"/>
@@ -22358,8 +22674,8 @@
         </w:r>
       </w:hyperlink>
     </w:p>
-    <w:bookmarkEnd w:id="152"/>
-    <w:bookmarkStart w:id="154" w:name="ref-wikipedia_standard_deviation"/>
+    <w:bookmarkEnd w:id="157"/>
+    <w:bookmarkStart w:id="159" w:name="ref-wikipedia_standard_deviation"/>
     <w:p>
       <w:pPr>
         <w:pStyle w:val="Bibliography"/>
@@ -22406,7 +22722,7 @@
       <w:r>
         <w:t xml:space="preserve"> </w:t>
       </w:r>
-      <w:hyperlink r:id="rId153">
+      <w:hyperlink r:id="rId158">
         <w:r>
           <w:rPr>
             <w:rStyle w:val="Hyperlink"/>
@@ -22415,8 +22731,8 @@
         </w:r>
       </w:hyperlink>
     </w:p>
-    <w:bookmarkEnd w:id="154"/>
-    <w:bookmarkStart w:id="156" w:name="ref-wikipedia_quartile"/>
+    <w:bookmarkEnd w:id="159"/>
+    <w:bookmarkStart w:id="161" w:name="ref-wikipedia_quartile"/>
     <w:p>
       <w:pPr>
         <w:pStyle w:val="Bibliography"/>
@@ -22463,7 +22779,7 @@
       <w:r>
         <w:t xml:space="preserve"> </w:t>
       </w:r>
-      <w:hyperlink r:id="rId155">
+      <w:hyperlink r:id="rId160">
         <w:r>
           <w:rPr>
             <w:rStyle w:val="Hyperlink"/>
@@ -22472,8 +22788,8 @@
         </w:r>
       </w:hyperlink>
     </w:p>
-    <w:bookmarkEnd w:id="156"/>
-    <w:bookmarkStart w:id="158" w:name="ref-wikipedia_interquartile_range"/>
+    <w:bookmarkEnd w:id="161"/>
+    <w:bookmarkStart w:id="163" w:name="ref-wikipedia_interquartile_range"/>
     <w:p>
       <w:pPr>
         <w:pStyle w:val="Bibliography"/>
@@ -22520,7 +22836,7 @@
       <w:r>
         <w:t xml:space="preserve"> </w:t>
       </w:r>
-      <w:hyperlink r:id="rId157">
+      <w:hyperlink r:id="rId162">
         <w:r>
           <w:rPr>
             <w:rStyle w:val="Hyperlink"/>
@@ -22529,8 +22845,8 @@
         </w:r>
       </w:hyperlink>
     </w:p>
-    <w:bookmarkEnd w:id="158"/>
-    <w:bookmarkStart w:id="159" w:name="ref-hoggtanis2015"/>
+    <w:bookmarkEnd w:id="163"/>
+    <w:bookmarkStart w:id="164" w:name="ref-hoggtanis2015"/>
     <w:p>
       <w:pPr>
         <w:pStyle w:val="Bibliography"/>
@@ -22561,8 +22877,8 @@
         <w:t xml:space="preserve">, Tenth edition. Boston: Pearson, 2019.</w:t>
       </w:r>
     </w:p>
-    <w:bookmarkEnd w:id="159"/>
-    <w:bookmarkStart w:id="160" w:name="ref-rice2007mathematical"/>
+    <w:bookmarkEnd w:id="164"/>
+    <w:bookmarkStart w:id="165" w:name="ref-rice2007mathematical"/>
     <w:p>
       <w:pPr>
         <w:pStyle w:val="Bibliography"/>
@@ -22593,8 +22909,8 @@
         <w:t xml:space="preserve">, 3rd ed. Belmont, CA: Cengage Learning, 2007.</w:t>
       </w:r>
     </w:p>
-    <w:bookmarkEnd w:id="160"/>
-    <w:bookmarkStart w:id="162" w:name="ref-wikipedia_histogram"/>
+    <w:bookmarkEnd w:id="165"/>
+    <w:bookmarkStart w:id="167" w:name="ref-wikipedia_histogram"/>
     <w:p>
       <w:pPr>
         <w:pStyle w:val="Bibliography"/>
@@ -22641,7 +22957,7 @@
       <w:r>
         <w:t xml:space="preserve"> </w:t>
       </w:r>
-      <w:hyperlink r:id="rId161">
+      <w:hyperlink r:id="rId166">
         <w:r>
           <w:rPr>
             <w:rStyle w:val="Hyperlink"/>
@@ -22650,8 +22966,8 @@
         </w:r>
       </w:hyperlink>
     </w:p>
-    <w:bookmarkEnd w:id="162"/>
-    <w:bookmarkStart w:id="164" w:name="ref-wikipedia_kernel_density_estimation"/>
+    <w:bookmarkEnd w:id="167"/>
+    <w:bookmarkStart w:id="169" w:name="ref-wikipedia_kernel_density_estimation"/>
     <w:p>
       <w:pPr>
         <w:pStyle w:val="Bibliography"/>
@@ -22698,7 +23014,7 @@
       <w:r>
         <w:t xml:space="preserve"> </w:t>
       </w:r>
-      <w:hyperlink r:id="rId163">
+      <w:hyperlink r:id="rId168">
         <w:r>
           <w:rPr>
             <w:rStyle w:val="Hyperlink"/>
@@ -22707,8 +23023,8 @@
         </w:r>
       </w:hyperlink>
     </w:p>
-    <w:bookmarkEnd w:id="164"/>
-    <w:bookmarkStart w:id="166" w:name="ref-wikipedia_box_plot"/>
+    <w:bookmarkEnd w:id="169"/>
+    <w:bookmarkStart w:id="171" w:name="ref-wikipedia_box_plot"/>
     <w:p>
       <w:pPr>
         <w:pStyle w:val="Bibliography"/>
@@ -22755,7 +23071,7 @@
       <w:r>
         <w:t xml:space="preserve"> </w:t>
       </w:r>
-      <w:hyperlink r:id="rId165">
+      <w:hyperlink r:id="rId170">
         <w:r>
           <w:rPr>
             <w:rStyle w:val="Hyperlink"/>
@@ -22764,8 +23080,8 @@
         </w:r>
       </w:hyperlink>
     </w:p>
-    <w:bookmarkEnd w:id="166"/>
-    <w:bookmarkStart w:id="168" w:name="ref-wikipedia_bar_chart"/>
+    <w:bookmarkEnd w:id="171"/>
+    <w:bookmarkStart w:id="173" w:name="ref-wikipedia_bar_chart"/>
     <w:p>
       <w:pPr>
         <w:pStyle w:val="Bibliography"/>
@@ -22812,7 +23128,7 @@
       <w:r>
         <w:t xml:space="preserve"> </w:t>
       </w:r>
-      <w:hyperlink r:id="rId167">
+      <w:hyperlink r:id="rId172">
         <w:r>
           <w:rPr>
             <w:rStyle w:val="Hyperlink"/>
@@ -22821,8 +23137,8 @@
         </w:r>
       </w:hyperlink>
     </w:p>
-    <w:bookmarkEnd w:id="168"/>
-    <w:bookmarkStart w:id="170" w:name="ref-wikipedia_q_q_plot"/>
+    <w:bookmarkEnd w:id="173"/>
+    <w:bookmarkStart w:id="175" w:name="ref-wikipedia_q_q_plot"/>
     <w:p>
       <w:pPr>
         <w:pStyle w:val="Bibliography"/>
@@ -22869,7 +23185,7 @@
       <w:r>
         <w:t xml:space="preserve"> </w:t>
       </w:r>
-      <w:hyperlink r:id="rId169">
+      <w:hyperlink r:id="rId174">
         <w:r>
           <w:rPr>
             <w:rStyle w:val="Hyperlink"/>
@@ -22878,8 +23194,8 @@
         </w:r>
       </w:hyperlink>
     </w:p>
-    <w:bookmarkEnd w:id="170"/>
-    <w:bookmarkStart w:id="172" w:name="ref-wikipedia_scatter_plot"/>
+    <w:bookmarkEnd w:id="175"/>
+    <w:bookmarkStart w:id="177" w:name="ref-wikipedia_scatter_plot"/>
     <w:p>
       <w:pPr>
         <w:pStyle w:val="Bibliography"/>
@@ -22926,7 +23242,7 @@
       <w:r>
         <w:t xml:space="preserve"> </w:t>
       </w:r>
-      <w:hyperlink r:id="rId171">
+      <w:hyperlink r:id="rId176">
         <w:r>
           <w:rPr>
             <w:rStyle w:val="Hyperlink"/>
@@ -22935,8 +23251,8 @@
         </w:r>
       </w:hyperlink>
     </w:p>
-    <w:bookmarkEnd w:id="172"/>
-    <w:bookmarkStart w:id="174" w:name="X9c68751dcff429bb8eebfb08e71b6f746222990"/>
+    <w:bookmarkEnd w:id="177"/>
+    <w:bookmarkStart w:id="179" w:name="X9c68751dcff429bb8eebfb08e71b6f746222990"/>
     <w:p>
       <w:pPr>
         <w:pStyle w:val="Bibliography"/>
@@ -22983,7 +23299,7 @@
       <w:r>
         <w:t xml:space="preserve"> </w:t>
       </w:r>
-      <w:hyperlink r:id="rId173">
+      <w:hyperlink r:id="rId178">
         <w:r>
           <w:rPr>
             <w:rStyle w:val="Hyperlink"/>
@@ -22992,8 +23308,8 @@
         </w:r>
       </w:hyperlink>
     </w:p>
-    <w:bookmarkEnd w:id="174"/>
-    <w:bookmarkStart w:id="176" w:name="ref-wikipedia_contingency_table"/>
+    <w:bookmarkEnd w:id="179"/>
+    <w:bookmarkStart w:id="181" w:name="ref-wikipedia_contingency_table"/>
     <w:p>
       <w:pPr>
         <w:pStyle w:val="Bibliography"/>
@@ -23040,7 +23356,7 @@
       <w:r>
         <w:t xml:space="preserve"> </w:t>
       </w:r>
-      <w:hyperlink r:id="rId175">
+      <w:hyperlink r:id="rId180">
         <w:r>
           <w:rPr>
             <w:rStyle w:val="Hyperlink"/>
@@ -23049,8 +23365,8 @@
         </w:r>
       </w:hyperlink>
     </w:p>
-    <w:bookmarkEnd w:id="176"/>
-    <w:bookmarkStart w:id="178" w:name="ref-wikipedia_standard_score"/>
+    <w:bookmarkEnd w:id="181"/>
+    <w:bookmarkStart w:id="183" w:name="ref-wikipedia_standard_score"/>
     <w:p>
       <w:pPr>
         <w:pStyle w:val="Bibliography"/>
@@ -23097,7 +23413,7 @@
       <w:r>
         <w:t xml:space="preserve"> </w:t>
       </w:r>
-      <w:hyperlink r:id="rId177">
+      <w:hyperlink r:id="rId182">
         <w:r>
           <w:rPr>
             <w:rStyle w:val="Hyperlink"/>
@@ -23106,8 +23422,8 @@
         </w:r>
       </w:hyperlink>
     </w:p>
-    <w:bookmarkEnd w:id="178"/>
-    <w:bookmarkStart w:id="180" w:name="ref-james2021islr2e"/>
+    <w:bookmarkEnd w:id="183"/>
+    <w:bookmarkStart w:id="185" w:name="ref-james2021islr2e"/>
     <w:p>
       <w:pPr>
         <w:pStyle w:val="Bibliography"/>
@@ -23154,7 +23470,7 @@
       <w:r>
         <w:t xml:space="preserve"> </w:t>
       </w:r>
-      <w:hyperlink r:id="rId179">
+      <w:hyperlink r:id="rId184">
         <w:r>
           <w:rPr>
             <w:rStyle w:val="Hyperlink"/>
@@ -23166,8 +23482,8 @@
         <w:t xml:space="preserve">.</w:t>
       </w:r>
     </w:p>
-    <w:bookmarkEnd w:id="180"/>
-    <w:bookmarkStart w:id="181" w:name="ref-geron2017hands"/>
+    <w:bookmarkEnd w:id="185"/>
+    <w:bookmarkStart w:id="186" w:name="ref-geron2017hands"/>
     <w:p>
       <w:pPr>
         <w:pStyle w:val="Bibliography"/>
@@ -23240,8 +23556,8 @@
         <w:t xml:space="preserve">, 1st ed. O’Reilly Media, 2017.</w:t>
       </w:r>
     </w:p>
-    <w:bookmarkEnd w:id="181"/>
-    <w:bookmarkStart w:id="183" w:name="ref-wikipedia_feature_scaling"/>
+    <w:bookmarkEnd w:id="186"/>
+    <w:bookmarkStart w:id="188" w:name="ref-wikipedia_feature_scaling"/>
     <w:p>
       <w:pPr>
         <w:pStyle w:val="Bibliography"/>
@@ -23288,7 +23604,7 @@
       <w:r>
         <w:t xml:space="preserve"> </w:t>
       </w:r>
-      <w:hyperlink r:id="rId182">
+      <w:hyperlink r:id="rId187">
         <w:r>
           <w:rPr>
             <w:rStyle w:val="Hyperlink"/>
@@ -23297,9 +23613,9 @@
         </w:r>
       </w:hyperlink>
     </w:p>
-    <w:bookmarkEnd w:id="183"/>
-    <w:bookmarkEnd w:id="184"/>
-    <w:bookmarkEnd w:id="185"/>
+    <w:bookmarkEnd w:id="188"/>
+    <w:bookmarkEnd w:id="189"/>
+    <w:bookmarkEnd w:id="190"/>
     <w:sectPr>
       <w:footnotePr>
         <w:numRestart w:val="eachSect"/>

</xml_diff>

<commit_message>
Deploying to gh-pages from @ Morrison-Lab/sds@34f0d33d9a182897f0ebf0e41559641abdbb53e3 🚀
</commit_message>
<xml_diff>
--- a/exploratory-descriptive-handout.docx
+++ b/exploratory-descriptive-handout.docx
@@ -15,10 +15,10 @@
         <w:pStyle w:val="Date"/>
       </w:pPr>
       <w:r>
-        <w:t xml:space="preserve">Last modified: 2026-10-23 16:25:36 (PDT)</w:t>
+        <w:t xml:space="preserve">Last modified: 2026-10-23 16:56:15 (PDT)</w:t>
       </w:r>
     </w:p>
-    <w:bookmarkStart w:id="27" w:name="introduction"/>
+    <w:bookmarkStart w:id="30" w:name="introduction"/>
     <w:p>
       <w:pPr>
         <w:pStyle w:val="Heading2"/>
@@ -1912,7 +1912,7 @@
       </w:r>
     </w:p>
     <w:bookmarkEnd w:id="14"/>
-    <w:bookmarkStart w:id="26" w:name="sec-populations-samples"/>
+    <w:bookmarkStart w:id="29" w:name="sec-populations-samples"/>
     <w:p>
       <w:pPr>
         <w:pStyle w:val="Heading3"/>
@@ -3280,37 +3280,236 @@
       </w:r>
     </w:p>
     <w:bookmarkEnd w:id="25"/>
-    <w:bookmarkEnd w:id="26"/>
-    <w:bookmarkEnd w:id="27"/>
-    <w:bookmarkStart w:id="53" w:name="summarizing-a-single-variable"/>
+    <w:bookmarkStart w:id="27" w:name="def-population-parameter"/>
     <w:p>
       <w:pPr>
-        <w:pStyle w:val="Heading2"/>
-      </w:pPr>
-      <w:r>
-        <w:t xml:space="preserve">2 Summarizing a single variable</w:t>
-      </w:r>
-    </w:p>
-    <w:bookmarkStart w:id="35" w:name="measures-of-center"/>
-    <w:p>
-      <w:pPr>
-        <w:pStyle w:val="Heading3"/>
-      </w:pPr>
-      <w:r>
-        <w:t xml:space="preserve">2.1 Measures of center</w:t>
-      </w:r>
-    </w:p>
-    <w:bookmarkStart w:id="28" w:name="def-sample-mean"/>
-    <w:p>
-      <w:pPr>
-        <w:pStyle w:val="FirstParagraph"/>
+        <w:pStyle w:val="BodyText"/>
       </w:pPr>
       <w:r>
         <w:rPr>
           <w:b/>
           <w:bCs/>
         </w:rPr>
-        <w:t xml:space="preserve">Definition 6 (Sample mean)</w:t>
+        <w:t xml:space="preserve">Definition 6 (Population parameter)</w:t>
+      </w:r>
+      <w:r>
+        <w:t xml:space="preserve"> </w:t>
+      </w:r>
+      <w:r>
+        <w:t xml:space="preserve">A</w:t>
+      </w:r>
+      <w:r>
+        <w:t xml:space="preserve"> </w:t>
+      </w:r>
+      <w:r>
+        <w:rPr>
+          <w:b/>
+          <w:bCs/>
+        </w:rPr>
+        <w:t xml:space="preserve">population parameter</w:t>
+      </w:r>
+      <w:r>
+        <w:t xml:space="preserve"> </w:t>
+      </w:r>
+      <w:r>
+        <w:t xml:space="preserve">is a number computed from the population distribution (</w:t>
+      </w:r>
+      <w:hyperlink w:anchor="def-population-distribution">
+        <w:r>
+          <w:rPr>
+            <w:rStyle w:val="Hyperlink"/>
+          </w:rPr>
+          <w:t xml:space="preserve">Definition 2</w:t>
+        </w:r>
+      </w:hyperlink>
+      <w:r>
+        <w:t xml:space="preserve">),</w:t>
+      </w:r>
+      <w:r>
+        <w:t xml:space="preserve"> </w:t>
+      </w:r>
+      <w:r>
+        <w:t xml:space="preserve">such as its</w:t>
+      </w:r>
+      <w:r>
+        <w:t xml:space="preserve"> </w:t>
+      </w:r>
+      <w:hyperlink r:id="rId26">
+        <w:r>
+          <w:rPr>
+            <w:rStyle w:val="Hyperlink"/>
+          </w:rPr>
+          <w:t xml:space="preserve">population mean</w:t>
+        </w:r>
+      </w:hyperlink>
+      <w:r>
+        <w:t xml:space="preserve">.</w:t>
+      </w:r>
+      <w:r>
+        <w:t xml:space="preserve"> </w:t>
+      </w:r>
+      <w:r>
+        <w:t xml:space="preserve">A population parameter is fixed.</w:t>
+      </w:r>
+      <w:r>
+        <w:t xml:space="preserve"> </w:t>
+      </w:r>
+      <w:r>
+        <w:t xml:space="preserve">It is usually unknown.</w:t>
+      </w:r>
+    </w:p>
+    <w:bookmarkEnd w:id="27"/>
+    <w:bookmarkStart w:id="28" w:name="exm-population-parameter-wcgs"/>
+    <w:p>
+      <w:pPr>
+        <w:pStyle w:val="BodyText"/>
+      </w:pPr>
+      <w:r>
+        <w:rPr>
+          <w:b/>
+          <w:bCs/>
+        </w:rPr>
+        <w:t xml:space="preserve">Example 3 (A population parameter in the WCGS)</w:t>
+      </w:r>
+      <w:r>
+        <w:t xml:space="preserve"> </w:t>
+      </w:r>
+      <w:r>
+        <w:t xml:space="preserve">In</w:t>
+      </w:r>
+      <w:r>
+        <w:t xml:space="preserve"> </w:t>
+      </w:r>
+      <w:hyperlink w:anchor="exm-population-sample-wcgs">
+        <w:r>
+          <w:rPr>
+            <w:rStyle w:val="Hyperlink"/>
+          </w:rPr>
+          <w:t xml:space="preserve">Example 2</w:t>
+        </w:r>
+      </w:hyperlink>
+      <w:r>
+        <w:t xml:space="preserve">, the</w:t>
+      </w:r>
+      <w:r>
+        <w:t xml:space="preserve"> </w:t>
+      </w:r>
+      <w:hyperlink r:id="rId26">
+        <w:r>
+          <w:rPr>
+            <w:rStyle w:val="Hyperlink"/>
+          </w:rPr>
+          <w:t xml:space="preserve">population mean</w:t>
+        </w:r>
+      </w:hyperlink>
+      <w:r>
+        <w:t xml:space="preserve"> </w:t>
+      </w:r>
+      <w:r>
+        <w:t xml:space="preserve">of cholesterol is a</w:t>
+      </w:r>
+      <w:r>
+        <w:t xml:space="preserve"> </w:t>
+      </w:r>
+      <w:hyperlink w:anchor="def-population-parameter">
+        <w:r>
+          <w:rPr>
+            <w:rStyle w:val="Hyperlink"/>
+          </w:rPr>
+          <w:t xml:space="preserve">population parameter</w:t>
+        </w:r>
+      </w:hyperlink>
+      <w:r>
+        <w:t xml:space="preserve">.</w:t>
+      </w:r>
+      <w:r>
+        <w:t xml:space="preserve"> </w:t>
+      </w:r>
+      <w:r>
+        <w:t xml:space="preserve">It describes all the men in the study’s population (</w:t>
+      </w:r>
+      <w:hyperlink w:anchor="def-population">
+        <w:r>
+          <w:rPr>
+            <w:rStyle w:val="Hyperlink"/>
+          </w:rPr>
+          <w:t xml:space="preserve">Definition 1</w:t>
+        </w:r>
+      </w:hyperlink>
+      <w:r>
+        <w:t xml:space="preserve">).</w:t>
+      </w:r>
+      <w:r>
+        <w:t xml:space="preserve"> </w:t>
+      </w:r>
+      <w:r>
+        <w:t xml:space="preserve">We know only the mean cholesterol of the sample (</w:t>
+      </w:r>
+      <w:hyperlink w:anchor="def-sample">
+        <w:r>
+          <w:rPr>
+            <w:rStyle w:val="Hyperlink"/>
+          </w:rPr>
+          <w:t xml:space="preserve">Definition 4</w:t>
+        </w:r>
+      </w:hyperlink>
+      <w:r>
+        <w:t xml:space="preserve">) of the</w:t>
+      </w:r>
+      <w:r>
+        <w:t xml:space="preserve"> </w:t>
+      </w:r>
+      <w:r>
+        <w:rPr>
+          <w:rStyle w:val="VerbatimChar"/>
+        </w:rPr>
+        <w:t xml:space="preserve">wcgs</w:t>
+      </w:r>
+      <w:r>
+        <w:t xml:space="preserve"> </w:t>
+      </w:r>
+      <w:r>
+        <w:t xml:space="preserve">data,</w:t>
+      </w:r>
+      <w:r>
+        <w:t xml:space="preserve"> </w:t>
+      </w:r>
+      <w:r>
+        <w:t xml:space="preserve">226.4 mg/dL.</w:t>
+      </w:r>
+    </w:p>
+    <w:bookmarkEnd w:id="28"/>
+    <w:bookmarkEnd w:id="29"/>
+    <w:bookmarkEnd w:id="30"/>
+    <w:bookmarkStart w:id="55" w:name="summarizing-a-single-variable"/>
+    <w:p>
+      <w:pPr>
+        <w:pStyle w:val="Heading2"/>
+      </w:pPr>
+      <w:r>
+        <w:t xml:space="preserve">2 Summarizing a single variable</w:t>
+      </w:r>
+    </w:p>
+    <w:bookmarkStart w:id="37" w:name="measures-of-center"/>
+    <w:p>
+      <w:pPr>
+        <w:pStyle w:val="Heading3"/>
+      </w:pPr>
+      <w:r>
+        <w:t xml:space="preserve">2.1 Measures of center</w:t>
+      </w:r>
+    </w:p>
+    <w:bookmarkStart w:id="31" w:name="def-sample-mean"/>
+    <w:p>
+      <w:pPr>
+        <w:pStyle w:val="FirstParagraph"/>
+      </w:pPr>
+      <w:r>
+        <w:rPr>
+          <w:b/>
+          <w:bCs/>
+        </w:rPr>
+        <w:t xml:space="preserve">Definition 7 (Sample mean)</w:t>
       </w:r>
       <w:r>
         <w:t xml:space="preserve"> </w:t>
@@ -3499,8 +3698,8 @@
         </m:oMath>
       </m:oMathPara>
     </w:p>
-    <w:bookmarkEnd w:id="28"/>
-    <w:bookmarkStart w:id="29" w:name="exm-sample-mean"/>
+    <w:bookmarkEnd w:id="31"/>
+    <w:bookmarkStart w:id="32" w:name="exm-sample-mean"/>
     <w:p>
       <w:pPr>
         <w:pStyle w:val="FirstParagraph"/>
@@ -3510,7 +3709,7 @@
           <w:b/>
           <w:bCs/>
         </w:rPr>
-        <w:t xml:space="preserve">Example 3 (Sample mean cholesterol in the WCGS)</w:t>
+        <w:t xml:space="preserve">Example 4 (Sample mean cholesterol in the WCGS)</w:t>
       </w:r>
       <w:r>
         <w:t xml:space="preserve"> </w:t>
@@ -3608,8 +3807,8 @@
         <w:t xml:space="preserve">#&gt; [1] 226.372</w:t>
       </w:r>
     </w:p>
-    <w:bookmarkEnd w:id="29"/>
-    <w:bookmarkStart w:id="31" w:name="exm-sample-vs-population-mean"/>
+    <w:bookmarkEnd w:id="32"/>
+    <w:bookmarkStart w:id="33" w:name="exm-sample-vs-population-mean"/>
     <w:p>
       <w:pPr>
         <w:pStyle w:val="FirstParagraph"/>
@@ -3619,7 +3818,7 @@
           <w:b/>
           <w:bCs/>
         </w:rPr>
-        <w:t xml:space="preserve">Example 4 (Sample mean versus population mean of cholesterol)</w:t>
+        <w:t xml:space="preserve">Example 5 (Sample mean versus population mean of cholesterol)</w:t>
       </w:r>
       <w:r>
         <w:t xml:space="preserve"> </w:t>
@@ -3630,7 +3829,7 @@
       <w:r>
         <w:t xml:space="preserve"> </w:t>
       </w:r>
-      <w:hyperlink r:id="rId30">
+      <w:hyperlink r:id="rId26">
         <w:r>
           <w:rPr>
             <w:rStyle w:val="Hyperlink"/>
@@ -3653,7 +3852,7 @@
       <w:r>
         <w:t xml:space="preserve"> </w:t>
       </w:r>
-      <w:hyperlink r:id="rId30">
+      <w:hyperlink r:id="rId26">
         <w:r>
           <w:rPr>
             <w:rStyle w:val="Hyperlink"/>
@@ -3695,7 +3894,7 @@
           <w:rPr>
             <w:rStyle w:val="Hyperlink"/>
           </w:rPr>
-          <w:t xml:space="preserve">Definition 6</w:t>
+          <w:t xml:space="preserve">Definition 7</w:t>
         </w:r>
       </w:hyperlink>
       <w:r>
@@ -3775,8 +3974,8 @@
         <w:t xml:space="preserve">while the population mean would not change.</w:t>
       </w:r>
     </w:p>
-    <w:bookmarkEnd w:id="31"/>
-    <w:bookmarkStart w:id="33" w:name="def-sample-median"/>
+    <w:bookmarkEnd w:id="33"/>
+    <w:bookmarkStart w:id="35" w:name="def-sample-median"/>
     <w:p>
       <w:pPr>
         <w:pStyle w:val="BodyText"/>
@@ -3786,7 +3985,7 @@
           <w:b/>
           <w:bCs/>
         </w:rPr>
-        <w:t xml:space="preserve">Definition 7 (Sample median)</w:t>
+        <w:t xml:space="preserve">Definition 8 (Sample median)</w:t>
       </w:r>
       <w:r>
         <w:t xml:space="preserve"> </w:t>
@@ -3825,7 +4024,7 @@
       <w:r>
         <w:t xml:space="preserve"> </w:t>
       </w:r>
-      <w:hyperlink r:id="rId32">
+      <w:hyperlink r:id="rId34">
         <w:r>
           <w:rPr>
             <w:rStyle w:val="Hyperlink"/>
@@ -4159,8 +4358,8 @@
         <w:t xml:space="preserve">.</w:t>
       </w:r>
     </w:p>
-    <w:bookmarkEnd w:id="33"/>
-    <w:bookmarkStart w:id="34" w:name="exm-sample-median"/>
+    <w:bookmarkEnd w:id="35"/>
+    <w:bookmarkStart w:id="36" w:name="exm-sample-median"/>
     <w:p>
       <w:pPr>
         <w:pStyle w:val="BodyText"/>
@@ -4170,7 +4369,7 @@
           <w:b/>
           <w:bCs/>
         </w:rPr>
-        <w:t xml:space="preserve">Example 5 (Median cholesterol in the WCGS)</w:t>
+        <w:t xml:space="preserve">Example 6 (Median cholesterol in the WCGS)</w:t>
       </w:r>
       <w:r>
         <w:t xml:space="preserve"> </w:t>
@@ -4259,7 +4458,7 @@
           <w:rPr>
             <w:rStyle w:val="Hyperlink"/>
           </w:rPr>
-          <w:t xml:space="preserve">Example 3</w:t>
+          <w:t xml:space="preserve">Example 4</w:t>
         </w:r>
       </w:hyperlink>
       <w:r>
@@ -4296,9 +4495,9 @@
         <w:t xml:space="preserve">A median is less sensitive to extreme values than a sample mean.</w:t>
       </w:r>
     </w:p>
-    <w:bookmarkEnd w:id="34"/>
-    <w:bookmarkEnd w:id="35"/>
-    <w:bookmarkStart w:id="46" w:name="measures-of-spread"/>
+    <w:bookmarkEnd w:id="36"/>
+    <w:bookmarkEnd w:id="37"/>
+    <w:bookmarkStart w:id="48" w:name="measures-of-spread"/>
     <w:p>
       <w:pPr>
         <w:pStyle w:val="Heading3"/>
@@ -4307,7 +4506,7 @@
         <w:t xml:space="preserve">2.2 Measures of spread</w:t>
       </w:r>
     </w:p>
-    <w:bookmarkStart w:id="36" w:name="def-sample-variance"/>
+    <w:bookmarkStart w:id="38" w:name="def-sample-variance"/>
     <w:p>
       <w:pPr>
         <w:pStyle w:val="FirstParagraph"/>
@@ -4317,7 +4516,7 @@
           <w:b/>
           <w:bCs/>
         </w:rPr>
-        <w:t xml:space="preserve">Definition 8 (Sample variance)</w:t>
+        <w:t xml:space="preserve">Definition 9 (Sample variance)</w:t>
       </w:r>
       <w:r>
         <w:t xml:space="preserve"> </w:t>
@@ -4527,8 +4726,8 @@
         <w:t xml:space="preserve">.</w:t>
       </w:r>
     </w:p>
-    <w:bookmarkEnd w:id="36"/>
-    <w:bookmarkStart w:id="37" w:name="def-sample-sd"/>
+    <w:bookmarkEnd w:id="38"/>
+    <w:bookmarkStart w:id="39" w:name="def-sample-sd"/>
     <w:p>
       <w:pPr>
         <w:pStyle w:val="BodyText"/>
@@ -4538,7 +4737,7 @@
           <w:b/>
           <w:bCs/>
         </w:rPr>
-        <w:t xml:space="preserve">Definition 9 (Sample standard deviation)</w:t>
+        <w:t xml:space="preserve">Definition 10 (Sample standard deviation)</w:t>
       </w:r>
       <w:r>
         <w:t xml:space="preserve"> </w:t>
@@ -4648,8 +4847,8 @@
         <w:t xml:space="preserve">.</w:t>
       </w:r>
     </w:p>
-    <w:bookmarkEnd w:id="37"/>
-    <w:bookmarkStart w:id="38" w:name="rem-sd-units"/>
+    <w:bookmarkEnd w:id="39"/>
+    <w:bookmarkStart w:id="40" w:name="rem-sd-units"/>
     <w:p>
       <w:pPr>
         <w:pStyle w:val="BodyText"/>
@@ -4680,8 +4879,8 @@
         <w:t xml:space="preserve">whose units are squared.</w:t>
       </w:r>
     </w:p>
-    <w:bookmarkEnd w:id="38"/>
-    <w:bookmarkStart w:id="39" w:name="exm-sample-sd"/>
+    <w:bookmarkEnd w:id="40"/>
+    <w:bookmarkStart w:id="41" w:name="exm-sample-sd"/>
     <w:p>
       <w:pPr>
         <w:pStyle w:val="BodyText"/>
@@ -4691,7 +4890,7 @@
           <w:b/>
           <w:bCs/>
         </w:rPr>
-        <w:t xml:space="preserve">Example 6 (Variance and standard deviation of cholesterol in the WCGS)</w:t>
+        <w:t xml:space="preserve">Example 7 (Variance and standard deviation of cholesterol in the WCGS)</w:t>
       </w:r>
       <w:r>
         <w:t xml:space="preserve"> </w:t>
@@ -4851,8 +5050,8 @@
         <w:t xml:space="preserve">like the cholesterol values themselves.</w:t>
       </w:r>
     </w:p>
-    <w:bookmarkEnd w:id="39"/>
-    <w:bookmarkStart w:id="41" w:name="def-quartiles"/>
+    <w:bookmarkEnd w:id="41"/>
+    <w:bookmarkStart w:id="43" w:name="def-quartiles"/>
     <w:p>
       <w:pPr>
         <w:pStyle w:val="BodyText"/>
@@ -4862,7 +5061,7 @@
           <w:b/>
           <w:bCs/>
         </w:rPr>
-        <w:t xml:space="preserve">Definition 10 (Quartiles (first quartile, third quartile, 25th percentile, 75th percentile))</w:t>
+        <w:t xml:space="preserve">Definition 11 (Quartiles (first quartile, third quartile, 25th percentile, 75th percentile))</w:t>
       </w:r>
       <w:r>
         <w:t xml:space="preserve"> </w:t>
@@ -4961,7 +5160,7 @@
       <w:r>
         <w:t xml:space="preserve">(</w:t>
       </w:r>
-      <w:hyperlink r:id="rId40">
+      <w:hyperlink r:id="rId42">
         <w:r>
           <w:rPr>
             <w:rStyle w:val="Hyperlink"/>
@@ -5028,8 +5227,8 @@
         <w:t xml:space="preserve">.</w:t>
       </w:r>
     </w:p>
-    <w:bookmarkEnd w:id="41"/>
-    <w:bookmarkStart w:id="43" w:name="rem-quartile-software"/>
+    <w:bookmarkEnd w:id="43"/>
+    <w:bookmarkStart w:id="45" w:name="rem-quartile-software"/>
     <w:p>
       <w:pPr>
         <w:pStyle w:val="BodyText"/>
@@ -5097,7 +5296,7 @@
       <w:r>
         <w:t xml:space="preserve">(</w:t>
       </w:r>
-      <w:hyperlink r:id="rId42">
+      <w:hyperlink r:id="rId44">
         <w:r>
           <w:rPr>
             <w:rStyle w:val="Hyperlink"/>
@@ -5148,8 +5347,8 @@
         <w:t xml:space="preserve">, interpolates.</w:t>
       </w:r>
     </w:p>
-    <w:bookmarkEnd w:id="43"/>
-    <w:bookmarkStart w:id="44" w:name="def-IQR"/>
+    <w:bookmarkEnd w:id="45"/>
+    <w:bookmarkStart w:id="46" w:name="def-IQR"/>
     <w:p>
       <w:pPr>
         <w:pStyle w:val="BodyText"/>
@@ -5159,7 +5358,7 @@
           <w:b/>
           <w:bCs/>
         </w:rPr>
-        <w:t xml:space="preserve">Definition 11 (Interquartile range)</w:t>
+        <w:t xml:space="preserve">Definition 12 (Interquartile range)</w:t>
       </w:r>
       <w:r>
         <w:t xml:space="preserve"> </w:t>
@@ -5289,8 +5488,8 @@
         <w:t xml:space="preserve">.</w:t>
       </w:r>
     </w:p>
-    <w:bookmarkEnd w:id="44"/>
-    <w:bookmarkStart w:id="45" w:name="exm-IQR"/>
+    <w:bookmarkEnd w:id="46"/>
+    <w:bookmarkStart w:id="47" w:name="exm-IQR"/>
     <w:p>
       <w:pPr>
         <w:pStyle w:val="BodyText"/>
@@ -5300,7 +5499,7 @@
           <w:b/>
           <w:bCs/>
         </w:rPr>
-        <w:t xml:space="preserve">Example 7 (Quartiles and IQR of cholesterol in the WCGS)</w:t>
+        <w:t xml:space="preserve">Example 8 (Quartiles and IQR of cholesterol in the WCGS)</w:t>
       </w:r>
       <w:r>
         <w:t xml:space="preserve"> </w:t>
@@ -5562,9 +5761,9 @@
         <w:t xml:space="preserve">so it is less sensitive to outliers than the standard deviation.</w:t>
       </w:r>
     </w:p>
-    <w:bookmarkEnd w:id="45"/>
-    <w:bookmarkEnd w:id="46"/>
-    <w:bookmarkStart w:id="48" w:name="summary-statistics-in-r"/>
+    <w:bookmarkEnd w:id="47"/>
+    <w:bookmarkEnd w:id="48"/>
+    <w:bookmarkStart w:id="50" w:name="summary-statistics-in-r"/>
     <w:p>
       <w:pPr>
         <w:pStyle w:val="Heading3"/>
@@ -5630,7 +5829,7 @@
           <w:rPr>
             <w:rStyle w:val="Hyperlink"/>
           </w:rPr>
-          <w:t xml:space="preserve">Definition 10</w:t>
+          <w:t xml:space="preserve">Definition 11</w:t>
         </w:r>
       </w:hyperlink>
       <w:r>
@@ -5731,7 +5930,7 @@
       <w:tr>
         <w:tc>
           <w:tcPr/>
-          <w:bookmarkStart w:id="47" w:name="tbl-wcgs-summary-continuous"/>
+          <w:bookmarkStart w:id="49" w:name="tbl-wcgs-summary-continuous"/>
           <w:p>
             <w:pPr>
               <w:jc w:val="center"/>
@@ -6458,12 +6657,12 @@
               </w:tc>
             </w:tr>
           </w:tbl>
-          <w:bookmarkEnd w:id="47"/>
+          <w:bookmarkEnd w:id="49"/>
         </w:tc>
       </w:tr>
     </w:tbl>
-    <w:bookmarkEnd w:id="48"/>
-    <w:bookmarkStart w:id="52" w:name="binary-and-categorical-variables"/>
+    <w:bookmarkEnd w:id="50"/>
+    <w:bookmarkStart w:id="54" w:name="binary-and-categorical-variables"/>
     <w:p>
       <w:pPr>
         <w:pStyle w:val="Heading3"/>
@@ -6472,7 +6671,7 @@
         <w:t xml:space="preserve">2.4 Binary and categorical variables</w:t>
       </w:r>
     </w:p>
-    <w:bookmarkStart w:id="49" w:name="def-sample-proportion"/>
+    <w:bookmarkStart w:id="51" w:name="def-sample-proportion"/>
     <w:p>
       <w:pPr>
         <w:pStyle w:val="FirstParagraph"/>
@@ -6482,7 +6681,7 @@
           <w:b/>
           <w:bCs/>
         </w:rPr>
-        <w:t xml:space="preserve">Definition 12 (Sample proportion)</w:t>
+        <w:t xml:space="preserve">Definition 13 (Sample proportion)</w:t>
       </w:r>
       <w:r>
         <w:t xml:space="preserve"> </w:t>
@@ -6611,8 +6810,8 @@
         <w:t xml:space="preserve">is the number of observations.</w:t>
       </w:r>
     </w:p>
-    <w:bookmarkEnd w:id="49"/>
-    <w:bookmarkStart w:id="50" w:name="exm-sample-proportion"/>
+    <w:bookmarkEnd w:id="51"/>
+    <w:bookmarkStart w:id="52" w:name="exm-sample-proportion"/>
     <w:p>
       <w:pPr>
         <w:pStyle w:val="BodyText"/>
@@ -6622,7 +6821,7 @@
           <w:b/>
           <w:bCs/>
         </w:rPr>
-        <w:t xml:space="preserve">Example 8 (Proportion of WCGS participants with a CHD event)</w:t>
+        <w:t xml:space="preserve">Example 9 (Proportion of WCGS participants with a CHD event)</w:t>
       </w:r>
       <w:r>
         <w:t xml:space="preserve"> </w:t>
@@ -6773,7 +6972,7 @@
         <w:t xml:space="preserve">0.081.</w:t>
       </w:r>
     </w:p>
-    <w:bookmarkEnd w:id="50"/>
+    <w:bookmarkEnd w:id="52"/>
     <w:p>
       <w:pPr>
         <w:pStyle w:val="BodyText"/>
@@ -6824,7 +7023,7 @@
       <w:tr>
         <w:tc>
           <w:tcPr/>
-          <w:bookmarkStart w:id="51" w:name="tbl-wcgs-summary-cat"/>
+          <w:bookmarkStart w:id="53" w:name="tbl-wcgs-summary-cat"/>
           <w:p>
             <w:pPr>
               <w:jc w:val="center"/>
@@ -7819,7 +8018,7 @@
               </w:tc>
             </w:tr>
           </w:tbl>
-          <w:bookmarkEnd w:id="51"/>
+          <w:bookmarkEnd w:id="53"/>
         </w:tc>
       </w:tr>
     </w:tbl>
@@ -7859,9 +8058,9 @@
         <w:t xml:space="preserve">covers measures of location and dispersion.</w:t>
       </w:r>
     </w:p>
-    <w:bookmarkEnd w:id="52"/>
-    <w:bookmarkEnd w:id="53"/>
-    <w:bookmarkStart w:id="87" w:name="graphical-methods"/>
+    <w:bookmarkEnd w:id="54"/>
+    <w:bookmarkEnd w:id="55"/>
+    <w:bookmarkStart w:id="89" w:name="graphical-methods"/>
     <w:p>
       <w:pPr>
         <w:pStyle w:val="Heading2"/>
@@ -7896,7 +8095,7 @@
         <w:t xml:space="preserve">Different types of graph suit different types of variable.</w:t>
       </w:r>
     </w:p>
-    <w:bookmarkStart w:id="60" w:name="histograms"/>
+    <w:bookmarkStart w:id="62" w:name="histograms"/>
     <w:p>
       <w:pPr>
         <w:pStyle w:val="Heading3"/>
@@ -7905,7 +8104,7 @@
         <w:t xml:space="preserve">3.1 Histograms</w:t>
       </w:r>
     </w:p>
-    <w:bookmarkStart w:id="54" w:name="def-histogram"/>
+    <w:bookmarkStart w:id="56" w:name="def-histogram"/>
     <w:p>
       <w:pPr>
         <w:pStyle w:val="FirstParagraph"/>
@@ -7915,7 +8114,7 @@
           <w:b/>
           <w:bCs/>
         </w:rPr>
-        <w:t xml:space="preserve">Definition 13 (Histogram)</w:t>
+        <w:t xml:space="preserve">Definition 14 (Histogram)</w:t>
       </w:r>
       <w:r>
         <w:t xml:space="preserve"> </w:t>
@@ -7975,8 +8174,8 @@
         <w:t xml:space="preserve">.</w:t>
       </w:r>
     </w:p>
-    <w:bookmarkEnd w:id="54"/>
-    <w:bookmarkStart w:id="55" w:name="def-bin"/>
+    <w:bookmarkEnd w:id="56"/>
+    <w:bookmarkStart w:id="57" w:name="def-bin"/>
     <w:p>
       <w:pPr>
         <w:pStyle w:val="BodyText"/>
@@ -7986,7 +8185,7 @@
           <w:b/>
           <w:bCs/>
         </w:rPr>
-        <w:t xml:space="preserve">Definition 14 (Bin)</w:t>
+        <w:t xml:space="preserve">Definition 15 (Bin)</w:t>
       </w:r>
       <w:r>
         <w:t xml:space="preserve"> </w:t>
@@ -8011,7 +8210,7 @@
         <w:t xml:space="preserve">of a histogram is one of its intervals.</w:t>
       </w:r>
     </w:p>
-    <w:bookmarkEnd w:id="55"/>
+    <w:bookmarkEnd w:id="57"/>
     <w:tbl>
       <w:tblPr>
         <w:tblStyle w:val="Table"/>
@@ -8025,7 +8224,7 @@
       <w:tr>
         <w:tc>
           <w:tcPr/>
-          <w:bookmarkStart w:id="59" w:name="fig-hist-chol"/>
+          <w:bookmarkStart w:id="61" w:name="fig-hist-chol"/>
           <w:p>
             <w:pPr>
               <w:pStyle w:val="SourceCode"/>
@@ -8311,18 +8510,18 @@
                 <wp:inline>
                   <wp:extent cx="4620126" cy="3696101"/>
                   <wp:effectExtent b="0" l="0" r="0" t="0"/>
-                  <wp:docPr descr="" title="" id="57" name="Picture"/>
+                  <wp:docPr descr="" title="" id="59" name="Picture"/>
                   <a:graphic>
                     <a:graphicData uri="http://schemas.openxmlformats.org/drawingml/2006/picture">
                       <pic:pic>
                         <pic:nvPicPr>
-                          <pic:cNvPr descr="exploratory-descriptive_files/figure-docx/unnamed-chunk-8-1.png" id="58" name="Picture"/>
+                          <pic:cNvPr descr="exploratory-descriptive_files/figure-docx/unnamed-chunk-8-1.png" id="60" name="Picture"/>
                           <pic:cNvPicPr>
                             <a:picLocks noChangeArrowheads="1" noChangeAspect="1"/>
                           </pic:cNvPicPr>
                         </pic:nvPicPr>
                         <pic:blipFill>
-                          <a:blip r:embed="rId56"/>
+                          <a:blip r:embed="rId58"/>
                           <a:stretch>
                             <a:fillRect/>
                           </a:stretch>
@@ -8362,7 +8561,7 @@
               <w:t xml:space="preserve">Figure 1: Histogram of total cholesterol in the WCGS dataset</w:t>
             </w:r>
           </w:p>
-          <w:bookmarkEnd w:id="59"/>
+          <w:bookmarkEnd w:id="61"/>
         </w:tc>
       </w:tr>
     </w:tbl>
@@ -8409,8 +8608,8 @@
         <w:t xml:space="preserve">but the largest value is 645 mg/dL.</w:t>
       </w:r>
     </w:p>
-    <w:bookmarkEnd w:id="60"/>
-    <w:bookmarkStart w:id="66" w:name="density-plots"/>
+    <w:bookmarkEnd w:id="62"/>
+    <w:bookmarkStart w:id="68" w:name="density-plots"/>
     <w:p>
       <w:pPr>
         <w:pStyle w:val="Heading3"/>
@@ -8419,7 +8618,7 @@
         <w:t xml:space="preserve">3.2 Density plots</w:t>
       </w:r>
     </w:p>
-    <w:bookmarkStart w:id="61" w:name="def-density-plot"/>
+    <w:bookmarkStart w:id="63" w:name="def-density-plot"/>
     <w:p>
       <w:pPr>
         <w:pStyle w:val="FirstParagraph"/>
@@ -8429,7 +8628,7 @@
           <w:b/>
           <w:bCs/>
         </w:rPr>
-        <w:t xml:space="preserve">Definition 15 (Density plot)</w:t>
+        <w:t xml:space="preserve">Definition 16 (Density plot)</w:t>
       </w:r>
       <w:r>
         <w:t xml:space="preserve"> </w:t>
@@ -8483,7 +8682,7 @@
         <w:t xml:space="preserve">.</w:t>
       </w:r>
     </w:p>
-    <w:bookmarkEnd w:id="61"/>
+    <w:bookmarkEnd w:id="63"/>
     <w:tbl>
       <w:tblPr>
         <w:tblStyle w:val="Table"/>
@@ -8497,7 +8696,7 @@
       <w:tr>
         <w:tc>
           <w:tcPr/>
-          <w:bookmarkStart w:id="65" w:name="fig-density-chol"/>
+          <w:bookmarkStart w:id="67" w:name="fig-density-chol"/>
           <w:p>
             <w:pPr>
               <w:pStyle w:val="SourceCode"/>
@@ -8759,18 +8958,18 @@
                 <wp:inline>
                   <wp:extent cx="4620126" cy="3696101"/>
                   <wp:effectExtent b="0" l="0" r="0" t="0"/>
-                  <wp:docPr descr="" title="" id="63" name="Picture"/>
+                  <wp:docPr descr="" title="" id="65" name="Picture"/>
                   <a:graphic>
                     <a:graphicData uri="http://schemas.openxmlformats.org/drawingml/2006/picture">
                       <pic:pic>
                         <pic:nvPicPr>
-                          <pic:cNvPr descr="exploratory-descriptive_files/figure-docx/unnamed-chunk-9-1.png" id="64" name="Picture"/>
+                          <pic:cNvPr descr="exploratory-descriptive_files/figure-docx/unnamed-chunk-9-1.png" id="66" name="Picture"/>
                           <pic:cNvPicPr>
                             <a:picLocks noChangeArrowheads="1" noChangeAspect="1"/>
                           </pic:cNvPicPr>
                         </pic:nvPicPr>
                         <pic:blipFill>
-                          <a:blip r:embed="rId62"/>
+                          <a:blip r:embed="rId64"/>
                           <a:stretch>
                             <a:fillRect/>
                           </a:stretch>
@@ -8810,12 +9009,12 @@
               <w:t xml:space="preserve">Figure 2: Density plot of total cholesterol in the WCGS dataset</w:t>
             </w:r>
           </w:p>
-          <w:bookmarkEnd w:id="65"/>
+          <w:bookmarkEnd w:id="67"/>
         </w:tc>
       </w:tr>
     </w:tbl>
-    <w:bookmarkEnd w:id="66"/>
-    <w:bookmarkStart w:id="74" w:name="box-plots"/>
+    <w:bookmarkEnd w:id="68"/>
+    <w:bookmarkStart w:id="76" w:name="box-plots"/>
     <w:p>
       <w:pPr>
         <w:pStyle w:val="Heading3"/>
@@ -8824,7 +9023,7 @@
         <w:t xml:space="preserve">3.3 Box plots</w:t>
       </w:r>
     </w:p>
-    <w:bookmarkStart w:id="68" w:name="def-boxplot"/>
+    <w:bookmarkStart w:id="70" w:name="def-boxplot"/>
     <w:p>
       <w:pPr>
         <w:pStyle w:val="FirstParagraph"/>
@@ -8834,7 +9033,7 @@
           <w:b/>
           <w:bCs/>
         </w:rPr>
-        <w:t xml:space="preserve">Definition 16 (Box plot (box-and-whisker plot))</w:t>
+        <w:t xml:space="preserve">Definition 17 (Box plot (box-and-whisker plot))</w:t>
       </w:r>
       <w:r>
         <w:t xml:space="preserve"> </w:t>
@@ -8880,7 +9079,7 @@
       <w:r>
         <w:t xml:space="preserve"> </w:t>
       </w:r>
-      <w:hyperlink r:id="rId67">
+      <w:hyperlink r:id="rId69">
         <w:r>
           <w:rPr>
             <w:rStyle w:val="Hyperlink"/>
@@ -9044,8 +9243,8 @@
         <w:t xml:space="preserve">.</w:t>
       </w:r>
     </w:p>
-    <w:bookmarkEnd w:id="68"/>
-    <w:bookmarkStart w:id="69" w:name="rem-whisker-rule"/>
+    <w:bookmarkEnd w:id="70"/>
+    <w:bookmarkStart w:id="71" w:name="rem-whisker-rule"/>
     <w:p>
       <w:pPr>
         <w:pStyle w:val="BodyText"/>
@@ -9130,7 +9329,7 @@
         <w:t xml:space="preserve">such as whiskers that run to the minimum and maximum.</w:t>
       </w:r>
     </w:p>
-    <w:bookmarkEnd w:id="69"/>
+    <w:bookmarkEnd w:id="71"/>
     <w:tbl>
       <w:tblPr>
         <w:tblStyle w:val="Table"/>
@@ -9144,7 +9343,7 @@
       <w:tr>
         <w:tc>
           <w:tcPr/>
-          <w:bookmarkStart w:id="73" w:name="fig-box-chol"/>
+          <w:bookmarkStart w:id="75" w:name="fig-box-chol"/>
           <w:p>
             <w:pPr>
               <w:pStyle w:val="SourceCode"/>
@@ -9421,18 +9620,18 @@
                 <wp:inline>
                   <wp:extent cx="4620126" cy="3696101"/>
                   <wp:effectExtent b="0" l="0" r="0" t="0"/>
-                  <wp:docPr descr="" title="" id="71" name="Picture"/>
+                  <wp:docPr descr="" title="" id="73" name="Picture"/>
                   <a:graphic>
                     <a:graphicData uri="http://schemas.openxmlformats.org/drawingml/2006/picture">
                       <pic:pic>
                         <pic:nvPicPr>
-                          <pic:cNvPr descr="exploratory-descriptive_files/figure-docx/unnamed-chunk-10-1.png" id="72" name="Picture"/>
+                          <pic:cNvPr descr="exploratory-descriptive_files/figure-docx/unnamed-chunk-10-1.png" id="74" name="Picture"/>
                           <pic:cNvPicPr>
                             <a:picLocks noChangeArrowheads="1" noChangeAspect="1"/>
                           </pic:cNvPicPr>
                         </pic:nvPicPr>
                         <pic:blipFill>
-                          <a:blip r:embed="rId70"/>
+                          <a:blip r:embed="rId72"/>
                           <a:stretch>
                             <a:fillRect/>
                           </a:stretch>
@@ -9472,12 +9671,12 @@
               <w:t xml:space="preserve">Figure 3: Box plot of total cholesterol in the WCGS dataset</w:t>
             </w:r>
           </w:p>
-          <w:bookmarkEnd w:id="73"/>
+          <w:bookmarkEnd w:id="75"/>
         </w:tc>
       </w:tr>
     </w:tbl>
-    <w:bookmarkEnd w:id="74"/>
-    <w:bookmarkStart w:id="80" w:name="bar-charts"/>
+    <w:bookmarkEnd w:id="76"/>
+    <w:bookmarkStart w:id="82" w:name="bar-charts"/>
     <w:p>
       <w:pPr>
         <w:pStyle w:val="Heading3"/>
@@ -9486,7 +9685,7 @@
         <w:t xml:space="preserve">3.4 Bar charts</w:t>
       </w:r>
     </w:p>
-    <w:bookmarkStart w:id="75" w:name="def-bar-chart"/>
+    <w:bookmarkStart w:id="77" w:name="def-bar-chart"/>
     <w:p>
       <w:pPr>
         <w:pStyle w:val="FirstParagraph"/>
@@ -9496,7 +9695,7 @@
           <w:b/>
           <w:bCs/>
         </w:rPr>
-        <w:t xml:space="preserve">Definition 17 (Bar chart)</w:t>
+        <w:t xml:space="preserve">Definition 18 (Bar chart)</w:t>
       </w:r>
       <w:r>
         <w:t xml:space="preserve"> </w:t>
@@ -9550,7 +9749,7 @@
         <w:t xml:space="preserve">.</w:t>
       </w:r>
     </w:p>
-    <w:bookmarkEnd w:id="75"/>
+    <w:bookmarkEnd w:id="77"/>
     <w:tbl>
       <w:tblPr>
         <w:tblStyle w:val="Table"/>
@@ -9564,7 +9763,7 @@
       <w:tr>
         <w:tc>
           <w:tcPr/>
-          <w:bookmarkStart w:id="79" w:name="fig-bar-behpat"/>
+          <w:bookmarkStart w:id="81" w:name="fig-bar-behpat"/>
           <w:p>
             <w:pPr>
               <w:pStyle w:val="SourceCode"/>
@@ -9802,18 +10001,18 @@
                 <wp:inline>
                   <wp:extent cx="4620126" cy="3696101"/>
                   <wp:effectExtent b="0" l="0" r="0" t="0"/>
-                  <wp:docPr descr="" title="" id="77" name="Picture"/>
+                  <wp:docPr descr="" title="" id="79" name="Picture"/>
                   <a:graphic>
                     <a:graphicData uri="http://schemas.openxmlformats.org/drawingml/2006/picture">
                       <pic:pic>
                         <pic:nvPicPr>
-                          <pic:cNvPr descr="exploratory-descriptive_files/figure-docx/unnamed-chunk-11-1.png" id="78" name="Picture"/>
+                          <pic:cNvPr descr="exploratory-descriptive_files/figure-docx/unnamed-chunk-11-1.png" id="80" name="Picture"/>
                           <pic:cNvPicPr>
                             <a:picLocks noChangeArrowheads="1" noChangeAspect="1"/>
                           </pic:cNvPicPr>
                         </pic:nvPicPr>
                         <pic:blipFill>
-                          <a:blip r:embed="rId76"/>
+                          <a:blip r:embed="rId78"/>
                           <a:stretch>
                             <a:fillRect/>
                           </a:stretch>
@@ -9853,12 +10052,12 @@
               <w:t xml:space="preserve">Figure 4: Bar chart of behavioral pattern in the WCGS dataset</w:t>
             </w:r>
           </w:p>
-          <w:bookmarkEnd w:id="79"/>
+          <w:bookmarkEnd w:id="81"/>
         </w:tc>
       </w:tr>
     </w:tbl>
-    <w:bookmarkEnd w:id="80"/>
-    <w:bookmarkStart w:id="86" w:name="normal-quantile-quantile-plots"/>
+    <w:bookmarkEnd w:id="82"/>
+    <w:bookmarkStart w:id="88" w:name="normal-quantile-quantile-plots"/>
     <w:p>
       <w:pPr>
         <w:pStyle w:val="Heading3"/>
@@ -9867,7 +10066,7 @@
         <w:t xml:space="preserve">3.5 Normal quantile-quantile plots</w:t>
       </w:r>
     </w:p>
-    <w:bookmarkStart w:id="81" w:name="def-qq-plot"/>
+    <w:bookmarkStart w:id="83" w:name="def-qq-plot"/>
     <w:p>
       <w:pPr>
         <w:pStyle w:val="FirstParagraph"/>
@@ -9877,7 +10076,7 @@
           <w:b/>
           <w:bCs/>
         </w:rPr>
-        <w:t xml:space="preserve">Definition 18 (Normal quantile-quantile plot)</w:t>
+        <w:t xml:space="preserve">Definition 19 (Normal quantile-quantile plot)</w:t>
       </w:r>
       <w:r>
         <w:t xml:space="preserve"> </w:t>
@@ -9907,7 +10106,7 @@
       <w:r>
         <w:t xml:space="preserve">(</w:t>
       </w:r>
-      <w:hyperlink r:id="rId32">
+      <w:hyperlink r:id="rId34">
         <w:r>
           <w:rPr>
             <w:rStyle w:val="Hyperlink"/>
@@ -9954,7 +10153,7 @@
         <w:t xml:space="preserve">.</w:t>
       </w:r>
     </w:p>
-    <w:bookmarkEnd w:id="81"/>
+    <w:bookmarkEnd w:id="83"/>
     <w:tbl>
       <w:tblPr>
         <w:tblStyle w:val="Table"/>
@@ -9968,7 +10167,7 @@
       <w:tr>
         <w:tc>
           <w:tcPr/>
-          <w:bookmarkStart w:id="85" w:name="fig-qq-chol"/>
+          <w:bookmarkStart w:id="87" w:name="fig-qq-chol"/>
           <w:p>
             <w:pPr>
               <w:pStyle w:val="SourceCode"/>
@@ -10239,18 +10438,18 @@
                 <wp:inline>
                   <wp:extent cx="4620126" cy="3696101"/>
                   <wp:effectExtent b="0" l="0" r="0" t="0"/>
-                  <wp:docPr descr="" title="" id="83" name="Picture"/>
+                  <wp:docPr descr="" title="" id="85" name="Picture"/>
                   <a:graphic>
                     <a:graphicData uri="http://schemas.openxmlformats.org/drawingml/2006/picture">
                       <pic:pic>
                         <pic:nvPicPr>
-                          <pic:cNvPr descr="exploratory-descriptive_files/figure-docx/unnamed-chunk-12-1.png" id="84" name="Picture"/>
+                          <pic:cNvPr descr="exploratory-descriptive_files/figure-docx/unnamed-chunk-12-1.png" id="86" name="Picture"/>
                           <pic:cNvPicPr>
                             <a:picLocks noChangeArrowheads="1" noChangeAspect="1"/>
                           </pic:cNvPicPr>
                         </pic:nvPicPr>
                         <pic:blipFill>
-                          <a:blip r:embed="rId82"/>
+                          <a:blip r:embed="rId84"/>
                           <a:stretch>
                             <a:fillRect/>
                           </a:stretch>
@@ -10290,7 +10489,7 @@
               <w:t xml:space="preserve">Figure 5: Normal Q-Q plot for total cholesterol in the WCGS dataset</w:t>
             </w:r>
           </w:p>
-          <w:bookmarkEnd w:id="85"/>
+          <w:bookmarkEnd w:id="87"/>
         </w:tc>
       </w:tr>
     </w:tbl>
@@ -10408,9 +10607,9 @@
         <w:t xml:space="preserve">covers boxplots.</w:t>
       </w:r>
     </w:p>
-    <w:bookmarkEnd w:id="86"/>
-    <w:bookmarkEnd w:id="87"/>
-    <w:bookmarkStart w:id="117" w:name="bivariate-relationships"/>
+    <w:bookmarkEnd w:id="88"/>
+    <w:bookmarkEnd w:id="89"/>
+    <w:bookmarkStart w:id="119" w:name="bivariate-relationships"/>
     <w:p>
       <w:pPr>
         <w:pStyle w:val="Heading2"/>
@@ -10419,7 +10618,7 @@
         <w:t xml:space="preserve">4 Bivariate relationships</w:t>
       </w:r>
     </w:p>
-    <w:bookmarkStart w:id="101" w:name="two-continuous-variables"/>
+    <w:bookmarkStart w:id="103" w:name="two-continuous-variables"/>
     <w:p>
       <w:pPr>
         <w:pStyle w:val="Heading3"/>
@@ -10428,7 +10627,7 @@
         <w:t xml:space="preserve">4.1 Two continuous variables</w:t>
       </w:r>
     </w:p>
-    <w:bookmarkStart w:id="88" w:name="def-scatterplot"/>
+    <w:bookmarkStart w:id="90" w:name="def-scatterplot"/>
     <w:p>
       <w:pPr>
         <w:pStyle w:val="FirstParagraph"/>
@@ -10438,7 +10637,7 @@
           <w:b/>
           <w:bCs/>
         </w:rPr>
-        <w:t xml:space="preserve">Definition 19 (Scatter plot)</w:t>
+        <w:t xml:space="preserve">Definition 20 (Scatter plot)</w:t>
       </w:r>
       <w:r>
         <w:t xml:space="preserve"> </w:t>
@@ -10492,7 +10691,7 @@
         <w:t xml:space="preserve">.</w:t>
       </w:r>
     </w:p>
-    <w:bookmarkEnd w:id="88"/>
+    <w:bookmarkEnd w:id="90"/>
     <w:tbl>
       <w:tblPr>
         <w:tblStyle w:val="Table"/>
@@ -10506,7 +10705,7 @@
       <w:tr>
         <w:tc>
           <w:tcPr/>
-          <w:bookmarkStart w:id="92" w:name="fig-scatter-chol-sbp"/>
+          <w:bookmarkStart w:id="94" w:name="fig-scatter-chol-sbp"/>
           <w:p>
             <w:pPr>
               <w:pStyle w:val="SourceCode"/>
@@ -10861,18 +11060,18 @@
                 <wp:inline>
                   <wp:extent cx="4620126" cy="3696101"/>
                   <wp:effectExtent b="0" l="0" r="0" t="0"/>
-                  <wp:docPr descr="" title="" id="90" name="Picture"/>
+                  <wp:docPr descr="" title="" id="92" name="Picture"/>
                   <a:graphic>
                     <a:graphicData uri="http://schemas.openxmlformats.org/drawingml/2006/picture">
                       <pic:pic>
                         <pic:nvPicPr>
-                          <pic:cNvPr descr="exploratory-descriptive_files/figure-docx/unnamed-chunk-13-1.png" id="91" name="Picture"/>
+                          <pic:cNvPr descr="exploratory-descriptive_files/figure-docx/unnamed-chunk-13-1.png" id="93" name="Picture"/>
                           <pic:cNvPicPr>
                             <a:picLocks noChangeArrowheads="1" noChangeAspect="1"/>
                           </pic:cNvPicPr>
                         </pic:nvPicPr>
                         <pic:blipFill>
-                          <a:blip r:embed="rId89"/>
+                          <a:blip r:embed="rId91"/>
                           <a:stretch>
                             <a:fillRect/>
                           </a:stretch>
@@ -10918,11 +11117,11 @@
               <w:t xml:space="preserve">with a least-squares line</w:t>
             </w:r>
           </w:p>
-          <w:bookmarkEnd w:id="92"/>
+          <w:bookmarkEnd w:id="94"/>
         </w:tc>
       </w:tr>
     </w:tbl>
-    <w:bookmarkStart w:id="93" w:name="def-pearson-r"/>
+    <w:bookmarkStart w:id="95" w:name="def-pearson-r"/>
     <w:p>
       <w:pPr>
         <w:pStyle w:val="BodyText"/>
@@ -10932,7 +11131,7 @@
           <w:b/>
           <w:bCs/>
         </w:rPr>
-        <w:t xml:space="preserve">Definition 20 (Pearson correlation coefficient)</w:t>
+        <w:t xml:space="preserve">Definition 21 (Pearson correlation coefficient)</w:t>
       </w:r>
       <w:r>
         <w:t xml:space="preserve"> </w:t>
@@ -11439,8 +11638,8 @@
         <w:t xml:space="preserve">.</w:t>
       </w:r>
     </w:p>
-    <w:bookmarkEnd w:id="93"/>
-    <w:bookmarkStart w:id="95" w:name="rem-pearson-r-estimates-population"/>
+    <w:bookmarkEnd w:id="95"/>
+    <w:bookmarkStart w:id="97" w:name="rem-pearson-r-estimates-population"/>
     <w:p>
       <w:pPr>
         <w:pStyle w:val="BodyText"/>
@@ -11461,7 +11660,7 @@
       <w:r>
         <w:t xml:space="preserve"> </w:t>
       </w:r>
-      <w:hyperlink r:id="rId94">
+      <w:hyperlink r:id="rId96">
         <w:r>
           <w:rPr>
             <w:rStyle w:val="Hyperlink"/>
@@ -11473,8 +11672,8 @@
         <w:t xml:space="preserve">.</w:t>
       </w:r>
     </w:p>
-    <w:bookmarkEnd w:id="95"/>
-    <w:bookmarkStart w:id="96" w:name="thm-pearson-r-range"/>
+    <w:bookmarkEnd w:id="97"/>
+    <w:bookmarkStart w:id="98" w:name="thm-pearson-r-range"/>
     <w:p>
       <w:pPr>
         <w:pStyle w:val="BodyText"/>
@@ -11645,7 +11844,7 @@
         <w:t xml:space="preserve">if and only if they lie on a straight line with negative slope.</w:t>
       </w:r>
     </w:p>
-    <w:bookmarkEnd w:id="96"/>
+    <w:bookmarkEnd w:id="98"/>
     <w:p>
       <w:pPr>
         <w:pStyle w:val="BodyText"/>
@@ -12789,7 +12988,7 @@
         <w:t xml:space="preserve">.</w:t>
       </w:r>
     </w:p>
-    <w:bookmarkStart w:id="97" w:name="exm-pearson-r"/>
+    <w:bookmarkStart w:id="99" w:name="exm-pearson-r"/>
     <w:p>
       <w:pPr>
         <w:pStyle w:val="BodyText"/>
@@ -12799,7 +12998,7 @@
           <w:b/>
           <w:bCs/>
         </w:rPr>
-        <w:t xml:space="preserve">Example 9 (Correlation between cholesterol and blood pressure in the WCGS)</w:t>
+        <w:t xml:space="preserve">Example 10 (Correlation between cholesterol and blood pressure in the WCGS)</w:t>
       </w:r>
       <w:r>
         <w:t xml:space="preserve"> </w:t>
@@ -12928,7 +13127,7 @@
         <w:t xml:space="preserve">.</w:t>
       </w:r>
     </w:p>
-    <w:bookmarkEnd w:id="97"/>
+    <w:bookmarkEnd w:id="99"/>
     <w:tbl>
       <w:tblPr>
         <w:tblStyle w:val="Table"/>
@@ -12970,18 +13169,18 @@
                 <wp:inline>
                   <wp:extent cx="152400" cy="152400"/>
                   <wp:effectExtent b="0" l="0" r="0" t="0"/>
-                  <wp:docPr descr="" title="" id="99" name="Picture"/>
+                  <wp:docPr descr="" title="" id="101" name="Picture"/>
                   <a:graphic>
                     <a:graphicData uri="http://schemas.openxmlformats.org/drawingml/2006/picture">
                       <pic:pic>
                         <pic:nvPicPr>
-                          <pic:cNvPr descr="/opt/quarto/share/formats/docx/caution.png" id="100" name="Picture"/>
+                          <pic:cNvPr descr="/opt/quarto/share/formats/docx/caution.png" id="102" name="Picture"/>
                           <pic:cNvPicPr>
                             <a:picLocks noChangeArrowheads="1" noChangeAspect="1"/>
                           </pic:cNvPicPr>
                         </pic:nvPicPr>
                         <pic:blipFill>
-                          <a:blip r:embed="rId98"/>
+                          <a:blip r:embed="rId100"/>
                           <a:stretch>
                             <a:fillRect/>
                           </a:stretch>
@@ -13251,8 +13450,8 @@
         <w:t xml:space="preserve">covers scatterplots.</w:t>
       </w:r>
     </w:p>
-    <w:bookmarkEnd w:id="101"/>
-    <w:bookmarkStart w:id="111" w:name="X276b94a7d03810956e9ce51874e5dad5aed6d75"/>
+    <w:bookmarkEnd w:id="103"/>
+    <w:bookmarkStart w:id="113" w:name="X276b94a7d03810956e9ce51874e5dad5aed6d75"/>
     <w:p>
       <w:pPr>
         <w:pStyle w:val="Heading3"/>
@@ -13339,7 +13538,7 @@
       <w:tr>
         <w:tc>
           <w:tcPr/>
-          <w:bookmarkStart w:id="105" w:name="fig-box-chol-by-smoke"/>
+          <w:bookmarkStart w:id="107" w:name="fig-box-chol-by-smoke"/>
           <w:p>
             <w:pPr>
               <w:pStyle w:val="SourceCode"/>
@@ -13634,18 +13833,18 @@
                 <wp:inline>
                   <wp:extent cx="4620126" cy="3696101"/>
                   <wp:effectExtent b="0" l="0" r="0" t="0"/>
-                  <wp:docPr descr="" title="" id="103" name="Picture"/>
+                  <wp:docPr descr="" title="" id="105" name="Picture"/>
                   <a:graphic>
                     <a:graphicData uri="http://schemas.openxmlformats.org/drawingml/2006/picture">
                       <pic:pic>
                         <pic:nvPicPr>
-                          <pic:cNvPr descr="exploratory-descriptive_files/figure-docx/unnamed-chunk-14-1.png" id="104" name="Picture"/>
+                          <pic:cNvPr descr="exploratory-descriptive_files/figure-docx/unnamed-chunk-14-1.png" id="106" name="Picture"/>
                           <pic:cNvPicPr>
                             <a:picLocks noChangeArrowheads="1" noChangeAspect="1"/>
                           </pic:cNvPicPr>
                         </pic:nvPicPr>
                         <pic:blipFill>
-                          <a:blip r:embed="rId102"/>
+                          <a:blip r:embed="rId104"/>
                           <a:stretch>
                             <a:fillRect/>
                           </a:stretch>
@@ -13685,7 +13884,7 @@
               <w:t xml:space="preserve">Figure 7: Box plots of cholesterol by smoking status in the WCGS dataset</w:t>
             </w:r>
           </w:p>
-          <w:bookmarkEnd w:id="105"/>
+          <w:bookmarkEnd w:id="107"/>
         </w:tc>
       </w:tr>
     </w:tbl>
@@ -13703,7 +13902,7 @@
       <w:tr>
         <w:tc>
           <w:tcPr/>
-          <w:bookmarkStart w:id="109" w:name="fig-box-chol-by-behpat"/>
+          <w:bookmarkStart w:id="111" w:name="fig-box-chol-by-behpat"/>
           <w:p>
             <w:pPr>
               <w:pStyle w:val="SourceCode"/>
@@ -13998,18 +14197,18 @@
                 <wp:inline>
                   <wp:extent cx="4620126" cy="3696101"/>
                   <wp:effectExtent b="0" l="0" r="0" t="0"/>
-                  <wp:docPr descr="" title="" id="107" name="Picture"/>
+                  <wp:docPr descr="" title="" id="109" name="Picture"/>
                   <a:graphic>
                     <a:graphicData uri="http://schemas.openxmlformats.org/drawingml/2006/picture">
                       <pic:pic>
                         <pic:nvPicPr>
-                          <pic:cNvPr descr="exploratory-descriptive_files/figure-docx/unnamed-chunk-15-1.png" id="108" name="Picture"/>
+                          <pic:cNvPr descr="exploratory-descriptive_files/figure-docx/unnamed-chunk-15-1.png" id="110" name="Picture"/>
                           <pic:cNvPicPr>
                             <a:picLocks noChangeArrowheads="1" noChangeAspect="1"/>
                           </pic:cNvPicPr>
                         </pic:nvPicPr>
                         <pic:blipFill>
-                          <a:blip r:embed="rId106"/>
+                          <a:blip r:embed="rId108"/>
                           <a:stretch>
                             <a:fillRect/>
                           </a:stretch>
@@ -14049,7 +14248,7 @@
               <w:t xml:space="preserve">Figure 8: Box plots of cholesterol by behavioral pattern in the WCGS dataset</w:t>
             </w:r>
           </w:p>
-          <w:bookmarkEnd w:id="109"/>
+          <w:bookmarkEnd w:id="111"/>
         </w:tc>
       </w:tr>
     </w:tbl>
@@ -14085,7 +14284,7 @@
       <w:tr>
         <w:tc>
           <w:tcPr/>
-          <w:bookmarkStart w:id="110" w:name="tbl-chol-by-chd"/>
+          <w:bookmarkStart w:id="112" w:name="tbl-chol-by-chd"/>
           <w:p>
             <w:pPr>
               <w:jc w:val="center"/>
@@ -15026,12 +15225,12 @@
               </w:tc>
             </w:tr>
           </w:tbl>
-          <w:bookmarkEnd w:id="110"/>
+          <w:bookmarkEnd w:id="112"/>
         </w:tc>
       </w:tr>
     </w:tbl>
-    <w:bookmarkEnd w:id="111"/>
-    <w:bookmarkStart w:id="116" w:name="two-categorical-variables"/>
+    <w:bookmarkEnd w:id="113"/>
+    <w:bookmarkStart w:id="118" w:name="two-categorical-variables"/>
     <w:p>
       <w:pPr>
         <w:pStyle w:val="Heading3"/>
@@ -15040,7 +15239,7 @@
         <w:t xml:space="preserve">4.3 Two categorical variables</w:t>
       </w:r>
     </w:p>
-    <w:bookmarkStart w:id="113" w:name="def-contingency-table"/>
+    <w:bookmarkStart w:id="115" w:name="def-contingency-table"/>
     <w:p>
       <w:pPr>
         <w:pStyle w:val="FirstParagraph"/>
@@ -15050,7 +15249,7 @@
           <w:b/>
           <w:bCs/>
         </w:rPr>
-        <w:t xml:space="preserve">Definition 21 (Contingency table (cross-tabulation))</w:t>
+        <w:t xml:space="preserve">Definition 22 (Contingency table (cross-tabulation))</w:t>
       </w:r>
       <w:r>
         <w:t xml:space="preserve"> </w:t>
@@ -15096,7 +15295,7 @@
       <w:r>
         <w:t xml:space="preserve"> </w:t>
       </w:r>
-      <w:hyperlink r:id="rId112">
+      <w:hyperlink r:id="rId114">
         <w:r>
           <w:rPr>
             <w:rStyle w:val="Hyperlink"/>
@@ -15500,8 +15699,8 @@
         <w:t xml:space="preserve">.</w:t>
       </w:r>
     </w:p>
-    <w:bookmarkEnd w:id="113"/>
-    <w:bookmarkStart w:id="115" w:name="exm-contingency-table"/>
+    <w:bookmarkEnd w:id="115"/>
+    <w:bookmarkStart w:id="117" w:name="exm-contingency-table"/>
     <w:p>
       <w:pPr>
         <w:pStyle w:val="BodyText"/>
@@ -15511,7 +15710,7 @@
           <w:b/>
           <w:bCs/>
         </w:rPr>
-        <w:t xml:space="preserve">Example 10 (Smoking and CHD in the WCGS)</w:t>
+        <w:t xml:space="preserve">Example 11 (Smoking and CHD in the WCGS)</w:t>
       </w:r>
       <w:r>
         <w:t xml:space="preserve"> </w:t>
@@ -15825,7 +16024,7 @@
       <w:tr>
         <w:tc>
           <w:tcPr/>
-          <w:bookmarkStart w:id="114" w:name="tbl-gtsummary-smoke-chd"/>
+          <w:bookmarkStart w:id="116" w:name="tbl-gtsummary-smoke-chd"/>
           <w:p>
             <w:pPr>
               <w:jc w:val="center"/>
@@ -16298,14 +16497,14 @@
               </w:tc>
             </w:tr>
           </w:tbl>
-          <w:bookmarkEnd w:id="114"/>
+          <w:bookmarkEnd w:id="116"/>
         </w:tc>
       </w:tr>
     </w:tbl>
-    <w:bookmarkEnd w:id="115"/>
-    <w:bookmarkEnd w:id="116"/>
     <w:bookmarkEnd w:id="117"/>
-    <w:bookmarkStart w:id="139" w:name="data-transformations"/>
+    <w:bookmarkEnd w:id="118"/>
+    <w:bookmarkEnd w:id="119"/>
+    <w:bookmarkStart w:id="141" w:name="data-transformations"/>
     <w:p>
       <w:pPr>
         <w:pStyle w:val="Heading2"/>
@@ -16614,7 +16813,7 @@
         <w:t xml:space="preserve">.</w:t>
       </w:r>
     </w:p>
-    <w:bookmarkStart w:id="126" w:name="fig-hist-sbp-log"/>
+    <w:bookmarkStart w:id="128" w:name="fig-hist-sbp-log"/>
     <w:tbl>
       <w:tblPr>
         <w:tblStyle w:val="Table"/>
@@ -16642,7 +16841,7 @@
             <w:tr>
               <w:tc>
                 <w:tcPr/>
-                <w:bookmarkStart w:id="121" w:name="fig-hist-sbp-raw"/>
+                <w:bookmarkStart w:id="123" w:name="fig-hist-sbp-raw"/>
                 <w:p>
                   <w:pPr>
                     <w:pStyle w:val="SourceCode"/>
@@ -16930,18 +17129,18 @@
                       <wp:inline>
                         <wp:extent cx="2971800" cy="2377440"/>
                         <wp:effectExtent b="0" l="0" r="0" t="0"/>
-                        <wp:docPr descr="" title="" id="119" name="Picture"/>
+                        <wp:docPr descr="" title="" id="121" name="Picture"/>
                         <a:graphic>
                           <a:graphicData uri="http://schemas.openxmlformats.org/drawingml/2006/picture">
                             <pic:pic>
                               <pic:nvPicPr>
-                                <pic:cNvPr descr="exploratory-descriptive_files/figure-docx/unnamed-chunk-18-1.png" id="120" name="Picture"/>
+                                <pic:cNvPr descr="exploratory-descriptive_files/figure-docx/unnamed-chunk-18-1.png" id="122" name="Picture"/>
                                 <pic:cNvPicPr>
                                   <a:picLocks noChangeArrowheads="1" noChangeAspect="1"/>
                                 </pic:cNvPicPr>
                               </pic:nvPicPr>
                               <pic:blipFill>
-                                <a:blip r:embed="rId118"/>
+                                <a:blip r:embed="rId120"/>
                                 <a:stretch>
                                   <a:fillRect/>
                                 </a:stretch>
@@ -16982,7 +17181,7 @@
                     <w:t xml:space="preserve">(a) Raw scale</w:t>
                   </w:r>
                 </w:p>
-                <w:bookmarkEnd w:id="121"/>
+                <w:bookmarkEnd w:id="123"/>
               </w:tc>
             </w:tr>
           </w:tbl>
@@ -17032,7 +17231,7 @@
             <w:tr>
               <w:tc>
                 <w:tcPr/>
-                <w:bookmarkStart w:id="125" w:name="fig-hist-sbp-logscale"/>
+                <w:bookmarkStart w:id="127" w:name="fig-hist-sbp-logscale"/>
                 <w:p>
                   <w:pPr>
                     <w:pStyle w:val="SourceCode"/>
@@ -17413,18 +17612,18 @@
                       <wp:inline>
                         <wp:extent cx="2971800" cy="2377440"/>
                         <wp:effectExtent b="0" l="0" r="0" t="0"/>
-                        <wp:docPr descr="" title="" id="123" name="Picture"/>
+                        <wp:docPr descr="" title="" id="125" name="Picture"/>
                         <a:graphic>
                           <a:graphicData uri="http://schemas.openxmlformats.org/drawingml/2006/picture">
                             <pic:pic>
                               <pic:nvPicPr>
-                                <pic:cNvPr descr="exploratory-descriptive_files/figure-docx/unnamed-chunk-19-1.png" id="124" name="Picture"/>
+                                <pic:cNvPr descr="exploratory-descriptive_files/figure-docx/unnamed-chunk-19-1.png" id="126" name="Picture"/>
                                 <pic:cNvPicPr>
                                   <a:picLocks noChangeArrowheads="1" noChangeAspect="1"/>
                                 </pic:cNvPicPr>
                               </pic:nvPicPr>
                               <pic:blipFill>
-                                <a:blip r:embed="rId122"/>
+                                <a:blip r:embed="rId124"/>
                                 <a:stretch>
                                   <a:fillRect/>
                                 </a:stretch>
@@ -17465,7 +17664,7 @@
                     <w:t xml:space="preserve">(b) Log scale</w:t>
                   </w:r>
                 </w:p>
-                <w:bookmarkEnd w:id="125"/>
+                <w:bookmarkEnd w:id="127"/>
               </w:tc>
             </w:tr>
           </w:tbl>
@@ -17515,7 +17714,7 @@
         <w:t xml:space="preserve">.</w:t>
       </w:r>
     </w:p>
-    <w:bookmarkEnd w:id="126"/>
+    <w:bookmarkEnd w:id="128"/>
     <w:p>
       <w:pPr>
         <w:pStyle w:val="SourceCode"/>
@@ -17904,7 +18103,7 @@
         <w:t xml:space="preserve">the assumptions of that model and on the scientific question.</w:t>
       </w:r>
     </w:p>
-    <w:bookmarkStart w:id="138" w:name="sec-rescaling"/>
+    <w:bookmarkStart w:id="140" w:name="sec-rescaling"/>
     <w:p>
       <w:pPr>
         <w:pStyle w:val="Heading3"/>
@@ -17913,7 +18112,7 @@
         <w:t xml:space="preserve">5.1 Rescaling a variable</w:t>
       </w:r>
     </w:p>
-    <w:bookmarkStart w:id="127" w:name="exr-standardize"/>
+    <w:bookmarkStart w:id="129" w:name="exr-standardize"/>
     <w:p>
       <w:pPr>
         <w:pStyle w:val="FirstParagraph"/>
@@ -18022,8 +18221,8 @@
         <w:t xml:space="preserve">What are the units of your answer to part 2?</w:t>
       </w:r>
     </w:p>
-    <w:bookmarkEnd w:id="127"/>
-    <w:bookmarkStart w:id="128" w:name="sol-standardize"/>
+    <w:bookmarkEnd w:id="129"/>
+    <w:bookmarkStart w:id="130" w:name="sol-standardize"/>
     <w:p>
       <w:pPr>
         <w:pStyle w:val="FirstParagraph"/>
@@ -18407,8 +18606,8 @@
         <w:t xml:space="preserve">so the answer has no units.</w:t>
       </w:r>
     </w:p>
-    <w:bookmarkEnd w:id="128"/>
-    <w:bookmarkStart w:id="129" w:name="def-standardization"/>
+    <w:bookmarkEnd w:id="130"/>
+    <w:bookmarkStart w:id="131" w:name="def-standardization"/>
     <w:p>
       <w:pPr>
         <w:pStyle w:val="FirstParagraph"/>
@@ -18418,7 +18617,7 @@
           <w:b/>
           <w:bCs/>
         </w:rPr>
-        <w:t xml:space="preserve">Definition 22 (Standardization (z-scoring, standard scaling))</w:t>
+        <w:t xml:space="preserve">Definition 23 (Standardization (z-scoring, standard scaling))</w:t>
       </w:r>
       <w:r>
         <w:t xml:space="preserve"> </w:t>
@@ -18754,8 +18953,8 @@
         <w:t xml:space="preserve">.</w:t>
       </w:r>
     </w:p>
-    <w:bookmarkEnd w:id="129"/>
-    <w:bookmarkStart w:id="130" w:name="rem-source-standardization"/>
+    <w:bookmarkEnd w:id="131"/>
+    <w:bookmarkStart w:id="132" w:name="rem-source-standardization"/>
     <w:p>
       <w:pPr>
         <w:pStyle w:val="BodyText"/>
@@ -18804,8 +19003,8 @@
         <w:t xml:space="preserve">.</w:t>
       </w:r>
     </w:p>
-    <w:bookmarkEnd w:id="130"/>
-    <w:bookmarkStart w:id="131" w:name="rem-standardization-units"/>
+    <w:bookmarkEnd w:id="132"/>
+    <w:bookmarkStart w:id="133" w:name="rem-standardization-units"/>
     <w:p>
       <w:pPr>
         <w:pStyle w:val="BodyText"/>
@@ -18880,8 +19079,8 @@
         <w:t xml:space="preserve">both become unitless numbers of standard deviations.</w:t>
       </w:r>
     </w:p>
-    <w:bookmarkEnd w:id="131"/>
-    <w:bookmarkStart w:id="132" w:name="thm-standardized-mean-sd"/>
+    <w:bookmarkEnd w:id="133"/>
+    <w:bookmarkStart w:id="134" w:name="thm-standardized-mean-sd"/>
     <w:p>
       <w:pPr>
         <w:pStyle w:val="BodyText"/>
@@ -19038,7 +19237,7 @@
         <w:t xml:space="preserve">.</w:t>
       </w:r>
     </w:p>
-    <w:bookmarkEnd w:id="132"/>
+    <w:bookmarkEnd w:id="134"/>
     <w:p>
       <w:pPr>
         <w:pStyle w:val="BodyText"/>
@@ -19751,7 +19950,7 @@
         <w:t xml:space="preserve">.</w:t>
       </w:r>
     </w:p>
-    <w:bookmarkStart w:id="133" w:name="rem-source-standardized-mean-sd"/>
+    <w:bookmarkStart w:id="135" w:name="rem-source-standardized-mean-sd"/>
     <w:p>
       <w:pPr>
         <w:pStyle w:val="BodyText"/>
@@ -19785,8 +19984,8 @@
         <w:t xml:space="preserve">the proof is the elementary calculation.</w:t>
       </w:r>
     </w:p>
-    <w:bookmarkEnd w:id="133"/>
-    <w:bookmarkStart w:id="134" w:name="exm-scale-wcgs"/>
+    <w:bookmarkEnd w:id="135"/>
+    <w:bookmarkStart w:id="136" w:name="exm-scale-wcgs"/>
     <w:p>
       <w:pPr>
         <w:pStyle w:val="BodyText"/>
@@ -19796,7 +19995,7 @@
           <w:b/>
           <w:bCs/>
         </w:rPr>
-        <w:t xml:space="preserve">Example 11 (Standardizing cholesterol in R)</w:t>
+        <w:t xml:space="preserve">Example 12 (Standardizing cholesterol in R)</w:t>
       </w:r>
       <w:r>
         <w:t xml:space="preserve"> </w:t>
@@ -20064,8 +20263,8 @@
         <w:t xml:space="preserve">is needed because 12 of the cholesterol values are missing.</w:t>
       </w:r>
     </w:p>
-    <w:bookmarkEnd w:id="134"/>
-    <w:bookmarkStart w:id="135" w:name="def-min-max-scaling"/>
+    <w:bookmarkEnd w:id="136"/>
+    <w:bookmarkStart w:id="137" w:name="def-min-max-scaling"/>
     <w:p>
       <w:pPr>
         <w:pStyle w:val="BodyText"/>
@@ -20075,7 +20274,7 @@
           <w:b/>
           <w:bCs/>
         </w:rPr>
-        <w:t xml:space="preserve">Definition 23 (Min-max scaling)</w:t>
+        <w:t xml:space="preserve">Definition 24 (Min-max scaling)</w:t>
       </w:r>
       <w:r>
         <w:t xml:space="preserve"> </w:t>
@@ -20374,8 +20573,8 @@
         <w:t xml:space="preserve">.</w:t>
       </w:r>
     </w:p>
-    <w:bookmarkEnd w:id="135"/>
-    <w:bookmarkStart w:id="136" w:name="rem-min-max-outliers"/>
+    <w:bookmarkEnd w:id="137"/>
+    <w:bookmarkStart w:id="138" w:name="rem-min-max-outliers"/>
     <w:p>
       <w:pPr>
         <w:pStyle w:val="BodyText"/>
@@ -20581,8 +20780,8 @@
         <w:t xml:space="preserve">.</w:t>
       </w:r>
     </w:p>
-    <w:bookmarkEnd w:id="136"/>
-    <w:bookmarkStart w:id="137" w:name="exm-min-max-wcgs"/>
+    <w:bookmarkEnd w:id="138"/>
+    <w:bookmarkStart w:id="139" w:name="exm-min-max-wcgs"/>
     <w:p>
       <w:pPr>
         <w:pStyle w:val="BodyText"/>
@@ -20592,7 +20791,7 @@
           <w:b/>
           <w:bCs/>
         </w:rPr>
-        <w:t xml:space="preserve">Example 12 (Min-max scaling of cholesterol in the WCGS)</w:t>
+        <w:t xml:space="preserve">Example 13 (Min-max scaling of cholesterol in the WCGS)</w:t>
       </w:r>
       <w:r>
         <w:t xml:space="preserve"> </w:t>
@@ -20821,10 +21020,10 @@
         <w:t xml:space="preserve">but have no units.</w:t>
       </w:r>
     </w:p>
-    <w:bookmarkEnd w:id="137"/>
-    <w:bookmarkEnd w:id="138"/>
     <w:bookmarkEnd w:id="139"/>
-    <w:bookmarkStart w:id="141" w:name="an-exploratory-data-analysis-workflow"/>
+    <w:bookmarkEnd w:id="140"/>
+    <w:bookmarkEnd w:id="141"/>
+    <w:bookmarkStart w:id="143" w:name="an-exploratory-data-analysis-workflow"/>
     <w:p>
       <w:pPr>
         <w:pStyle w:val="Heading2"/>
@@ -21052,7 +21251,7 @@
       <w:tr>
         <w:tc>
           <w:tcPr/>
-          <w:bookmarkStart w:id="140" w:name="tbl-wcgs-all-summary"/>
+          <w:bookmarkStart w:id="142" w:name="tbl-wcgs-all-summary"/>
           <w:p>
             <w:pPr>
               <w:jc w:val="center"/>
@@ -22233,12 +22432,12 @@
               </w:tc>
             </w:tr>
           </w:tbl>
-          <w:bookmarkEnd w:id="140"/>
+          <w:bookmarkEnd w:id="142"/>
         </w:tc>
       </w:tr>
     </w:tbl>
-    <w:bookmarkEnd w:id="141"/>
-    <w:bookmarkStart w:id="145" w:name="further-reading"/>
+    <w:bookmarkEnd w:id="143"/>
+    <w:bookmarkStart w:id="147" w:name="further-reading"/>
     <w:p>
       <w:pPr>
         <w:pStyle w:val="Heading2"/>
@@ -22251,7 +22450,7 @@
       <w:pPr>
         <w:pStyle w:val="FirstParagraph"/>
       </w:pPr>
-      <w:hyperlink r:id="rId142">
+      <w:hyperlink r:id="rId144">
         <w:r>
           <w:rPr>
             <w:rStyle w:val="Hyperlink"/>
@@ -22268,7 +22467,7 @@
       <w:r>
         <w:t xml:space="preserve"> </w:t>
       </w:r>
-      <w:hyperlink r:id="rId67">
+      <w:hyperlink r:id="rId69">
         <w:r>
           <w:rPr>
             <w:rStyle w:val="Hyperlink"/>
@@ -22291,7 +22490,7 @@
       <w:r>
         <w:t xml:space="preserve"> </w:t>
       </w:r>
-      <w:hyperlink r:id="rId143">
+      <w:hyperlink r:id="rId145">
         <w:r>
           <w:rPr>
             <w:rStyle w:val="Hyperlink"/>
@@ -22314,7 +22513,7 @@
       <w:r>
         <w:t xml:space="preserve"> </w:t>
       </w:r>
-      <w:hyperlink r:id="rId144">
+      <w:hyperlink r:id="rId146">
         <w:r>
           <w:rPr>
             <w:rStyle w:val="Hyperlink"/>
@@ -22329,8 +22528,8 @@
         <w:t xml:space="preserve">of the WCGS data, in R and Python.</w:t>
       </w:r>
     </w:p>
-    <w:bookmarkEnd w:id="145"/>
-    <w:bookmarkStart w:id="190" w:name="references"/>
+    <w:bookmarkEnd w:id="147"/>
+    <w:bookmarkStart w:id="192" w:name="references"/>
     <w:p>
       <w:pPr>
         <w:pStyle w:val="Heading2"/>
@@ -22339,8 +22538,8 @@
         <w:t xml:space="preserve">References</w:t>
       </w:r>
     </w:p>
-    <w:bookmarkStart w:id="189" w:name="refs"/>
-    <w:bookmarkStart w:id="147" w:name="ref-vittinghoff2e"/>
+    <w:bookmarkStart w:id="191" w:name="refs"/>
+    <w:bookmarkStart w:id="149" w:name="ref-vittinghoff2e"/>
     <w:p>
       <w:pPr>
         <w:pStyle w:val="Bibliography"/>
@@ -22373,7 +22572,7 @@
       <w:r>
         <w:t xml:space="preserve"> </w:t>
       </w:r>
-      <w:hyperlink r:id="rId146">
+      <w:hyperlink r:id="rId148">
         <w:r>
           <w:rPr>
             <w:rStyle w:val="Hyperlink"/>
@@ -22385,8 +22584,8 @@
         <w:t xml:space="preserve">.</w:t>
       </w:r>
     </w:p>
-    <w:bookmarkEnd w:id="147"/>
-    <w:bookmarkStart w:id="149" w:name="ref-rosenman1975coronary"/>
+    <w:bookmarkEnd w:id="149"/>
+    <w:bookmarkStart w:id="151" w:name="ref-rosenman1975coronary"/>
     <w:p>
       <w:pPr>
         <w:pStyle w:val="Bibliography"/>
@@ -22434,7 +22633,7 @@
       <w:r>
         <w:t xml:space="preserve"> </w:t>
       </w:r>
-      <w:hyperlink r:id="rId148">
+      <w:hyperlink r:id="rId150">
         <w:r>
           <w:rPr>
             <w:rStyle w:val="Hyperlink"/>
@@ -22446,8 +22645,8 @@
         <w:t xml:space="preserve">.</w:t>
       </w:r>
     </w:p>
-    <w:bookmarkEnd w:id="149"/>
-    <w:bookmarkStart w:id="151" w:name="ref-wikipedia_statistical_population"/>
+    <w:bookmarkEnd w:id="151"/>
+    <w:bookmarkStart w:id="153" w:name="ref-wikipedia_statistical_population"/>
     <w:p>
       <w:pPr>
         <w:pStyle w:val="Bibliography"/>
@@ -22494,7 +22693,7 @@
       <w:r>
         <w:t xml:space="preserve"> </w:t>
       </w:r>
-      <w:hyperlink r:id="rId150">
+      <w:hyperlink r:id="rId152">
         <w:r>
           <w:rPr>
             <w:rStyle w:val="Hyperlink"/>
@@ -22503,8 +22702,8 @@
         </w:r>
       </w:hyperlink>
     </w:p>
-    <w:bookmarkEnd w:id="151"/>
-    <w:bookmarkStart w:id="153" w:name="ref-wikipedia_simple_random_sample"/>
+    <w:bookmarkEnd w:id="153"/>
+    <w:bookmarkStart w:id="155" w:name="ref-wikipedia_simple_random_sample"/>
     <w:p>
       <w:pPr>
         <w:pStyle w:val="Bibliography"/>
@@ -22551,7 +22750,7 @@
       <w:r>
         <w:t xml:space="preserve"> </w:t>
       </w:r>
-      <w:hyperlink r:id="rId152">
+      <w:hyperlink r:id="rId154">
         <w:r>
           <w:rPr>
             <w:rStyle w:val="Hyperlink"/>
@@ -22560,8 +22759,8 @@
         </w:r>
       </w:hyperlink>
     </w:p>
-    <w:bookmarkEnd w:id="153"/>
-    <w:bookmarkStart w:id="155" w:name="ref-wikipedia_median"/>
+    <w:bookmarkEnd w:id="155"/>
+    <w:bookmarkStart w:id="157" w:name="ref-wikipedia_median"/>
     <w:p>
       <w:pPr>
         <w:pStyle w:val="Bibliography"/>
@@ -22608,7 +22807,7 @@
       <w:r>
         <w:t xml:space="preserve"> </w:t>
       </w:r>
-      <w:hyperlink r:id="rId154">
+      <w:hyperlink r:id="rId156">
         <w:r>
           <w:rPr>
             <w:rStyle w:val="Hyperlink"/>
@@ -22617,8 +22816,8 @@
         </w:r>
       </w:hyperlink>
     </w:p>
-    <w:bookmarkEnd w:id="155"/>
-    <w:bookmarkStart w:id="157" w:name="ref-wikipedia_variance"/>
+    <w:bookmarkEnd w:id="157"/>
+    <w:bookmarkStart w:id="159" w:name="ref-wikipedia_variance"/>
     <w:p>
       <w:pPr>
         <w:pStyle w:val="Bibliography"/>
@@ -22665,7 +22864,7 @@
       <w:r>
         <w:t xml:space="preserve"> </w:t>
       </w:r>
-      <w:hyperlink r:id="rId156">
+      <w:hyperlink r:id="rId158">
         <w:r>
           <w:rPr>
             <w:rStyle w:val="Hyperlink"/>
@@ -22674,8 +22873,8 @@
         </w:r>
       </w:hyperlink>
     </w:p>
-    <w:bookmarkEnd w:id="157"/>
-    <w:bookmarkStart w:id="159" w:name="ref-wikipedia_standard_deviation"/>
+    <w:bookmarkEnd w:id="159"/>
+    <w:bookmarkStart w:id="161" w:name="ref-wikipedia_standard_deviation"/>
     <w:p>
       <w:pPr>
         <w:pStyle w:val="Bibliography"/>
@@ -22722,7 +22921,7 @@
       <w:r>
         <w:t xml:space="preserve"> </w:t>
       </w:r>
-      <w:hyperlink r:id="rId158">
+      <w:hyperlink r:id="rId160">
         <w:r>
           <w:rPr>
             <w:rStyle w:val="Hyperlink"/>
@@ -22731,8 +22930,8 @@
         </w:r>
       </w:hyperlink>
     </w:p>
-    <w:bookmarkEnd w:id="159"/>
-    <w:bookmarkStart w:id="161" w:name="ref-wikipedia_quartile"/>
+    <w:bookmarkEnd w:id="161"/>
+    <w:bookmarkStart w:id="163" w:name="ref-wikipedia_quartile"/>
     <w:p>
       <w:pPr>
         <w:pStyle w:val="Bibliography"/>
@@ -22779,7 +22978,7 @@
       <w:r>
         <w:t xml:space="preserve"> </w:t>
       </w:r>
-      <w:hyperlink r:id="rId160">
+      <w:hyperlink r:id="rId162">
         <w:r>
           <w:rPr>
             <w:rStyle w:val="Hyperlink"/>
@@ -22788,8 +22987,8 @@
         </w:r>
       </w:hyperlink>
     </w:p>
-    <w:bookmarkEnd w:id="161"/>
-    <w:bookmarkStart w:id="163" w:name="ref-wikipedia_interquartile_range"/>
+    <w:bookmarkEnd w:id="163"/>
+    <w:bookmarkStart w:id="165" w:name="ref-wikipedia_interquartile_range"/>
     <w:p>
       <w:pPr>
         <w:pStyle w:val="Bibliography"/>
@@ -22836,7 +23035,7 @@
       <w:r>
         <w:t xml:space="preserve"> </w:t>
       </w:r>
-      <w:hyperlink r:id="rId162">
+      <w:hyperlink r:id="rId164">
         <w:r>
           <w:rPr>
             <w:rStyle w:val="Hyperlink"/>
@@ -22845,8 +23044,8 @@
         </w:r>
       </w:hyperlink>
     </w:p>
-    <w:bookmarkEnd w:id="163"/>
-    <w:bookmarkStart w:id="164" w:name="ref-hoggtanis2015"/>
+    <w:bookmarkEnd w:id="165"/>
+    <w:bookmarkStart w:id="166" w:name="ref-hoggtanis2015"/>
     <w:p>
       <w:pPr>
         <w:pStyle w:val="Bibliography"/>
@@ -22877,8 +23076,8 @@
         <w:t xml:space="preserve">, Tenth edition. Boston: Pearson, 2019.</w:t>
       </w:r>
     </w:p>
-    <w:bookmarkEnd w:id="164"/>
-    <w:bookmarkStart w:id="165" w:name="ref-rice2007mathematical"/>
+    <w:bookmarkEnd w:id="166"/>
+    <w:bookmarkStart w:id="167" w:name="ref-rice2007mathematical"/>
     <w:p>
       <w:pPr>
         <w:pStyle w:val="Bibliography"/>
@@ -22909,8 +23108,8 @@
         <w:t xml:space="preserve">, 3rd ed. Belmont, CA: Cengage Learning, 2007.</w:t>
       </w:r>
     </w:p>
-    <w:bookmarkEnd w:id="165"/>
-    <w:bookmarkStart w:id="167" w:name="ref-wikipedia_histogram"/>
+    <w:bookmarkEnd w:id="167"/>
+    <w:bookmarkStart w:id="169" w:name="ref-wikipedia_histogram"/>
     <w:p>
       <w:pPr>
         <w:pStyle w:val="Bibliography"/>
@@ -22957,7 +23156,7 @@
       <w:r>
         <w:t xml:space="preserve"> </w:t>
       </w:r>
-      <w:hyperlink r:id="rId166">
+      <w:hyperlink r:id="rId168">
         <w:r>
           <w:rPr>
             <w:rStyle w:val="Hyperlink"/>
@@ -22966,8 +23165,8 @@
         </w:r>
       </w:hyperlink>
     </w:p>
-    <w:bookmarkEnd w:id="167"/>
-    <w:bookmarkStart w:id="169" w:name="ref-wikipedia_kernel_density_estimation"/>
+    <w:bookmarkEnd w:id="169"/>
+    <w:bookmarkStart w:id="171" w:name="ref-wikipedia_kernel_density_estimation"/>
     <w:p>
       <w:pPr>
         <w:pStyle w:val="Bibliography"/>
@@ -23014,7 +23213,7 @@
       <w:r>
         <w:t xml:space="preserve"> </w:t>
       </w:r>
-      <w:hyperlink r:id="rId168">
+      <w:hyperlink r:id="rId170">
         <w:r>
           <w:rPr>
             <w:rStyle w:val="Hyperlink"/>
@@ -23023,8 +23222,8 @@
         </w:r>
       </w:hyperlink>
     </w:p>
-    <w:bookmarkEnd w:id="169"/>
-    <w:bookmarkStart w:id="171" w:name="ref-wikipedia_box_plot"/>
+    <w:bookmarkEnd w:id="171"/>
+    <w:bookmarkStart w:id="173" w:name="ref-wikipedia_box_plot"/>
     <w:p>
       <w:pPr>
         <w:pStyle w:val="Bibliography"/>
@@ -23071,7 +23270,7 @@
       <w:r>
         <w:t xml:space="preserve"> </w:t>
       </w:r>
-      <w:hyperlink r:id="rId170">
+      <w:hyperlink r:id="rId172">
         <w:r>
           <w:rPr>
             <w:rStyle w:val="Hyperlink"/>
@@ -23080,8 +23279,8 @@
         </w:r>
       </w:hyperlink>
     </w:p>
-    <w:bookmarkEnd w:id="171"/>
-    <w:bookmarkStart w:id="173" w:name="ref-wikipedia_bar_chart"/>
+    <w:bookmarkEnd w:id="173"/>
+    <w:bookmarkStart w:id="175" w:name="ref-wikipedia_bar_chart"/>
     <w:p>
       <w:pPr>
         <w:pStyle w:val="Bibliography"/>
@@ -23128,7 +23327,7 @@
       <w:r>
         <w:t xml:space="preserve"> </w:t>
       </w:r>
-      <w:hyperlink r:id="rId172">
+      <w:hyperlink r:id="rId174">
         <w:r>
           <w:rPr>
             <w:rStyle w:val="Hyperlink"/>
@@ -23137,8 +23336,8 @@
         </w:r>
       </w:hyperlink>
     </w:p>
-    <w:bookmarkEnd w:id="173"/>
-    <w:bookmarkStart w:id="175" w:name="ref-wikipedia_q_q_plot"/>
+    <w:bookmarkEnd w:id="175"/>
+    <w:bookmarkStart w:id="177" w:name="ref-wikipedia_q_q_plot"/>
     <w:p>
       <w:pPr>
         <w:pStyle w:val="Bibliography"/>
@@ -23185,7 +23384,7 @@
       <w:r>
         <w:t xml:space="preserve"> </w:t>
       </w:r>
-      <w:hyperlink r:id="rId174">
+      <w:hyperlink r:id="rId176">
         <w:r>
           <w:rPr>
             <w:rStyle w:val="Hyperlink"/>
@@ -23194,8 +23393,8 @@
         </w:r>
       </w:hyperlink>
     </w:p>
-    <w:bookmarkEnd w:id="175"/>
-    <w:bookmarkStart w:id="177" w:name="ref-wikipedia_scatter_plot"/>
+    <w:bookmarkEnd w:id="177"/>
+    <w:bookmarkStart w:id="179" w:name="ref-wikipedia_scatter_plot"/>
     <w:p>
       <w:pPr>
         <w:pStyle w:val="Bibliography"/>
@@ -23242,7 +23441,7 @@
       <w:r>
         <w:t xml:space="preserve"> </w:t>
       </w:r>
-      <w:hyperlink r:id="rId176">
+      <w:hyperlink r:id="rId178">
         <w:r>
           <w:rPr>
             <w:rStyle w:val="Hyperlink"/>
@@ -23251,8 +23450,8 @@
         </w:r>
       </w:hyperlink>
     </w:p>
-    <w:bookmarkEnd w:id="177"/>
-    <w:bookmarkStart w:id="179" w:name="X9c68751dcff429bb8eebfb08e71b6f746222990"/>
+    <w:bookmarkEnd w:id="179"/>
+    <w:bookmarkStart w:id="181" w:name="X9c68751dcff429bb8eebfb08e71b6f746222990"/>
     <w:p>
       <w:pPr>
         <w:pStyle w:val="Bibliography"/>
@@ -23299,7 +23498,7 @@
       <w:r>
         <w:t xml:space="preserve"> </w:t>
       </w:r>
-      <w:hyperlink r:id="rId178">
+      <w:hyperlink r:id="rId180">
         <w:r>
           <w:rPr>
             <w:rStyle w:val="Hyperlink"/>
@@ -23308,8 +23507,8 @@
         </w:r>
       </w:hyperlink>
     </w:p>
-    <w:bookmarkEnd w:id="179"/>
-    <w:bookmarkStart w:id="181" w:name="ref-wikipedia_contingency_table"/>
+    <w:bookmarkEnd w:id="181"/>
+    <w:bookmarkStart w:id="183" w:name="ref-wikipedia_contingency_table"/>
     <w:p>
       <w:pPr>
         <w:pStyle w:val="Bibliography"/>
@@ -23356,7 +23555,7 @@
       <w:r>
         <w:t xml:space="preserve"> </w:t>
       </w:r>
-      <w:hyperlink r:id="rId180">
+      <w:hyperlink r:id="rId182">
         <w:r>
           <w:rPr>
             <w:rStyle w:val="Hyperlink"/>
@@ -23365,8 +23564,8 @@
         </w:r>
       </w:hyperlink>
     </w:p>
-    <w:bookmarkEnd w:id="181"/>
-    <w:bookmarkStart w:id="183" w:name="ref-wikipedia_standard_score"/>
+    <w:bookmarkEnd w:id="183"/>
+    <w:bookmarkStart w:id="185" w:name="ref-wikipedia_standard_score"/>
     <w:p>
       <w:pPr>
         <w:pStyle w:val="Bibliography"/>
@@ -23413,7 +23612,7 @@
       <w:r>
         <w:t xml:space="preserve"> </w:t>
       </w:r>
-      <w:hyperlink r:id="rId182">
+      <w:hyperlink r:id="rId184">
         <w:r>
           <w:rPr>
             <w:rStyle w:val="Hyperlink"/>
@@ -23422,8 +23621,8 @@
         </w:r>
       </w:hyperlink>
     </w:p>
-    <w:bookmarkEnd w:id="183"/>
-    <w:bookmarkStart w:id="185" w:name="ref-james2021islr2e"/>
+    <w:bookmarkEnd w:id="185"/>
+    <w:bookmarkStart w:id="187" w:name="ref-james2021islr2e"/>
     <w:p>
       <w:pPr>
         <w:pStyle w:val="Bibliography"/>
@@ -23470,7 +23669,7 @@
       <w:r>
         <w:t xml:space="preserve"> </w:t>
       </w:r>
-      <w:hyperlink r:id="rId184">
+      <w:hyperlink r:id="rId186">
         <w:r>
           <w:rPr>
             <w:rStyle w:val="Hyperlink"/>
@@ -23482,8 +23681,8 @@
         <w:t xml:space="preserve">.</w:t>
       </w:r>
     </w:p>
-    <w:bookmarkEnd w:id="185"/>
-    <w:bookmarkStart w:id="186" w:name="ref-geron2017hands"/>
+    <w:bookmarkEnd w:id="187"/>
+    <w:bookmarkStart w:id="188" w:name="ref-geron2017hands"/>
     <w:p>
       <w:pPr>
         <w:pStyle w:val="Bibliography"/>
@@ -23556,8 +23755,8 @@
         <w:t xml:space="preserve">, 1st ed. O’Reilly Media, 2017.</w:t>
       </w:r>
     </w:p>
-    <w:bookmarkEnd w:id="186"/>
-    <w:bookmarkStart w:id="188" w:name="ref-wikipedia_feature_scaling"/>
+    <w:bookmarkEnd w:id="188"/>
+    <w:bookmarkStart w:id="190" w:name="ref-wikipedia_feature_scaling"/>
     <w:p>
       <w:pPr>
         <w:pStyle w:val="Bibliography"/>
@@ -23604,7 +23803,7 @@
       <w:r>
         <w:t xml:space="preserve"> </w:t>
       </w:r>
-      <w:hyperlink r:id="rId187">
+      <w:hyperlink r:id="rId189">
         <w:r>
           <w:rPr>
             <w:rStyle w:val="Hyperlink"/>
@@ -23613,9 +23812,9 @@
         </w:r>
       </w:hyperlink>
     </w:p>
-    <w:bookmarkEnd w:id="188"/>
-    <w:bookmarkEnd w:id="189"/>
     <w:bookmarkEnd w:id="190"/>
+    <w:bookmarkEnd w:id="191"/>
+    <w:bookmarkEnd w:id="192"/>
     <w:sectPr>
       <w:footnotePr>
         <w:numRestart w:val="eachSect"/>

</xml_diff>

<commit_message>
Deploying to gh-pages from @ Morrison-Lab/sds@c5367b5137a58bddfa32ec894e51344b70c412c6 🚀
</commit_message>
<xml_diff>
--- a/exploratory-descriptive-handout.docx
+++ b/exploratory-descriptive-handout.docx
@@ -15,10 +15,10 @@
         <w:pStyle w:val="Date"/>
       </w:pPr>
       <w:r>
-        <w:t xml:space="preserve">Last modified: 2026-10-23 16:56:15 (PDT)</w:t>
+        <w:t xml:space="preserve">Last modified: 2026-10-23 17:28:11 (PDT)</w:t>
       </w:r>
     </w:p>
-    <w:bookmarkStart w:id="30" w:name="introduction"/>
+    <w:bookmarkStart w:id="31" w:name="introduction"/>
     <w:p>
       <w:pPr>
         <w:pStyle w:val="Heading2"/>
@@ -1912,7 +1912,7 @@
       </w:r>
     </w:p>
     <w:bookmarkEnd w:id="14"/>
-    <w:bookmarkStart w:id="29" w:name="sec-populations-samples"/>
+    <w:bookmarkStart w:id="30" w:name="sec-populations-samples"/>
     <w:p>
       <w:pPr>
         <w:pStyle w:val="Heading3"/>
@@ -3345,18 +3345,6 @@
       <w:r>
         <w:t xml:space="preserve">.</w:t>
       </w:r>
-      <w:r>
-        <w:t xml:space="preserve"> </w:t>
-      </w:r>
-      <w:r>
-        <w:t xml:space="preserve">A population parameter is fixed.</w:t>
-      </w:r>
-      <w:r>
-        <w:t xml:space="preserve"> </w:t>
-      </w:r>
-      <w:r>
-        <w:t xml:space="preserve">It is usually unknown.</w:t>
-      </w:r>
     </w:p>
     <w:bookmarkEnd w:id="27"/>
     <w:bookmarkStart w:id="28" w:name="exm-population-parameter-wcgs"/>
@@ -3479,9 +3467,35 @@
       </w:r>
     </w:p>
     <w:bookmarkEnd w:id="28"/>
+    <w:bookmarkStart w:id="29" w:name="rem-population-parameter"/>
+    <w:p>
+      <w:pPr>
+        <w:pStyle w:val="BodyText"/>
+      </w:pPr>
+      <w:r>
+        <w:rPr>
+          <w:i/>
+          <w:iCs/>
+        </w:rPr>
+        <w:t xml:space="preserve">Remark 1</w:t>
+      </w:r>
+      <w:r>
+        <w:t xml:space="preserve"> (Population parameters are fixed and usually unknown). </w:t>
+      </w:r>
+      <w:r>
+        <w:t xml:space="preserve">A population parameter is fixed.</w:t>
+      </w:r>
+      <w:r>
+        <w:t xml:space="preserve"> </w:t>
+      </w:r>
+      <w:r>
+        <w:t xml:space="preserve">It is usually unknown.</w:t>
+      </w:r>
+    </w:p>
     <w:bookmarkEnd w:id="29"/>
     <w:bookmarkEnd w:id="30"/>
-    <w:bookmarkStart w:id="55" w:name="summarizing-a-single-variable"/>
+    <w:bookmarkEnd w:id="31"/>
+    <w:bookmarkStart w:id="56" w:name="summarizing-a-single-variable"/>
     <w:p>
       <w:pPr>
         <w:pStyle w:val="Heading2"/>
@@ -3490,7 +3504,7 @@
         <w:t xml:space="preserve">2 Summarizing a single variable</w:t>
       </w:r>
     </w:p>
-    <w:bookmarkStart w:id="37" w:name="measures-of-center"/>
+    <w:bookmarkStart w:id="38" w:name="measures-of-center"/>
     <w:p>
       <w:pPr>
         <w:pStyle w:val="Heading3"/>
@@ -3499,7 +3513,7 @@
         <w:t xml:space="preserve">2.1 Measures of center</w:t>
       </w:r>
     </w:p>
-    <w:bookmarkStart w:id="31" w:name="def-sample-mean"/>
+    <w:bookmarkStart w:id="32" w:name="def-sample-mean"/>
     <w:p>
       <w:pPr>
         <w:pStyle w:val="FirstParagraph"/>
@@ -3698,8 +3712,8 @@
         </m:oMath>
       </m:oMathPara>
     </w:p>
-    <w:bookmarkEnd w:id="31"/>
-    <w:bookmarkStart w:id="32" w:name="exm-sample-mean"/>
+    <w:bookmarkEnd w:id="32"/>
+    <w:bookmarkStart w:id="33" w:name="exm-sample-mean"/>
     <w:p>
       <w:pPr>
         <w:pStyle w:val="FirstParagraph"/>
@@ -3807,8 +3821,8 @@
         <w:t xml:space="preserve">#&gt; [1] 226.372</w:t>
       </w:r>
     </w:p>
-    <w:bookmarkEnd w:id="32"/>
-    <w:bookmarkStart w:id="33" w:name="exm-sample-vs-population-mean"/>
+    <w:bookmarkEnd w:id="33"/>
+    <w:bookmarkStart w:id="34" w:name="exm-sample-vs-population-mean"/>
     <w:p>
       <w:pPr>
         <w:pStyle w:val="FirstParagraph"/>
@@ -3974,8 +3988,8 @@
         <w:t xml:space="preserve">while the population mean would not change.</w:t>
       </w:r>
     </w:p>
-    <w:bookmarkEnd w:id="33"/>
-    <w:bookmarkStart w:id="35" w:name="def-sample-median"/>
+    <w:bookmarkEnd w:id="34"/>
+    <w:bookmarkStart w:id="36" w:name="def-sample-median"/>
     <w:p>
       <w:pPr>
         <w:pStyle w:val="BodyText"/>
@@ -4024,7 +4038,7 @@
       <w:r>
         <w:t xml:space="preserve"> </w:t>
       </w:r>
-      <w:hyperlink r:id="rId34">
+      <w:hyperlink r:id="rId35">
         <w:r>
           <w:rPr>
             <w:rStyle w:val="Hyperlink"/>
@@ -4358,8 +4372,8 @@
         <w:t xml:space="preserve">.</w:t>
       </w:r>
     </w:p>
-    <w:bookmarkEnd w:id="35"/>
-    <w:bookmarkStart w:id="36" w:name="exm-sample-median"/>
+    <w:bookmarkEnd w:id="36"/>
+    <w:bookmarkStart w:id="37" w:name="exm-sample-median"/>
     <w:p>
       <w:pPr>
         <w:pStyle w:val="BodyText"/>
@@ -4495,9 +4509,9 @@
         <w:t xml:space="preserve">A median is less sensitive to extreme values than a sample mean.</w:t>
       </w:r>
     </w:p>
-    <w:bookmarkEnd w:id="36"/>
     <w:bookmarkEnd w:id="37"/>
-    <w:bookmarkStart w:id="48" w:name="measures-of-spread"/>
+    <w:bookmarkEnd w:id="38"/>
+    <w:bookmarkStart w:id="49" w:name="measures-of-spread"/>
     <w:p>
       <w:pPr>
         <w:pStyle w:val="Heading3"/>
@@ -4506,7 +4520,7 @@
         <w:t xml:space="preserve">2.2 Measures of spread</w:t>
       </w:r>
     </w:p>
-    <w:bookmarkStart w:id="38" w:name="def-sample-variance"/>
+    <w:bookmarkStart w:id="39" w:name="def-sample-variance"/>
     <w:p>
       <w:pPr>
         <w:pStyle w:val="FirstParagraph"/>
@@ -4726,8 +4740,8 @@
         <w:t xml:space="preserve">.</w:t>
       </w:r>
     </w:p>
-    <w:bookmarkEnd w:id="38"/>
-    <w:bookmarkStart w:id="39" w:name="def-sample-sd"/>
+    <w:bookmarkEnd w:id="39"/>
+    <w:bookmarkStart w:id="40" w:name="def-sample-sd"/>
     <w:p>
       <w:pPr>
         <w:pStyle w:val="BodyText"/>
@@ -4847,8 +4861,8 @@
         <w:t xml:space="preserve">.</w:t>
       </w:r>
     </w:p>
-    <w:bookmarkEnd w:id="39"/>
-    <w:bookmarkStart w:id="40" w:name="rem-sd-units"/>
+    <w:bookmarkEnd w:id="40"/>
+    <w:bookmarkStart w:id="41" w:name="rem-sd-units"/>
     <w:p>
       <w:pPr>
         <w:pStyle w:val="BodyText"/>
@@ -4858,7 +4872,7 @@
           <w:i/>
           <w:iCs/>
         </w:rPr>
-        <w:t xml:space="preserve">Remark 1</w:t>
+        <w:t xml:space="preserve">Remark 2</w:t>
       </w:r>
       <w:r>
         <w:t xml:space="preserve"> (Units of the standard deviation). </w:t>
@@ -4879,8 +4893,8 @@
         <w:t xml:space="preserve">whose units are squared.</w:t>
       </w:r>
     </w:p>
-    <w:bookmarkEnd w:id="40"/>
-    <w:bookmarkStart w:id="41" w:name="exm-sample-sd"/>
+    <w:bookmarkEnd w:id="41"/>
+    <w:bookmarkStart w:id="42" w:name="exm-sample-sd"/>
     <w:p>
       <w:pPr>
         <w:pStyle w:val="BodyText"/>
@@ -5050,8 +5064,8 @@
         <w:t xml:space="preserve">like the cholesterol values themselves.</w:t>
       </w:r>
     </w:p>
-    <w:bookmarkEnd w:id="41"/>
-    <w:bookmarkStart w:id="43" w:name="def-quartiles"/>
+    <w:bookmarkEnd w:id="42"/>
+    <w:bookmarkStart w:id="44" w:name="def-quartiles"/>
     <w:p>
       <w:pPr>
         <w:pStyle w:val="BodyText"/>
@@ -5160,7 +5174,7 @@
       <w:r>
         <w:t xml:space="preserve">(</w:t>
       </w:r>
-      <w:hyperlink r:id="rId42">
+      <w:hyperlink r:id="rId43">
         <w:r>
           <w:rPr>
             <w:rStyle w:val="Hyperlink"/>
@@ -5227,8 +5241,8 @@
         <w:t xml:space="preserve">.</w:t>
       </w:r>
     </w:p>
-    <w:bookmarkEnd w:id="43"/>
-    <w:bookmarkStart w:id="45" w:name="rem-quartile-software"/>
+    <w:bookmarkEnd w:id="44"/>
+    <w:bookmarkStart w:id="46" w:name="rem-quartile-software"/>
     <w:p>
       <w:pPr>
         <w:pStyle w:val="BodyText"/>
@@ -5238,7 +5252,7 @@
           <w:i/>
           <w:iCs/>
         </w:rPr>
-        <w:t xml:space="preserve">Remark 2</w:t>
+        <w:t xml:space="preserve">Remark 3</w:t>
       </w:r>
       <w:r>
         <w:t xml:space="preserve"> (Quartiles in software). </w:t>
@@ -5296,7 +5310,7 @@
       <w:r>
         <w:t xml:space="preserve">(</w:t>
       </w:r>
-      <w:hyperlink r:id="rId44">
+      <w:hyperlink r:id="rId45">
         <w:r>
           <w:rPr>
             <w:rStyle w:val="Hyperlink"/>
@@ -5347,8 +5361,8 @@
         <w:t xml:space="preserve">, interpolates.</w:t>
       </w:r>
     </w:p>
-    <w:bookmarkEnd w:id="45"/>
-    <w:bookmarkStart w:id="46" w:name="def-IQR"/>
+    <w:bookmarkEnd w:id="46"/>
+    <w:bookmarkStart w:id="47" w:name="def-IQR"/>
     <w:p>
       <w:pPr>
         <w:pStyle w:val="BodyText"/>
@@ -5488,8 +5502,8 @@
         <w:t xml:space="preserve">.</w:t>
       </w:r>
     </w:p>
-    <w:bookmarkEnd w:id="46"/>
-    <w:bookmarkStart w:id="47" w:name="exm-IQR"/>
+    <w:bookmarkEnd w:id="47"/>
+    <w:bookmarkStart w:id="48" w:name="exm-IQR"/>
     <w:p>
       <w:pPr>
         <w:pStyle w:val="BodyText"/>
@@ -5761,9 +5775,9 @@
         <w:t xml:space="preserve">so it is less sensitive to outliers than the standard deviation.</w:t>
       </w:r>
     </w:p>
-    <w:bookmarkEnd w:id="47"/>
     <w:bookmarkEnd w:id="48"/>
-    <w:bookmarkStart w:id="50" w:name="summary-statistics-in-r"/>
+    <w:bookmarkEnd w:id="49"/>
+    <w:bookmarkStart w:id="51" w:name="summary-statistics-in-r"/>
     <w:p>
       <w:pPr>
         <w:pStyle w:val="Heading3"/>
@@ -5930,7 +5944,7 @@
       <w:tr>
         <w:tc>
           <w:tcPr/>
-          <w:bookmarkStart w:id="49" w:name="tbl-wcgs-summary-continuous"/>
+          <w:bookmarkStart w:id="50" w:name="tbl-wcgs-summary-continuous"/>
           <w:p>
             <w:pPr>
               <w:jc w:val="center"/>
@@ -6657,12 +6671,12 @@
               </w:tc>
             </w:tr>
           </w:tbl>
-          <w:bookmarkEnd w:id="49"/>
+          <w:bookmarkEnd w:id="50"/>
         </w:tc>
       </w:tr>
     </w:tbl>
-    <w:bookmarkEnd w:id="50"/>
-    <w:bookmarkStart w:id="54" w:name="binary-and-categorical-variables"/>
+    <w:bookmarkEnd w:id="51"/>
+    <w:bookmarkStart w:id="55" w:name="binary-and-categorical-variables"/>
     <w:p>
       <w:pPr>
         <w:pStyle w:val="Heading3"/>
@@ -6671,7 +6685,7 @@
         <w:t xml:space="preserve">2.4 Binary and categorical variables</w:t>
       </w:r>
     </w:p>
-    <w:bookmarkStart w:id="51" w:name="def-sample-proportion"/>
+    <w:bookmarkStart w:id="52" w:name="def-sample-proportion"/>
     <w:p>
       <w:pPr>
         <w:pStyle w:val="FirstParagraph"/>
@@ -6810,8 +6824,8 @@
         <w:t xml:space="preserve">is the number of observations.</w:t>
       </w:r>
     </w:p>
-    <w:bookmarkEnd w:id="51"/>
-    <w:bookmarkStart w:id="52" w:name="exm-sample-proportion"/>
+    <w:bookmarkEnd w:id="52"/>
+    <w:bookmarkStart w:id="53" w:name="exm-sample-proportion"/>
     <w:p>
       <w:pPr>
         <w:pStyle w:val="BodyText"/>
@@ -6972,7 +6986,7 @@
         <w:t xml:space="preserve">0.081.</w:t>
       </w:r>
     </w:p>
-    <w:bookmarkEnd w:id="52"/>
+    <w:bookmarkEnd w:id="53"/>
     <w:p>
       <w:pPr>
         <w:pStyle w:val="BodyText"/>
@@ -7023,7 +7037,7 @@
       <w:tr>
         <w:tc>
           <w:tcPr/>
-          <w:bookmarkStart w:id="53" w:name="tbl-wcgs-summary-cat"/>
+          <w:bookmarkStart w:id="54" w:name="tbl-wcgs-summary-cat"/>
           <w:p>
             <w:pPr>
               <w:jc w:val="center"/>
@@ -8018,7 +8032,7 @@
               </w:tc>
             </w:tr>
           </w:tbl>
-          <w:bookmarkEnd w:id="53"/>
+          <w:bookmarkEnd w:id="54"/>
         </w:tc>
       </w:tr>
     </w:tbl>
@@ -8058,9 +8072,9 @@
         <w:t xml:space="preserve">covers measures of location and dispersion.</w:t>
       </w:r>
     </w:p>
-    <w:bookmarkEnd w:id="54"/>
     <w:bookmarkEnd w:id="55"/>
-    <w:bookmarkStart w:id="89" w:name="graphical-methods"/>
+    <w:bookmarkEnd w:id="56"/>
+    <w:bookmarkStart w:id="90" w:name="graphical-methods"/>
     <w:p>
       <w:pPr>
         <w:pStyle w:val="Heading2"/>
@@ -8095,7 +8109,7 @@
         <w:t xml:space="preserve">Different types of graph suit different types of variable.</w:t>
       </w:r>
     </w:p>
-    <w:bookmarkStart w:id="62" w:name="histograms"/>
+    <w:bookmarkStart w:id="63" w:name="histograms"/>
     <w:p>
       <w:pPr>
         <w:pStyle w:val="Heading3"/>
@@ -8104,7 +8118,7 @@
         <w:t xml:space="preserve">3.1 Histograms</w:t>
       </w:r>
     </w:p>
-    <w:bookmarkStart w:id="56" w:name="def-histogram"/>
+    <w:bookmarkStart w:id="57" w:name="def-histogram"/>
     <w:p>
       <w:pPr>
         <w:pStyle w:val="FirstParagraph"/>
@@ -8174,8 +8188,8 @@
         <w:t xml:space="preserve">.</w:t>
       </w:r>
     </w:p>
-    <w:bookmarkEnd w:id="56"/>
-    <w:bookmarkStart w:id="57" w:name="def-bin"/>
+    <w:bookmarkEnd w:id="57"/>
+    <w:bookmarkStart w:id="58" w:name="def-bin"/>
     <w:p>
       <w:pPr>
         <w:pStyle w:val="BodyText"/>
@@ -8210,7 +8224,7 @@
         <w:t xml:space="preserve">of a histogram is one of its intervals.</w:t>
       </w:r>
     </w:p>
-    <w:bookmarkEnd w:id="57"/>
+    <w:bookmarkEnd w:id="58"/>
     <w:tbl>
       <w:tblPr>
         <w:tblStyle w:val="Table"/>
@@ -8224,7 +8238,7 @@
       <w:tr>
         <w:tc>
           <w:tcPr/>
-          <w:bookmarkStart w:id="61" w:name="fig-hist-chol"/>
+          <w:bookmarkStart w:id="62" w:name="fig-hist-chol"/>
           <w:p>
             <w:pPr>
               <w:pStyle w:val="SourceCode"/>
@@ -8510,18 +8524,18 @@
                 <wp:inline>
                   <wp:extent cx="4620126" cy="3696101"/>
                   <wp:effectExtent b="0" l="0" r="0" t="0"/>
-                  <wp:docPr descr="" title="" id="59" name="Picture"/>
+                  <wp:docPr descr="" title="" id="60" name="Picture"/>
                   <a:graphic>
                     <a:graphicData uri="http://schemas.openxmlformats.org/drawingml/2006/picture">
                       <pic:pic>
                         <pic:nvPicPr>
-                          <pic:cNvPr descr="exploratory-descriptive_files/figure-docx/unnamed-chunk-8-1.png" id="60" name="Picture"/>
+                          <pic:cNvPr descr="exploratory-descriptive_files/figure-docx/unnamed-chunk-8-1.png" id="61" name="Picture"/>
                           <pic:cNvPicPr>
                             <a:picLocks noChangeArrowheads="1" noChangeAspect="1"/>
                           </pic:cNvPicPr>
                         </pic:nvPicPr>
                         <pic:blipFill>
-                          <a:blip r:embed="rId58"/>
+                          <a:blip r:embed="rId59"/>
                           <a:stretch>
                             <a:fillRect/>
                           </a:stretch>
@@ -8561,7 +8575,7 @@
               <w:t xml:space="preserve">Figure 1: Histogram of total cholesterol in the WCGS dataset</w:t>
             </w:r>
           </w:p>
-          <w:bookmarkEnd w:id="61"/>
+          <w:bookmarkEnd w:id="62"/>
         </w:tc>
       </w:tr>
     </w:tbl>
@@ -8608,8 +8622,8 @@
         <w:t xml:space="preserve">but the largest value is 645 mg/dL.</w:t>
       </w:r>
     </w:p>
-    <w:bookmarkEnd w:id="62"/>
-    <w:bookmarkStart w:id="68" w:name="density-plots"/>
+    <w:bookmarkEnd w:id="63"/>
+    <w:bookmarkStart w:id="69" w:name="density-plots"/>
     <w:p>
       <w:pPr>
         <w:pStyle w:val="Heading3"/>
@@ -8618,7 +8632,7 @@
         <w:t xml:space="preserve">3.2 Density plots</w:t>
       </w:r>
     </w:p>
-    <w:bookmarkStart w:id="63" w:name="def-density-plot"/>
+    <w:bookmarkStart w:id="64" w:name="def-density-plot"/>
     <w:p>
       <w:pPr>
         <w:pStyle w:val="FirstParagraph"/>
@@ -8682,7 +8696,7 @@
         <w:t xml:space="preserve">.</w:t>
       </w:r>
     </w:p>
-    <w:bookmarkEnd w:id="63"/>
+    <w:bookmarkEnd w:id="64"/>
     <w:tbl>
       <w:tblPr>
         <w:tblStyle w:val="Table"/>
@@ -8696,7 +8710,7 @@
       <w:tr>
         <w:tc>
           <w:tcPr/>
-          <w:bookmarkStart w:id="67" w:name="fig-density-chol"/>
+          <w:bookmarkStart w:id="68" w:name="fig-density-chol"/>
           <w:p>
             <w:pPr>
               <w:pStyle w:val="SourceCode"/>
@@ -8958,18 +8972,18 @@
                 <wp:inline>
                   <wp:extent cx="4620126" cy="3696101"/>
                   <wp:effectExtent b="0" l="0" r="0" t="0"/>
-                  <wp:docPr descr="" title="" id="65" name="Picture"/>
+                  <wp:docPr descr="" title="" id="66" name="Picture"/>
                   <a:graphic>
                     <a:graphicData uri="http://schemas.openxmlformats.org/drawingml/2006/picture">
                       <pic:pic>
                         <pic:nvPicPr>
-                          <pic:cNvPr descr="exploratory-descriptive_files/figure-docx/unnamed-chunk-9-1.png" id="66" name="Picture"/>
+                          <pic:cNvPr descr="exploratory-descriptive_files/figure-docx/unnamed-chunk-9-1.png" id="67" name="Picture"/>
                           <pic:cNvPicPr>
                             <a:picLocks noChangeArrowheads="1" noChangeAspect="1"/>
                           </pic:cNvPicPr>
                         </pic:nvPicPr>
                         <pic:blipFill>
-                          <a:blip r:embed="rId64"/>
+                          <a:blip r:embed="rId65"/>
                           <a:stretch>
                             <a:fillRect/>
                           </a:stretch>
@@ -9009,12 +9023,12 @@
               <w:t xml:space="preserve">Figure 2: Density plot of total cholesterol in the WCGS dataset</w:t>
             </w:r>
           </w:p>
-          <w:bookmarkEnd w:id="67"/>
+          <w:bookmarkEnd w:id="68"/>
         </w:tc>
       </w:tr>
     </w:tbl>
-    <w:bookmarkEnd w:id="68"/>
-    <w:bookmarkStart w:id="76" w:name="box-plots"/>
+    <w:bookmarkEnd w:id="69"/>
+    <w:bookmarkStart w:id="77" w:name="box-plots"/>
     <w:p>
       <w:pPr>
         <w:pStyle w:val="Heading3"/>
@@ -9023,7 +9037,7 @@
         <w:t xml:space="preserve">3.3 Box plots</w:t>
       </w:r>
     </w:p>
-    <w:bookmarkStart w:id="70" w:name="def-boxplot"/>
+    <w:bookmarkStart w:id="71" w:name="def-boxplot"/>
     <w:p>
       <w:pPr>
         <w:pStyle w:val="FirstParagraph"/>
@@ -9079,7 +9093,7 @@
       <w:r>
         <w:t xml:space="preserve"> </w:t>
       </w:r>
-      <w:hyperlink r:id="rId69">
+      <w:hyperlink r:id="rId70">
         <w:r>
           <w:rPr>
             <w:rStyle w:val="Hyperlink"/>
@@ -9243,8 +9257,8 @@
         <w:t xml:space="preserve">.</w:t>
       </w:r>
     </w:p>
-    <w:bookmarkEnd w:id="70"/>
-    <w:bookmarkStart w:id="71" w:name="rem-whisker-rule"/>
+    <w:bookmarkEnd w:id="71"/>
+    <w:bookmarkStart w:id="72" w:name="rem-whisker-rule"/>
     <w:p>
       <w:pPr>
         <w:pStyle w:val="BodyText"/>
@@ -9254,7 +9268,7 @@
           <w:i/>
           <w:iCs/>
         </w:rPr>
-        <w:t xml:space="preserve">Remark 3</w:t>
+        <w:t xml:space="preserve">Remark 4</w:t>
       </w:r>
       <w:r>
         <w:t xml:space="preserve"> (Whisker rules). </w:t>
@@ -9329,7 +9343,7 @@
         <w:t xml:space="preserve">such as whiskers that run to the minimum and maximum.</w:t>
       </w:r>
     </w:p>
-    <w:bookmarkEnd w:id="71"/>
+    <w:bookmarkEnd w:id="72"/>
     <w:tbl>
       <w:tblPr>
         <w:tblStyle w:val="Table"/>
@@ -9343,7 +9357,7 @@
       <w:tr>
         <w:tc>
           <w:tcPr/>
-          <w:bookmarkStart w:id="75" w:name="fig-box-chol"/>
+          <w:bookmarkStart w:id="76" w:name="fig-box-chol"/>
           <w:p>
             <w:pPr>
               <w:pStyle w:val="SourceCode"/>
@@ -9620,18 +9634,18 @@
                 <wp:inline>
                   <wp:extent cx="4620126" cy="3696101"/>
                   <wp:effectExtent b="0" l="0" r="0" t="0"/>
-                  <wp:docPr descr="" title="" id="73" name="Picture"/>
+                  <wp:docPr descr="" title="" id="74" name="Picture"/>
                   <a:graphic>
                     <a:graphicData uri="http://schemas.openxmlformats.org/drawingml/2006/picture">
                       <pic:pic>
                         <pic:nvPicPr>
-                          <pic:cNvPr descr="exploratory-descriptive_files/figure-docx/unnamed-chunk-10-1.png" id="74" name="Picture"/>
+                          <pic:cNvPr descr="exploratory-descriptive_files/figure-docx/unnamed-chunk-10-1.png" id="75" name="Picture"/>
                           <pic:cNvPicPr>
                             <a:picLocks noChangeArrowheads="1" noChangeAspect="1"/>
                           </pic:cNvPicPr>
                         </pic:nvPicPr>
                         <pic:blipFill>
-                          <a:blip r:embed="rId72"/>
+                          <a:blip r:embed="rId73"/>
                           <a:stretch>
                             <a:fillRect/>
                           </a:stretch>
@@ -9671,12 +9685,12 @@
               <w:t xml:space="preserve">Figure 3: Box plot of total cholesterol in the WCGS dataset</w:t>
             </w:r>
           </w:p>
-          <w:bookmarkEnd w:id="75"/>
+          <w:bookmarkEnd w:id="76"/>
         </w:tc>
       </w:tr>
     </w:tbl>
-    <w:bookmarkEnd w:id="76"/>
-    <w:bookmarkStart w:id="82" w:name="bar-charts"/>
+    <w:bookmarkEnd w:id="77"/>
+    <w:bookmarkStart w:id="83" w:name="bar-charts"/>
     <w:p>
       <w:pPr>
         <w:pStyle w:val="Heading3"/>
@@ -9685,7 +9699,7 @@
         <w:t xml:space="preserve">3.4 Bar charts</w:t>
       </w:r>
     </w:p>
-    <w:bookmarkStart w:id="77" w:name="def-bar-chart"/>
+    <w:bookmarkStart w:id="78" w:name="def-bar-chart"/>
     <w:p>
       <w:pPr>
         <w:pStyle w:val="FirstParagraph"/>
@@ -9749,7 +9763,7 @@
         <w:t xml:space="preserve">.</w:t>
       </w:r>
     </w:p>
-    <w:bookmarkEnd w:id="77"/>
+    <w:bookmarkEnd w:id="78"/>
     <w:tbl>
       <w:tblPr>
         <w:tblStyle w:val="Table"/>
@@ -9763,7 +9777,7 @@
       <w:tr>
         <w:tc>
           <w:tcPr/>
-          <w:bookmarkStart w:id="81" w:name="fig-bar-behpat"/>
+          <w:bookmarkStart w:id="82" w:name="fig-bar-behpat"/>
           <w:p>
             <w:pPr>
               <w:pStyle w:val="SourceCode"/>
@@ -10001,18 +10015,18 @@
                 <wp:inline>
                   <wp:extent cx="4620126" cy="3696101"/>
                   <wp:effectExtent b="0" l="0" r="0" t="0"/>
-                  <wp:docPr descr="" title="" id="79" name="Picture"/>
+                  <wp:docPr descr="" title="" id="80" name="Picture"/>
                   <a:graphic>
                     <a:graphicData uri="http://schemas.openxmlformats.org/drawingml/2006/picture">
                       <pic:pic>
                         <pic:nvPicPr>
-                          <pic:cNvPr descr="exploratory-descriptive_files/figure-docx/unnamed-chunk-11-1.png" id="80" name="Picture"/>
+                          <pic:cNvPr descr="exploratory-descriptive_files/figure-docx/unnamed-chunk-11-1.png" id="81" name="Picture"/>
                           <pic:cNvPicPr>
                             <a:picLocks noChangeArrowheads="1" noChangeAspect="1"/>
                           </pic:cNvPicPr>
                         </pic:nvPicPr>
                         <pic:blipFill>
-                          <a:blip r:embed="rId78"/>
+                          <a:blip r:embed="rId79"/>
                           <a:stretch>
                             <a:fillRect/>
                           </a:stretch>
@@ -10052,12 +10066,12 @@
               <w:t xml:space="preserve">Figure 4: Bar chart of behavioral pattern in the WCGS dataset</w:t>
             </w:r>
           </w:p>
-          <w:bookmarkEnd w:id="81"/>
+          <w:bookmarkEnd w:id="82"/>
         </w:tc>
       </w:tr>
     </w:tbl>
-    <w:bookmarkEnd w:id="82"/>
-    <w:bookmarkStart w:id="88" w:name="normal-quantile-quantile-plots"/>
+    <w:bookmarkEnd w:id="83"/>
+    <w:bookmarkStart w:id="89" w:name="normal-quantile-quantile-plots"/>
     <w:p>
       <w:pPr>
         <w:pStyle w:val="Heading3"/>
@@ -10066,7 +10080,7 @@
         <w:t xml:space="preserve">3.5 Normal quantile-quantile plots</w:t>
       </w:r>
     </w:p>
-    <w:bookmarkStart w:id="83" w:name="def-qq-plot"/>
+    <w:bookmarkStart w:id="84" w:name="def-qq-plot"/>
     <w:p>
       <w:pPr>
         <w:pStyle w:val="FirstParagraph"/>
@@ -10106,7 +10120,7 @@
       <w:r>
         <w:t xml:space="preserve">(</w:t>
       </w:r>
-      <w:hyperlink r:id="rId34">
+      <w:hyperlink r:id="rId35">
         <w:r>
           <w:rPr>
             <w:rStyle w:val="Hyperlink"/>
@@ -10153,7 +10167,7 @@
         <w:t xml:space="preserve">.</w:t>
       </w:r>
     </w:p>
-    <w:bookmarkEnd w:id="83"/>
+    <w:bookmarkEnd w:id="84"/>
     <w:tbl>
       <w:tblPr>
         <w:tblStyle w:val="Table"/>
@@ -10167,7 +10181,7 @@
       <w:tr>
         <w:tc>
           <w:tcPr/>
-          <w:bookmarkStart w:id="87" w:name="fig-qq-chol"/>
+          <w:bookmarkStart w:id="88" w:name="fig-qq-chol"/>
           <w:p>
             <w:pPr>
               <w:pStyle w:val="SourceCode"/>
@@ -10438,18 +10452,18 @@
                 <wp:inline>
                   <wp:extent cx="4620126" cy="3696101"/>
                   <wp:effectExtent b="0" l="0" r="0" t="0"/>
-                  <wp:docPr descr="" title="" id="85" name="Picture"/>
+                  <wp:docPr descr="" title="" id="86" name="Picture"/>
                   <a:graphic>
                     <a:graphicData uri="http://schemas.openxmlformats.org/drawingml/2006/picture">
                       <pic:pic>
                         <pic:nvPicPr>
-                          <pic:cNvPr descr="exploratory-descriptive_files/figure-docx/unnamed-chunk-12-1.png" id="86" name="Picture"/>
+                          <pic:cNvPr descr="exploratory-descriptive_files/figure-docx/unnamed-chunk-12-1.png" id="87" name="Picture"/>
                           <pic:cNvPicPr>
                             <a:picLocks noChangeArrowheads="1" noChangeAspect="1"/>
                           </pic:cNvPicPr>
                         </pic:nvPicPr>
                         <pic:blipFill>
-                          <a:blip r:embed="rId84"/>
+                          <a:blip r:embed="rId85"/>
                           <a:stretch>
                             <a:fillRect/>
                           </a:stretch>
@@ -10489,7 +10503,7 @@
               <w:t xml:space="preserve">Figure 5: Normal Q-Q plot for total cholesterol in the WCGS dataset</w:t>
             </w:r>
           </w:p>
-          <w:bookmarkEnd w:id="87"/>
+          <w:bookmarkEnd w:id="88"/>
         </w:tc>
       </w:tr>
     </w:tbl>
@@ -10607,9 +10621,9 @@
         <w:t xml:space="preserve">covers boxplots.</w:t>
       </w:r>
     </w:p>
-    <w:bookmarkEnd w:id="88"/>
     <w:bookmarkEnd w:id="89"/>
-    <w:bookmarkStart w:id="119" w:name="bivariate-relationships"/>
+    <w:bookmarkEnd w:id="90"/>
+    <w:bookmarkStart w:id="120" w:name="bivariate-relationships"/>
     <w:p>
       <w:pPr>
         <w:pStyle w:val="Heading2"/>
@@ -10618,7 +10632,7 @@
         <w:t xml:space="preserve">4 Bivariate relationships</w:t>
       </w:r>
     </w:p>
-    <w:bookmarkStart w:id="103" w:name="two-continuous-variables"/>
+    <w:bookmarkStart w:id="104" w:name="two-continuous-variables"/>
     <w:p>
       <w:pPr>
         <w:pStyle w:val="Heading3"/>
@@ -10627,7 +10641,7 @@
         <w:t xml:space="preserve">4.1 Two continuous variables</w:t>
       </w:r>
     </w:p>
-    <w:bookmarkStart w:id="90" w:name="def-scatterplot"/>
+    <w:bookmarkStart w:id="91" w:name="def-scatterplot"/>
     <w:p>
       <w:pPr>
         <w:pStyle w:val="FirstParagraph"/>
@@ -10691,7 +10705,7 @@
         <w:t xml:space="preserve">.</w:t>
       </w:r>
     </w:p>
-    <w:bookmarkEnd w:id="90"/>
+    <w:bookmarkEnd w:id="91"/>
     <w:tbl>
       <w:tblPr>
         <w:tblStyle w:val="Table"/>
@@ -10705,7 +10719,7 @@
       <w:tr>
         <w:tc>
           <w:tcPr/>
-          <w:bookmarkStart w:id="94" w:name="fig-scatter-chol-sbp"/>
+          <w:bookmarkStart w:id="95" w:name="fig-scatter-chol-sbp"/>
           <w:p>
             <w:pPr>
               <w:pStyle w:val="SourceCode"/>
@@ -11060,18 +11074,18 @@
                 <wp:inline>
                   <wp:extent cx="4620126" cy="3696101"/>
                   <wp:effectExtent b="0" l="0" r="0" t="0"/>
-                  <wp:docPr descr="" title="" id="92" name="Picture"/>
+                  <wp:docPr descr="" title="" id="93" name="Picture"/>
                   <a:graphic>
                     <a:graphicData uri="http://schemas.openxmlformats.org/drawingml/2006/picture">
                       <pic:pic>
                         <pic:nvPicPr>
-                          <pic:cNvPr descr="exploratory-descriptive_files/figure-docx/unnamed-chunk-13-1.png" id="93" name="Picture"/>
+                          <pic:cNvPr descr="exploratory-descriptive_files/figure-docx/unnamed-chunk-13-1.png" id="94" name="Picture"/>
                           <pic:cNvPicPr>
                             <a:picLocks noChangeArrowheads="1" noChangeAspect="1"/>
                           </pic:cNvPicPr>
                         </pic:nvPicPr>
                         <pic:blipFill>
-                          <a:blip r:embed="rId91"/>
+                          <a:blip r:embed="rId92"/>
                           <a:stretch>
                             <a:fillRect/>
                           </a:stretch>
@@ -11117,11 +11131,11 @@
               <w:t xml:space="preserve">with a least-squares line</w:t>
             </w:r>
           </w:p>
-          <w:bookmarkEnd w:id="94"/>
+          <w:bookmarkEnd w:id="95"/>
         </w:tc>
       </w:tr>
     </w:tbl>
-    <w:bookmarkStart w:id="95" w:name="def-pearson-r"/>
+    <w:bookmarkStart w:id="96" w:name="def-pearson-r"/>
     <w:p>
       <w:pPr>
         <w:pStyle w:val="BodyText"/>
@@ -11638,8 +11652,8 @@
         <w:t xml:space="preserve">.</w:t>
       </w:r>
     </w:p>
-    <w:bookmarkEnd w:id="95"/>
-    <w:bookmarkStart w:id="97" w:name="rem-pearson-r-estimates-population"/>
+    <w:bookmarkEnd w:id="96"/>
+    <w:bookmarkStart w:id="98" w:name="rem-pearson-r-estimates-population"/>
     <w:p>
       <w:pPr>
         <w:pStyle w:val="BodyText"/>
@@ -11649,7 +11663,7 @@
           <w:i/>
           <w:iCs/>
         </w:rPr>
-        <w:t xml:space="preserve">Remark 4</w:t>
+        <w:t xml:space="preserve">Remark 5</w:t>
       </w:r>
       <w:r>
         <w:t xml:space="preserve"> (The Pearson correlation coefficient estimates the population correlation). </w:t>
@@ -11660,7 +11674,7 @@
       <w:r>
         <w:t xml:space="preserve"> </w:t>
       </w:r>
-      <w:hyperlink r:id="rId96">
+      <w:hyperlink r:id="rId97">
         <w:r>
           <w:rPr>
             <w:rStyle w:val="Hyperlink"/>
@@ -11672,8 +11686,8 @@
         <w:t xml:space="preserve">.</w:t>
       </w:r>
     </w:p>
-    <w:bookmarkEnd w:id="97"/>
-    <w:bookmarkStart w:id="98" w:name="thm-pearson-r-range"/>
+    <w:bookmarkEnd w:id="98"/>
+    <w:bookmarkStart w:id="99" w:name="thm-pearson-r-range"/>
     <w:p>
       <w:pPr>
         <w:pStyle w:val="BodyText"/>
@@ -11844,7 +11858,7 @@
         <w:t xml:space="preserve">if and only if they lie on a straight line with negative slope.</w:t>
       </w:r>
     </w:p>
-    <w:bookmarkEnd w:id="98"/>
+    <w:bookmarkEnd w:id="99"/>
     <w:p>
       <w:pPr>
         <w:pStyle w:val="BodyText"/>
@@ -12988,7 +13002,7 @@
         <w:t xml:space="preserve">.</w:t>
       </w:r>
     </w:p>
-    <w:bookmarkStart w:id="99" w:name="exm-pearson-r"/>
+    <w:bookmarkStart w:id="100" w:name="exm-pearson-r"/>
     <w:p>
       <w:pPr>
         <w:pStyle w:val="BodyText"/>
@@ -13127,7 +13141,7 @@
         <w:t xml:space="preserve">.</w:t>
       </w:r>
     </w:p>
-    <w:bookmarkEnd w:id="99"/>
+    <w:bookmarkEnd w:id="100"/>
     <w:tbl>
       <w:tblPr>
         <w:tblStyle w:val="Table"/>
@@ -13169,18 +13183,18 @@
                 <wp:inline>
                   <wp:extent cx="152400" cy="152400"/>
                   <wp:effectExtent b="0" l="0" r="0" t="0"/>
-                  <wp:docPr descr="" title="" id="101" name="Picture"/>
+                  <wp:docPr descr="" title="" id="102" name="Picture"/>
                   <a:graphic>
                     <a:graphicData uri="http://schemas.openxmlformats.org/drawingml/2006/picture">
                       <pic:pic>
                         <pic:nvPicPr>
-                          <pic:cNvPr descr="/opt/quarto/share/formats/docx/caution.png" id="102" name="Picture"/>
+                          <pic:cNvPr descr="/opt/quarto/share/formats/docx/caution.png" id="103" name="Picture"/>
                           <pic:cNvPicPr>
                             <a:picLocks noChangeArrowheads="1" noChangeAspect="1"/>
                           </pic:cNvPicPr>
                         </pic:nvPicPr>
                         <pic:blipFill>
-                          <a:blip r:embed="rId100"/>
+                          <a:blip r:embed="rId101"/>
                           <a:stretch>
                             <a:fillRect/>
                           </a:stretch>
@@ -13450,8 +13464,8 @@
         <w:t xml:space="preserve">covers scatterplots.</w:t>
       </w:r>
     </w:p>
-    <w:bookmarkEnd w:id="103"/>
-    <w:bookmarkStart w:id="113" w:name="X276b94a7d03810956e9ce51874e5dad5aed6d75"/>
+    <w:bookmarkEnd w:id="104"/>
+    <w:bookmarkStart w:id="114" w:name="X276b94a7d03810956e9ce51874e5dad5aed6d75"/>
     <w:p>
       <w:pPr>
         <w:pStyle w:val="Heading3"/>
@@ -13538,7 +13552,7 @@
       <w:tr>
         <w:tc>
           <w:tcPr/>
-          <w:bookmarkStart w:id="107" w:name="fig-box-chol-by-smoke"/>
+          <w:bookmarkStart w:id="108" w:name="fig-box-chol-by-smoke"/>
           <w:p>
             <w:pPr>
               <w:pStyle w:val="SourceCode"/>
@@ -13833,18 +13847,18 @@
                 <wp:inline>
                   <wp:extent cx="4620126" cy="3696101"/>
                   <wp:effectExtent b="0" l="0" r="0" t="0"/>
-                  <wp:docPr descr="" title="" id="105" name="Picture"/>
+                  <wp:docPr descr="" title="" id="106" name="Picture"/>
                   <a:graphic>
                     <a:graphicData uri="http://schemas.openxmlformats.org/drawingml/2006/picture">
                       <pic:pic>
                         <pic:nvPicPr>
-                          <pic:cNvPr descr="exploratory-descriptive_files/figure-docx/unnamed-chunk-14-1.png" id="106" name="Picture"/>
+                          <pic:cNvPr descr="exploratory-descriptive_files/figure-docx/unnamed-chunk-14-1.png" id="107" name="Picture"/>
                           <pic:cNvPicPr>
                             <a:picLocks noChangeArrowheads="1" noChangeAspect="1"/>
                           </pic:cNvPicPr>
                         </pic:nvPicPr>
                         <pic:blipFill>
-                          <a:blip r:embed="rId104"/>
+                          <a:blip r:embed="rId105"/>
                           <a:stretch>
                             <a:fillRect/>
                           </a:stretch>
@@ -13884,7 +13898,7 @@
               <w:t xml:space="preserve">Figure 7: Box plots of cholesterol by smoking status in the WCGS dataset</w:t>
             </w:r>
           </w:p>
-          <w:bookmarkEnd w:id="107"/>
+          <w:bookmarkEnd w:id="108"/>
         </w:tc>
       </w:tr>
     </w:tbl>
@@ -13902,7 +13916,7 @@
       <w:tr>
         <w:tc>
           <w:tcPr/>
-          <w:bookmarkStart w:id="111" w:name="fig-box-chol-by-behpat"/>
+          <w:bookmarkStart w:id="112" w:name="fig-box-chol-by-behpat"/>
           <w:p>
             <w:pPr>
               <w:pStyle w:val="SourceCode"/>
@@ -14197,18 +14211,18 @@
                 <wp:inline>
                   <wp:extent cx="4620126" cy="3696101"/>
                   <wp:effectExtent b="0" l="0" r="0" t="0"/>
-                  <wp:docPr descr="" title="" id="109" name="Picture"/>
+                  <wp:docPr descr="" title="" id="110" name="Picture"/>
                   <a:graphic>
                     <a:graphicData uri="http://schemas.openxmlformats.org/drawingml/2006/picture">
                       <pic:pic>
                         <pic:nvPicPr>
-                          <pic:cNvPr descr="exploratory-descriptive_files/figure-docx/unnamed-chunk-15-1.png" id="110" name="Picture"/>
+                          <pic:cNvPr descr="exploratory-descriptive_files/figure-docx/unnamed-chunk-15-1.png" id="111" name="Picture"/>
                           <pic:cNvPicPr>
                             <a:picLocks noChangeArrowheads="1" noChangeAspect="1"/>
                           </pic:cNvPicPr>
                         </pic:nvPicPr>
                         <pic:blipFill>
-                          <a:blip r:embed="rId108"/>
+                          <a:blip r:embed="rId109"/>
                           <a:stretch>
                             <a:fillRect/>
                           </a:stretch>
@@ -14248,7 +14262,7 @@
               <w:t xml:space="preserve">Figure 8: Box plots of cholesterol by behavioral pattern in the WCGS dataset</w:t>
             </w:r>
           </w:p>
-          <w:bookmarkEnd w:id="111"/>
+          <w:bookmarkEnd w:id="112"/>
         </w:tc>
       </w:tr>
     </w:tbl>
@@ -14284,7 +14298,7 @@
       <w:tr>
         <w:tc>
           <w:tcPr/>
-          <w:bookmarkStart w:id="112" w:name="tbl-chol-by-chd"/>
+          <w:bookmarkStart w:id="113" w:name="tbl-chol-by-chd"/>
           <w:p>
             <w:pPr>
               <w:jc w:val="center"/>
@@ -15225,12 +15239,12 @@
               </w:tc>
             </w:tr>
           </w:tbl>
-          <w:bookmarkEnd w:id="112"/>
+          <w:bookmarkEnd w:id="113"/>
         </w:tc>
       </w:tr>
     </w:tbl>
-    <w:bookmarkEnd w:id="113"/>
-    <w:bookmarkStart w:id="118" w:name="two-categorical-variables"/>
+    <w:bookmarkEnd w:id="114"/>
+    <w:bookmarkStart w:id="119" w:name="two-categorical-variables"/>
     <w:p>
       <w:pPr>
         <w:pStyle w:val="Heading3"/>
@@ -15239,7 +15253,7 @@
         <w:t xml:space="preserve">4.3 Two categorical variables</w:t>
       </w:r>
     </w:p>
-    <w:bookmarkStart w:id="115" w:name="def-contingency-table"/>
+    <w:bookmarkStart w:id="116" w:name="def-contingency-table"/>
     <w:p>
       <w:pPr>
         <w:pStyle w:val="FirstParagraph"/>
@@ -15295,7 +15309,7 @@
       <w:r>
         <w:t xml:space="preserve"> </w:t>
       </w:r>
-      <w:hyperlink r:id="rId114">
+      <w:hyperlink r:id="rId115">
         <w:r>
           <w:rPr>
             <w:rStyle w:val="Hyperlink"/>
@@ -15699,8 +15713,8 @@
         <w:t xml:space="preserve">.</w:t>
       </w:r>
     </w:p>
-    <w:bookmarkEnd w:id="115"/>
-    <w:bookmarkStart w:id="117" w:name="exm-contingency-table"/>
+    <w:bookmarkEnd w:id="116"/>
+    <w:bookmarkStart w:id="118" w:name="exm-contingency-table"/>
     <w:p>
       <w:pPr>
         <w:pStyle w:val="BodyText"/>
@@ -16024,7 +16038,7 @@
       <w:tr>
         <w:tc>
           <w:tcPr/>
-          <w:bookmarkStart w:id="116" w:name="tbl-gtsummary-smoke-chd"/>
+          <w:bookmarkStart w:id="117" w:name="tbl-gtsummary-smoke-chd"/>
           <w:p>
             <w:pPr>
               <w:jc w:val="center"/>
@@ -16497,14 +16511,14 @@
               </w:tc>
             </w:tr>
           </w:tbl>
-          <w:bookmarkEnd w:id="116"/>
+          <w:bookmarkEnd w:id="117"/>
         </w:tc>
       </w:tr>
     </w:tbl>
-    <w:bookmarkEnd w:id="117"/>
     <w:bookmarkEnd w:id="118"/>
     <w:bookmarkEnd w:id="119"/>
-    <w:bookmarkStart w:id="141" w:name="data-transformations"/>
+    <w:bookmarkEnd w:id="120"/>
+    <w:bookmarkStart w:id="142" w:name="data-transformations"/>
     <w:p>
       <w:pPr>
         <w:pStyle w:val="Heading2"/>
@@ -16813,7 +16827,7 @@
         <w:t xml:space="preserve">.</w:t>
       </w:r>
     </w:p>
-    <w:bookmarkStart w:id="128" w:name="fig-hist-sbp-log"/>
+    <w:bookmarkStart w:id="129" w:name="fig-hist-sbp-log"/>
     <w:tbl>
       <w:tblPr>
         <w:tblStyle w:val="Table"/>
@@ -16841,7 +16855,7 @@
             <w:tr>
               <w:tc>
                 <w:tcPr/>
-                <w:bookmarkStart w:id="123" w:name="fig-hist-sbp-raw"/>
+                <w:bookmarkStart w:id="124" w:name="fig-hist-sbp-raw"/>
                 <w:p>
                   <w:pPr>
                     <w:pStyle w:val="SourceCode"/>
@@ -17129,18 +17143,18 @@
                       <wp:inline>
                         <wp:extent cx="2971800" cy="2377440"/>
                         <wp:effectExtent b="0" l="0" r="0" t="0"/>
-                        <wp:docPr descr="" title="" id="121" name="Picture"/>
+                        <wp:docPr descr="" title="" id="122" name="Picture"/>
                         <a:graphic>
                           <a:graphicData uri="http://schemas.openxmlformats.org/drawingml/2006/picture">
                             <pic:pic>
                               <pic:nvPicPr>
-                                <pic:cNvPr descr="exploratory-descriptive_files/figure-docx/unnamed-chunk-18-1.png" id="122" name="Picture"/>
+                                <pic:cNvPr descr="exploratory-descriptive_files/figure-docx/unnamed-chunk-18-1.png" id="123" name="Picture"/>
                                 <pic:cNvPicPr>
                                   <a:picLocks noChangeArrowheads="1" noChangeAspect="1"/>
                                 </pic:cNvPicPr>
                               </pic:nvPicPr>
                               <pic:blipFill>
-                                <a:blip r:embed="rId120"/>
+                                <a:blip r:embed="rId121"/>
                                 <a:stretch>
                                   <a:fillRect/>
                                 </a:stretch>
@@ -17181,7 +17195,7 @@
                     <w:t xml:space="preserve">(a) Raw scale</w:t>
                   </w:r>
                 </w:p>
-                <w:bookmarkEnd w:id="123"/>
+                <w:bookmarkEnd w:id="124"/>
               </w:tc>
             </w:tr>
           </w:tbl>
@@ -17231,7 +17245,7 @@
             <w:tr>
               <w:tc>
                 <w:tcPr/>
-                <w:bookmarkStart w:id="127" w:name="fig-hist-sbp-logscale"/>
+                <w:bookmarkStart w:id="128" w:name="fig-hist-sbp-logscale"/>
                 <w:p>
                   <w:pPr>
                     <w:pStyle w:val="SourceCode"/>
@@ -17612,18 +17626,18 @@
                       <wp:inline>
                         <wp:extent cx="2971800" cy="2377440"/>
                         <wp:effectExtent b="0" l="0" r="0" t="0"/>
-                        <wp:docPr descr="" title="" id="125" name="Picture"/>
+                        <wp:docPr descr="" title="" id="126" name="Picture"/>
                         <a:graphic>
                           <a:graphicData uri="http://schemas.openxmlformats.org/drawingml/2006/picture">
                             <pic:pic>
                               <pic:nvPicPr>
-                                <pic:cNvPr descr="exploratory-descriptive_files/figure-docx/unnamed-chunk-19-1.png" id="126" name="Picture"/>
+                                <pic:cNvPr descr="exploratory-descriptive_files/figure-docx/unnamed-chunk-19-1.png" id="127" name="Picture"/>
                                 <pic:cNvPicPr>
                                   <a:picLocks noChangeArrowheads="1" noChangeAspect="1"/>
                                 </pic:cNvPicPr>
                               </pic:nvPicPr>
                               <pic:blipFill>
-                                <a:blip r:embed="rId124"/>
+                                <a:blip r:embed="rId125"/>
                                 <a:stretch>
                                   <a:fillRect/>
                                 </a:stretch>
@@ -17664,7 +17678,7 @@
                     <w:t xml:space="preserve">(b) Log scale</w:t>
                   </w:r>
                 </w:p>
-                <w:bookmarkEnd w:id="127"/>
+                <w:bookmarkEnd w:id="128"/>
               </w:tc>
             </w:tr>
           </w:tbl>
@@ -17714,7 +17728,7 @@
         <w:t xml:space="preserve">.</w:t>
       </w:r>
     </w:p>
-    <w:bookmarkEnd w:id="128"/>
+    <w:bookmarkEnd w:id="129"/>
     <w:p>
       <w:pPr>
         <w:pStyle w:val="SourceCode"/>
@@ -18103,7 +18117,7 @@
         <w:t xml:space="preserve">the assumptions of that model and on the scientific question.</w:t>
       </w:r>
     </w:p>
-    <w:bookmarkStart w:id="140" w:name="sec-rescaling"/>
+    <w:bookmarkStart w:id="141" w:name="sec-rescaling"/>
     <w:p>
       <w:pPr>
         <w:pStyle w:val="Heading3"/>
@@ -18112,7 +18126,7 @@
         <w:t xml:space="preserve">5.1 Rescaling a variable</w:t>
       </w:r>
     </w:p>
-    <w:bookmarkStart w:id="129" w:name="exr-standardize"/>
+    <w:bookmarkStart w:id="130" w:name="exr-standardize"/>
     <w:p>
       <w:pPr>
         <w:pStyle w:val="FirstParagraph"/>
@@ -18221,8 +18235,8 @@
         <w:t xml:space="preserve">What are the units of your answer to part 2?</w:t>
       </w:r>
     </w:p>
-    <w:bookmarkEnd w:id="129"/>
-    <w:bookmarkStart w:id="130" w:name="sol-standardize"/>
+    <w:bookmarkEnd w:id="130"/>
+    <w:bookmarkStart w:id="131" w:name="sol-standardize"/>
     <w:p>
       <w:pPr>
         <w:pStyle w:val="FirstParagraph"/>
@@ -18606,8 +18620,8 @@
         <w:t xml:space="preserve">so the answer has no units.</w:t>
       </w:r>
     </w:p>
-    <w:bookmarkEnd w:id="130"/>
-    <w:bookmarkStart w:id="131" w:name="def-standardization"/>
+    <w:bookmarkEnd w:id="131"/>
+    <w:bookmarkStart w:id="132" w:name="def-standardization"/>
     <w:p>
       <w:pPr>
         <w:pStyle w:val="FirstParagraph"/>
@@ -18953,8 +18967,8 @@
         <w:t xml:space="preserve">.</w:t>
       </w:r>
     </w:p>
-    <w:bookmarkEnd w:id="131"/>
-    <w:bookmarkStart w:id="132" w:name="rem-source-standardization"/>
+    <w:bookmarkEnd w:id="132"/>
+    <w:bookmarkStart w:id="133" w:name="rem-source-standardization"/>
     <w:p>
       <w:pPr>
         <w:pStyle w:val="BodyText"/>
@@ -18964,7 +18978,7 @@
           <w:i/>
           <w:iCs/>
         </w:rPr>
-        <w:t xml:space="preserve">Remark 5</w:t>
+        <w:t xml:space="preserve">Remark 6</w:t>
       </w:r>
       <w:r>
         <w:t xml:space="preserve"> (Source: Standardization). </w:t>
@@ -19003,8 +19017,8 @@
         <w:t xml:space="preserve">.</w:t>
       </w:r>
     </w:p>
-    <w:bookmarkEnd w:id="132"/>
-    <w:bookmarkStart w:id="133" w:name="rem-standardization-units"/>
+    <w:bookmarkEnd w:id="133"/>
+    <w:bookmarkStart w:id="134" w:name="rem-standardization-units"/>
     <w:p>
       <w:pPr>
         <w:pStyle w:val="BodyText"/>
@@ -19014,7 +19028,7 @@
           <w:i/>
           <w:iCs/>
         </w:rPr>
-        <w:t xml:space="preserve">Remark 6</w:t>
+        <w:t xml:space="preserve">Remark 7</w:t>
       </w:r>
       <w:r>
         <w:t xml:space="preserve"> (Standardized values have no units). </w:t>
@@ -19079,8 +19093,8 @@
         <w:t xml:space="preserve">both become unitless numbers of standard deviations.</w:t>
       </w:r>
     </w:p>
-    <w:bookmarkEnd w:id="133"/>
-    <w:bookmarkStart w:id="134" w:name="thm-standardized-mean-sd"/>
+    <w:bookmarkEnd w:id="134"/>
+    <w:bookmarkStart w:id="135" w:name="thm-standardized-mean-sd"/>
     <w:p>
       <w:pPr>
         <w:pStyle w:val="BodyText"/>
@@ -19237,7 +19251,7 @@
         <w:t xml:space="preserve">.</w:t>
       </w:r>
     </w:p>
-    <w:bookmarkEnd w:id="134"/>
+    <w:bookmarkEnd w:id="135"/>
     <w:p>
       <w:pPr>
         <w:pStyle w:val="BodyText"/>
@@ -19950,7 +19964,7 @@
         <w:t xml:space="preserve">.</w:t>
       </w:r>
     </w:p>
-    <w:bookmarkStart w:id="135" w:name="rem-source-standardized-mean-sd"/>
+    <w:bookmarkStart w:id="136" w:name="rem-source-standardized-mean-sd"/>
     <w:p>
       <w:pPr>
         <w:pStyle w:val="BodyText"/>
@@ -19960,7 +19974,7 @@
           <w:i/>
           <w:iCs/>
         </w:rPr>
-        <w:t xml:space="preserve">Remark 7</w:t>
+        <w:t xml:space="preserve">Remark 8</w:t>
       </w:r>
       <w:r>
         <w:t xml:space="preserve"> (Source: Standardized values have sample mean 0 and sample standard deviation 1). </w:t>
@@ -19984,8 +19998,8 @@
         <w:t xml:space="preserve">the proof is the elementary calculation.</w:t>
       </w:r>
     </w:p>
-    <w:bookmarkEnd w:id="135"/>
-    <w:bookmarkStart w:id="136" w:name="exm-scale-wcgs"/>
+    <w:bookmarkEnd w:id="136"/>
+    <w:bookmarkStart w:id="137" w:name="exm-scale-wcgs"/>
     <w:p>
       <w:pPr>
         <w:pStyle w:val="BodyText"/>
@@ -20263,8 +20277,8 @@
         <w:t xml:space="preserve">is needed because 12 of the cholesterol values are missing.</w:t>
       </w:r>
     </w:p>
-    <w:bookmarkEnd w:id="136"/>
-    <w:bookmarkStart w:id="137" w:name="def-min-max-scaling"/>
+    <w:bookmarkEnd w:id="137"/>
+    <w:bookmarkStart w:id="138" w:name="def-min-max-scaling"/>
     <w:p>
       <w:pPr>
         <w:pStyle w:val="BodyText"/>
@@ -20573,8 +20587,8 @@
         <w:t xml:space="preserve">.</w:t>
       </w:r>
     </w:p>
-    <w:bookmarkEnd w:id="137"/>
-    <w:bookmarkStart w:id="138" w:name="rem-min-max-outliers"/>
+    <w:bookmarkEnd w:id="138"/>
+    <w:bookmarkStart w:id="139" w:name="rem-min-max-outliers"/>
     <w:p>
       <w:pPr>
         <w:pStyle w:val="BodyText"/>
@@ -20584,7 +20598,7 @@
           <w:i/>
           <w:iCs/>
         </w:rPr>
-        <w:t xml:space="preserve">Remark 8</w:t>
+        <w:t xml:space="preserve">Remark 9</w:t>
       </w:r>
       <w:r>
         <w:t xml:space="preserve"> (Min-max scaling and outliers). </w:t>
@@ -20780,8 +20794,8 @@
         <w:t xml:space="preserve">.</w:t>
       </w:r>
     </w:p>
-    <w:bookmarkEnd w:id="138"/>
-    <w:bookmarkStart w:id="139" w:name="exm-min-max-wcgs"/>
+    <w:bookmarkEnd w:id="139"/>
+    <w:bookmarkStart w:id="140" w:name="exm-min-max-wcgs"/>
     <w:p>
       <w:pPr>
         <w:pStyle w:val="BodyText"/>
@@ -21020,10 +21034,10 @@
         <w:t xml:space="preserve">but have no units.</w:t>
       </w:r>
     </w:p>
-    <w:bookmarkEnd w:id="139"/>
     <w:bookmarkEnd w:id="140"/>
     <w:bookmarkEnd w:id="141"/>
-    <w:bookmarkStart w:id="143" w:name="an-exploratory-data-analysis-workflow"/>
+    <w:bookmarkEnd w:id="142"/>
+    <w:bookmarkStart w:id="144" w:name="an-exploratory-data-analysis-workflow"/>
     <w:p>
       <w:pPr>
         <w:pStyle w:val="Heading2"/>
@@ -21251,7 +21265,7 @@
       <w:tr>
         <w:tc>
           <w:tcPr/>
-          <w:bookmarkStart w:id="142" w:name="tbl-wcgs-all-summary"/>
+          <w:bookmarkStart w:id="143" w:name="tbl-wcgs-all-summary"/>
           <w:p>
             <w:pPr>
               <w:jc w:val="center"/>
@@ -22432,12 +22446,12 @@
               </w:tc>
             </w:tr>
           </w:tbl>
-          <w:bookmarkEnd w:id="142"/>
+          <w:bookmarkEnd w:id="143"/>
         </w:tc>
       </w:tr>
     </w:tbl>
-    <w:bookmarkEnd w:id="143"/>
-    <w:bookmarkStart w:id="147" w:name="further-reading"/>
+    <w:bookmarkEnd w:id="144"/>
+    <w:bookmarkStart w:id="148" w:name="further-reading"/>
     <w:p>
       <w:pPr>
         <w:pStyle w:val="Heading2"/>
@@ -22450,7 +22464,7 @@
       <w:pPr>
         <w:pStyle w:val="FirstParagraph"/>
       </w:pPr>
-      <w:hyperlink r:id="rId144">
+      <w:hyperlink r:id="rId145">
         <w:r>
           <w:rPr>
             <w:rStyle w:val="Hyperlink"/>
@@ -22467,7 +22481,7 @@
       <w:r>
         <w:t xml:space="preserve"> </w:t>
       </w:r>
-      <w:hyperlink r:id="rId69">
+      <w:hyperlink r:id="rId70">
         <w:r>
           <w:rPr>
             <w:rStyle w:val="Hyperlink"/>
@@ -22490,7 +22504,7 @@
       <w:r>
         <w:t xml:space="preserve"> </w:t>
       </w:r>
-      <w:hyperlink r:id="rId145">
+      <w:hyperlink r:id="rId146">
         <w:r>
           <w:rPr>
             <w:rStyle w:val="Hyperlink"/>
@@ -22513,7 +22527,7 @@
       <w:r>
         <w:t xml:space="preserve"> </w:t>
       </w:r>
-      <w:hyperlink r:id="rId146">
+      <w:hyperlink r:id="rId147">
         <w:r>
           <w:rPr>
             <w:rStyle w:val="Hyperlink"/>
@@ -22528,8 +22542,8 @@
         <w:t xml:space="preserve">of the WCGS data, in R and Python.</w:t>
       </w:r>
     </w:p>
-    <w:bookmarkEnd w:id="147"/>
-    <w:bookmarkStart w:id="192" w:name="references"/>
+    <w:bookmarkEnd w:id="148"/>
+    <w:bookmarkStart w:id="193" w:name="references"/>
     <w:p>
       <w:pPr>
         <w:pStyle w:val="Heading2"/>
@@ -22538,8 +22552,8 @@
         <w:t xml:space="preserve">References</w:t>
       </w:r>
     </w:p>
-    <w:bookmarkStart w:id="191" w:name="refs"/>
-    <w:bookmarkStart w:id="149" w:name="ref-vittinghoff2e"/>
+    <w:bookmarkStart w:id="192" w:name="refs"/>
+    <w:bookmarkStart w:id="150" w:name="ref-vittinghoff2e"/>
     <w:p>
       <w:pPr>
         <w:pStyle w:val="Bibliography"/>
@@ -22572,7 +22586,7 @@
       <w:r>
         <w:t xml:space="preserve"> </w:t>
       </w:r>
-      <w:hyperlink r:id="rId148">
+      <w:hyperlink r:id="rId149">
         <w:r>
           <w:rPr>
             <w:rStyle w:val="Hyperlink"/>
@@ -22584,8 +22598,8 @@
         <w:t xml:space="preserve">.</w:t>
       </w:r>
     </w:p>
-    <w:bookmarkEnd w:id="149"/>
-    <w:bookmarkStart w:id="151" w:name="ref-rosenman1975coronary"/>
+    <w:bookmarkEnd w:id="150"/>
+    <w:bookmarkStart w:id="152" w:name="ref-rosenman1975coronary"/>
     <w:p>
       <w:pPr>
         <w:pStyle w:val="Bibliography"/>
@@ -22633,7 +22647,7 @@
       <w:r>
         <w:t xml:space="preserve"> </w:t>
       </w:r>
-      <w:hyperlink r:id="rId150">
+      <w:hyperlink r:id="rId151">
         <w:r>
           <w:rPr>
             <w:rStyle w:val="Hyperlink"/>
@@ -22645,8 +22659,8 @@
         <w:t xml:space="preserve">.</w:t>
       </w:r>
     </w:p>
-    <w:bookmarkEnd w:id="151"/>
-    <w:bookmarkStart w:id="153" w:name="ref-wikipedia_statistical_population"/>
+    <w:bookmarkEnd w:id="152"/>
+    <w:bookmarkStart w:id="154" w:name="ref-wikipedia_statistical_population"/>
     <w:p>
       <w:pPr>
         <w:pStyle w:val="Bibliography"/>
@@ -22693,7 +22707,7 @@
       <w:r>
         <w:t xml:space="preserve"> </w:t>
       </w:r>
-      <w:hyperlink r:id="rId152">
+      <w:hyperlink r:id="rId153">
         <w:r>
           <w:rPr>
             <w:rStyle w:val="Hyperlink"/>
@@ -22702,8 +22716,8 @@
         </w:r>
       </w:hyperlink>
     </w:p>
-    <w:bookmarkEnd w:id="153"/>
-    <w:bookmarkStart w:id="155" w:name="ref-wikipedia_simple_random_sample"/>
+    <w:bookmarkEnd w:id="154"/>
+    <w:bookmarkStart w:id="156" w:name="ref-wikipedia_simple_random_sample"/>
     <w:p>
       <w:pPr>
         <w:pStyle w:val="Bibliography"/>
@@ -22750,7 +22764,7 @@
       <w:r>
         <w:t xml:space="preserve"> </w:t>
       </w:r>
-      <w:hyperlink r:id="rId154">
+      <w:hyperlink r:id="rId155">
         <w:r>
           <w:rPr>
             <w:rStyle w:val="Hyperlink"/>
@@ -22759,8 +22773,8 @@
         </w:r>
       </w:hyperlink>
     </w:p>
-    <w:bookmarkEnd w:id="155"/>
-    <w:bookmarkStart w:id="157" w:name="ref-wikipedia_median"/>
+    <w:bookmarkEnd w:id="156"/>
+    <w:bookmarkStart w:id="158" w:name="ref-wikipedia_median"/>
     <w:p>
       <w:pPr>
         <w:pStyle w:val="Bibliography"/>
@@ -22807,7 +22821,7 @@
       <w:r>
         <w:t xml:space="preserve"> </w:t>
       </w:r>
-      <w:hyperlink r:id="rId156">
+      <w:hyperlink r:id="rId157">
         <w:r>
           <w:rPr>
             <w:rStyle w:val="Hyperlink"/>
@@ -22816,8 +22830,8 @@
         </w:r>
       </w:hyperlink>
     </w:p>
-    <w:bookmarkEnd w:id="157"/>
-    <w:bookmarkStart w:id="159" w:name="ref-wikipedia_variance"/>
+    <w:bookmarkEnd w:id="158"/>
+    <w:bookmarkStart w:id="160" w:name="ref-wikipedia_variance"/>
     <w:p>
       <w:pPr>
         <w:pStyle w:val="Bibliography"/>
@@ -22864,7 +22878,7 @@
       <w:r>
         <w:t xml:space="preserve"> </w:t>
       </w:r>
-      <w:hyperlink r:id="rId158">
+      <w:hyperlink r:id="rId159">
         <w:r>
           <w:rPr>
             <w:rStyle w:val="Hyperlink"/>
@@ -22873,8 +22887,8 @@
         </w:r>
       </w:hyperlink>
     </w:p>
-    <w:bookmarkEnd w:id="159"/>
-    <w:bookmarkStart w:id="161" w:name="ref-wikipedia_standard_deviation"/>
+    <w:bookmarkEnd w:id="160"/>
+    <w:bookmarkStart w:id="162" w:name="ref-wikipedia_standard_deviation"/>
     <w:p>
       <w:pPr>
         <w:pStyle w:val="Bibliography"/>
@@ -22921,7 +22935,7 @@
       <w:r>
         <w:t xml:space="preserve"> </w:t>
       </w:r>
-      <w:hyperlink r:id="rId160">
+      <w:hyperlink r:id="rId161">
         <w:r>
           <w:rPr>
             <w:rStyle w:val="Hyperlink"/>
@@ -22930,8 +22944,8 @@
         </w:r>
       </w:hyperlink>
     </w:p>
-    <w:bookmarkEnd w:id="161"/>
-    <w:bookmarkStart w:id="163" w:name="ref-wikipedia_quartile"/>
+    <w:bookmarkEnd w:id="162"/>
+    <w:bookmarkStart w:id="164" w:name="ref-wikipedia_quartile"/>
     <w:p>
       <w:pPr>
         <w:pStyle w:val="Bibliography"/>
@@ -22978,7 +22992,7 @@
       <w:r>
         <w:t xml:space="preserve"> </w:t>
       </w:r>
-      <w:hyperlink r:id="rId162">
+      <w:hyperlink r:id="rId163">
         <w:r>
           <w:rPr>
             <w:rStyle w:val="Hyperlink"/>
@@ -22987,8 +23001,8 @@
         </w:r>
       </w:hyperlink>
     </w:p>
-    <w:bookmarkEnd w:id="163"/>
-    <w:bookmarkStart w:id="165" w:name="ref-wikipedia_interquartile_range"/>
+    <w:bookmarkEnd w:id="164"/>
+    <w:bookmarkStart w:id="166" w:name="ref-wikipedia_interquartile_range"/>
     <w:p>
       <w:pPr>
         <w:pStyle w:val="Bibliography"/>
@@ -23035,7 +23049,7 @@
       <w:r>
         <w:t xml:space="preserve"> </w:t>
       </w:r>
-      <w:hyperlink r:id="rId164">
+      <w:hyperlink r:id="rId165">
         <w:r>
           <w:rPr>
             <w:rStyle w:val="Hyperlink"/>
@@ -23044,8 +23058,8 @@
         </w:r>
       </w:hyperlink>
     </w:p>
-    <w:bookmarkEnd w:id="165"/>
-    <w:bookmarkStart w:id="166" w:name="ref-hoggtanis2015"/>
+    <w:bookmarkEnd w:id="166"/>
+    <w:bookmarkStart w:id="167" w:name="ref-hoggtanis2015"/>
     <w:p>
       <w:pPr>
         <w:pStyle w:val="Bibliography"/>
@@ -23076,8 +23090,8 @@
         <w:t xml:space="preserve">, Tenth edition. Boston: Pearson, 2019.</w:t>
       </w:r>
     </w:p>
-    <w:bookmarkEnd w:id="166"/>
-    <w:bookmarkStart w:id="167" w:name="ref-rice2007mathematical"/>
+    <w:bookmarkEnd w:id="167"/>
+    <w:bookmarkStart w:id="168" w:name="ref-rice2007mathematical"/>
     <w:p>
       <w:pPr>
         <w:pStyle w:val="Bibliography"/>
@@ -23108,8 +23122,8 @@
         <w:t xml:space="preserve">, 3rd ed. Belmont, CA: Cengage Learning, 2007.</w:t>
       </w:r>
     </w:p>
-    <w:bookmarkEnd w:id="167"/>
-    <w:bookmarkStart w:id="169" w:name="ref-wikipedia_histogram"/>
+    <w:bookmarkEnd w:id="168"/>
+    <w:bookmarkStart w:id="170" w:name="ref-wikipedia_histogram"/>
     <w:p>
       <w:pPr>
         <w:pStyle w:val="Bibliography"/>
@@ -23156,7 +23170,7 @@
       <w:r>
         <w:t xml:space="preserve"> </w:t>
       </w:r>
-      <w:hyperlink r:id="rId168">
+      <w:hyperlink r:id="rId169">
         <w:r>
           <w:rPr>
             <w:rStyle w:val="Hyperlink"/>
@@ -23165,8 +23179,8 @@
         </w:r>
       </w:hyperlink>
     </w:p>
-    <w:bookmarkEnd w:id="169"/>
-    <w:bookmarkStart w:id="171" w:name="ref-wikipedia_kernel_density_estimation"/>
+    <w:bookmarkEnd w:id="170"/>
+    <w:bookmarkStart w:id="172" w:name="ref-wikipedia_kernel_density_estimation"/>
     <w:p>
       <w:pPr>
         <w:pStyle w:val="Bibliography"/>
@@ -23213,7 +23227,7 @@
       <w:r>
         <w:t xml:space="preserve"> </w:t>
       </w:r>
-      <w:hyperlink r:id="rId170">
+      <w:hyperlink r:id="rId171">
         <w:r>
           <w:rPr>
             <w:rStyle w:val="Hyperlink"/>
@@ -23222,8 +23236,8 @@
         </w:r>
       </w:hyperlink>
     </w:p>
-    <w:bookmarkEnd w:id="171"/>
-    <w:bookmarkStart w:id="173" w:name="ref-wikipedia_box_plot"/>
+    <w:bookmarkEnd w:id="172"/>
+    <w:bookmarkStart w:id="174" w:name="ref-wikipedia_box_plot"/>
     <w:p>
       <w:pPr>
         <w:pStyle w:val="Bibliography"/>
@@ -23270,7 +23284,7 @@
       <w:r>
         <w:t xml:space="preserve"> </w:t>
       </w:r>
-      <w:hyperlink r:id="rId172">
+      <w:hyperlink r:id="rId173">
         <w:r>
           <w:rPr>
             <w:rStyle w:val="Hyperlink"/>
@@ -23279,8 +23293,8 @@
         </w:r>
       </w:hyperlink>
     </w:p>
-    <w:bookmarkEnd w:id="173"/>
-    <w:bookmarkStart w:id="175" w:name="ref-wikipedia_bar_chart"/>
+    <w:bookmarkEnd w:id="174"/>
+    <w:bookmarkStart w:id="176" w:name="ref-wikipedia_bar_chart"/>
     <w:p>
       <w:pPr>
         <w:pStyle w:val="Bibliography"/>
@@ -23327,7 +23341,7 @@
       <w:r>
         <w:t xml:space="preserve"> </w:t>
       </w:r>
-      <w:hyperlink r:id="rId174">
+      <w:hyperlink r:id="rId175">
         <w:r>
           <w:rPr>
             <w:rStyle w:val="Hyperlink"/>
@@ -23336,8 +23350,8 @@
         </w:r>
       </w:hyperlink>
     </w:p>
-    <w:bookmarkEnd w:id="175"/>
-    <w:bookmarkStart w:id="177" w:name="ref-wikipedia_q_q_plot"/>
+    <w:bookmarkEnd w:id="176"/>
+    <w:bookmarkStart w:id="178" w:name="ref-wikipedia_q_q_plot"/>
     <w:p>
       <w:pPr>
         <w:pStyle w:val="Bibliography"/>
@@ -23384,7 +23398,7 @@
       <w:r>
         <w:t xml:space="preserve"> </w:t>
       </w:r>
-      <w:hyperlink r:id="rId176">
+      <w:hyperlink r:id="rId177">
         <w:r>
           <w:rPr>
             <w:rStyle w:val="Hyperlink"/>
@@ -23393,8 +23407,8 @@
         </w:r>
       </w:hyperlink>
     </w:p>
-    <w:bookmarkEnd w:id="177"/>
-    <w:bookmarkStart w:id="179" w:name="ref-wikipedia_scatter_plot"/>
+    <w:bookmarkEnd w:id="178"/>
+    <w:bookmarkStart w:id="180" w:name="ref-wikipedia_scatter_plot"/>
     <w:p>
       <w:pPr>
         <w:pStyle w:val="Bibliography"/>
@@ -23441,7 +23455,7 @@
       <w:r>
         <w:t xml:space="preserve"> </w:t>
       </w:r>
-      <w:hyperlink r:id="rId178">
+      <w:hyperlink r:id="rId179">
         <w:r>
           <w:rPr>
             <w:rStyle w:val="Hyperlink"/>
@@ -23450,8 +23464,8 @@
         </w:r>
       </w:hyperlink>
     </w:p>
-    <w:bookmarkEnd w:id="179"/>
-    <w:bookmarkStart w:id="181" w:name="X9c68751dcff429bb8eebfb08e71b6f746222990"/>
+    <w:bookmarkEnd w:id="180"/>
+    <w:bookmarkStart w:id="182" w:name="X9c68751dcff429bb8eebfb08e71b6f746222990"/>
     <w:p>
       <w:pPr>
         <w:pStyle w:val="Bibliography"/>
@@ -23498,7 +23512,7 @@
       <w:r>
         <w:t xml:space="preserve"> </w:t>
       </w:r>
-      <w:hyperlink r:id="rId180">
+      <w:hyperlink r:id="rId181">
         <w:r>
           <w:rPr>
             <w:rStyle w:val="Hyperlink"/>
@@ -23507,8 +23521,8 @@
         </w:r>
       </w:hyperlink>
     </w:p>
-    <w:bookmarkEnd w:id="181"/>
-    <w:bookmarkStart w:id="183" w:name="ref-wikipedia_contingency_table"/>
+    <w:bookmarkEnd w:id="182"/>
+    <w:bookmarkStart w:id="184" w:name="ref-wikipedia_contingency_table"/>
     <w:p>
       <w:pPr>
         <w:pStyle w:val="Bibliography"/>
@@ -23555,7 +23569,7 @@
       <w:r>
         <w:t xml:space="preserve"> </w:t>
       </w:r>
-      <w:hyperlink r:id="rId182">
+      <w:hyperlink r:id="rId183">
         <w:r>
           <w:rPr>
             <w:rStyle w:val="Hyperlink"/>
@@ -23564,8 +23578,8 @@
         </w:r>
       </w:hyperlink>
     </w:p>
-    <w:bookmarkEnd w:id="183"/>
-    <w:bookmarkStart w:id="185" w:name="ref-wikipedia_standard_score"/>
+    <w:bookmarkEnd w:id="184"/>
+    <w:bookmarkStart w:id="186" w:name="ref-wikipedia_standard_score"/>
     <w:p>
       <w:pPr>
         <w:pStyle w:val="Bibliography"/>
@@ -23612,7 +23626,7 @@
       <w:r>
         <w:t xml:space="preserve"> </w:t>
       </w:r>
-      <w:hyperlink r:id="rId184">
+      <w:hyperlink r:id="rId185">
         <w:r>
           <w:rPr>
             <w:rStyle w:val="Hyperlink"/>
@@ -23621,8 +23635,8 @@
         </w:r>
       </w:hyperlink>
     </w:p>
-    <w:bookmarkEnd w:id="185"/>
-    <w:bookmarkStart w:id="187" w:name="ref-james2021islr2e"/>
+    <w:bookmarkEnd w:id="186"/>
+    <w:bookmarkStart w:id="188" w:name="ref-james2021islr2e"/>
     <w:p>
       <w:pPr>
         <w:pStyle w:val="Bibliography"/>
@@ -23669,7 +23683,7 @@
       <w:r>
         <w:t xml:space="preserve"> </w:t>
       </w:r>
-      <w:hyperlink r:id="rId186">
+      <w:hyperlink r:id="rId187">
         <w:r>
           <w:rPr>
             <w:rStyle w:val="Hyperlink"/>
@@ -23681,8 +23695,8 @@
         <w:t xml:space="preserve">.</w:t>
       </w:r>
     </w:p>
-    <w:bookmarkEnd w:id="187"/>
-    <w:bookmarkStart w:id="188" w:name="ref-geron2017hands"/>
+    <w:bookmarkEnd w:id="188"/>
+    <w:bookmarkStart w:id="189" w:name="ref-geron2017hands"/>
     <w:p>
       <w:pPr>
         <w:pStyle w:val="Bibliography"/>
@@ -23755,8 +23769,8 @@
         <w:t xml:space="preserve">, 1st ed. O’Reilly Media, 2017.</w:t>
       </w:r>
     </w:p>
-    <w:bookmarkEnd w:id="188"/>
-    <w:bookmarkStart w:id="190" w:name="ref-wikipedia_feature_scaling"/>
+    <w:bookmarkEnd w:id="189"/>
+    <w:bookmarkStart w:id="191" w:name="ref-wikipedia_feature_scaling"/>
     <w:p>
       <w:pPr>
         <w:pStyle w:val="Bibliography"/>
@@ -23803,7 +23817,7 @@
       <w:r>
         <w:t xml:space="preserve"> </w:t>
       </w:r>
-      <w:hyperlink r:id="rId189">
+      <w:hyperlink r:id="rId190">
         <w:r>
           <w:rPr>
             <w:rStyle w:val="Hyperlink"/>
@@ -23812,9 +23826,9 @@
         </w:r>
       </w:hyperlink>
     </w:p>
-    <w:bookmarkEnd w:id="190"/>
     <w:bookmarkEnd w:id="191"/>
     <w:bookmarkEnd w:id="192"/>
+    <w:bookmarkEnd w:id="193"/>
     <w:sectPr>
       <w:footnotePr>
         <w:numRestart w:val="eachSect"/>

</xml_diff>

<commit_message>
Deploying to gh-pages from @ Morrison-Lab/sds@1b1daca3411de8e96047888bc04e1831106db34c 🚀
</commit_message>
<xml_diff>
--- a/exploratory-descriptive-handout.docx
+++ b/exploratory-descriptive-handout.docx
@@ -15,7 +15,7 @@
         <w:pStyle w:val="Date"/>
       </w:pPr>
       <w:r>
-        <w:t xml:space="preserve">Last modified: 2026-10-26 23:10:36 (PDT)</w:t>
+        <w:t xml:space="preserve">Last modified: 2026-10-26 23:44:21 (PDT)</w:t>
       </w:r>
     </w:p>
     <w:bookmarkStart w:id="31" w:name="introduction"/>
@@ -10912,6 +10912,15 @@
               <w:t xml:space="preserve">(</w:t>
             </w:r>
             <w:r>
+              <w:br/>
+            </w:r>
+            <w:r>
+              <w:rPr>
+                <w:rStyle w:val="NormalTok"/>
+              </w:rPr>
+              <w:t xml:space="preserve">    </w:t>
+            </w:r>
+            <w:r>
               <w:rPr>
                 <w:rStyle w:val="AttributeTok"/>
               </w:rPr>
@@ -10933,12 +10942,54 @@
               <w:rPr>
                 <w:rStyle w:val="NormalTok"/>
               </w:rPr>
-              <w:t xml:space="preserve">, </w:t>
+              <w:t xml:space="preserve">,</w:t>
+            </w:r>
+            <w:r>
+              <w:br/>
+            </w:r>
+            <w:r>
+              <w:rPr>
+                <w:rStyle w:val="NormalTok"/>
+              </w:rPr>
+              <w:t xml:space="preserve">    </w:t>
             </w:r>
             <w:r>
               <w:rPr>
                 <w:rStyle w:val="AttributeTok"/>
               </w:rPr>
+              <w:t xml:space="preserve">formula =</w:t>
+            </w:r>
+            <w:r>
+              <w:rPr>
+                <w:rStyle w:val="NormalTok"/>
+              </w:rPr>
+              <w:t xml:space="preserve"> y </w:t>
+            </w:r>
+            <w:r>
+              <w:rPr>
+                <w:rStyle w:val="SpecialCharTok"/>
+              </w:rPr>
+              <w:t xml:space="preserve">~</w:t>
+            </w:r>
+            <w:r>
+              <w:rPr>
+                <w:rStyle w:val="NormalTok"/>
+              </w:rPr>
+              <w:t xml:space="preserve"> x,</w:t>
+            </w:r>
+            <w:r>
+              <w:br/>
+            </w:r>
+            <w:r>
+              <w:rPr>
+                <w:rStyle w:val="NormalTok"/>
+              </w:rPr>
+              <w:t xml:space="preserve">    </w:t>
+            </w:r>
+            <w:r>
+              <w:rPr>
+                <w:rStyle w:val="AttributeTok"/>
+              </w:rPr>
               <w:t xml:space="preserve">se =</w:t>
             </w:r>
             <w:r>
@@ -10957,7 +11008,16 @@
               <w:rPr>
                 <w:rStyle w:val="NormalTok"/>
               </w:rPr>
-              <w:t xml:space="preserve">, </w:t>
+              <w:t xml:space="preserve">,</w:t>
+            </w:r>
+            <w:r>
+              <w:br/>
+            </w:r>
+            <w:r>
+              <w:rPr>
+                <w:rStyle w:val="NormalTok"/>
+              </w:rPr>
+              <w:t xml:space="preserve">    </w:t>
             </w:r>
             <w:r>
               <w:rPr>
@@ -10978,10 +11038,13 @@
               <w:t xml:space="preserve">"red"</w:t>
             </w:r>
             <w:r>
+              <w:br/>
+            </w:r>
+            <w:r>
               <w:rPr>
                 <w:rStyle w:val="NormalTok"/>
               </w:rPr>
-              <w:t xml:space="preserve">) </w:t>
+              <w:t xml:space="preserve">  ) </w:t>
             </w:r>
             <w:r>
               <w:rPr>

</xml_diff>